<commit_message>
User Profile and Badges information added in both user manuals
</commit_message>
<xml_diff>
--- a/User Manual/User-Manual.docx
+++ b/User Manual/User-Manual.docx
@@ -1,6 +1,6 @@
 
 <file path=word/document.xml><?xml version="1.0" encoding="utf-8"?>
-<w:document xmlns:wpc="http://schemas.microsoft.com/office/word/2010/wordprocessingCanvas" xmlns:cx="http://schemas.microsoft.com/office/drawing/2014/chartex" xmlns:cx1="http://schemas.microsoft.com/office/drawing/2015/9/8/chartex" xmlns:cx2="http://schemas.microsoft.com/office/drawing/2015/10/21/chartex" xmlns:cx3="http://schemas.microsoft.com/office/drawing/2016/5/9/chartex" xmlns:cx4="http://schemas.microsoft.com/office/drawing/2016/5/10/chartex" xmlns:cx5="http://schemas.microsoft.com/office/drawing/2016/5/11/chartex" xmlns:cx6="http://schemas.microsoft.com/office/drawing/2016/5/12/chartex" xmlns:cx7="http://schemas.microsoft.com/office/drawing/2016/5/13/chartex" xmlns:cx8="http://schemas.microsoft.com/office/drawing/2016/5/14/chartex" xmlns:mc="http://schemas.openxmlformats.org/markup-compatibility/2006" xmlns:aink="http://schemas.microsoft.com/office/drawing/2016/ink" xmlns:am3d="http://schemas.microsoft.com/office/drawing/2017/model3d" xmlns:o="urn:schemas-microsoft-com:office:office" xmlns:oel="http://schemas.microsoft.com/office/2019/extlst" xmlns:r="http://schemas.openxmlformats.org/officeDocument/2006/relationships" xmlns:m="http://schemas.openxmlformats.org/officeDocument/2006/math" xmlns:v="urn:schemas-microsoft-com:vml" xmlns:wp14="http://schemas.microsoft.com/office/word/2010/wordprocessingDrawing" xmlns:wp="http://schemas.openxmlformats.org/drawingml/2006/wordprocessingDrawing" xmlns:w10="urn:schemas-microsoft-com:office:word" xmlns:w="http://schemas.openxmlformats.org/wordprocessingml/2006/main" xmlns:w14="http://schemas.microsoft.com/office/word/2010/wordml" xmlns:w15="http://schemas.microsoft.com/office/word/2012/wordml" xmlns:w16cex="http://schemas.microsoft.com/office/word/2018/wordml/cex" xmlns:w16cid="http://schemas.microsoft.com/office/word/2016/wordml/cid" xmlns:w16="http://schemas.microsoft.com/office/word/2018/wordml" xmlns:w16du="http://schemas.microsoft.com/office/word/2023/wordml/word16du" xmlns:w16sdtdh="http://schemas.microsoft.com/office/word/2020/wordml/sdtdatahash" xmlns:w16sdtfl="http://schemas.microsoft.com/office/word/2024/wordml/sdtformatlock" xmlns:w16se="http://schemas.microsoft.com/office/word/2015/wordml/symex" xmlns:wpg="http://schemas.microsoft.com/office/word/2010/wordprocessingGroup" xmlns:wpi="http://schemas.microsoft.com/office/word/2010/wordprocessingInk" xmlns:wne="http://schemas.microsoft.com/office/word/2006/wordml" xmlns:wps="http://schemas.microsoft.com/office/word/2010/wordprocessingShape" mc:Ignorable="w14 w15 w16se w16cid w16 w16cex w16sdtdh w16sdtfl w16du wp14">
+<w:document xmlns:wpc="http://schemas.microsoft.com/office/word/2010/wordprocessingCanvas" xmlns:mc="http://schemas.openxmlformats.org/markup-compatibility/2006" xmlns:o="urn:schemas-microsoft-com:office:office" xmlns:r="http://schemas.openxmlformats.org/officeDocument/2006/relationships" xmlns:m="http://schemas.openxmlformats.org/officeDocument/2006/math" xmlns:v="urn:schemas-microsoft-com:vml" xmlns:wp14="http://schemas.microsoft.com/office/word/2010/wordprocessingDrawing" xmlns:wp="http://schemas.openxmlformats.org/drawingml/2006/wordprocessingDrawing" xmlns:w10="urn:schemas-microsoft-com:office:word" xmlns:w="http://schemas.openxmlformats.org/wordprocessingml/2006/main" xmlns:w14="http://schemas.microsoft.com/office/word/2010/wordml" xmlns:w15="http://schemas.microsoft.com/office/word/2012/wordml" xmlns:wpg="http://schemas.microsoft.com/office/word/2010/wordprocessingGroup" xmlns:wpi="http://schemas.microsoft.com/office/word/2010/wordprocessingInk" xmlns:wne="http://schemas.microsoft.com/office/word/2006/wordml" xmlns:wps="http://schemas.microsoft.com/office/word/2010/wordprocessingShape" mc:Ignorable="w14 w15 wp14">
   <w:body>
     <w:p>
       <w:r>
@@ -160,6 +160,7 @@
       <w:r>
         <w:rPr>
           <w:noProof/>
+          <w:lang w:val="en-US"/>
         </w:rPr>
         <w:drawing>
           <wp:inline distT="0" distB="0" distL="0" distR="0" wp14:anchorId="1881B632" wp14:editId="70A824E1">
@@ -293,15 +294,15 @@
         </w:numPr>
       </w:pPr>
       <w:r>
+        <w:t>Cloud Computin</w:t>
+      </w:r>
+      <w:r>
+        <w:t>g</w:t>
+      </w:r>
+    </w:p>
+    <w:p>
+      <w:r>
         <w:lastRenderedPageBreak/>
-        <w:t>Cloud Computin</w:t>
-      </w:r>
-      <w:r>
-        <w:t>g</w:t>
-      </w:r>
-    </w:p>
-    <w:p>
-      <w:r>
         <w:t>Leaderboard Button:</w:t>
       </w:r>
     </w:p>
@@ -379,6 +380,7 @@
       <w:r>
         <w:rPr>
           <w:noProof/>
+          <w:lang w:val="en-US"/>
         </w:rPr>
         <w:drawing>
           <wp:inline distT="0" distB="0" distL="0" distR="0" wp14:anchorId="1760471E" wp14:editId="4D14C1E9">
@@ -542,6 +544,920 @@
     </w:p>
     <w:p/>
     <w:p/>
+    <w:p>
+      <w:pPr>
+        <w:rPr>
+          <w:b/>
+          <w:bCs/>
+          <w:lang w:val="en-US"/>
+        </w:rPr>
+      </w:pPr>
+      <w:r>
+        <w:rPr>
+          <w:b/>
+          <w:bCs/>
+          <w:lang w:val="en-US"/>
+        </w:rPr>
+        <w:t>3. User Profile Management and Badges</w:t>
+      </w:r>
+    </w:p>
+    <w:p>
+      <w:pPr>
+        <w:rPr>
+          <w:b/>
+          <w:bCs/>
+          <w:lang w:val="en-US"/>
+        </w:rPr>
+      </w:pPr>
+      <w:r>
+        <w:rPr>
+          <w:b/>
+          <w:bCs/>
+          <w:lang w:val="en-US"/>
+        </w:rPr>
+        <w:t>3.1 Profile Page Overview</w:t>
+      </w:r>
+    </w:p>
+    <w:p>
+      <w:pPr>
+        <w:rPr>
+          <w:lang w:val="en-US"/>
+        </w:rPr>
+      </w:pPr>
+      <w:r>
+        <w:rPr>
+          <w:lang w:val="en-US"/>
+        </w:rPr>
+        <w:t xml:space="preserve">The </w:t>
+      </w:r>
+      <w:r>
+        <w:rPr>
+          <w:bCs/>
+          <w:lang w:val="en-US"/>
+        </w:rPr>
+        <w:t>Profile Page</w:t>
+      </w:r>
+      <w:r>
+        <w:rPr>
+          <w:lang w:val="en-US"/>
+        </w:rPr>
+        <w:t xml:space="preserve"> displays key details about the user, their progress, and achievements. Users can view their personal information, track progress, and access settings.</w:t>
+      </w:r>
+    </w:p>
+    <w:p>
+      <w:pPr>
+        <w:rPr>
+          <w:bCs/>
+          <w:lang w:val="en-US"/>
+        </w:rPr>
+      </w:pPr>
+      <w:r>
+        <w:rPr>
+          <w:bCs/>
+          <w:lang w:val="en-US"/>
+        </w:rPr>
+        <w:t>Main Features on the Profile Page</w:t>
+      </w:r>
+    </w:p>
+    <w:p>
+      <w:pPr>
+        <w:rPr>
+          <w:lang w:val="en-US"/>
+        </w:rPr>
+      </w:pPr>
+      <w:r>
+        <w:rPr>
+          <w:bCs/>
+          <w:lang w:val="en-US"/>
+        </w:rPr>
+        <w:t>User Information</w:t>
+      </w:r>
+    </w:p>
+    <w:p>
+      <w:pPr>
+        <w:numPr>
+          <w:ilvl w:val="0"/>
+          <w:numId w:val="12"/>
+        </w:numPr>
+        <w:rPr>
+          <w:lang w:val="en-US"/>
+        </w:rPr>
+      </w:pPr>
+      <w:r>
+        <w:rPr>
+          <w:lang w:val="en-US"/>
+        </w:rPr>
+        <w:t>Displays the username, profile picture, and user level.</w:t>
+      </w:r>
+    </w:p>
+    <w:p>
+      <w:pPr>
+        <w:numPr>
+          <w:ilvl w:val="0"/>
+          <w:numId w:val="12"/>
+        </w:numPr>
+        <w:rPr>
+          <w:lang w:val="en-US"/>
+        </w:rPr>
+      </w:pPr>
+      <w:r>
+        <w:rPr>
+          <w:lang w:val="en-US"/>
+        </w:rPr>
+        <w:t>Shows basic details like email (if applicable) and registration date.</w:t>
+      </w:r>
+    </w:p>
+    <w:p>
+      <w:pPr>
+        <w:rPr>
+          <w:lang w:val="en-US"/>
+        </w:rPr>
+      </w:pPr>
+      <w:r>
+        <w:rPr>
+          <w:bCs/>
+          <w:lang w:val="en-US"/>
+        </w:rPr>
+        <w:t>Completed and In-Progress Courses</w:t>
+      </w:r>
+    </w:p>
+    <w:p>
+      <w:pPr>
+        <w:numPr>
+          <w:ilvl w:val="0"/>
+          <w:numId w:val="13"/>
+        </w:numPr>
+        <w:rPr>
+          <w:lang w:val="en-US"/>
+        </w:rPr>
+      </w:pPr>
+      <w:r>
+        <w:rPr>
+          <w:lang w:val="en-US"/>
+        </w:rPr>
+        <w:t>Shows the total number of completed courses.</w:t>
+      </w:r>
+    </w:p>
+    <w:p>
+      <w:pPr>
+        <w:numPr>
+          <w:ilvl w:val="0"/>
+          <w:numId w:val="13"/>
+        </w:numPr>
+        <w:rPr>
+          <w:lang w:val="en-US"/>
+        </w:rPr>
+      </w:pPr>
+      <w:r>
+        <w:rPr>
+          <w:lang w:val="en-US"/>
+        </w:rPr>
+        <w:t>Displays courses currently in progress, helping users track learning progress.</w:t>
+      </w:r>
+    </w:p>
+    <w:p>
+      <w:pPr>
+        <w:rPr>
+          <w:lang w:val="en-US"/>
+        </w:rPr>
+      </w:pPr>
+      <w:r>
+        <w:rPr>
+          <w:bCs/>
+          <w:lang w:val="en-US"/>
+        </w:rPr>
+        <w:t>Badges and Achievements</w:t>
+      </w:r>
+    </w:p>
+    <w:p>
+      <w:pPr>
+        <w:numPr>
+          <w:ilvl w:val="0"/>
+          <w:numId w:val="14"/>
+        </w:numPr>
+        <w:rPr>
+          <w:lang w:val="en-US"/>
+        </w:rPr>
+      </w:pPr>
+      <w:r>
+        <w:rPr>
+          <w:lang w:val="en-US"/>
+        </w:rPr>
+        <w:t xml:space="preserve">Displays all earned </w:t>
+      </w:r>
+      <w:r>
+        <w:rPr>
+          <w:bCs/>
+          <w:lang w:val="en-US"/>
+        </w:rPr>
+        <w:t>badges</w:t>
+      </w:r>
+      <w:r>
+        <w:rPr>
+          <w:lang w:val="en-US"/>
+        </w:rPr>
+        <w:t xml:space="preserve"> for milestones in completing courses</w:t>
+      </w:r>
+    </w:p>
+    <w:p>
+      <w:pPr>
+        <w:numPr>
+          <w:ilvl w:val="0"/>
+          <w:numId w:val="14"/>
+        </w:numPr>
+        <w:rPr>
+          <w:lang w:val="en-US"/>
+        </w:rPr>
+      </w:pPr>
+      <w:r>
+        <w:rPr>
+          <w:lang w:val="en-US"/>
+        </w:rPr>
+        <w:t>Hovering over a badge shows detailed information about how it was earned.</w:t>
+      </w:r>
+    </w:p>
+    <w:p>
+      <w:pPr>
+        <w:rPr>
+          <w:lang w:val="en-US"/>
+        </w:rPr>
+      </w:pPr>
+      <w:r>
+        <w:rPr>
+          <w:bCs/>
+          <w:lang w:val="en-US"/>
+        </w:rPr>
+        <w:t>Edit Profile Button</w:t>
+      </w:r>
+    </w:p>
+    <w:p>
+      <w:pPr>
+        <w:numPr>
+          <w:ilvl w:val="0"/>
+          <w:numId w:val="15"/>
+        </w:numPr>
+        <w:rPr>
+          <w:lang w:val="en-US"/>
+        </w:rPr>
+      </w:pPr>
+      <w:r>
+        <w:rPr>
+          <w:lang w:val="en-US"/>
+        </w:rPr>
+        <w:t xml:space="preserve">Clicking this button redirects to the </w:t>
+      </w:r>
+      <w:r>
+        <w:rPr>
+          <w:bCs/>
+          <w:lang w:val="en-US"/>
+        </w:rPr>
+        <w:t>Edit Profile Page</w:t>
+      </w:r>
+      <w:r>
+        <w:rPr>
+          <w:lang w:val="en-US"/>
+        </w:rPr>
+        <w:t>, where users can update their details.</w:t>
+      </w:r>
+    </w:p>
+    <w:p>
+      <w:pPr>
+        <w:rPr>
+          <w:lang w:val="en-US"/>
+        </w:rPr>
+      </w:pPr>
+      <w:r>
+        <w:rPr>
+          <w:bCs/>
+          <w:lang w:val="en-US"/>
+        </w:rPr>
+        <w:t>Leaderboard and Ranking</w:t>
+      </w:r>
+    </w:p>
+    <w:p>
+      <w:pPr>
+        <w:numPr>
+          <w:ilvl w:val="0"/>
+          <w:numId w:val="16"/>
+        </w:numPr>
+        <w:rPr>
+          <w:lang w:val="en-US"/>
+        </w:rPr>
+      </w:pPr>
+      <w:r>
+        <w:rPr>
+          <w:lang w:val="en-US"/>
+        </w:rPr>
+        <w:t xml:space="preserve">Displays the user’s position in the </w:t>
+      </w:r>
+      <w:r>
+        <w:rPr>
+          <w:bCs/>
+          <w:lang w:val="en-US"/>
+        </w:rPr>
+        <w:t>leaderboard</w:t>
+      </w:r>
+      <w:r>
+        <w:rPr>
+          <w:lang w:val="en-US"/>
+        </w:rPr>
+        <w:t>, based on points and completed courses.</w:t>
+      </w:r>
+    </w:p>
+    <w:p>
+      <w:pPr>
+        <w:rPr>
+          <w:lang w:val="en-US"/>
+        </w:rPr>
+      </w:pPr>
+      <w:r>
+        <w:rPr>
+          <w:lang w:val="en-US"/>
+        </w:rPr>
+        <w:t>Logout</w:t>
+      </w:r>
+    </w:p>
+    <w:p>
+      <w:pPr>
+        <w:numPr>
+          <w:ilvl w:val="0"/>
+          <w:numId w:val="16"/>
+        </w:numPr>
+        <w:rPr>
+          <w:lang w:val="en-US"/>
+        </w:rPr>
+      </w:pPr>
+      <w:r>
+        <w:rPr>
+          <w:lang w:val="en-US"/>
+        </w:rPr>
+        <w:t>Allows users to logout of their ID returning back to the login page.</w:t>
+      </w:r>
+    </w:p>
+    <w:p>
+      <w:pPr>
+        <w:rPr>
+          <w:lang w:val="en-US"/>
+        </w:rPr>
+      </w:pPr>
+    </w:p>
+    <w:p>
+      <w:pPr>
+        <w:rPr>
+          <w:b/>
+          <w:bCs/>
+          <w:lang w:val="en-US"/>
+        </w:rPr>
+      </w:pPr>
+      <w:r>
+        <w:rPr>
+          <w:b/>
+          <w:bCs/>
+          <w:lang w:val="en-US"/>
+        </w:rPr>
+        <w:t>3.2 Edit Profile Page</w:t>
+      </w:r>
+    </w:p>
+    <w:p>
+      <w:pPr>
+        <w:rPr>
+          <w:lang w:val="en-US"/>
+        </w:rPr>
+      </w:pPr>
+      <w:r>
+        <w:rPr>
+          <w:lang w:val="en-US"/>
+        </w:rPr>
+        <w:t xml:space="preserve">The </w:t>
+      </w:r>
+      <w:r>
+        <w:rPr>
+          <w:bCs/>
+          <w:lang w:val="en-US"/>
+        </w:rPr>
+        <w:t>Edit Profile Page</w:t>
+      </w:r>
+      <w:r>
+        <w:rPr>
+          <w:lang w:val="en-US"/>
+        </w:rPr>
+        <w:t xml:space="preserve"> allows users to modify their personal information and update their profile picture.</w:t>
+      </w:r>
+    </w:p>
+    <w:p>
+      <w:pPr>
+        <w:rPr>
+          <w:b/>
+          <w:bCs/>
+          <w:lang w:val="en-US"/>
+        </w:rPr>
+      </w:pPr>
+      <w:r>
+        <w:rPr>
+          <w:b/>
+          <w:bCs/>
+          <w:lang w:val="en-US"/>
+        </w:rPr>
+        <w:t>Features of the Edit Profile Page</w:t>
+      </w:r>
+    </w:p>
+    <w:p>
+      <w:pPr>
+        <w:rPr>
+          <w:lang w:val="en-US"/>
+        </w:rPr>
+      </w:pPr>
+      <w:r>
+        <w:rPr>
+          <w:bCs/>
+          <w:lang w:val="en-US"/>
+        </w:rPr>
+        <w:t>Change Password</w:t>
+      </w:r>
+    </w:p>
+    <w:p>
+      <w:pPr>
+        <w:numPr>
+          <w:ilvl w:val="0"/>
+          <w:numId w:val="17"/>
+        </w:numPr>
+        <w:rPr>
+          <w:lang w:val="en-US"/>
+        </w:rPr>
+      </w:pPr>
+      <w:r>
+        <w:rPr>
+          <w:lang w:val="en-US"/>
+        </w:rPr>
+        <w:t xml:space="preserve">Users can enter a </w:t>
+      </w:r>
+      <w:r>
+        <w:rPr>
+          <w:bCs/>
+          <w:lang w:val="en-US"/>
+        </w:rPr>
+        <w:t>new password</w:t>
+      </w:r>
+      <w:r>
+        <w:rPr>
+          <w:lang w:val="en-US"/>
+        </w:rPr>
+        <w:t xml:space="preserve"> and confirm it to change their login credentials.</w:t>
+      </w:r>
+    </w:p>
+    <w:p>
+      <w:pPr>
+        <w:rPr>
+          <w:lang w:val="en-US"/>
+        </w:rPr>
+      </w:pPr>
+      <w:r>
+        <w:rPr>
+          <w:bCs/>
+          <w:lang w:val="en-US"/>
+        </w:rPr>
+        <w:t>Upload Profile Picture</w:t>
+      </w:r>
+    </w:p>
+    <w:p>
+      <w:pPr>
+        <w:numPr>
+          <w:ilvl w:val="0"/>
+          <w:numId w:val="18"/>
+        </w:numPr>
+        <w:rPr>
+          <w:lang w:val="en-US"/>
+        </w:rPr>
+      </w:pPr>
+      <w:r>
+        <w:rPr>
+          <w:lang w:val="en-US"/>
+        </w:rPr>
+        <w:t xml:space="preserve">Allows users to </w:t>
+      </w:r>
+      <w:r>
+        <w:rPr>
+          <w:bCs/>
+          <w:lang w:val="en-US"/>
+        </w:rPr>
+        <w:t>upload a profile picture</w:t>
+      </w:r>
+      <w:r>
+        <w:rPr>
+          <w:lang w:val="en-US"/>
+        </w:rPr>
+        <w:t xml:space="preserve"> or choose an avatar.</w:t>
+      </w:r>
+    </w:p>
+    <w:p>
+      <w:pPr>
+        <w:rPr>
+          <w:bCs/>
+          <w:lang w:val="en-US"/>
+        </w:rPr>
+      </w:pPr>
+      <w:r>
+        <w:rPr>
+          <w:bCs/>
+          <w:lang w:val="en-US"/>
+        </w:rPr>
+        <w:t>Add and change Bio</w:t>
+      </w:r>
+    </w:p>
+    <w:p>
+      <w:pPr>
+        <w:numPr>
+          <w:ilvl w:val="0"/>
+          <w:numId w:val="18"/>
+        </w:numPr>
+        <w:rPr>
+          <w:bCs/>
+          <w:lang w:val="en-US"/>
+        </w:rPr>
+      </w:pPr>
+      <w:r>
+        <w:rPr>
+          <w:bCs/>
+          <w:lang w:val="en-US"/>
+        </w:rPr>
+        <w:t>Allows users to add or change their bio to tell other about them.</w:t>
+      </w:r>
+    </w:p>
+    <w:p>
+      <w:pPr>
+        <w:rPr>
+          <w:bCs/>
+          <w:lang w:val="en-US"/>
+        </w:rPr>
+      </w:pPr>
+    </w:p>
+    <w:p>
+      <w:pPr>
+        <w:rPr>
+          <w:lang w:val="en-US"/>
+        </w:rPr>
+      </w:pPr>
+      <w:r>
+        <w:rPr>
+          <w:bCs/>
+          <w:lang w:val="en-US"/>
+        </w:rPr>
+        <w:t>Save Changes Button</w:t>
+      </w:r>
+    </w:p>
+    <w:p>
+      <w:pPr>
+        <w:numPr>
+          <w:ilvl w:val="0"/>
+          <w:numId w:val="19"/>
+        </w:numPr>
+        <w:rPr>
+          <w:lang w:val="en-US"/>
+        </w:rPr>
+      </w:pPr>
+      <w:r>
+        <w:rPr>
+          <w:lang w:val="en-US"/>
+        </w:rPr>
+        <w:t xml:space="preserve">Clicking </w:t>
+      </w:r>
+      <w:r>
+        <w:rPr>
+          <w:bCs/>
+          <w:lang w:val="en-US"/>
+        </w:rPr>
+        <w:t>Save Changes</w:t>
+      </w:r>
+      <w:r>
+        <w:rPr>
+          <w:lang w:val="en-US"/>
+        </w:rPr>
+        <w:t xml:space="preserve"> updates the user’s details.</w:t>
+      </w:r>
+    </w:p>
+    <w:p>
+      <w:pPr>
+        <w:numPr>
+          <w:ilvl w:val="0"/>
+          <w:numId w:val="19"/>
+        </w:numPr>
+        <w:rPr>
+          <w:lang w:val="en-US"/>
+        </w:rPr>
+      </w:pPr>
+      <w:r>
+        <w:rPr>
+          <w:lang w:val="en-US"/>
+        </w:rPr>
+        <w:t>If an error occurs (e.g., weak password), a message is displayed.</w:t>
+      </w:r>
+    </w:p>
+    <w:p>
+      <w:pPr>
+        <w:rPr>
+          <w:lang w:val="en-US"/>
+        </w:rPr>
+      </w:pPr>
+      <w:r>
+        <w:rPr>
+          <w:bCs/>
+          <w:lang w:val="en-US"/>
+        </w:rPr>
+        <w:t>Cancel Button</w:t>
+      </w:r>
+    </w:p>
+    <w:p>
+      <w:pPr>
+        <w:numPr>
+          <w:ilvl w:val="0"/>
+          <w:numId w:val="20"/>
+        </w:numPr>
+        <w:rPr>
+          <w:lang w:val="en-US"/>
+        </w:rPr>
+      </w:pPr>
+      <w:r>
+        <w:rPr>
+          <w:lang w:val="en-US"/>
+        </w:rPr>
+        <w:t xml:space="preserve">Redirects back to the </w:t>
+      </w:r>
+      <w:r>
+        <w:rPr>
+          <w:bCs/>
+          <w:lang w:val="en-US"/>
+        </w:rPr>
+        <w:t>Profile Page</w:t>
+      </w:r>
+      <w:r>
+        <w:rPr>
+          <w:lang w:val="en-US"/>
+        </w:rPr>
+        <w:t xml:space="preserve"> without saving changes.</w:t>
+      </w:r>
+    </w:p>
+    <w:p>
+      <w:pPr>
+        <w:rPr>
+          <w:b/>
+          <w:bCs/>
+          <w:lang w:val="en-US"/>
+        </w:rPr>
+      </w:pPr>
+      <w:r>
+        <w:rPr>
+          <w:b/>
+          <w:bCs/>
+          <w:lang w:val="en-US"/>
+        </w:rPr>
+        <w:t>3.3. How Badges Work</w:t>
+      </w:r>
+    </w:p>
+    <w:p>
+      <w:pPr>
+        <w:rPr>
+          <w:lang w:val="en-US"/>
+        </w:rPr>
+      </w:pPr>
+      <w:r>
+        <w:rPr>
+          <w:bCs/>
+          <w:lang w:val="en-US"/>
+        </w:rPr>
+        <w:t>Earning Badges</w:t>
+      </w:r>
+    </w:p>
+    <w:p>
+      <w:pPr>
+        <w:rPr>
+          <w:bCs/>
+          <w:lang w:val="en-US"/>
+        </w:rPr>
+      </w:pPr>
+      <w:r>
+        <w:rPr>
+          <w:lang w:val="en-US"/>
+        </w:rPr>
+        <w:t xml:space="preserve">Badges are awarded based on user achievements. Users can track their </w:t>
+      </w:r>
+      <w:r>
+        <w:rPr>
+          <w:bCs/>
+          <w:lang w:val="en-US"/>
+        </w:rPr>
+        <w:t>badges collection</w:t>
+      </w:r>
+      <w:r>
+        <w:rPr>
+          <w:lang w:val="en-US"/>
+        </w:rPr>
+        <w:t xml:space="preserve"> from the </w:t>
+      </w:r>
+      <w:r>
+        <w:rPr>
+          <w:bCs/>
+          <w:lang w:val="en-US"/>
+        </w:rPr>
+        <w:t xml:space="preserve">Profile Page </w:t>
+      </w:r>
+    </w:p>
+    <w:p>
+      <w:pPr>
+        <w:rPr>
+          <w:bCs/>
+          <w:lang w:val="en-US"/>
+        </w:rPr>
+      </w:pPr>
+      <w:r>
+        <w:rPr>
+          <w:bCs/>
+          <w:lang w:val="en-US"/>
+        </w:rPr>
+        <w:t>Types of Badges</w:t>
+      </w:r>
+    </w:p>
+    <w:p>
+      <w:pPr>
+        <w:numPr>
+          <w:ilvl w:val="0"/>
+          <w:numId w:val="22"/>
+        </w:numPr>
+        <w:rPr>
+          <w:lang w:val="en-US"/>
+        </w:rPr>
+      </w:pPr>
+      <w:r>
+        <w:rPr>
+          <w:bCs/>
+          <w:lang w:val="en-US"/>
+        </w:rPr>
+        <w:t>Novice Badge</w:t>
+      </w:r>
+      <w:r>
+        <w:rPr>
+          <w:lang w:val="en-US"/>
+        </w:rPr>
+        <w:t xml:space="preserve"> – Awarded for completing the first course.</w:t>
+      </w:r>
+    </w:p>
+    <w:p>
+      <w:pPr>
+        <w:numPr>
+          <w:ilvl w:val="0"/>
+          <w:numId w:val="22"/>
+        </w:numPr>
+        <w:rPr>
+          <w:lang w:val="en-US"/>
+        </w:rPr>
+      </w:pPr>
+      <w:r>
+        <w:rPr>
+          <w:bCs/>
+          <w:lang w:val="en-US"/>
+        </w:rPr>
+        <w:t>Intermediate Badge</w:t>
+      </w:r>
+      <w:r>
+        <w:rPr>
+          <w:lang w:val="en-US"/>
+        </w:rPr>
+        <w:t xml:space="preserve"> – Earned after completing </w:t>
+      </w:r>
+      <w:r>
+        <w:rPr>
+          <w:bCs/>
+          <w:lang w:val="en-US"/>
+        </w:rPr>
+        <w:t>3 courses</w:t>
+      </w:r>
+      <w:r>
+        <w:rPr>
+          <w:lang w:val="en-US"/>
+        </w:rPr>
+        <w:t>.</w:t>
+      </w:r>
+    </w:p>
+    <w:p>
+      <w:pPr>
+        <w:numPr>
+          <w:ilvl w:val="0"/>
+          <w:numId w:val="22"/>
+        </w:numPr>
+        <w:rPr>
+          <w:lang w:val="en-US"/>
+        </w:rPr>
+      </w:pPr>
+      <w:r>
+        <w:rPr>
+          <w:bCs/>
+          <w:lang w:val="en-US"/>
+        </w:rPr>
+        <w:t>Advanced Badge</w:t>
+      </w:r>
+      <w:r>
+        <w:rPr>
+          <w:lang w:val="en-US"/>
+        </w:rPr>
+        <w:t xml:space="preserve"> – Earned after completing </w:t>
+      </w:r>
+      <w:r>
+        <w:rPr>
+          <w:bCs/>
+          <w:lang w:val="en-US"/>
+        </w:rPr>
+        <w:t>5 courses</w:t>
+      </w:r>
+      <w:r>
+        <w:rPr>
+          <w:lang w:val="en-US"/>
+        </w:rPr>
+        <w:t>.</w:t>
+      </w:r>
+    </w:p>
+    <w:p>
+      <w:pPr>
+        <w:numPr>
+          <w:ilvl w:val="0"/>
+          <w:numId w:val="22"/>
+        </w:numPr>
+        <w:rPr>
+          <w:lang w:val="en-US"/>
+        </w:rPr>
+      </w:pPr>
+      <w:r>
+        <w:rPr>
+          <w:bCs/>
+          <w:lang w:val="en-US"/>
+        </w:rPr>
+        <w:t>Expert Badge</w:t>
+      </w:r>
+      <w:r>
+        <w:rPr>
+          <w:lang w:val="en-US"/>
+        </w:rPr>
+        <w:t xml:space="preserve"> – Earned after completing </w:t>
+      </w:r>
+      <w:r>
+        <w:rPr>
+          <w:bCs/>
+          <w:lang w:val="en-US"/>
+        </w:rPr>
+        <w:t>7 courses</w:t>
+      </w:r>
+      <w:r>
+        <w:rPr>
+          <w:lang w:val="en-US"/>
+        </w:rPr>
+        <w:t>.</w:t>
+      </w:r>
+      <w:bookmarkStart w:id="0" w:name="_GoBack"/>
+      <w:bookmarkEnd w:id="0"/>
+    </w:p>
+    <w:p>
+      <w:pPr>
+        <w:rPr>
+          <w:lang w:val="en-US"/>
+        </w:rPr>
+      </w:pPr>
+      <w:r>
+        <w:rPr>
+          <w:bCs/>
+          <w:lang w:val="en-US"/>
+        </w:rPr>
+        <w:t>Hover Feature</w:t>
+      </w:r>
+    </w:p>
+    <w:p>
+      <w:pPr>
+        <w:numPr>
+          <w:ilvl w:val="0"/>
+          <w:numId w:val="21"/>
+        </w:numPr>
+        <w:rPr>
+          <w:lang w:val="en-US"/>
+        </w:rPr>
+      </w:pPr>
+      <w:r>
+        <w:rPr>
+          <w:lang w:val="en-US"/>
+        </w:rPr>
+        <w:t xml:space="preserve">Hovering over a badge displays its </w:t>
+      </w:r>
+      <w:r>
+        <w:rPr>
+          <w:bCs/>
+          <w:lang w:val="en-US"/>
+        </w:rPr>
+        <w:t>criteria and progress</w:t>
+      </w:r>
+      <w:r>
+        <w:rPr>
+          <w:lang w:val="en-US"/>
+        </w:rPr>
+        <w:t>.</w:t>
+      </w:r>
+    </w:p>
+    <w:p/>
     <w:p/>
     <w:p/>
     <w:sectPr>
@@ -555,8 +1471,157 @@
 </file>
 
 <file path=word/numbering.xml><?xml version="1.0" encoding="utf-8"?>
-<w:numbering xmlns:wpc="http://schemas.microsoft.com/office/word/2010/wordprocessingCanvas" xmlns:cx="http://schemas.microsoft.com/office/drawing/2014/chartex" xmlns:cx1="http://schemas.microsoft.com/office/drawing/2015/9/8/chartex" xmlns:cx2="http://schemas.microsoft.com/office/drawing/2015/10/21/chartex" xmlns:cx3="http://schemas.microsoft.com/office/drawing/2016/5/9/chartex" xmlns:cx4="http://schemas.microsoft.com/office/drawing/2016/5/10/chartex" xmlns:cx5="http://schemas.microsoft.com/office/drawing/2016/5/11/chartex" xmlns:cx6="http://schemas.microsoft.com/office/drawing/2016/5/12/chartex" xmlns:cx7="http://schemas.microsoft.com/office/drawing/2016/5/13/chartex" xmlns:cx8="http://schemas.microsoft.com/office/drawing/2016/5/14/chartex" xmlns:mc="http://schemas.openxmlformats.org/markup-compatibility/2006" xmlns:aink="http://schemas.microsoft.com/office/drawing/2016/ink" xmlns:am3d="http://schemas.microsoft.com/office/drawing/2017/model3d" xmlns:o="urn:schemas-microsoft-com:office:office" xmlns:oel="http://schemas.microsoft.com/office/2019/extlst" xmlns:r="http://schemas.openxmlformats.org/officeDocument/2006/relationships" xmlns:m="http://schemas.openxmlformats.org/officeDocument/2006/math" xmlns:v="urn:schemas-microsoft-com:vml" xmlns:wp14="http://schemas.microsoft.com/office/word/2010/wordprocessingDrawing" xmlns:wp="http://schemas.openxmlformats.org/drawingml/2006/wordprocessingDrawing" xmlns:w10="urn:schemas-microsoft-com:office:word" xmlns:w="http://schemas.openxmlformats.org/wordprocessingml/2006/main" xmlns:w14="http://schemas.microsoft.com/office/word/2010/wordml" xmlns:w15="http://schemas.microsoft.com/office/word/2012/wordml" xmlns:w16cex="http://schemas.microsoft.com/office/word/2018/wordml/cex" xmlns:w16cid="http://schemas.microsoft.com/office/word/2016/wordml/cid" xmlns:w16="http://schemas.microsoft.com/office/word/2018/wordml" xmlns:w16du="http://schemas.microsoft.com/office/word/2023/wordml/word16du" xmlns:w16sdtdh="http://schemas.microsoft.com/office/word/2020/wordml/sdtdatahash" xmlns:w16sdtfl="http://schemas.microsoft.com/office/word/2024/wordml/sdtformatlock" xmlns:w16se="http://schemas.microsoft.com/office/word/2015/wordml/symex" xmlns:wpg="http://schemas.microsoft.com/office/word/2010/wordprocessingGroup" xmlns:wpi="http://schemas.microsoft.com/office/word/2010/wordprocessingInk" xmlns:wne="http://schemas.microsoft.com/office/word/2006/wordml" xmlns:wps="http://schemas.microsoft.com/office/word/2010/wordprocessingShape" mc:Ignorable="w14 w15 w16se w16cid w16 w16cex w16sdtdh w16sdtfl w16du wp14">
-  <w:abstractNum w:abstractNumId="0" w15:restartNumberingAfterBreak="0">
+<w:numbering xmlns:wpc="http://schemas.microsoft.com/office/word/2010/wordprocessingCanvas" xmlns:mc="http://schemas.openxmlformats.org/markup-compatibility/2006" xmlns:o="urn:schemas-microsoft-com:office:office" xmlns:r="http://schemas.openxmlformats.org/officeDocument/2006/relationships" xmlns:m="http://schemas.openxmlformats.org/officeDocument/2006/math" xmlns:v="urn:schemas-microsoft-com:vml" xmlns:wp14="http://schemas.microsoft.com/office/word/2010/wordprocessingDrawing" xmlns:wp="http://schemas.openxmlformats.org/drawingml/2006/wordprocessingDrawing" xmlns:w10="urn:schemas-microsoft-com:office:word" xmlns:w="http://schemas.openxmlformats.org/wordprocessingml/2006/main" xmlns:w14="http://schemas.microsoft.com/office/word/2010/wordml" xmlns:w15="http://schemas.microsoft.com/office/word/2012/wordml" xmlns:wpg="http://schemas.microsoft.com/office/word/2010/wordprocessingGroup" xmlns:wpi="http://schemas.microsoft.com/office/word/2010/wordprocessingInk" xmlns:wne="http://schemas.microsoft.com/office/word/2006/wordml" xmlns:wps="http://schemas.microsoft.com/office/word/2010/wordprocessingShape" mc:Ignorable="w14 w15 wp14">
+  <w:abstractNum w:abstractNumId="0">
+    <w:nsid w:val="03D70A73"/>
+    <w:multiLevelType w:val="multilevel"/>
+    <w:tmpl w:val="07FCCC2A"/>
+    <w:lvl w:ilvl="0">
+      <w:start w:val="1"/>
+      <w:numFmt w:val="bullet"/>
+      <w:lvlText w:val=""/>
+      <w:lvlJc w:val="left"/>
+      <w:pPr>
+        <w:tabs>
+          <w:tab w:val="num" w:pos="720"/>
+        </w:tabs>
+        <w:ind w:left="720" w:hanging="360"/>
+      </w:pPr>
+      <w:rPr>
+        <w:rFonts w:ascii="Symbol" w:hAnsi="Symbol" w:hint="default"/>
+        <w:sz w:val="20"/>
+      </w:rPr>
+    </w:lvl>
+    <w:lvl w:ilvl="1" w:tentative="1">
+      <w:start w:val="1"/>
+      <w:numFmt w:val="bullet"/>
+      <w:lvlText w:val="o"/>
+      <w:lvlJc w:val="left"/>
+      <w:pPr>
+        <w:tabs>
+          <w:tab w:val="num" w:pos="1440"/>
+        </w:tabs>
+        <w:ind w:left="1440" w:hanging="360"/>
+      </w:pPr>
+      <w:rPr>
+        <w:rFonts w:ascii="Courier New" w:hAnsi="Courier New" w:hint="default"/>
+        <w:sz w:val="20"/>
+      </w:rPr>
+    </w:lvl>
+    <w:lvl w:ilvl="2" w:tentative="1">
+      <w:start w:val="1"/>
+      <w:numFmt w:val="bullet"/>
+      <w:lvlText w:val=""/>
+      <w:lvlJc w:val="left"/>
+      <w:pPr>
+        <w:tabs>
+          <w:tab w:val="num" w:pos="2160"/>
+        </w:tabs>
+        <w:ind w:left="2160" w:hanging="360"/>
+      </w:pPr>
+      <w:rPr>
+        <w:rFonts w:ascii="Wingdings" w:hAnsi="Wingdings" w:hint="default"/>
+        <w:sz w:val="20"/>
+      </w:rPr>
+    </w:lvl>
+    <w:lvl w:ilvl="3" w:tentative="1">
+      <w:start w:val="1"/>
+      <w:numFmt w:val="bullet"/>
+      <w:lvlText w:val=""/>
+      <w:lvlJc w:val="left"/>
+      <w:pPr>
+        <w:tabs>
+          <w:tab w:val="num" w:pos="2880"/>
+        </w:tabs>
+        <w:ind w:left="2880" w:hanging="360"/>
+      </w:pPr>
+      <w:rPr>
+        <w:rFonts w:ascii="Wingdings" w:hAnsi="Wingdings" w:hint="default"/>
+        <w:sz w:val="20"/>
+      </w:rPr>
+    </w:lvl>
+    <w:lvl w:ilvl="4" w:tentative="1">
+      <w:start w:val="1"/>
+      <w:numFmt w:val="bullet"/>
+      <w:lvlText w:val=""/>
+      <w:lvlJc w:val="left"/>
+      <w:pPr>
+        <w:tabs>
+          <w:tab w:val="num" w:pos="3600"/>
+        </w:tabs>
+        <w:ind w:left="3600" w:hanging="360"/>
+      </w:pPr>
+      <w:rPr>
+        <w:rFonts w:ascii="Wingdings" w:hAnsi="Wingdings" w:hint="default"/>
+        <w:sz w:val="20"/>
+      </w:rPr>
+    </w:lvl>
+    <w:lvl w:ilvl="5" w:tentative="1">
+      <w:start w:val="1"/>
+      <w:numFmt w:val="bullet"/>
+      <w:lvlText w:val=""/>
+      <w:lvlJc w:val="left"/>
+      <w:pPr>
+        <w:tabs>
+          <w:tab w:val="num" w:pos="4320"/>
+        </w:tabs>
+        <w:ind w:left="4320" w:hanging="360"/>
+      </w:pPr>
+      <w:rPr>
+        <w:rFonts w:ascii="Wingdings" w:hAnsi="Wingdings" w:hint="default"/>
+        <w:sz w:val="20"/>
+      </w:rPr>
+    </w:lvl>
+    <w:lvl w:ilvl="6" w:tentative="1">
+      <w:start w:val="1"/>
+      <w:numFmt w:val="bullet"/>
+      <w:lvlText w:val=""/>
+      <w:lvlJc w:val="left"/>
+      <w:pPr>
+        <w:tabs>
+          <w:tab w:val="num" w:pos="5040"/>
+        </w:tabs>
+        <w:ind w:left="5040" w:hanging="360"/>
+      </w:pPr>
+      <w:rPr>
+        <w:rFonts w:ascii="Wingdings" w:hAnsi="Wingdings" w:hint="default"/>
+        <w:sz w:val="20"/>
+      </w:rPr>
+    </w:lvl>
+    <w:lvl w:ilvl="7" w:tentative="1">
+      <w:start w:val="1"/>
+      <w:numFmt w:val="bullet"/>
+      <w:lvlText w:val=""/>
+      <w:lvlJc w:val="left"/>
+      <w:pPr>
+        <w:tabs>
+          <w:tab w:val="num" w:pos="5760"/>
+        </w:tabs>
+        <w:ind w:left="5760" w:hanging="360"/>
+      </w:pPr>
+      <w:rPr>
+        <w:rFonts w:ascii="Wingdings" w:hAnsi="Wingdings" w:hint="default"/>
+        <w:sz w:val="20"/>
+      </w:rPr>
+    </w:lvl>
+    <w:lvl w:ilvl="8" w:tentative="1">
+      <w:start w:val="1"/>
+      <w:numFmt w:val="bullet"/>
+      <w:lvlText w:val=""/>
+      <w:lvlJc w:val="left"/>
+      <w:pPr>
+        <w:tabs>
+          <w:tab w:val="num" w:pos="6480"/>
+        </w:tabs>
+        <w:ind w:left="6480" w:hanging="360"/>
+      </w:pPr>
+      <w:rPr>
+        <w:rFonts w:ascii="Wingdings" w:hAnsi="Wingdings" w:hint="default"/>
+        <w:sz w:val="20"/>
+      </w:rPr>
+    </w:lvl>
+  </w:abstractNum>
+  <w:abstractNum w:abstractNumId="1">
     <w:nsid w:val="07B00BF2"/>
     <w:multiLevelType w:val="multilevel"/>
     <w:tmpl w:val="FA5416C6"/>
@@ -705,7 +1770,7 @@
       </w:rPr>
     </w:lvl>
   </w:abstractNum>
-  <w:abstractNum w:abstractNumId="1" w15:restartNumberingAfterBreak="0">
+  <w:abstractNum w:abstractNumId="2">
     <w:nsid w:val="07CC49D6"/>
     <w:multiLevelType w:val="multilevel"/>
     <w:tmpl w:val="AA7A8E3A"/>
@@ -854,7 +1919,7 @@
       </w:rPr>
     </w:lvl>
   </w:abstractNum>
-  <w:abstractNum w:abstractNumId="2" w15:restartNumberingAfterBreak="0">
+  <w:abstractNum w:abstractNumId="3">
     <w:nsid w:val="0B9F1721"/>
     <w:multiLevelType w:val="multilevel"/>
     <w:tmpl w:val="F4CE0A32"/>
@@ -1003,7 +2068,156 @@
       </w:rPr>
     </w:lvl>
   </w:abstractNum>
-  <w:abstractNum w:abstractNumId="3" w15:restartNumberingAfterBreak="0">
+  <w:abstractNum w:abstractNumId="4">
+    <w:nsid w:val="0D5C44E5"/>
+    <w:multiLevelType w:val="multilevel"/>
+    <w:tmpl w:val="B3348786"/>
+    <w:lvl w:ilvl="0">
+      <w:start w:val="1"/>
+      <w:numFmt w:val="bullet"/>
+      <w:lvlText w:val=""/>
+      <w:lvlJc w:val="left"/>
+      <w:pPr>
+        <w:tabs>
+          <w:tab w:val="num" w:pos="720"/>
+        </w:tabs>
+        <w:ind w:left="720" w:hanging="360"/>
+      </w:pPr>
+      <w:rPr>
+        <w:rFonts w:ascii="Symbol" w:hAnsi="Symbol" w:hint="default"/>
+        <w:sz w:val="20"/>
+      </w:rPr>
+    </w:lvl>
+    <w:lvl w:ilvl="1" w:tentative="1">
+      <w:start w:val="1"/>
+      <w:numFmt w:val="bullet"/>
+      <w:lvlText w:val="o"/>
+      <w:lvlJc w:val="left"/>
+      <w:pPr>
+        <w:tabs>
+          <w:tab w:val="num" w:pos="1440"/>
+        </w:tabs>
+        <w:ind w:left="1440" w:hanging="360"/>
+      </w:pPr>
+      <w:rPr>
+        <w:rFonts w:ascii="Courier New" w:hAnsi="Courier New" w:hint="default"/>
+        <w:sz w:val="20"/>
+      </w:rPr>
+    </w:lvl>
+    <w:lvl w:ilvl="2" w:tentative="1">
+      <w:start w:val="1"/>
+      <w:numFmt w:val="bullet"/>
+      <w:lvlText w:val=""/>
+      <w:lvlJc w:val="left"/>
+      <w:pPr>
+        <w:tabs>
+          <w:tab w:val="num" w:pos="2160"/>
+        </w:tabs>
+        <w:ind w:left="2160" w:hanging="360"/>
+      </w:pPr>
+      <w:rPr>
+        <w:rFonts w:ascii="Wingdings" w:hAnsi="Wingdings" w:hint="default"/>
+        <w:sz w:val="20"/>
+      </w:rPr>
+    </w:lvl>
+    <w:lvl w:ilvl="3" w:tentative="1">
+      <w:start w:val="1"/>
+      <w:numFmt w:val="bullet"/>
+      <w:lvlText w:val=""/>
+      <w:lvlJc w:val="left"/>
+      <w:pPr>
+        <w:tabs>
+          <w:tab w:val="num" w:pos="2880"/>
+        </w:tabs>
+        <w:ind w:left="2880" w:hanging="360"/>
+      </w:pPr>
+      <w:rPr>
+        <w:rFonts w:ascii="Wingdings" w:hAnsi="Wingdings" w:hint="default"/>
+        <w:sz w:val="20"/>
+      </w:rPr>
+    </w:lvl>
+    <w:lvl w:ilvl="4" w:tentative="1">
+      <w:start w:val="1"/>
+      <w:numFmt w:val="bullet"/>
+      <w:lvlText w:val=""/>
+      <w:lvlJc w:val="left"/>
+      <w:pPr>
+        <w:tabs>
+          <w:tab w:val="num" w:pos="3600"/>
+        </w:tabs>
+        <w:ind w:left="3600" w:hanging="360"/>
+      </w:pPr>
+      <w:rPr>
+        <w:rFonts w:ascii="Wingdings" w:hAnsi="Wingdings" w:hint="default"/>
+        <w:sz w:val="20"/>
+      </w:rPr>
+    </w:lvl>
+    <w:lvl w:ilvl="5" w:tentative="1">
+      <w:start w:val="1"/>
+      <w:numFmt w:val="bullet"/>
+      <w:lvlText w:val=""/>
+      <w:lvlJc w:val="left"/>
+      <w:pPr>
+        <w:tabs>
+          <w:tab w:val="num" w:pos="4320"/>
+        </w:tabs>
+        <w:ind w:left="4320" w:hanging="360"/>
+      </w:pPr>
+      <w:rPr>
+        <w:rFonts w:ascii="Wingdings" w:hAnsi="Wingdings" w:hint="default"/>
+        <w:sz w:val="20"/>
+      </w:rPr>
+    </w:lvl>
+    <w:lvl w:ilvl="6" w:tentative="1">
+      <w:start w:val="1"/>
+      <w:numFmt w:val="bullet"/>
+      <w:lvlText w:val=""/>
+      <w:lvlJc w:val="left"/>
+      <w:pPr>
+        <w:tabs>
+          <w:tab w:val="num" w:pos="5040"/>
+        </w:tabs>
+        <w:ind w:left="5040" w:hanging="360"/>
+      </w:pPr>
+      <w:rPr>
+        <w:rFonts w:ascii="Wingdings" w:hAnsi="Wingdings" w:hint="default"/>
+        <w:sz w:val="20"/>
+      </w:rPr>
+    </w:lvl>
+    <w:lvl w:ilvl="7" w:tentative="1">
+      <w:start w:val="1"/>
+      <w:numFmt w:val="bullet"/>
+      <w:lvlText w:val=""/>
+      <w:lvlJc w:val="left"/>
+      <w:pPr>
+        <w:tabs>
+          <w:tab w:val="num" w:pos="5760"/>
+        </w:tabs>
+        <w:ind w:left="5760" w:hanging="360"/>
+      </w:pPr>
+      <w:rPr>
+        <w:rFonts w:ascii="Wingdings" w:hAnsi="Wingdings" w:hint="default"/>
+        <w:sz w:val="20"/>
+      </w:rPr>
+    </w:lvl>
+    <w:lvl w:ilvl="8" w:tentative="1">
+      <w:start w:val="1"/>
+      <w:numFmt w:val="bullet"/>
+      <w:lvlText w:val=""/>
+      <w:lvlJc w:val="left"/>
+      <w:pPr>
+        <w:tabs>
+          <w:tab w:val="num" w:pos="6480"/>
+        </w:tabs>
+        <w:ind w:left="6480" w:hanging="360"/>
+      </w:pPr>
+      <w:rPr>
+        <w:rFonts w:ascii="Wingdings" w:hAnsi="Wingdings" w:hint="default"/>
+        <w:sz w:val="20"/>
+      </w:rPr>
+    </w:lvl>
+  </w:abstractNum>
+  <w:abstractNum w:abstractNumId="5">
     <w:nsid w:val="0FB8304D"/>
     <w:multiLevelType w:val="multilevel"/>
     <w:tmpl w:val="63C624E2"/>
@@ -1125,7 +2339,7 @@
       </w:rPr>
     </w:lvl>
   </w:abstractNum>
-  <w:abstractNum w:abstractNumId="4" w15:restartNumberingAfterBreak="0">
+  <w:abstractNum w:abstractNumId="6">
     <w:nsid w:val="178D1E89"/>
     <w:multiLevelType w:val="multilevel"/>
     <w:tmpl w:val="64A0D09C"/>
@@ -1246,7 +2460,7 @@
       </w:pPr>
     </w:lvl>
   </w:abstractNum>
-  <w:abstractNum w:abstractNumId="5" w15:restartNumberingAfterBreak="0">
+  <w:abstractNum w:abstractNumId="7">
     <w:nsid w:val="215B4E67"/>
     <w:multiLevelType w:val="multilevel"/>
     <w:tmpl w:val="235E4AEA"/>
@@ -1368,7 +2582,305 @@
       </w:rPr>
     </w:lvl>
   </w:abstractNum>
-  <w:abstractNum w:abstractNumId="6" w15:restartNumberingAfterBreak="0">
+  <w:abstractNum w:abstractNumId="8">
+    <w:nsid w:val="25432EBD"/>
+    <w:multiLevelType w:val="multilevel"/>
+    <w:tmpl w:val="A88226A6"/>
+    <w:lvl w:ilvl="0">
+      <w:start w:val="1"/>
+      <w:numFmt w:val="bullet"/>
+      <w:lvlText w:val=""/>
+      <w:lvlJc w:val="left"/>
+      <w:pPr>
+        <w:tabs>
+          <w:tab w:val="num" w:pos="720"/>
+        </w:tabs>
+        <w:ind w:left="720" w:hanging="360"/>
+      </w:pPr>
+      <w:rPr>
+        <w:rFonts w:ascii="Symbol" w:hAnsi="Symbol" w:hint="default"/>
+        <w:sz w:val="20"/>
+      </w:rPr>
+    </w:lvl>
+    <w:lvl w:ilvl="1" w:tentative="1">
+      <w:start w:val="1"/>
+      <w:numFmt w:val="bullet"/>
+      <w:lvlText w:val="o"/>
+      <w:lvlJc w:val="left"/>
+      <w:pPr>
+        <w:tabs>
+          <w:tab w:val="num" w:pos="1440"/>
+        </w:tabs>
+        <w:ind w:left="1440" w:hanging="360"/>
+      </w:pPr>
+      <w:rPr>
+        <w:rFonts w:ascii="Courier New" w:hAnsi="Courier New" w:hint="default"/>
+        <w:sz w:val="20"/>
+      </w:rPr>
+    </w:lvl>
+    <w:lvl w:ilvl="2" w:tentative="1">
+      <w:start w:val="1"/>
+      <w:numFmt w:val="bullet"/>
+      <w:lvlText w:val=""/>
+      <w:lvlJc w:val="left"/>
+      <w:pPr>
+        <w:tabs>
+          <w:tab w:val="num" w:pos="2160"/>
+        </w:tabs>
+        <w:ind w:left="2160" w:hanging="360"/>
+      </w:pPr>
+      <w:rPr>
+        <w:rFonts w:ascii="Wingdings" w:hAnsi="Wingdings" w:hint="default"/>
+        <w:sz w:val="20"/>
+      </w:rPr>
+    </w:lvl>
+    <w:lvl w:ilvl="3" w:tentative="1">
+      <w:start w:val="1"/>
+      <w:numFmt w:val="bullet"/>
+      <w:lvlText w:val=""/>
+      <w:lvlJc w:val="left"/>
+      <w:pPr>
+        <w:tabs>
+          <w:tab w:val="num" w:pos="2880"/>
+        </w:tabs>
+        <w:ind w:left="2880" w:hanging="360"/>
+      </w:pPr>
+      <w:rPr>
+        <w:rFonts w:ascii="Wingdings" w:hAnsi="Wingdings" w:hint="default"/>
+        <w:sz w:val="20"/>
+      </w:rPr>
+    </w:lvl>
+    <w:lvl w:ilvl="4" w:tentative="1">
+      <w:start w:val="1"/>
+      <w:numFmt w:val="bullet"/>
+      <w:lvlText w:val=""/>
+      <w:lvlJc w:val="left"/>
+      <w:pPr>
+        <w:tabs>
+          <w:tab w:val="num" w:pos="3600"/>
+        </w:tabs>
+        <w:ind w:left="3600" w:hanging="360"/>
+      </w:pPr>
+      <w:rPr>
+        <w:rFonts w:ascii="Wingdings" w:hAnsi="Wingdings" w:hint="default"/>
+        <w:sz w:val="20"/>
+      </w:rPr>
+    </w:lvl>
+    <w:lvl w:ilvl="5" w:tentative="1">
+      <w:start w:val="1"/>
+      <w:numFmt w:val="bullet"/>
+      <w:lvlText w:val=""/>
+      <w:lvlJc w:val="left"/>
+      <w:pPr>
+        <w:tabs>
+          <w:tab w:val="num" w:pos="4320"/>
+        </w:tabs>
+        <w:ind w:left="4320" w:hanging="360"/>
+      </w:pPr>
+      <w:rPr>
+        <w:rFonts w:ascii="Wingdings" w:hAnsi="Wingdings" w:hint="default"/>
+        <w:sz w:val="20"/>
+      </w:rPr>
+    </w:lvl>
+    <w:lvl w:ilvl="6" w:tentative="1">
+      <w:start w:val="1"/>
+      <w:numFmt w:val="bullet"/>
+      <w:lvlText w:val=""/>
+      <w:lvlJc w:val="left"/>
+      <w:pPr>
+        <w:tabs>
+          <w:tab w:val="num" w:pos="5040"/>
+        </w:tabs>
+        <w:ind w:left="5040" w:hanging="360"/>
+      </w:pPr>
+      <w:rPr>
+        <w:rFonts w:ascii="Wingdings" w:hAnsi="Wingdings" w:hint="default"/>
+        <w:sz w:val="20"/>
+      </w:rPr>
+    </w:lvl>
+    <w:lvl w:ilvl="7" w:tentative="1">
+      <w:start w:val="1"/>
+      <w:numFmt w:val="bullet"/>
+      <w:lvlText w:val=""/>
+      <w:lvlJc w:val="left"/>
+      <w:pPr>
+        <w:tabs>
+          <w:tab w:val="num" w:pos="5760"/>
+        </w:tabs>
+        <w:ind w:left="5760" w:hanging="360"/>
+      </w:pPr>
+      <w:rPr>
+        <w:rFonts w:ascii="Wingdings" w:hAnsi="Wingdings" w:hint="default"/>
+        <w:sz w:val="20"/>
+      </w:rPr>
+    </w:lvl>
+    <w:lvl w:ilvl="8" w:tentative="1">
+      <w:start w:val="1"/>
+      <w:numFmt w:val="bullet"/>
+      <w:lvlText w:val=""/>
+      <w:lvlJc w:val="left"/>
+      <w:pPr>
+        <w:tabs>
+          <w:tab w:val="num" w:pos="6480"/>
+        </w:tabs>
+        <w:ind w:left="6480" w:hanging="360"/>
+      </w:pPr>
+      <w:rPr>
+        <w:rFonts w:ascii="Wingdings" w:hAnsi="Wingdings" w:hint="default"/>
+        <w:sz w:val="20"/>
+      </w:rPr>
+    </w:lvl>
+  </w:abstractNum>
+  <w:abstractNum w:abstractNumId="9">
+    <w:nsid w:val="2BAB0BF2"/>
+    <w:multiLevelType w:val="multilevel"/>
+    <w:tmpl w:val="C548190E"/>
+    <w:lvl w:ilvl="0">
+      <w:start w:val="1"/>
+      <w:numFmt w:val="bullet"/>
+      <w:lvlText w:val=""/>
+      <w:lvlJc w:val="left"/>
+      <w:pPr>
+        <w:tabs>
+          <w:tab w:val="num" w:pos="720"/>
+        </w:tabs>
+        <w:ind w:left="720" w:hanging="360"/>
+      </w:pPr>
+      <w:rPr>
+        <w:rFonts w:ascii="Symbol" w:hAnsi="Symbol" w:hint="default"/>
+        <w:sz w:val="20"/>
+      </w:rPr>
+    </w:lvl>
+    <w:lvl w:ilvl="1" w:tentative="1">
+      <w:start w:val="1"/>
+      <w:numFmt w:val="bullet"/>
+      <w:lvlText w:val="o"/>
+      <w:lvlJc w:val="left"/>
+      <w:pPr>
+        <w:tabs>
+          <w:tab w:val="num" w:pos="1440"/>
+        </w:tabs>
+        <w:ind w:left="1440" w:hanging="360"/>
+      </w:pPr>
+      <w:rPr>
+        <w:rFonts w:ascii="Courier New" w:hAnsi="Courier New" w:hint="default"/>
+        <w:sz w:val="20"/>
+      </w:rPr>
+    </w:lvl>
+    <w:lvl w:ilvl="2" w:tentative="1">
+      <w:start w:val="1"/>
+      <w:numFmt w:val="bullet"/>
+      <w:lvlText w:val=""/>
+      <w:lvlJc w:val="left"/>
+      <w:pPr>
+        <w:tabs>
+          <w:tab w:val="num" w:pos="2160"/>
+        </w:tabs>
+        <w:ind w:left="2160" w:hanging="360"/>
+      </w:pPr>
+      <w:rPr>
+        <w:rFonts w:ascii="Wingdings" w:hAnsi="Wingdings" w:hint="default"/>
+        <w:sz w:val="20"/>
+      </w:rPr>
+    </w:lvl>
+    <w:lvl w:ilvl="3" w:tentative="1">
+      <w:start w:val="1"/>
+      <w:numFmt w:val="bullet"/>
+      <w:lvlText w:val=""/>
+      <w:lvlJc w:val="left"/>
+      <w:pPr>
+        <w:tabs>
+          <w:tab w:val="num" w:pos="2880"/>
+        </w:tabs>
+        <w:ind w:left="2880" w:hanging="360"/>
+      </w:pPr>
+      <w:rPr>
+        <w:rFonts w:ascii="Wingdings" w:hAnsi="Wingdings" w:hint="default"/>
+        <w:sz w:val="20"/>
+      </w:rPr>
+    </w:lvl>
+    <w:lvl w:ilvl="4" w:tentative="1">
+      <w:start w:val="1"/>
+      <w:numFmt w:val="bullet"/>
+      <w:lvlText w:val=""/>
+      <w:lvlJc w:val="left"/>
+      <w:pPr>
+        <w:tabs>
+          <w:tab w:val="num" w:pos="3600"/>
+        </w:tabs>
+        <w:ind w:left="3600" w:hanging="360"/>
+      </w:pPr>
+      <w:rPr>
+        <w:rFonts w:ascii="Wingdings" w:hAnsi="Wingdings" w:hint="default"/>
+        <w:sz w:val="20"/>
+      </w:rPr>
+    </w:lvl>
+    <w:lvl w:ilvl="5" w:tentative="1">
+      <w:start w:val="1"/>
+      <w:numFmt w:val="bullet"/>
+      <w:lvlText w:val=""/>
+      <w:lvlJc w:val="left"/>
+      <w:pPr>
+        <w:tabs>
+          <w:tab w:val="num" w:pos="4320"/>
+        </w:tabs>
+        <w:ind w:left="4320" w:hanging="360"/>
+      </w:pPr>
+      <w:rPr>
+        <w:rFonts w:ascii="Wingdings" w:hAnsi="Wingdings" w:hint="default"/>
+        <w:sz w:val="20"/>
+      </w:rPr>
+    </w:lvl>
+    <w:lvl w:ilvl="6" w:tentative="1">
+      <w:start w:val="1"/>
+      <w:numFmt w:val="bullet"/>
+      <w:lvlText w:val=""/>
+      <w:lvlJc w:val="left"/>
+      <w:pPr>
+        <w:tabs>
+          <w:tab w:val="num" w:pos="5040"/>
+        </w:tabs>
+        <w:ind w:left="5040" w:hanging="360"/>
+      </w:pPr>
+      <w:rPr>
+        <w:rFonts w:ascii="Wingdings" w:hAnsi="Wingdings" w:hint="default"/>
+        <w:sz w:val="20"/>
+      </w:rPr>
+    </w:lvl>
+    <w:lvl w:ilvl="7" w:tentative="1">
+      <w:start w:val="1"/>
+      <w:numFmt w:val="bullet"/>
+      <w:lvlText w:val=""/>
+      <w:lvlJc w:val="left"/>
+      <w:pPr>
+        <w:tabs>
+          <w:tab w:val="num" w:pos="5760"/>
+        </w:tabs>
+        <w:ind w:left="5760" w:hanging="360"/>
+      </w:pPr>
+      <w:rPr>
+        <w:rFonts w:ascii="Wingdings" w:hAnsi="Wingdings" w:hint="default"/>
+        <w:sz w:val="20"/>
+      </w:rPr>
+    </w:lvl>
+    <w:lvl w:ilvl="8" w:tentative="1">
+      <w:start w:val="1"/>
+      <w:numFmt w:val="bullet"/>
+      <w:lvlText w:val=""/>
+      <w:lvlJc w:val="left"/>
+      <w:pPr>
+        <w:tabs>
+          <w:tab w:val="num" w:pos="6480"/>
+        </w:tabs>
+        <w:ind w:left="6480" w:hanging="360"/>
+      </w:pPr>
+      <w:rPr>
+        <w:rFonts w:ascii="Wingdings" w:hAnsi="Wingdings" w:hint="default"/>
+        <w:sz w:val="20"/>
+      </w:rPr>
+    </w:lvl>
+  </w:abstractNum>
+  <w:abstractNum w:abstractNumId="10">
     <w:nsid w:val="310C5824"/>
     <w:multiLevelType w:val="multilevel"/>
     <w:tmpl w:val="3F1A578A"/>
@@ -1517,7 +3029,543 @@
       </w:rPr>
     </w:lvl>
   </w:abstractNum>
-  <w:abstractNum w:abstractNumId="7" w15:restartNumberingAfterBreak="0">
+  <w:abstractNum w:abstractNumId="11">
+    <w:nsid w:val="33ED51BF"/>
+    <w:multiLevelType w:val="hybridMultilevel"/>
+    <w:tmpl w:val="48901C52"/>
+    <w:lvl w:ilvl="0" w:tplc="0409000F">
+      <w:start w:val="1"/>
+      <w:numFmt w:val="decimal"/>
+      <w:lvlText w:val="%1."/>
+      <w:lvlJc w:val="left"/>
+      <w:pPr>
+        <w:ind w:left="720" w:hanging="360"/>
+      </w:pPr>
+      <w:rPr>
+        <w:rFonts w:hint="default"/>
+      </w:rPr>
+    </w:lvl>
+    <w:lvl w:ilvl="1" w:tplc="04090019" w:tentative="1">
+      <w:start w:val="1"/>
+      <w:numFmt w:val="lowerLetter"/>
+      <w:lvlText w:val="%2."/>
+      <w:lvlJc w:val="left"/>
+      <w:pPr>
+        <w:ind w:left="1440" w:hanging="360"/>
+      </w:pPr>
+    </w:lvl>
+    <w:lvl w:ilvl="2" w:tplc="0409001B" w:tentative="1">
+      <w:start w:val="1"/>
+      <w:numFmt w:val="lowerRoman"/>
+      <w:lvlText w:val="%3."/>
+      <w:lvlJc w:val="right"/>
+      <w:pPr>
+        <w:ind w:left="2160" w:hanging="180"/>
+      </w:pPr>
+    </w:lvl>
+    <w:lvl w:ilvl="3" w:tplc="0409000F" w:tentative="1">
+      <w:start w:val="1"/>
+      <w:numFmt w:val="decimal"/>
+      <w:lvlText w:val="%4."/>
+      <w:lvlJc w:val="left"/>
+      <w:pPr>
+        <w:ind w:left="2880" w:hanging="360"/>
+      </w:pPr>
+    </w:lvl>
+    <w:lvl w:ilvl="4" w:tplc="04090019" w:tentative="1">
+      <w:start w:val="1"/>
+      <w:numFmt w:val="lowerLetter"/>
+      <w:lvlText w:val="%5."/>
+      <w:lvlJc w:val="left"/>
+      <w:pPr>
+        <w:ind w:left="3600" w:hanging="360"/>
+      </w:pPr>
+    </w:lvl>
+    <w:lvl w:ilvl="5" w:tplc="0409001B" w:tentative="1">
+      <w:start w:val="1"/>
+      <w:numFmt w:val="lowerRoman"/>
+      <w:lvlText w:val="%6."/>
+      <w:lvlJc w:val="right"/>
+      <w:pPr>
+        <w:ind w:left="4320" w:hanging="180"/>
+      </w:pPr>
+    </w:lvl>
+    <w:lvl w:ilvl="6" w:tplc="0409000F" w:tentative="1">
+      <w:start w:val="1"/>
+      <w:numFmt w:val="decimal"/>
+      <w:lvlText w:val="%7."/>
+      <w:lvlJc w:val="left"/>
+      <w:pPr>
+        <w:ind w:left="5040" w:hanging="360"/>
+      </w:pPr>
+    </w:lvl>
+    <w:lvl w:ilvl="7" w:tplc="04090019" w:tentative="1">
+      <w:start w:val="1"/>
+      <w:numFmt w:val="lowerLetter"/>
+      <w:lvlText w:val="%8."/>
+      <w:lvlJc w:val="left"/>
+      <w:pPr>
+        <w:ind w:left="5760" w:hanging="360"/>
+      </w:pPr>
+    </w:lvl>
+    <w:lvl w:ilvl="8" w:tplc="0409001B" w:tentative="1">
+      <w:start w:val="1"/>
+      <w:numFmt w:val="lowerRoman"/>
+      <w:lvlText w:val="%9."/>
+      <w:lvlJc w:val="right"/>
+      <w:pPr>
+        <w:ind w:left="6480" w:hanging="180"/>
+      </w:pPr>
+    </w:lvl>
+  </w:abstractNum>
+  <w:abstractNum w:abstractNumId="12">
+    <w:nsid w:val="387C27BB"/>
+    <w:multiLevelType w:val="multilevel"/>
+    <w:tmpl w:val="D81EA4A6"/>
+    <w:lvl w:ilvl="0">
+      <w:start w:val="1"/>
+      <w:numFmt w:val="bullet"/>
+      <w:lvlText w:val=""/>
+      <w:lvlJc w:val="left"/>
+      <w:pPr>
+        <w:tabs>
+          <w:tab w:val="num" w:pos="720"/>
+        </w:tabs>
+        <w:ind w:left="720" w:hanging="360"/>
+      </w:pPr>
+      <w:rPr>
+        <w:rFonts w:ascii="Symbol" w:hAnsi="Symbol" w:hint="default"/>
+        <w:sz w:val="20"/>
+      </w:rPr>
+    </w:lvl>
+    <w:lvl w:ilvl="1" w:tentative="1">
+      <w:start w:val="1"/>
+      <w:numFmt w:val="bullet"/>
+      <w:lvlText w:val="o"/>
+      <w:lvlJc w:val="left"/>
+      <w:pPr>
+        <w:tabs>
+          <w:tab w:val="num" w:pos="1440"/>
+        </w:tabs>
+        <w:ind w:left="1440" w:hanging="360"/>
+      </w:pPr>
+      <w:rPr>
+        <w:rFonts w:ascii="Courier New" w:hAnsi="Courier New" w:hint="default"/>
+        <w:sz w:val="20"/>
+      </w:rPr>
+    </w:lvl>
+    <w:lvl w:ilvl="2" w:tentative="1">
+      <w:start w:val="1"/>
+      <w:numFmt w:val="bullet"/>
+      <w:lvlText w:val=""/>
+      <w:lvlJc w:val="left"/>
+      <w:pPr>
+        <w:tabs>
+          <w:tab w:val="num" w:pos="2160"/>
+        </w:tabs>
+        <w:ind w:left="2160" w:hanging="360"/>
+      </w:pPr>
+      <w:rPr>
+        <w:rFonts w:ascii="Wingdings" w:hAnsi="Wingdings" w:hint="default"/>
+        <w:sz w:val="20"/>
+      </w:rPr>
+    </w:lvl>
+    <w:lvl w:ilvl="3" w:tentative="1">
+      <w:start w:val="1"/>
+      <w:numFmt w:val="bullet"/>
+      <w:lvlText w:val=""/>
+      <w:lvlJc w:val="left"/>
+      <w:pPr>
+        <w:tabs>
+          <w:tab w:val="num" w:pos="2880"/>
+        </w:tabs>
+        <w:ind w:left="2880" w:hanging="360"/>
+      </w:pPr>
+      <w:rPr>
+        <w:rFonts w:ascii="Wingdings" w:hAnsi="Wingdings" w:hint="default"/>
+        <w:sz w:val="20"/>
+      </w:rPr>
+    </w:lvl>
+    <w:lvl w:ilvl="4" w:tentative="1">
+      <w:start w:val="1"/>
+      <w:numFmt w:val="bullet"/>
+      <w:lvlText w:val=""/>
+      <w:lvlJc w:val="left"/>
+      <w:pPr>
+        <w:tabs>
+          <w:tab w:val="num" w:pos="3600"/>
+        </w:tabs>
+        <w:ind w:left="3600" w:hanging="360"/>
+      </w:pPr>
+      <w:rPr>
+        <w:rFonts w:ascii="Wingdings" w:hAnsi="Wingdings" w:hint="default"/>
+        <w:sz w:val="20"/>
+      </w:rPr>
+    </w:lvl>
+    <w:lvl w:ilvl="5" w:tentative="1">
+      <w:start w:val="1"/>
+      <w:numFmt w:val="bullet"/>
+      <w:lvlText w:val=""/>
+      <w:lvlJc w:val="left"/>
+      <w:pPr>
+        <w:tabs>
+          <w:tab w:val="num" w:pos="4320"/>
+        </w:tabs>
+        <w:ind w:left="4320" w:hanging="360"/>
+      </w:pPr>
+      <w:rPr>
+        <w:rFonts w:ascii="Wingdings" w:hAnsi="Wingdings" w:hint="default"/>
+        <w:sz w:val="20"/>
+      </w:rPr>
+    </w:lvl>
+    <w:lvl w:ilvl="6" w:tentative="1">
+      <w:start w:val="1"/>
+      <w:numFmt w:val="bullet"/>
+      <w:lvlText w:val=""/>
+      <w:lvlJc w:val="left"/>
+      <w:pPr>
+        <w:tabs>
+          <w:tab w:val="num" w:pos="5040"/>
+        </w:tabs>
+        <w:ind w:left="5040" w:hanging="360"/>
+      </w:pPr>
+      <w:rPr>
+        <w:rFonts w:ascii="Wingdings" w:hAnsi="Wingdings" w:hint="default"/>
+        <w:sz w:val="20"/>
+      </w:rPr>
+    </w:lvl>
+    <w:lvl w:ilvl="7" w:tentative="1">
+      <w:start w:val="1"/>
+      <w:numFmt w:val="bullet"/>
+      <w:lvlText w:val=""/>
+      <w:lvlJc w:val="left"/>
+      <w:pPr>
+        <w:tabs>
+          <w:tab w:val="num" w:pos="5760"/>
+        </w:tabs>
+        <w:ind w:left="5760" w:hanging="360"/>
+      </w:pPr>
+      <w:rPr>
+        <w:rFonts w:ascii="Wingdings" w:hAnsi="Wingdings" w:hint="default"/>
+        <w:sz w:val="20"/>
+      </w:rPr>
+    </w:lvl>
+    <w:lvl w:ilvl="8" w:tentative="1">
+      <w:start w:val="1"/>
+      <w:numFmt w:val="bullet"/>
+      <w:lvlText w:val=""/>
+      <w:lvlJc w:val="left"/>
+      <w:pPr>
+        <w:tabs>
+          <w:tab w:val="num" w:pos="6480"/>
+        </w:tabs>
+        <w:ind w:left="6480" w:hanging="360"/>
+      </w:pPr>
+      <w:rPr>
+        <w:rFonts w:ascii="Wingdings" w:hAnsi="Wingdings" w:hint="default"/>
+        <w:sz w:val="20"/>
+      </w:rPr>
+    </w:lvl>
+  </w:abstractNum>
+  <w:abstractNum w:abstractNumId="13">
+    <w:nsid w:val="445C3565"/>
+    <w:multiLevelType w:val="multilevel"/>
+    <w:tmpl w:val="5CB04B10"/>
+    <w:lvl w:ilvl="0">
+      <w:start w:val="1"/>
+      <w:numFmt w:val="bullet"/>
+      <w:lvlText w:val=""/>
+      <w:lvlJc w:val="left"/>
+      <w:pPr>
+        <w:tabs>
+          <w:tab w:val="num" w:pos="720"/>
+        </w:tabs>
+        <w:ind w:left="720" w:hanging="360"/>
+      </w:pPr>
+      <w:rPr>
+        <w:rFonts w:ascii="Symbol" w:hAnsi="Symbol" w:hint="default"/>
+        <w:sz w:val="20"/>
+      </w:rPr>
+    </w:lvl>
+    <w:lvl w:ilvl="1" w:tentative="1">
+      <w:start w:val="1"/>
+      <w:numFmt w:val="bullet"/>
+      <w:lvlText w:val="o"/>
+      <w:lvlJc w:val="left"/>
+      <w:pPr>
+        <w:tabs>
+          <w:tab w:val="num" w:pos="1440"/>
+        </w:tabs>
+        <w:ind w:left="1440" w:hanging="360"/>
+      </w:pPr>
+      <w:rPr>
+        <w:rFonts w:ascii="Courier New" w:hAnsi="Courier New" w:hint="default"/>
+        <w:sz w:val="20"/>
+      </w:rPr>
+    </w:lvl>
+    <w:lvl w:ilvl="2" w:tentative="1">
+      <w:start w:val="1"/>
+      <w:numFmt w:val="bullet"/>
+      <w:lvlText w:val=""/>
+      <w:lvlJc w:val="left"/>
+      <w:pPr>
+        <w:tabs>
+          <w:tab w:val="num" w:pos="2160"/>
+        </w:tabs>
+        <w:ind w:left="2160" w:hanging="360"/>
+      </w:pPr>
+      <w:rPr>
+        <w:rFonts w:ascii="Wingdings" w:hAnsi="Wingdings" w:hint="default"/>
+        <w:sz w:val="20"/>
+      </w:rPr>
+    </w:lvl>
+    <w:lvl w:ilvl="3" w:tentative="1">
+      <w:start w:val="1"/>
+      <w:numFmt w:val="bullet"/>
+      <w:lvlText w:val=""/>
+      <w:lvlJc w:val="left"/>
+      <w:pPr>
+        <w:tabs>
+          <w:tab w:val="num" w:pos="2880"/>
+        </w:tabs>
+        <w:ind w:left="2880" w:hanging="360"/>
+      </w:pPr>
+      <w:rPr>
+        <w:rFonts w:ascii="Wingdings" w:hAnsi="Wingdings" w:hint="default"/>
+        <w:sz w:val="20"/>
+      </w:rPr>
+    </w:lvl>
+    <w:lvl w:ilvl="4" w:tentative="1">
+      <w:start w:val="1"/>
+      <w:numFmt w:val="bullet"/>
+      <w:lvlText w:val=""/>
+      <w:lvlJc w:val="left"/>
+      <w:pPr>
+        <w:tabs>
+          <w:tab w:val="num" w:pos="3600"/>
+        </w:tabs>
+        <w:ind w:left="3600" w:hanging="360"/>
+      </w:pPr>
+      <w:rPr>
+        <w:rFonts w:ascii="Wingdings" w:hAnsi="Wingdings" w:hint="default"/>
+        <w:sz w:val="20"/>
+      </w:rPr>
+    </w:lvl>
+    <w:lvl w:ilvl="5" w:tentative="1">
+      <w:start w:val="1"/>
+      <w:numFmt w:val="bullet"/>
+      <w:lvlText w:val=""/>
+      <w:lvlJc w:val="left"/>
+      <w:pPr>
+        <w:tabs>
+          <w:tab w:val="num" w:pos="4320"/>
+        </w:tabs>
+        <w:ind w:left="4320" w:hanging="360"/>
+      </w:pPr>
+      <w:rPr>
+        <w:rFonts w:ascii="Wingdings" w:hAnsi="Wingdings" w:hint="default"/>
+        <w:sz w:val="20"/>
+      </w:rPr>
+    </w:lvl>
+    <w:lvl w:ilvl="6" w:tentative="1">
+      <w:start w:val="1"/>
+      <w:numFmt w:val="bullet"/>
+      <w:lvlText w:val=""/>
+      <w:lvlJc w:val="left"/>
+      <w:pPr>
+        <w:tabs>
+          <w:tab w:val="num" w:pos="5040"/>
+        </w:tabs>
+        <w:ind w:left="5040" w:hanging="360"/>
+      </w:pPr>
+      <w:rPr>
+        <w:rFonts w:ascii="Wingdings" w:hAnsi="Wingdings" w:hint="default"/>
+        <w:sz w:val="20"/>
+      </w:rPr>
+    </w:lvl>
+    <w:lvl w:ilvl="7" w:tentative="1">
+      <w:start w:val="1"/>
+      <w:numFmt w:val="bullet"/>
+      <w:lvlText w:val=""/>
+      <w:lvlJc w:val="left"/>
+      <w:pPr>
+        <w:tabs>
+          <w:tab w:val="num" w:pos="5760"/>
+        </w:tabs>
+        <w:ind w:left="5760" w:hanging="360"/>
+      </w:pPr>
+      <w:rPr>
+        <w:rFonts w:ascii="Wingdings" w:hAnsi="Wingdings" w:hint="default"/>
+        <w:sz w:val="20"/>
+      </w:rPr>
+    </w:lvl>
+    <w:lvl w:ilvl="8" w:tentative="1">
+      <w:start w:val="1"/>
+      <w:numFmt w:val="bullet"/>
+      <w:lvlText w:val=""/>
+      <w:lvlJc w:val="left"/>
+      <w:pPr>
+        <w:tabs>
+          <w:tab w:val="num" w:pos="6480"/>
+        </w:tabs>
+        <w:ind w:left="6480" w:hanging="360"/>
+      </w:pPr>
+      <w:rPr>
+        <w:rFonts w:ascii="Wingdings" w:hAnsi="Wingdings" w:hint="default"/>
+        <w:sz w:val="20"/>
+      </w:rPr>
+    </w:lvl>
+  </w:abstractNum>
+  <w:abstractNum w:abstractNumId="14">
+    <w:nsid w:val="46D77447"/>
+    <w:multiLevelType w:val="multilevel"/>
+    <w:tmpl w:val="177E9CD4"/>
+    <w:lvl w:ilvl="0">
+      <w:start w:val="1"/>
+      <w:numFmt w:val="bullet"/>
+      <w:lvlText w:val=""/>
+      <w:lvlJc w:val="left"/>
+      <w:pPr>
+        <w:tabs>
+          <w:tab w:val="num" w:pos="720"/>
+        </w:tabs>
+        <w:ind w:left="720" w:hanging="360"/>
+      </w:pPr>
+      <w:rPr>
+        <w:rFonts w:ascii="Symbol" w:hAnsi="Symbol" w:hint="default"/>
+        <w:sz w:val="20"/>
+      </w:rPr>
+    </w:lvl>
+    <w:lvl w:ilvl="1" w:tentative="1">
+      <w:start w:val="1"/>
+      <w:numFmt w:val="bullet"/>
+      <w:lvlText w:val="o"/>
+      <w:lvlJc w:val="left"/>
+      <w:pPr>
+        <w:tabs>
+          <w:tab w:val="num" w:pos="1440"/>
+        </w:tabs>
+        <w:ind w:left="1440" w:hanging="360"/>
+      </w:pPr>
+      <w:rPr>
+        <w:rFonts w:ascii="Courier New" w:hAnsi="Courier New" w:hint="default"/>
+        <w:sz w:val="20"/>
+      </w:rPr>
+    </w:lvl>
+    <w:lvl w:ilvl="2" w:tentative="1">
+      <w:start w:val="1"/>
+      <w:numFmt w:val="bullet"/>
+      <w:lvlText w:val=""/>
+      <w:lvlJc w:val="left"/>
+      <w:pPr>
+        <w:tabs>
+          <w:tab w:val="num" w:pos="2160"/>
+        </w:tabs>
+        <w:ind w:left="2160" w:hanging="360"/>
+      </w:pPr>
+      <w:rPr>
+        <w:rFonts w:ascii="Wingdings" w:hAnsi="Wingdings" w:hint="default"/>
+        <w:sz w:val="20"/>
+      </w:rPr>
+    </w:lvl>
+    <w:lvl w:ilvl="3" w:tentative="1">
+      <w:start w:val="1"/>
+      <w:numFmt w:val="bullet"/>
+      <w:lvlText w:val=""/>
+      <w:lvlJc w:val="left"/>
+      <w:pPr>
+        <w:tabs>
+          <w:tab w:val="num" w:pos="2880"/>
+        </w:tabs>
+        <w:ind w:left="2880" w:hanging="360"/>
+      </w:pPr>
+      <w:rPr>
+        <w:rFonts w:ascii="Wingdings" w:hAnsi="Wingdings" w:hint="default"/>
+        <w:sz w:val="20"/>
+      </w:rPr>
+    </w:lvl>
+    <w:lvl w:ilvl="4" w:tentative="1">
+      <w:start w:val="1"/>
+      <w:numFmt w:val="bullet"/>
+      <w:lvlText w:val=""/>
+      <w:lvlJc w:val="left"/>
+      <w:pPr>
+        <w:tabs>
+          <w:tab w:val="num" w:pos="3600"/>
+        </w:tabs>
+        <w:ind w:left="3600" w:hanging="360"/>
+      </w:pPr>
+      <w:rPr>
+        <w:rFonts w:ascii="Wingdings" w:hAnsi="Wingdings" w:hint="default"/>
+        <w:sz w:val="20"/>
+      </w:rPr>
+    </w:lvl>
+    <w:lvl w:ilvl="5" w:tentative="1">
+      <w:start w:val="1"/>
+      <w:numFmt w:val="bullet"/>
+      <w:lvlText w:val=""/>
+      <w:lvlJc w:val="left"/>
+      <w:pPr>
+        <w:tabs>
+          <w:tab w:val="num" w:pos="4320"/>
+        </w:tabs>
+        <w:ind w:left="4320" w:hanging="360"/>
+      </w:pPr>
+      <w:rPr>
+        <w:rFonts w:ascii="Wingdings" w:hAnsi="Wingdings" w:hint="default"/>
+        <w:sz w:val="20"/>
+      </w:rPr>
+    </w:lvl>
+    <w:lvl w:ilvl="6" w:tentative="1">
+      <w:start w:val="1"/>
+      <w:numFmt w:val="bullet"/>
+      <w:lvlText w:val=""/>
+      <w:lvlJc w:val="left"/>
+      <w:pPr>
+        <w:tabs>
+          <w:tab w:val="num" w:pos="5040"/>
+        </w:tabs>
+        <w:ind w:left="5040" w:hanging="360"/>
+      </w:pPr>
+      <w:rPr>
+        <w:rFonts w:ascii="Wingdings" w:hAnsi="Wingdings" w:hint="default"/>
+        <w:sz w:val="20"/>
+      </w:rPr>
+    </w:lvl>
+    <w:lvl w:ilvl="7" w:tentative="1">
+      <w:start w:val="1"/>
+      <w:numFmt w:val="bullet"/>
+      <w:lvlText w:val=""/>
+      <w:lvlJc w:val="left"/>
+      <w:pPr>
+        <w:tabs>
+          <w:tab w:val="num" w:pos="5760"/>
+        </w:tabs>
+        <w:ind w:left="5760" w:hanging="360"/>
+      </w:pPr>
+      <w:rPr>
+        <w:rFonts w:ascii="Wingdings" w:hAnsi="Wingdings" w:hint="default"/>
+        <w:sz w:val="20"/>
+      </w:rPr>
+    </w:lvl>
+    <w:lvl w:ilvl="8" w:tentative="1">
+      <w:start w:val="1"/>
+      <w:numFmt w:val="bullet"/>
+      <w:lvlText w:val=""/>
+      <w:lvlJc w:val="left"/>
+      <w:pPr>
+        <w:tabs>
+          <w:tab w:val="num" w:pos="6480"/>
+        </w:tabs>
+        <w:ind w:left="6480" w:hanging="360"/>
+      </w:pPr>
+      <w:rPr>
+        <w:rFonts w:ascii="Wingdings" w:hAnsi="Wingdings" w:hint="default"/>
+        <w:sz w:val="20"/>
+      </w:rPr>
+    </w:lvl>
+  </w:abstractNum>
+  <w:abstractNum w:abstractNumId="15">
     <w:nsid w:val="57ED770E"/>
     <w:multiLevelType w:val="multilevel"/>
     <w:tmpl w:val="278C8B90"/>
@@ -1666,7 +3714,156 @@
       </w:rPr>
     </w:lvl>
   </w:abstractNum>
-  <w:abstractNum w:abstractNumId="8" w15:restartNumberingAfterBreak="0">
+  <w:abstractNum w:abstractNumId="16">
+    <w:nsid w:val="5F0625A8"/>
+    <w:multiLevelType w:val="multilevel"/>
+    <w:tmpl w:val="CE42726E"/>
+    <w:lvl w:ilvl="0">
+      <w:start w:val="1"/>
+      <w:numFmt w:val="bullet"/>
+      <w:lvlText w:val=""/>
+      <w:lvlJc w:val="left"/>
+      <w:pPr>
+        <w:tabs>
+          <w:tab w:val="num" w:pos="720"/>
+        </w:tabs>
+        <w:ind w:left="720" w:hanging="360"/>
+      </w:pPr>
+      <w:rPr>
+        <w:rFonts w:ascii="Symbol" w:hAnsi="Symbol" w:hint="default"/>
+        <w:sz w:val="20"/>
+      </w:rPr>
+    </w:lvl>
+    <w:lvl w:ilvl="1" w:tentative="1">
+      <w:start w:val="1"/>
+      <w:numFmt w:val="bullet"/>
+      <w:lvlText w:val="o"/>
+      <w:lvlJc w:val="left"/>
+      <w:pPr>
+        <w:tabs>
+          <w:tab w:val="num" w:pos="1440"/>
+        </w:tabs>
+        <w:ind w:left="1440" w:hanging="360"/>
+      </w:pPr>
+      <w:rPr>
+        <w:rFonts w:ascii="Courier New" w:hAnsi="Courier New" w:hint="default"/>
+        <w:sz w:val="20"/>
+      </w:rPr>
+    </w:lvl>
+    <w:lvl w:ilvl="2" w:tentative="1">
+      <w:start w:val="1"/>
+      <w:numFmt w:val="bullet"/>
+      <w:lvlText w:val=""/>
+      <w:lvlJc w:val="left"/>
+      <w:pPr>
+        <w:tabs>
+          <w:tab w:val="num" w:pos="2160"/>
+        </w:tabs>
+        <w:ind w:left="2160" w:hanging="360"/>
+      </w:pPr>
+      <w:rPr>
+        <w:rFonts w:ascii="Wingdings" w:hAnsi="Wingdings" w:hint="default"/>
+        <w:sz w:val="20"/>
+      </w:rPr>
+    </w:lvl>
+    <w:lvl w:ilvl="3" w:tentative="1">
+      <w:start w:val="1"/>
+      <w:numFmt w:val="bullet"/>
+      <w:lvlText w:val=""/>
+      <w:lvlJc w:val="left"/>
+      <w:pPr>
+        <w:tabs>
+          <w:tab w:val="num" w:pos="2880"/>
+        </w:tabs>
+        <w:ind w:left="2880" w:hanging="360"/>
+      </w:pPr>
+      <w:rPr>
+        <w:rFonts w:ascii="Wingdings" w:hAnsi="Wingdings" w:hint="default"/>
+        <w:sz w:val="20"/>
+      </w:rPr>
+    </w:lvl>
+    <w:lvl w:ilvl="4" w:tentative="1">
+      <w:start w:val="1"/>
+      <w:numFmt w:val="bullet"/>
+      <w:lvlText w:val=""/>
+      <w:lvlJc w:val="left"/>
+      <w:pPr>
+        <w:tabs>
+          <w:tab w:val="num" w:pos="3600"/>
+        </w:tabs>
+        <w:ind w:left="3600" w:hanging="360"/>
+      </w:pPr>
+      <w:rPr>
+        <w:rFonts w:ascii="Wingdings" w:hAnsi="Wingdings" w:hint="default"/>
+        <w:sz w:val="20"/>
+      </w:rPr>
+    </w:lvl>
+    <w:lvl w:ilvl="5" w:tentative="1">
+      <w:start w:val="1"/>
+      <w:numFmt w:val="bullet"/>
+      <w:lvlText w:val=""/>
+      <w:lvlJc w:val="left"/>
+      <w:pPr>
+        <w:tabs>
+          <w:tab w:val="num" w:pos="4320"/>
+        </w:tabs>
+        <w:ind w:left="4320" w:hanging="360"/>
+      </w:pPr>
+      <w:rPr>
+        <w:rFonts w:ascii="Wingdings" w:hAnsi="Wingdings" w:hint="default"/>
+        <w:sz w:val="20"/>
+      </w:rPr>
+    </w:lvl>
+    <w:lvl w:ilvl="6" w:tentative="1">
+      <w:start w:val="1"/>
+      <w:numFmt w:val="bullet"/>
+      <w:lvlText w:val=""/>
+      <w:lvlJc w:val="left"/>
+      <w:pPr>
+        <w:tabs>
+          <w:tab w:val="num" w:pos="5040"/>
+        </w:tabs>
+        <w:ind w:left="5040" w:hanging="360"/>
+      </w:pPr>
+      <w:rPr>
+        <w:rFonts w:ascii="Wingdings" w:hAnsi="Wingdings" w:hint="default"/>
+        <w:sz w:val="20"/>
+      </w:rPr>
+    </w:lvl>
+    <w:lvl w:ilvl="7" w:tentative="1">
+      <w:start w:val="1"/>
+      <w:numFmt w:val="bullet"/>
+      <w:lvlText w:val=""/>
+      <w:lvlJc w:val="left"/>
+      <w:pPr>
+        <w:tabs>
+          <w:tab w:val="num" w:pos="5760"/>
+        </w:tabs>
+        <w:ind w:left="5760" w:hanging="360"/>
+      </w:pPr>
+      <w:rPr>
+        <w:rFonts w:ascii="Wingdings" w:hAnsi="Wingdings" w:hint="default"/>
+        <w:sz w:val="20"/>
+      </w:rPr>
+    </w:lvl>
+    <w:lvl w:ilvl="8" w:tentative="1">
+      <w:start w:val="1"/>
+      <w:numFmt w:val="bullet"/>
+      <w:lvlText w:val=""/>
+      <w:lvlJc w:val="left"/>
+      <w:pPr>
+        <w:tabs>
+          <w:tab w:val="num" w:pos="6480"/>
+        </w:tabs>
+        <w:ind w:left="6480" w:hanging="360"/>
+      </w:pPr>
+      <w:rPr>
+        <w:rFonts w:ascii="Wingdings" w:hAnsi="Wingdings" w:hint="default"/>
+        <w:sz w:val="20"/>
+      </w:rPr>
+    </w:lvl>
+  </w:abstractNum>
+  <w:abstractNum w:abstractNumId="17">
     <w:nsid w:val="6C791F12"/>
     <w:multiLevelType w:val="multilevel"/>
     <w:tmpl w:val="70945560"/>
@@ -1815,7 +4012,7 @@
       </w:rPr>
     </w:lvl>
   </w:abstractNum>
-  <w:abstractNum w:abstractNumId="9" w15:restartNumberingAfterBreak="0">
+  <w:abstractNum w:abstractNumId="18">
     <w:nsid w:val="6D726BB4"/>
     <w:multiLevelType w:val="multilevel"/>
     <w:tmpl w:val="42842DFA"/>
@@ -1964,7 +4161,156 @@
       </w:rPr>
     </w:lvl>
   </w:abstractNum>
-  <w:abstractNum w:abstractNumId="10" w15:restartNumberingAfterBreak="0">
+  <w:abstractNum w:abstractNumId="19">
+    <w:nsid w:val="6FA44483"/>
+    <w:multiLevelType w:val="multilevel"/>
+    <w:tmpl w:val="39E8C2C8"/>
+    <w:lvl w:ilvl="0">
+      <w:start w:val="1"/>
+      <w:numFmt w:val="bullet"/>
+      <w:lvlText w:val=""/>
+      <w:lvlJc w:val="left"/>
+      <w:pPr>
+        <w:tabs>
+          <w:tab w:val="num" w:pos="720"/>
+        </w:tabs>
+        <w:ind w:left="720" w:hanging="360"/>
+      </w:pPr>
+      <w:rPr>
+        <w:rFonts w:ascii="Symbol" w:hAnsi="Symbol" w:hint="default"/>
+        <w:sz w:val="20"/>
+      </w:rPr>
+    </w:lvl>
+    <w:lvl w:ilvl="1" w:tentative="1">
+      <w:start w:val="1"/>
+      <w:numFmt w:val="bullet"/>
+      <w:lvlText w:val="o"/>
+      <w:lvlJc w:val="left"/>
+      <w:pPr>
+        <w:tabs>
+          <w:tab w:val="num" w:pos="1440"/>
+        </w:tabs>
+        <w:ind w:left="1440" w:hanging="360"/>
+      </w:pPr>
+      <w:rPr>
+        <w:rFonts w:ascii="Courier New" w:hAnsi="Courier New" w:hint="default"/>
+        <w:sz w:val="20"/>
+      </w:rPr>
+    </w:lvl>
+    <w:lvl w:ilvl="2" w:tentative="1">
+      <w:start w:val="1"/>
+      <w:numFmt w:val="bullet"/>
+      <w:lvlText w:val=""/>
+      <w:lvlJc w:val="left"/>
+      <w:pPr>
+        <w:tabs>
+          <w:tab w:val="num" w:pos="2160"/>
+        </w:tabs>
+        <w:ind w:left="2160" w:hanging="360"/>
+      </w:pPr>
+      <w:rPr>
+        <w:rFonts w:ascii="Wingdings" w:hAnsi="Wingdings" w:hint="default"/>
+        <w:sz w:val="20"/>
+      </w:rPr>
+    </w:lvl>
+    <w:lvl w:ilvl="3" w:tentative="1">
+      <w:start w:val="1"/>
+      <w:numFmt w:val="bullet"/>
+      <w:lvlText w:val=""/>
+      <w:lvlJc w:val="left"/>
+      <w:pPr>
+        <w:tabs>
+          <w:tab w:val="num" w:pos="2880"/>
+        </w:tabs>
+        <w:ind w:left="2880" w:hanging="360"/>
+      </w:pPr>
+      <w:rPr>
+        <w:rFonts w:ascii="Wingdings" w:hAnsi="Wingdings" w:hint="default"/>
+        <w:sz w:val="20"/>
+      </w:rPr>
+    </w:lvl>
+    <w:lvl w:ilvl="4" w:tentative="1">
+      <w:start w:val="1"/>
+      <w:numFmt w:val="bullet"/>
+      <w:lvlText w:val=""/>
+      <w:lvlJc w:val="left"/>
+      <w:pPr>
+        <w:tabs>
+          <w:tab w:val="num" w:pos="3600"/>
+        </w:tabs>
+        <w:ind w:left="3600" w:hanging="360"/>
+      </w:pPr>
+      <w:rPr>
+        <w:rFonts w:ascii="Wingdings" w:hAnsi="Wingdings" w:hint="default"/>
+        <w:sz w:val="20"/>
+      </w:rPr>
+    </w:lvl>
+    <w:lvl w:ilvl="5" w:tentative="1">
+      <w:start w:val="1"/>
+      <w:numFmt w:val="bullet"/>
+      <w:lvlText w:val=""/>
+      <w:lvlJc w:val="left"/>
+      <w:pPr>
+        <w:tabs>
+          <w:tab w:val="num" w:pos="4320"/>
+        </w:tabs>
+        <w:ind w:left="4320" w:hanging="360"/>
+      </w:pPr>
+      <w:rPr>
+        <w:rFonts w:ascii="Wingdings" w:hAnsi="Wingdings" w:hint="default"/>
+        <w:sz w:val="20"/>
+      </w:rPr>
+    </w:lvl>
+    <w:lvl w:ilvl="6" w:tentative="1">
+      <w:start w:val="1"/>
+      <w:numFmt w:val="bullet"/>
+      <w:lvlText w:val=""/>
+      <w:lvlJc w:val="left"/>
+      <w:pPr>
+        <w:tabs>
+          <w:tab w:val="num" w:pos="5040"/>
+        </w:tabs>
+        <w:ind w:left="5040" w:hanging="360"/>
+      </w:pPr>
+      <w:rPr>
+        <w:rFonts w:ascii="Wingdings" w:hAnsi="Wingdings" w:hint="default"/>
+        <w:sz w:val="20"/>
+      </w:rPr>
+    </w:lvl>
+    <w:lvl w:ilvl="7" w:tentative="1">
+      <w:start w:val="1"/>
+      <w:numFmt w:val="bullet"/>
+      <w:lvlText w:val=""/>
+      <w:lvlJc w:val="left"/>
+      <w:pPr>
+        <w:tabs>
+          <w:tab w:val="num" w:pos="5760"/>
+        </w:tabs>
+        <w:ind w:left="5760" w:hanging="360"/>
+      </w:pPr>
+      <w:rPr>
+        <w:rFonts w:ascii="Wingdings" w:hAnsi="Wingdings" w:hint="default"/>
+        <w:sz w:val="20"/>
+      </w:rPr>
+    </w:lvl>
+    <w:lvl w:ilvl="8" w:tentative="1">
+      <w:start w:val="1"/>
+      <w:numFmt w:val="bullet"/>
+      <w:lvlText w:val=""/>
+      <w:lvlJc w:val="left"/>
+      <w:pPr>
+        <w:tabs>
+          <w:tab w:val="num" w:pos="6480"/>
+        </w:tabs>
+        <w:ind w:left="6480" w:hanging="360"/>
+      </w:pPr>
+      <w:rPr>
+        <w:rFonts w:ascii="Wingdings" w:hAnsi="Wingdings" w:hint="default"/>
+        <w:sz w:val="20"/>
+      </w:rPr>
+    </w:lvl>
+  </w:abstractNum>
+  <w:abstractNum w:abstractNumId="20">
     <w:nsid w:val="6FF2749B"/>
     <w:multiLevelType w:val="multilevel"/>
     <w:tmpl w:val="811689B8"/>
@@ -2085,44 +4431,226 @@
       </w:pPr>
     </w:lvl>
   </w:abstractNum>
-  <w:num w:numId="1" w16cid:durableId="2054035871">
+  <w:abstractNum w:abstractNumId="21">
+    <w:nsid w:val="77AC5D83"/>
+    <w:multiLevelType w:val="multilevel"/>
+    <w:tmpl w:val="6BB2F0C6"/>
+    <w:lvl w:ilvl="0">
+      <w:start w:val="1"/>
+      <w:numFmt w:val="bullet"/>
+      <w:lvlText w:val=""/>
+      <w:lvlJc w:val="left"/>
+      <w:pPr>
+        <w:tabs>
+          <w:tab w:val="num" w:pos="720"/>
+        </w:tabs>
+        <w:ind w:left="720" w:hanging="360"/>
+      </w:pPr>
+      <w:rPr>
+        <w:rFonts w:ascii="Symbol" w:hAnsi="Symbol" w:hint="default"/>
+        <w:sz w:val="20"/>
+      </w:rPr>
+    </w:lvl>
+    <w:lvl w:ilvl="1" w:tentative="1">
+      <w:start w:val="1"/>
+      <w:numFmt w:val="bullet"/>
+      <w:lvlText w:val="o"/>
+      <w:lvlJc w:val="left"/>
+      <w:pPr>
+        <w:tabs>
+          <w:tab w:val="num" w:pos="1440"/>
+        </w:tabs>
+        <w:ind w:left="1440" w:hanging="360"/>
+      </w:pPr>
+      <w:rPr>
+        <w:rFonts w:ascii="Courier New" w:hAnsi="Courier New" w:hint="default"/>
+        <w:sz w:val="20"/>
+      </w:rPr>
+    </w:lvl>
+    <w:lvl w:ilvl="2" w:tentative="1">
+      <w:start w:val="1"/>
+      <w:numFmt w:val="bullet"/>
+      <w:lvlText w:val=""/>
+      <w:lvlJc w:val="left"/>
+      <w:pPr>
+        <w:tabs>
+          <w:tab w:val="num" w:pos="2160"/>
+        </w:tabs>
+        <w:ind w:left="2160" w:hanging="360"/>
+      </w:pPr>
+      <w:rPr>
+        <w:rFonts w:ascii="Wingdings" w:hAnsi="Wingdings" w:hint="default"/>
+        <w:sz w:val="20"/>
+      </w:rPr>
+    </w:lvl>
+    <w:lvl w:ilvl="3" w:tentative="1">
+      <w:start w:val="1"/>
+      <w:numFmt w:val="bullet"/>
+      <w:lvlText w:val=""/>
+      <w:lvlJc w:val="left"/>
+      <w:pPr>
+        <w:tabs>
+          <w:tab w:val="num" w:pos="2880"/>
+        </w:tabs>
+        <w:ind w:left="2880" w:hanging="360"/>
+      </w:pPr>
+      <w:rPr>
+        <w:rFonts w:ascii="Wingdings" w:hAnsi="Wingdings" w:hint="default"/>
+        <w:sz w:val="20"/>
+      </w:rPr>
+    </w:lvl>
+    <w:lvl w:ilvl="4" w:tentative="1">
+      <w:start w:val="1"/>
+      <w:numFmt w:val="bullet"/>
+      <w:lvlText w:val=""/>
+      <w:lvlJc w:val="left"/>
+      <w:pPr>
+        <w:tabs>
+          <w:tab w:val="num" w:pos="3600"/>
+        </w:tabs>
+        <w:ind w:left="3600" w:hanging="360"/>
+      </w:pPr>
+      <w:rPr>
+        <w:rFonts w:ascii="Wingdings" w:hAnsi="Wingdings" w:hint="default"/>
+        <w:sz w:val="20"/>
+      </w:rPr>
+    </w:lvl>
+    <w:lvl w:ilvl="5" w:tentative="1">
+      <w:start w:val="1"/>
+      <w:numFmt w:val="bullet"/>
+      <w:lvlText w:val=""/>
+      <w:lvlJc w:val="left"/>
+      <w:pPr>
+        <w:tabs>
+          <w:tab w:val="num" w:pos="4320"/>
+        </w:tabs>
+        <w:ind w:left="4320" w:hanging="360"/>
+      </w:pPr>
+      <w:rPr>
+        <w:rFonts w:ascii="Wingdings" w:hAnsi="Wingdings" w:hint="default"/>
+        <w:sz w:val="20"/>
+      </w:rPr>
+    </w:lvl>
+    <w:lvl w:ilvl="6" w:tentative="1">
+      <w:start w:val="1"/>
+      <w:numFmt w:val="bullet"/>
+      <w:lvlText w:val=""/>
+      <w:lvlJc w:val="left"/>
+      <w:pPr>
+        <w:tabs>
+          <w:tab w:val="num" w:pos="5040"/>
+        </w:tabs>
+        <w:ind w:left="5040" w:hanging="360"/>
+      </w:pPr>
+      <w:rPr>
+        <w:rFonts w:ascii="Wingdings" w:hAnsi="Wingdings" w:hint="default"/>
+        <w:sz w:val="20"/>
+      </w:rPr>
+    </w:lvl>
+    <w:lvl w:ilvl="7" w:tentative="1">
+      <w:start w:val="1"/>
+      <w:numFmt w:val="bullet"/>
+      <w:lvlText w:val=""/>
+      <w:lvlJc w:val="left"/>
+      <w:pPr>
+        <w:tabs>
+          <w:tab w:val="num" w:pos="5760"/>
+        </w:tabs>
+        <w:ind w:left="5760" w:hanging="360"/>
+      </w:pPr>
+      <w:rPr>
+        <w:rFonts w:ascii="Wingdings" w:hAnsi="Wingdings" w:hint="default"/>
+        <w:sz w:val="20"/>
+      </w:rPr>
+    </w:lvl>
+    <w:lvl w:ilvl="8" w:tentative="1">
+      <w:start w:val="1"/>
+      <w:numFmt w:val="bullet"/>
+      <w:lvlText w:val=""/>
+      <w:lvlJc w:val="left"/>
+      <w:pPr>
+        <w:tabs>
+          <w:tab w:val="num" w:pos="6480"/>
+        </w:tabs>
+        <w:ind w:left="6480" w:hanging="360"/>
+      </w:pPr>
+      <w:rPr>
+        <w:rFonts w:ascii="Wingdings" w:hAnsi="Wingdings" w:hint="default"/>
+        <w:sz w:val="20"/>
+      </w:rPr>
+    </w:lvl>
+  </w:abstractNum>
+  <w:num w:numId="1">
+    <w:abstractNumId w:val="20"/>
+  </w:num>
+  <w:num w:numId="2">
+    <w:abstractNumId w:val="6"/>
+  </w:num>
+  <w:num w:numId="3">
+    <w:abstractNumId w:val="1"/>
+  </w:num>
+  <w:num w:numId="4">
+    <w:abstractNumId w:val="2"/>
+  </w:num>
+  <w:num w:numId="5">
+    <w:abstractNumId w:val="17"/>
+  </w:num>
+  <w:num w:numId="6">
+    <w:abstractNumId w:val="3"/>
+  </w:num>
+  <w:num w:numId="7">
+    <w:abstractNumId w:val="15"/>
+  </w:num>
+  <w:num w:numId="8">
+    <w:abstractNumId w:val="18"/>
+  </w:num>
+  <w:num w:numId="9">
     <w:abstractNumId w:val="10"/>
   </w:num>
-  <w:num w:numId="2" w16cid:durableId="1208371310">
+  <w:num w:numId="10">
+    <w:abstractNumId w:val="5"/>
+  </w:num>
+  <w:num w:numId="11">
+    <w:abstractNumId w:val="7"/>
+  </w:num>
+  <w:num w:numId="12">
+    <w:abstractNumId w:val="16"/>
+  </w:num>
+  <w:num w:numId="13">
+    <w:abstractNumId w:val="9"/>
+  </w:num>
+  <w:num w:numId="14">
+    <w:abstractNumId w:val="12"/>
+  </w:num>
+  <w:num w:numId="15">
+    <w:abstractNumId w:val="21"/>
+  </w:num>
+  <w:num w:numId="16">
+    <w:abstractNumId w:val="13"/>
+  </w:num>
+  <w:num w:numId="17">
+    <w:abstractNumId w:val="8"/>
+  </w:num>
+  <w:num w:numId="18">
+    <w:abstractNumId w:val="0"/>
+  </w:num>
+  <w:num w:numId="19">
+    <w:abstractNumId w:val="19"/>
+  </w:num>
+  <w:num w:numId="20">
     <w:abstractNumId w:val="4"/>
   </w:num>
-  <w:num w:numId="3" w16cid:durableId="60250521">
-    <w:abstractNumId w:val="0"/>
+  <w:num w:numId="21">
+    <w:abstractNumId w:val="14"/>
   </w:num>
-  <w:num w:numId="4" w16cid:durableId="1970865214">
-    <w:abstractNumId w:val="1"/>
-  </w:num>
-  <w:num w:numId="5" w16cid:durableId="1569417856">
-    <w:abstractNumId w:val="8"/>
-  </w:num>
-  <w:num w:numId="6" w16cid:durableId="807866537">
-    <w:abstractNumId w:val="2"/>
-  </w:num>
-  <w:num w:numId="7" w16cid:durableId="1215704069">
-    <w:abstractNumId w:val="7"/>
-  </w:num>
-  <w:num w:numId="8" w16cid:durableId="179054548">
-    <w:abstractNumId w:val="9"/>
-  </w:num>
-  <w:num w:numId="9" w16cid:durableId="1383401601">
-    <w:abstractNumId w:val="6"/>
-  </w:num>
-  <w:num w:numId="10" w16cid:durableId="435173128">
-    <w:abstractNumId w:val="3"/>
-  </w:num>
-  <w:num w:numId="11" w16cid:durableId="1077440618">
-    <w:abstractNumId w:val="5"/>
+  <w:num w:numId="22">
+    <w:abstractNumId w:val="11"/>
   </w:num>
 </w:numbering>
 </file>
 
 <file path=word/styles.xml><?xml version="1.0" encoding="utf-8"?>
-<w:styles xmlns:mc="http://schemas.openxmlformats.org/markup-compatibility/2006" xmlns:r="http://schemas.openxmlformats.org/officeDocument/2006/relationships" xmlns:w="http://schemas.openxmlformats.org/wordprocessingml/2006/main" xmlns:w14="http://schemas.microsoft.com/office/word/2010/wordml" xmlns:w15="http://schemas.microsoft.com/office/word/2012/wordml" xmlns:w16cex="http://schemas.microsoft.com/office/word/2018/wordml/cex" xmlns:w16cid="http://schemas.microsoft.com/office/word/2016/wordml/cid" xmlns:w16="http://schemas.microsoft.com/office/word/2018/wordml" xmlns:w16du="http://schemas.microsoft.com/office/word/2023/wordml/word16du" xmlns:w16sdtdh="http://schemas.microsoft.com/office/word/2020/wordml/sdtdatahash" xmlns:w16sdtfl="http://schemas.microsoft.com/office/word/2024/wordml/sdtformatlock" xmlns:w16se="http://schemas.microsoft.com/office/word/2015/wordml/symex" mc:Ignorable="w14 w15 w16se w16cid w16 w16cex w16sdtdh w16sdtfl w16du">
+<w:styles xmlns:mc="http://schemas.openxmlformats.org/markup-compatibility/2006" xmlns:r="http://schemas.openxmlformats.org/officeDocument/2006/relationships" xmlns:w="http://schemas.openxmlformats.org/wordprocessingml/2006/main" xmlns:w14="http://schemas.microsoft.com/office/word/2010/wordml" xmlns:w15="http://schemas.microsoft.com/office/word/2012/wordml" mc:Ignorable="w14 w15">
   <w:docDefaults>
     <w:rPrDefault>
       <w:rPr>
@@ -2138,7 +4666,7 @@
       </w:pPr>
     </w:pPrDefault>
   </w:docDefaults>
-  <w:latentStyles w:defLockedState="0" w:defUIPriority="99" w:defSemiHidden="0" w:defUnhideWhenUsed="0" w:defQFormat="0" w:count="376">
+  <w:latentStyles w:defLockedState="0" w:defUIPriority="99" w:defSemiHidden="0" w:defUnhideWhenUsed="0" w:defQFormat="0" w:count="371">
     <w:lsdException w:name="Normal" w:uiPriority="0" w:qFormat="1"/>
     <w:lsdException w:name="heading 1" w:uiPriority="9" w:qFormat="1"/>
     <w:lsdException w:name="heading 2" w:semiHidden="1" w:uiPriority="9" w:unhideWhenUsed="1" w:qFormat="1"/>
@@ -2510,11 +5038,6 @@
     <w:lsdException w:name="List Table 5 Dark Accent 6" w:uiPriority="50"/>
     <w:lsdException w:name="List Table 6 Colorful Accent 6" w:uiPriority="51"/>
     <w:lsdException w:name="List Table 7 Colorful Accent 6" w:uiPriority="52"/>
-    <w:lsdException w:name="Mention" w:semiHidden="1" w:unhideWhenUsed="1"/>
-    <w:lsdException w:name="Smart Hyperlink" w:semiHidden="1" w:unhideWhenUsed="1"/>
-    <w:lsdException w:name="Hashtag" w:semiHidden="1" w:unhideWhenUsed="1"/>
-    <w:lsdException w:name="Unresolved Mention" w:semiHidden="1" w:unhideWhenUsed="1"/>
-    <w:lsdException w:name="Smart Link" w:semiHidden="1" w:unhideWhenUsed="1"/>
   </w:latentStyles>
   <w:style w:type="paragraph" w:default="1" w:styleId="Normal">
     <w:name w:val="Normal"/>
@@ -2722,7 +5245,6 @@
   <w:style w:type="character" w:default="1" w:styleId="DefaultParagraphFont">
     <w:name w:val="Default Paragraph Font"/>
     <w:uiPriority w:val="1"/>
-    <w:semiHidden/>
     <w:unhideWhenUsed/>
   </w:style>
   <w:style w:type="table" w:default="1" w:styleId="TableNormal">

</xml_diff>

<commit_message>
User profile and badges information added in User manual
</commit_message>
<xml_diff>
--- a/User Manual/User-Manual.docx
+++ b/User Manual/User-Manual.docx
@@ -1,6 +1,6 @@
 
 <file path=word/document.xml><?xml version="1.0" encoding="utf-8"?>
-<w:document xmlns:wpc="http://schemas.microsoft.com/office/word/2010/wordprocessingCanvas" xmlns:cx="http://schemas.microsoft.com/office/drawing/2014/chartex" xmlns:cx1="http://schemas.microsoft.com/office/drawing/2015/9/8/chartex" xmlns:cx2="http://schemas.microsoft.com/office/drawing/2015/10/21/chartex" xmlns:cx3="http://schemas.microsoft.com/office/drawing/2016/5/9/chartex" xmlns:cx4="http://schemas.microsoft.com/office/drawing/2016/5/10/chartex" xmlns:cx5="http://schemas.microsoft.com/office/drawing/2016/5/11/chartex" xmlns:cx6="http://schemas.microsoft.com/office/drawing/2016/5/12/chartex" xmlns:cx7="http://schemas.microsoft.com/office/drawing/2016/5/13/chartex" xmlns:cx8="http://schemas.microsoft.com/office/drawing/2016/5/14/chartex" xmlns:mc="http://schemas.openxmlformats.org/markup-compatibility/2006" xmlns:aink="http://schemas.microsoft.com/office/drawing/2016/ink" xmlns:am3d="http://schemas.microsoft.com/office/drawing/2017/model3d" xmlns:o="urn:schemas-microsoft-com:office:office" xmlns:oel="http://schemas.microsoft.com/office/2019/extlst" xmlns:r="http://schemas.openxmlformats.org/officeDocument/2006/relationships" xmlns:m="http://schemas.openxmlformats.org/officeDocument/2006/math" xmlns:v="urn:schemas-microsoft-com:vml" xmlns:wp14="http://schemas.microsoft.com/office/word/2010/wordprocessingDrawing" xmlns:wp="http://schemas.openxmlformats.org/drawingml/2006/wordprocessingDrawing" xmlns:w10="urn:schemas-microsoft-com:office:word" xmlns:w="http://schemas.openxmlformats.org/wordprocessingml/2006/main" xmlns:w14="http://schemas.microsoft.com/office/word/2010/wordml" xmlns:w15="http://schemas.microsoft.com/office/word/2012/wordml" xmlns:w16cex="http://schemas.microsoft.com/office/word/2018/wordml/cex" xmlns:w16cid="http://schemas.microsoft.com/office/word/2016/wordml/cid" xmlns:w16="http://schemas.microsoft.com/office/word/2018/wordml" xmlns:w16du="http://schemas.microsoft.com/office/word/2023/wordml/word16du" xmlns:w16sdtdh="http://schemas.microsoft.com/office/word/2020/wordml/sdtdatahash" xmlns:w16sdtfl="http://schemas.microsoft.com/office/word/2024/wordml/sdtformatlock" xmlns:w16se="http://schemas.microsoft.com/office/word/2015/wordml/symex" xmlns:wpg="http://schemas.microsoft.com/office/word/2010/wordprocessingGroup" xmlns:wpi="http://schemas.microsoft.com/office/word/2010/wordprocessingInk" xmlns:wne="http://schemas.microsoft.com/office/word/2006/wordml" xmlns:wps="http://schemas.microsoft.com/office/word/2010/wordprocessingShape" mc:Ignorable="w14 w15 w16se w16cid w16 w16cex w16sdtdh w16sdtfl w16du wp14">
+<w:document xmlns:wpc="http://schemas.microsoft.com/office/word/2010/wordprocessingCanvas" xmlns:mc="http://schemas.openxmlformats.org/markup-compatibility/2006" xmlns:o="urn:schemas-microsoft-com:office:office" xmlns:r="http://schemas.openxmlformats.org/officeDocument/2006/relationships" xmlns:m="http://schemas.openxmlformats.org/officeDocument/2006/math" xmlns:v="urn:schemas-microsoft-com:vml" xmlns:wp14="http://schemas.microsoft.com/office/word/2010/wordprocessingDrawing" xmlns:wp="http://schemas.openxmlformats.org/drawingml/2006/wordprocessingDrawing" xmlns:w10="urn:schemas-microsoft-com:office:word" xmlns:w="http://schemas.openxmlformats.org/wordprocessingml/2006/main" xmlns:w14="http://schemas.microsoft.com/office/word/2010/wordml" xmlns:w15="http://schemas.microsoft.com/office/word/2012/wordml" xmlns:wpg="http://schemas.microsoft.com/office/word/2010/wordprocessingGroup" xmlns:wpi="http://schemas.microsoft.com/office/word/2010/wordprocessingInk" xmlns:wne="http://schemas.microsoft.com/office/word/2006/wordml" xmlns:wps="http://schemas.microsoft.com/office/word/2010/wordprocessingShape" mc:Ignorable="w14 w15 wp14">
   <w:body>
     <w:p>
       <w:r>
@@ -160,6 +160,7 @@
       <w:r>
         <w:rPr>
           <w:noProof/>
+          <w:lang w:val="en-US"/>
         </w:rPr>
         <w:drawing>
           <wp:inline distT="0" distB="0" distL="0" distR="0" wp14:anchorId="1881B632" wp14:editId="70A824E1">
@@ -293,15 +294,15 @@
         </w:numPr>
       </w:pPr>
       <w:r>
+        <w:t>Cloud Computin</w:t>
+      </w:r>
+      <w:r>
+        <w:t>g</w:t>
+      </w:r>
+    </w:p>
+    <w:p>
+      <w:r>
         <w:lastRenderedPageBreak/>
-        <w:t>Cloud Computin</w:t>
-      </w:r>
-      <w:r>
-        <w:t>g</w:t>
-      </w:r>
-    </w:p>
-    <w:p>
-      <w:r>
         <w:t>Leaderboard Button:</w:t>
       </w:r>
     </w:p>
@@ -379,6 +380,7 @@
       <w:r>
         <w:rPr>
           <w:noProof/>
+          <w:lang w:val="en-US"/>
         </w:rPr>
         <w:drawing>
           <wp:inline distT="0" distB="0" distL="0" distR="0" wp14:anchorId="1760471E" wp14:editId="4D14C1E9">
@@ -542,6 +544,920 @@
     </w:p>
     <w:p/>
     <w:p/>
+    <w:p>
+      <w:pPr>
+        <w:rPr>
+          <w:b/>
+          <w:bCs/>
+          <w:lang w:val="en-US"/>
+        </w:rPr>
+      </w:pPr>
+      <w:r>
+        <w:rPr>
+          <w:b/>
+          <w:bCs/>
+          <w:lang w:val="en-US"/>
+        </w:rPr>
+        <w:t>3. User Profile Management and Badges</w:t>
+      </w:r>
+    </w:p>
+    <w:p>
+      <w:pPr>
+        <w:rPr>
+          <w:b/>
+          <w:bCs/>
+          <w:lang w:val="en-US"/>
+        </w:rPr>
+      </w:pPr>
+      <w:r>
+        <w:rPr>
+          <w:b/>
+          <w:bCs/>
+          <w:lang w:val="en-US"/>
+        </w:rPr>
+        <w:t>3.1 Profile Page Overview</w:t>
+      </w:r>
+    </w:p>
+    <w:p>
+      <w:pPr>
+        <w:rPr>
+          <w:lang w:val="en-US"/>
+        </w:rPr>
+      </w:pPr>
+      <w:r>
+        <w:rPr>
+          <w:lang w:val="en-US"/>
+        </w:rPr>
+        <w:t xml:space="preserve">The </w:t>
+      </w:r>
+      <w:r>
+        <w:rPr>
+          <w:bCs/>
+          <w:lang w:val="en-US"/>
+        </w:rPr>
+        <w:t>Profile Page</w:t>
+      </w:r>
+      <w:r>
+        <w:rPr>
+          <w:lang w:val="en-US"/>
+        </w:rPr>
+        <w:t xml:space="preserve"> displays key details about the user, their progress, and achievements. Users can view their personal information, track progress, and access settings.</w:t>
+      </w:r>
+    </w:p>
+    <w:p>
+      <w:pPr>
+        <w:rPr>
+          <w:bCs/>
+          <w:lang w:val="en-US"/>
+        </w:rPr>
+      </w:pPr>
+      <w:r>
+        <w:rPr>
+          <w:bCs/>
+          <w:lang w:val="en-US"/>
+        </w:rPr>
+        <w:t>Main Features on the Profile Page</w:t>
+      </w:r>
+    </w:p>
+    <w:p>
+      <w:pPr>
+        <w:rPr>
+          <w:lang w:val="en-US"/>
+        </w:rPr>
+      </w:pPr>
+      <w:r>
+        <w:rPr>
+          <w:bCs/>
+          <w:lang w:val="en-US"/>
+        </w:rPr>
+        <w:t>User Information</w:t>
+      </w:r>
+    </w:p>
+    <w:p>
+      <w:pPr>
+        <w:numPr>
+          <w:ilvl w:val="0"/>
+          <w:numId w:val="12"/>
+        </w:numPr>
+        <w:rPr>
+          <w:lang w:val="en-US"/>
+        </w:rPr>
+      </w:pPr>
+      <w:r>
+        <w:rPr>
+          <w:lang w:val="en-US"/>
+        </w:rPr>
+        <w:t>Displays the username, profile picture, and user level.</w:t>
+      </w:r>
+    </w:p>
+    <w:p>
+      <w:pPr>
+        <w:numPr>
+          <w:ilvl w:val="0"/>
+          <w:numId w:val="12"/>
+        </w:numPr>
+        <w:rPr>
+          <w:lang w:val="en-US"/>
+        </w:rPr>
+      </w:pPr>
+      <w:r>
+        <w:rPr>
+          <w:lang w:val="en-US"/>
+        </w:rPr>
+        <w:t>Shows basic details like email (if applicable) and registration date.</w:t>
+      </w:r>
+    </w:p>
+    <w:p>
+      <w:pPr>
+        <w:rPr>
+          <w:lang w:val="en-US"/>
+        </w:rPr>
+      </w:pPr>
+      <w:r>
+        <w:rPr>
+          <w:bCs/>
+          <w:lang w:val="en-US"/>
+        </w:rPr>
+        <w:t>Completed and In-Progress Courses</w:t>
+      </w:r>
+    </w:p>
+    <w:p>
+      <w:pPr>
+        <w:numPr>
+          <w:ilvl w:val="0"/>
+          <w:numId w:val="13"/>
+        </w:numPr>
+        <w:rPr>
+          <w:lang w:val="en-US"/>
+        </w:rPr>
+      </w:pPr>
+      <w:r>
+        <w:rPr>
+          <w:lang w:val="en-US"/>
+        </w:rPr>
+        <w:t>Shows the total number of completed courses.</w:t>
+      </w:r>
+    </w:p>
+    <w:p>
+      <w:pPr>
+        <w:numPr>
+          <w:ilvl w:val="0"/>
+          <w:numId w:val="13"/>
+        </w:numPr>
+        <w:rPr>
+          <w:lang w:val="en-US"/>
+        </w:rPr>
+      </w:pPr>
+      <w:r>
+        <w:rPr>
+          <w:lang w:val="en-US"/>
+        </w:rPr>
+        <w:t>Displays courses currently in progress, helping users track learning progress.</w:t>
+      </w:r>
+    </w:p>
+    <w:p>
+      <w:pPr>
+        <w:rPr>
+          <w:lang w:val="en-US"/>
+        </w:rPr>
+      </w:pPr>
+      <w:r>
+        <w:rPr>
+          <w:bCs/>
+          <w:lang w:val="en-US"/>
+        </w:rPr>
+        <w:t>Badges and Achievements</w:t>
+      </w:r>
+    </w:p>
+    <w:p>
+      <w:pPr>
+        <w:numPr>
+          <w:ilvl w:val="0"/>
+          <w:numId w:val="14"/>
+        </w:numPr>
+        <w:rPr>
+          <w:lang w:val="en-US"/>
+        </w:rPr>
+      </w:pPr>
+      <w:r>
+        <w:rPr>
+          <w:lang w:val="en-US"/>
+        </w:rPr>
+        <w:t xml:space="preserve">Displays all earned </w:t>
+      </w:r>
+      <w:r>
+        <w:rPr>
+          <w:bCs/>
+          <w:lang w:val="en-US"/>
+        </w:rPr>
+        <w:t>badges</w:t>
+      </w:r>
+      <w:r>
+        <w:rPr>
+          <w:lang w:val="en-US"/>
+        </w:rPr>
+        <w:t xml:space="preserve"> for milestones in completing courses</w:t>
+      </w:r>
+    </w:p>
+    <w:p>
+      <w:pPr>
+        <w:numPr>
+          <w:ilvl w:val="0"/>
+          <w:numId w:val="14"/>
+        </w:numPr>
+        <w:rPr>
+          <w:lang w:val="en-US"/>
+        </w:rPr>
+      </w:pPr>
+      <w:r>
+        <w:rPr>
+          <w:lang w:val="en-US"/>
+        </w:rPr>
+        <w:t>Hovering over a badge shows detailed information about how it was earned.</w:t>
+      </w:r>
+    </w:p>
+    <w:p>
+      <w:pPr>
+        <w:rPr>
+          <w:lang w:val="en-US"/>
+        </w:rPr>
+      </w:pPr>
+      <w:r>
+        <w:rPr>
+          <w:bCs/>
+          <w:lang w:val="en-US"/>
+        </w:rPr>
+        <w:t>Edit Profile Button</w:t>
+      </w:r>
+    </w:p>
+    <w:p>
+      <w:pPr>
+        <w:numPr>
+          <w:ilvl w:val="0"/>
+          <w:numId w:val="15"/>
+        </w:numPr>
+        <w:rPr>
+          <w:lang w:val="en-US"/>
+        </w:rPr>
+      </w:pPr>
+      <w:r>
+        <w:rPr>
+          <w:lang w:val="en-US"/>
+        </w:rPr>
+        <w:t xml:space="preserve">Clicking this button redirects to the </w:t>
+      </w:r>
+      <w:r>
+        <w:rPr>
+          <w:bCs/>
+          <w:lang w:val="en-US"/>
+        </w:rPr>
+        <w:t>Edit Profile Page</w:t>
+      </w:r>
+      <w:r>
+        <w:rPr>
+          <w:lang w:val="en-US"/>
+        </w:rPr>
+        <w:t>, where users can update their details.</w:t>
+      </w:r>
+    </w:p>
+    <w:p>
+      <w:pPr>
+        <w:rPr>
+          <w:lang w:val="en-US"/>
+        </w:rPr>
+      </w:pPr>
+      <w:r>
+        <w:rPr>
+          <w:bCs/>
+          <w:lang w:val="en-US"/>
+        </w:rPr>
+        <w:t>Leaderboard and Ranking</w:t>
+      </w:r>
+    </w:p>
+    <w:p>
+      <w:pPr>
+        <w:numPr>
+          <w:ilvl w:val="0"/>
+          <w:numId w:val="16"/>
+        </w:numPr>
+        <w:rPr>
+          <w:lang w:val="en-US"/>
+        </w:rPr>
+      </w:pPr>
+      <w:r>
+        <w:rPr>
+          <w:lang w:val="en-US"/>
+        </w:rPr>
+        <w:t xml:space="preserve">Displays the user’s position in the </w:t>
+      </w:r>
+      <w:r>
+        <w:rPr>
+          <w:bCs/>
+          <w:lang w:val="en-US"/>
+        </w:rPr>
+        <w:t>leaderboard</w:t>
+      </w:r>
+      <w:r>
+        <w:rPr>
+          <w:lang w:val="en-US"/>
+        </w:rPr>
+        <w:t>, based on points and completed courses.</w:t>
+      </w:r>
+    </w:p>
+    <w:p>
+      <w:pPr>
+        <w:rPr>
+          <w:lang w:val="en-US"/>
+        </w:rPr>
+      </w:pPr>
+      <w:r>
+        <w:rPr>
+          <w:lang w:val="en-US"/>
+        </w:rPr>
+        <w:t>Logout</w:t>
+      </w:r>
+    </w:p>
+    <w:p>
+      <w:pPr>
+        <w:numPr>
+          <w:ilvl w:val="0"/>
+          <w:numId w:val="16"/>
+        </w:numPr>
+        <w:rPr>
+          <w:lang w:val="en-US"/>
+        </w:rPr>
+      </w:pPr>
+      <w:r>
+        <w:rPr>
+          <w:lang w:val="en-US"/>
+        </w:rPr>
+        <w:t>Allows users to logout of their ID returning back to the login page.</w:t>
+      </w:r>
+    </w:p>
+    <w:p>
+      <w:pPr>
+        <w:rPr>
+          <w:lang w:val="en-US"/>
+        </w:rPr>
+      </w:pPr>
+    </w:p>
+    <w:p>
+      <w:pPr>
+        <w:rPr>
+          <w:b/>
+          <w:bCs/>
+          <w:lang w:val="en-US"/>
+        </w:rPr>
+      </w:pPr>
+      <w:r>
+        <w:rPr>
+          <w:b/>
+          <w:bCs/>
+          <w:lang w:val="en-US"/>
+        </w:rPr>
+        <w:t>3.2 Edit Profile Page</w:t>
+      </w:r>
+    </w:p>
+    <w:p>
+      <w:pPr>
+        <w:rPr>
+          <w:lang w:val="en-US"/>
+        </w:rPr>
+      </w:pPr>
+      <w:r>
+        <w:rPr>
+          <w:lang w:val="en-US"/>
+        </w:rPr>
+        <w:t xml:space="preserve">The </w:t>
+      </w:r>
+      <w:r>
+        <w:rPr>
+          <w:bCs/>
+          <w:lang w:val="en-US"/>
+        </w:rPr>
+        <w:t>Edit Profile Page</w:t>
+      </w:r>
+      <w:r>
+        <w:rPr>
+          <w:lang w:val="en-US"/>
+        </w:rPr>
+        <w:t xml:space="preserve"> allows users to modify their personal information and update their profile picture.</w:t>
+      </w:r>
+    </w:p>
+    <w:p>
+      <w:pPr>
+        <w:rPr>
+          <w:b/>
+          <w:bCs/>
+          <w:lang w:val="en-US"/>
+        </w:rPr>
+      </w:pPr>
+      <w:r>
+        <w:rPr>
+          <w:b/>
+          <w:bCs/>
+          <w:lang w:val="en-US"/>
+        </w:rPr>
+        <w:t>Features of the Edit Profile Page</w:t>
+      </w:r>
+    </w:p>
+    <w:p>
+      <w:pPr>
+        <w:rPr>
+          <w:lang w:val="en-US"/>
+        </w:rPr>
+      </w:pPr>
+      <w:r>
+        <w:rPr>
+          <w:bCs/>
+          <w:lang w:val="en-US"/>
+        </w:rPr>
+        <w:t>Change Password</w:t>
+      </w:r>
+    </w:p>
+    <w:p>
+      <w:pPr>
+        <w:numPr>
+          <w:ilvl w:val="0"/>
+          <w:numId w:val="17"/>
+        </w:numPr>
+        <w:rPr>
+          <w:lang w:val="en-US"/>
+        </w:rPr>
+      </w:pPr>
+      <w:r>
+        <w:rPr>
+          <w:lang w:val="en-US"/>
+        </w:rPr>
+        <w:t xml:space="preserve">Users can enter a </w:t>
+      </w:r>
+      <w:r>
+        <w:rPr>
+          <w:bCs/>
+          <w:lang w:val="en-US"/>
+        </w:rPr>
+        <w:t>new password</w:t>
+      </w:r>
+      <w:r>
+        <w:rPr>
+          <w:lang w:val="en-US"/>
+        </w:rPr>
+        <w:t xml:space="preserve"> and confirm it to change their login credentials.</w:t>
+      </w:r>
+    </w:p>
+    <w:p>
+      <w:pPr>
+        <w:rPr>
+          <w:lang w:val="en-US"/>
+        </w:rPr>
+      </w:pPr>
+      <w:r>
+        <w:rPr>
+          <w:bCs/>
+          <w:lang w:val="en-US"/>
+        </w:rPr>
+        <w:t>Upload Profile Picture</w:t>
+      </w:r>
+    </w:p>
+    <w:p>
+      <w:pPr>
+        <w:numPr>
+          <w:ilvl w:val="0"/>
+          <w:numId w:val="18"/>
+        </w:numPr>
+        <w:rPr>
+          <w:lang w:val="en-US"/>
+        </w:rPr>
+      </w:pPr>
+      <w:r>
+        <w:rPr>
+          <w:lang w:val="en-US"/>
+        </w:rPr>
+        <w:t xml:space="preserve">Allows users to </w:t>
+      </w:r>
+      <w:r>
+        <w:rPr>
+          <w:bCs/>
+          <w:lang w:val="en-US"/>
+        </w:rPr>
+        <w:t>upload a profile picture</w:t>
+      </w:r>
+      <w:r>
+        <w:rPr>
+          <w:lang w:val="en-US"/>
+        </w:rPr>
+        <w:t xml:space="preserve"> or choose an avatar.</w:t>
+      </w:r>
+    </w:p>
+    <w:p>
+      <w:pPr>
+        <w:rPr>
+          <w:bCs/>
+          <w:lang w:val="en-US"/>
+        </w:rPr>
+      </w:pPr>
+      <w:r>
+        <w:rPr>
+          <w:bCs/>
+          <w:lang w:val="en-US"/>
+        </w:rPr>
+        <w:t>Add and change Bio</w:t>
+      </w:r>
+    </w:p>
+    <w:p>
+      <w:pPr>
+        <w:numPr>
+          <w:ilvl w:val="0"/>
+          <w:numId w:val="18"/>
+        </w:numPr>
+        <w:rPr>
+          <w:bCs/>
+          <w:lang w:val="en-US"/>
+        </w:rPr>
+      </w:pPr>
+      <w:r>
+        <w:rPr>
+          <w:bCs/>
+          <w:lang w:val="en-US"/>
+        </w:rPr>
+        <w:t>Allows users to add or change their bio to tell other about them.</w:t>
+      </w:r>
+    </w:p>
+    <w:p>
+      <w:pPr>
+        <w:rPr>
+          <w:bCs/>
+          <w:lang w:val="en-US"/>
+        </w:rPr>
+      </w:pPr>
+    </w:p>
+    <w:p>
+      <w:pPr>
+        <w:rPr>
+          <w:lang w:val="en-US"/>
+        </w:rPr>
+      </w:pPr>
+      <w:r>
+        <w:rPr>
+          <w:bCs/>
+          <w:lang w:val="en-US"/>
+        </w:rPr>
+        <w:t>Save Changes Button</w:t>
+      </w:r>
+    </w:p>
+    <w:p>
+      <w:pPr>
+        <w:numPr>
+          <w:ilvl w:val="0"/>
+          <w:numId w:val="19"/>
+        </w:numPr>
+        <w:rPr>
+          <w:lang w:val="en-US"/>
+        </w:rPr>
+      </w:pPr>
+      <w:r>
+        <w:rPr>
+          <w:lang w:val="en-US"/>
+        </w:rPr>
+        <w:t xml:space="preserve">Clicking </w:t>
+      </w:r>
+      <w:r>
+        <w:rPr>
+          <w:bCs/>
+          <w:lang w:val="en-US"/>
+        </w:rPr>
+        <w:t>Save Changes</w:t>
+      </w:r>
+      <w:r>
+        <w:rPr>
+          <w:lang w:val="en-US"/>
+        </w:rPr>
+        <w:t xml:space="preserve"> updates the user’s details.</w:t>
+      </w:r>
+    </w:p>
+    <w:p>
+      <w:pPr>
+        <w:numPr>
+          <w:ilvl w:val="0"/>
+          <w:numId w:val="19"/>
+        </w:numPr>
+        <w:rPr>
+          <w:lang w:val="en-US"/>
+        </w:rPr>
+      </w:pPr>
+      <w:r>
+        <w:rPr>
+          <w:lang w:val="en-US"/>
+        </w:rPr>
+        <w:t>If an error occurs (e.g., weak password), a message is displayed.</w:t>
+      </w:r>
+    </w:p>
+    <w:p>
+      <w:pPr>
+        <w:rPr>
+          <w:lang w:val="en-US"/>
+        </w:rPr>
+      </w:pPr>
+      <w:r>
+        <w:rPr>
+          <w:bCs/>
+          <w:lang w:val="en-US"/>
+        </w:rPr>
+        <w:t>Cancel Button</w:t>
+      </w:r>
+    </w:p>
+    <w:p>
+      <w:pPr>
+        <w:numPr>
+          <w:ilvl w:val="0"/>
+          <w:numId w:val="20"/>
+        </w:numPr>
+        <w:rPr>
+          <w:lang w:val="en-US"/>
+        </w:rPr>
+      </w:pPr>
+      <w:r>
+        <w:rPr>
+          <w:lang w:val="en-US"/>
+        </w:rPr>
+        <w:t xml:space="preserve">Redirects back to the </w:t>
+      </w:r>
+      <w:r>
+        <w:rPr>
+          <w:bCs/>
+          <w:lang w:val="en-US"/>
+        </w:rPr>
+        <w:t>Profile Page</w:t>
+      </w:r>
+      <w:r>
+        <w:rPr>
+          <w:lang w:val="en-US"/>
+        </w:rPr>
+        <w:t xml:space="preserve"> without saving changes.</w:t>
+      </w:r>
+    </w:p>
+    <w:p>
+      <w:pPr>
+        <w:rPr>
+          <w:b/>
+          <w:bCs/>
+          <w:lang w:val="en-US"/>
+        </w:rPr>
+      </w:pPr>
+      <w:r>
+        <w:rPr>
+          <w:b/>
+          <w:bCs/>
+          <w:lang w:val="en-US"/>
+        </w:rPr>
+        <w:t>3.3. How Badges Work</w:t>
+      </w:r>
+    </w:p>
+    <w:p>
+      <w:pPr>
+        <w:rPr>
+          <w:lang w:val="en-US"/>
+        </w:rPr>
+      </w:pPr>
+      <w:r>
+        <w:rPr>
+          <w:bCs/>
+          <w:lang w:val="en-US"/>
+        </w:rPr>
+        <w:t>Earning Badges</w:t>
+      </w:r>
+    </w:p>
+    <w:p>
+      <w:pPr>
+        <w:rPr>
+          <w:bCs/>
+          <w:lang w:val="en-US"/>
+        </w:rPr>
+      </w:pPr>
+      <w:r>
+        <w:rPr>
+          <w:lang w:val="en-US"/>
+        </w:rPr>
+        <w:t xml:space="preserve">Badges are awarded based on user achievements. Users can track their </w:t>
+      </w:r>
+      <w:r>
+        <w:rPr>
+          <w:bCs/>
+          <w:lang w:val="en-US"/>
+        </w:rPr>
+        <w:t>badges collection</w:t>
+      </w:r>
+      <w:r>
+        <w:rPr>
+          <w:lang w:val="en-US"/>
+        </w:rPr>
+        <w:t xml:space="preserve"> from the </w:t>
+      </w:r>
+      <w:r>
+        <w:rPr>
+          <w:bCs/>
+          <w:lang w:val="en-US"/>
+        </w:rPr>
+        <w:t xml:space="preserve">Profile Page </w:t>
+      </w:r>
+    </w:p>
+    <w:p>
+      <w:pPr>
+        <w:rPr>
+          <w:bCs/>
+          <w:lang w:val="en-US"/>
+        </w:rPr>
+      </w:pPr>
+      <w:r>
+        <w:rPr>
+          <w:bCs/>
+          <w:lang w:val="en-US"/>
+        </w:rPr>
+        <w:t>Types of Badges</w:t>
+      </w:r>
+    </w:p>
+    <w:p>
+      <w:pPr>
+        <w:numPr>
+          <w:ilvl w:val="0"/>
+          <w:numId w:val="22"/>
+        </w:numPr>
+        <w:rPr>
+          <w:lang w:val="en-US"/>
+        </w:rPr>
+      </w:pPr>
+      <w:r>
+        <w:rPr>
+          <w:bCs/>
+          <w:lang w:val="en-US"/>
+        </w:rPr>
+        <w:t>Novice Badge</w:t>
+      </w:r>
+      <w:r>
+        <w:rPr>
+          <w:lang w:val="en-US"/>
+        </w:rPr>
+        <w:t xml:space="preserve"> – Awarded for completing the first course.</w:t>
+      </w:r>
+    </w:p>
+    <w:p>
+      <w:pPr>
+        <w:numPr>
+          <w:ilvl w:val="0"/>
+          <w:numId w:val="22"/>
+        </w:numPr>
+        <w:rPr>
+          <w:lang w:val="en-US"/>
+        </w:rPr>
+      </w:pPr>
+      <w:r>
+        <w:rPr>
+          <w:bCs/>
+          <w:lang w:val="en-US"/>
+        </w:rPr>
+        <w:t>Intermediate Badge</w:t>
+      </w:r>
+      <w:r>
+        <w:rPr>
+          <w:lang w:val="en-US"/>
+        </w:rPr>
+        <w:t xml:space="preserve"> – Earned after completing </w:t>
+      </w:r>
+      <w:r>
+        <w:rPr>
+          <w:bCs/>
+          <w:lang w:val="en-US"/>
+        </w:rPr>
+        <w:t>3 courses</w:t>
+      </w:r>
+      <w:r>
+        <w:rPr>
+          <w:lang w:val="en-US"/>
+        </w:rPr>
+        <w:t>.</w:t>
+      </w:r>
+    </w:p>
+    <w:p>
+      <w:pPr>
+        <w:numPr>
+          <w:ilvl w:val="0"/>
+          <w:numId w:val="22"/>
+        </w:numPr>
+        <w:rPr>
+          <w:lang w:val="en-US"/>
+        </w:rPr>
+      </w:pPr>
+      <w:r>
+        <w:rPr>
+          <w:bCs/>
+          <w:lang w:val="en-US"/>
+        </w:rPr>
+        <w:t>Advanced Badge</w:t>
+      </w:r>
+      <w:r>
+        <w:rPr>
+          <w:lang w:val="en-US"/>
+        </w:rPr>
+        <w:t xml:space="preserve"> – Earned after completing </w:t>
+      </w:r>
+      <w:r>
+        <w:rPr>
+          <w:bCs/>
+          <w:lang w:val="en-US"/>
+        </w:rPr>
+        <w:t>5 courses</w:t>
+      </w:r>
+      <w:r>
+        <w:rPr>
+          <w:lang w:val="en-US"/>
+        </w:rPr>
+        <w:t>.</w:t>
+      </w:r>
+    </w:p>
+    <w:p>
+      <w:pPr>
+        <w:numPr>
+          <w:ilvl w:val="0"/>
+          <w:numId w:val="22"/>
+        </w:numPr>
+        <w:rPr>
+          <w:lang w:val="en-US"/>
+        </w:rPr>
+      </w:pPr>
+      <w:r>
+        <w:rPr>
+          <w:bCs/>
+          <w:lang w:val="en-US"/>
+        </w:rPr>
+        <w:t>Expert Badge</w:t>
+      </w:r>
+      <w:r>
+        <w:rPr>
+          <w:lang w:val="en-US"/>
+        </w:rPr>
+        <w:t xml:space="preserve"> – Earned after completing </w:t>
+      </w:r>
+      <w:r>
+        <w:rPr>
+          <w:bCs/>
+          <w:lang w:val="en-US"/>
+        </w:rPr>
+        <w:t>7 courses</w:t>
+      </w:r>
+      <w:r>
+        <w:rPr>
+          <w:lang w:val="en-US"/>
+        </w:rPr>
+        <w:t>.</w:t>
+      </w:r>
+      <w:bookmarkStart w:id="0" w:name="_GoBack"/>
+      <w:bookmarkEnd w:id="0"/>
+    </w:p>
+    <w:p>
+      <w:pPr>
+        <w:rPr>
+          <w:lang w:val="en-US"/>
+        </w:rPr>
+      </w:pPr>
+      <w:r>
+        <w:rPr>
+          <w:bCs/>
+          <w:lang w:val="en-US"/>
+        </w:rPr>
+        <w:t>Hover Feature</w:t>
+      </w:r>
+    </w:p>
+    <w:p>
+      <w:pPr>
+        <w:numPr>
+          <w:ilvl w:val="0"/>
+          <w:numId w:val="21"/>
+        </w:numPr>
+        <w:rPr>
+          <w:lang w:val="en-US"/>
+        </w:rPr>
+      </w:pPr>
+      <w:r>
+        <w:rPr>
+          <w:lang w:val="en-US"/>
+        </w:rPr>
+        <w:t xml:space="preserve">Hovering over a badge displays its </w:t>
+      </w:r>
+      <w:r>
+        <w:rPr>
+          <w:bCs/>
+          <w:lang w:val="en-US"/>
+        </w:rPr>
+        <w:t>criteria and progress</w:t>
+      </w:r>
+      <w:r>
+        <w:rPr>
+          <w:lang w:val="en-US"/>
+        </w:rPr>
+        <w:t>.</w:t>
+      </w:r>
+    </w:p>
+    <w:p/>
     <w:p/>
     <w:p/>
     <w:sectPr>
@@ -555,8 +1471,157 @@
 </file>
 
 <file path=word/numbering.xml><?xml version="1.0" encoding="utf-8"?>
-<w:numbering xmlns:wpc="http://schemas.microsoft.com/office/word/2010/wordprocessingCanvas" xmlns:cx="http://schemas.microsoft.com/office/drawing/2014/chartex" xmlns:cx1="http://schemas.microsoft.com/office/drawing/2015/9/8/chartex" xmlns:cx2="http://schemas.microsoft.com/office/drawing/2015/10/21/chartex" xmlns:cx3="http://schemas.microsoft.com/office/drawing/2016/5/9/chartex" xmlns:cx4="http://schemas.microsoft.com/office/drawing/2016/5/10/chartex" xmlns:cx5="http://schemas.microsoft.com/office/drawing/2016/5/11/chartex" xmlns:cx6="http://schemas.microsoft.com/office/drawing/2016/5/12/chartex" xmlns:cx7="http://schemas.microsoft.com/office/drawing/2016/5/13/chartex" xmlns:cx8="http://schemas.microsoft.com/office/drawing/2016/5/14/chartex" xmlns:mc="http://schemas.openxmlformats.org/markup-compatibility/2006" xmlns:aink="http://schemas.microsoft.com/office/drawing/2016/ink" xmlns:am3d="http://schemas.microsoft.com/office/drawing/2017/model3d" xmlns:o="urn:schemas-microsoft-com:office:office" xmlns:oel="http://schemas.microsoft.com/office/2019/extlst" xmlns:r="http://schemas.openxmlformats.org/officeDocument/2006/relationships" xmlns:m="http://schemas.openxmlformats.org/officeDocument/2006/math" xmlns:v="urn:schemas-microsoft-com:vml" xmlns:wp14="http://schemas.microsoft.com/office/word/2010/wordprocessingDrawing" xmlns:wp="http://schemas.openxmlformats.org/drawingml/2006/wordprocessingDrawing" xmlns:w10="urn:schemas-microsoft-com:office:word" xmlns:w="http://schemas.openxmlformats.org/wordprocessingml/2006/main" xmlns:w14="http://schemas.microsoft.com/office/word/2010/wordml" xmlns:w15="http://schemas.microsoft.com/office/word/2012/wordml" xmlns:w16cex="http://schemas.microsoft.com/office/word/2018/wordml/cex" xmlns:w16cid="http://schemas.microsoft.com/office/word/2016/wordml/cid" xmlns:w16="http://schemas.microsoft.com/office/word/2018/wordml" xmlns:w16du="http://schemas.microsoft.com/office/word/2023/wordml/word16du" xmlns:w16sdtdh="http://schemas.microsoft.com/office/word/2020/wordml/sdtdatahash" xmlns:w16sdtfl="http://schemas.microsoft.com/office/word/2024/wordml/sdtformatlock" xmlns:w16se="http://schemas.microsoft.com/office/word/2015/wordml/symex" xmlns:wpg="http://schemas.microsoft.com/office/word/2010/wordprocessingGroup" xmlns:wpi="http://schemas.microsoft.com/office/word/2010/wordprocessingInk" xmlns:wne="http://schemas.microsoft.com/office/word/2006/wordml" xmlns:wps="http://schemas.microsoft.com/office/word/2010/wordprocessingShape" mc:Ignorable="w14 w15 w16se w16cid w16 w16cex w16sdtdh w16sdtfl w16du wp14">
-  <w:abstractNum w:abstractNumId="0" w15:restartNumberingAfterBreak="0">
+<w:numbering xmlns:wpc="http://schemas.microsoft.com/office/word/2010/wordprocessingCanvas" xmlns:mc="http://schemas.openxmlformats.org/markup-compatibility/2006" xmlns:o="urn:schemas-microsoft-com:office:office" xmlns:r="http://schemas.openxmlformats.org/officeDocument/2006/relationships" xmlns:m="http://schemas.openxmlformats.org/officeDocument/2006/math" xmlns:v="urn:schemas-microsoft-com:vml" xmlns:wp14="http://schemas.microsoft.com/office/word/2010/wordprocessingDrawing" xmlns:wp="http://schemas.openxmlformats.org/drawingml/2006/wordprocessingDrawing" xmlns:w10="urn:schemas-microsoft-com:office:word" xmlns:w="http://schemas.openxmlformats.org/wordprocessingml/2006/main" xmlns:w14="http://schemas.microsoft.com/office/word/2010/wordml" xmlns:w15="http://schemas.microsoft.com/office/word/2012/wordml" xmlns:wpg="http://schemas.microsoft.com/office/word/2010/wordprocessingGroup" xmlns:wpi="http://schemas.microsoft.com/office/word/2010/wordprocessingInk" xmlns:wne="http://schemas.microsoft.com/office/word/2006/wordml" xmlns:wps="http://schemas.microsoft.com/office/word/2010/wordprocessingShape" mc:Ignorable="w14 w15 wp14">
+  <w:abstractNum w:abstractNumId="0">
+    <w:nsid w:val="03D70A73"/>
+    <w:multiLevelType w:val="multilevel"/>
+    <w:tmpl w:val="07FCCC2A"/>
+    <w:lvl w:ilvl="0">
+      <w:start w:val="1"/>
+      <w:numFmt w:val="bullet"/>
+      <w:lvlText w:val=""/>
+      <w:lvlJc w:val="left"/>
+      <w:pPr>
+        <w:tabs>
+          <w:tab w:val="num" w:pos="720"/>
+        </w:tabs>
+        <w:ind w:left="720" w:hanging="360"/>
+      </w:pPr>
+      <w:rPr>
+        <w:rFonts w:ascii="Symbol" w:hAnsi="Symbol" w:hint="default"/>
+        <w:sz w:val="20"/>
+      </w:rPr>
+    </w:lvl>
+    <w:lvl w:ilvl="1" w:tentative="1">
+      <w:start w:val="1"/>
+      <w:numFmt w:val="bullet"/>
+      <w:lvlText w:val="o"/>
+      <w:lvlJc w:val="left"/>
+      <w:pPr>
+        <w:tabs>
+          <w:tab w:val="num" w:pos="1440"/>
+        </w:tabs>
+        <w:ind w:left="1440" w:hanging="360"/>
+      </w:pPr>
+      <w:rPr>
+        <w:rFonts w:ascii="Courier New" w:hAnsi="Courier New" w:hint="default"/>
+        <w:sz w:val="20"/>
+      </w:rPr>
+    </w:lvl>
+    <w:lvl w:ilvl="2" w:tentative="1">
+      <w:start w:val="1"/>
+      <w:numFmt w:val="bullet"/>
+      <w:lvlText w:val=""/>
+      <w:lvlJc w:val="left"/>
+      <w:pPr>
+        <w:tabs>
+          <w:tab w:val="num" w:pos="2160"/>
+        </w:tabs>
+        <w:ind w:left="2160" w:hanging="360"/>
+      </w:pPr>
+      <w:rPr>
+        <w:rFonts w:ascii="Wingdings" w:hAnsi="Wingdings" w:hint="default"/>
+        <w:sz w:val="20"/>
+      </w:rPr>
+    </w:lvl>
+    <w:lvl w:ilvl="3" w:tentative="1">
+      <w:start w:val="1"/>
+      <w:numFmt w:val="bullet"/>
+      <w:lvlText w:val=""/>
+      <w:lvlJc w:val="left"/>
+      <w:pPr>
+        <w:tabs>
+          <w:tab w:val="num" w:pos="2880"/>
+        </w:tabs>
+        <w:ind w:left="2880" w:hanging="360"/>
+      </w:pPr>
+      <w:rPr>
+        <w:rFonts w:ascii="Wingdings" w:hAnsi="Wingdings" w:hint="default"/>
+        <w:sz w:val="20"/>
+      </w:rPr>
+    </w:lvl>
+    <w:lvl w:ilvl="4" w:tentative="1">
+      <w:start w:val="1"/>
+      <w:numFmt w:val="bullet"/>
+      <w:lvlText w:val=""/>
+      <w:lvlJc w:val="left"/>
+      <w:pPr>
+        <w:tabs>
+          <w:tab w:val="num" w:pos="3600"/>
+        </w:tabs>
+        <w:ind w:left="3600" w:hanging="360"/>
+      </w:pPr>
+      <w:rPr>
+        <w:rFonts w:ascii="Wingdings" w:hAnsi="Wingdings" w:hint="default"/>
+        <w:sz w:val="20"/>
+      </w:rPr>
+    </w:lvl>
+    <w:lvl w:ilvl="5" w:tentative="1">
+      <w:start w:val="1"/>
+      <w:numFmt w:val="bullet"/>
+      <w:lvlText w:val=""/>
+      <w:lvlJc w:val="left"/>
+      <w:pPr>
+        <w:tabs>
+          <w:tab w:val="num" w:pos="4320"/>
+        </w:tabs>
+        <w:ind w:left="4320" w:hanging="360"/>
+      </w:pPr>
+      <w:rPr>
+        <w:rFonts w:ascii="Wingdings" w:hAnsi="Wingdings" w:hint="default"/>
+        <w:sz w:val="20"/>
+      </w:rPr>
+    </w:lvl>
+    <w:lvl w:ilvl="6" w:tentative="1">
+      <w:start w:val="1"/>
+      <w:numFmt w:val="bullet"/>
+      <w:lvlText w:val=""/>
+      <w:lvlJc w:val="left"/>
+      <w:pPr>
+        <w:tabs>
+          <w:tab w:val="num" w:pos="5040"/>
+        </w:tabs>
+        <w:ind w:left="5040" w:hanging="360"/>
+      </w:pPr>
+      <w:rPr>
+        <w:rFonts w:ascii="Wingdings" w:hAnsi="Wingdings" w:hint="default"/>
+        <w:sz w:val="20"/>
+      </w:rPr>
+    </w:lvl>
+    <w:lvl w:ilvl="7" w:tentative="1">
+      <w:start w:val="1"/>
+      <w:numFmt w:val="bullet"/>
+      <w:lvlText w:val=""/>
+      <w:lvlJc w:val="left"/>
+      <w:pPr>
+        <w:tabs>
+          <w:tab w:val="num" w:pos="5760"/>
+        </w:tabs>
+        <w:ind w:left="5760" w:hanging="360"/>
+      </w:pPr>
+      <w:rPr>
+        <w:rFonts w:ascii="Wingdings" w:hAnsi="Wingdings" w:hint="default"/>
+        <w:sz w:val="20"/>
+      </w:rPr>
+    </w:lvl>
+    <w:lvl w:ilvl="8" w:tentative="1">
+      <w:start w:val="1"/>
+      <w:numFmt w:val="bullet"/>
+      <w:lvlText w:val=""/>
+      <w:lvlJc w:val="left"/>
+      <w:pPr>
+        <w:tabs>
+          <w:tab w:val="num" w:pos="6480"/>
+        </w:tabs>
+        <w:ind w:left="6480" w:hanging="360"/>
+      </w:pPr>
+      <w:rPr>
+        <w:rFonts w:ascii="Wingdings" w:hAnsi="Wingdings" w:hint="default"/>
+        <w:sz w:val="20"/>
+      </w:rPr>
+    </w:lvl>
+  </w:abstractNum>
+  <w:abstractNum w:abstractNumId="1">
     <w:nsid w:val="07B00BF2"/>
     <w:multiLevelType w:val="multilevel"/>
     <w:tmpl w:val="FA5416C6"/>
@@ -705,7 +1770,7 @@
       </w:rPr>
     </w:lvl>
   </w:abstractNum>
-  <w:abstractNum w:abstractNumId="1" w15:restartNumberingAfterBreak="0">
+  <w:abstractNum w:abstractNumId="2">
     <w:nsid w:val="07CC49D6"/>
     <w:multiLevelType w:val="multilevel"/>
     <w:tmpl w:val="AA7A8E3A"/>
@@ -854,7 +1919,7 @@
       </w:rPr>
     </w:lvl>
   </w:abstractNum>
-  <w:abstractNum w:abstractNumId="2" w15:restartNumberingAfterBreak="0">
+  <w:abstractNum w:abstractNumId="3">
     <w:nsid w:val="0B9F1721"/>
     <w:multiLevelType w:val="multilevel"/>
     <w:tmpl w:val="F4CE0A32"/>
@@ -1003,7 +2068,156 @@
       </w:rPr>
     </w:lvl>
   </w:abstractNum>
-  <w:abstractNum w:abstractNumId="3" w15:restartNumberingAfterBreak="0">
+  <w:abstractNum w:abstractNumId="4">
+    <w:nsid w:val="0D5C44E5"/>
+    <w:multiLevelType w:val="multilevel"/>
+    <w:tmpl w:val="B3348786"/>
+    <w:lvl w:ilvl="0">
+      <w:start w:val="1"/>
+      <w:numFmt w:val="bullet"/>
+      <w:lvlText w:val=""/>
+      <w:lvlJc w:val="left"/>
+      <w:pPr>
+        <w:tabs>
+          <w:tab w:val="num" w:pos="720"/>
+        </w:tabs>
+        <w:ind w:left="720" w:hanging="360"/>
+      </w:pPr>
+      <w:rPr>
+        <w:rFonts w:ascii="Symbol" w:hAnsi="Symbol" w:hint="default"/>
+        <w:sz w:val="20"/>
+      </w:rPr>
+    </w:lvl>
+    <w:lvl w:ilvl="1" w:tentative="1">
+      <w:start w:val="1"/>
+      <w:numFmt w:val="bullet"/>
+      <w:lvlText w:val="o"/>
+      <w:lvlJc w:val="left"/>
+      <w:pPr>
+        <w:tabs>
+          <w:tab w:val="num" w:pos="1440"/>
+        </w:tabs>
+        <w:ind w:left="1440" w:hanging="360"/>
+      </w:pPr>
+      <w:rPr>
+        <w:rFonts w:ascii="Courier New" w:hAnsi="Courier New" w:hint="default"/>
+        <w:sz w:val="20"/>
+      </w:rPr>
+    </w:lvl>
+    <w:lvl w:ilvl="2" w:tentative="1">
+      <w:start w:val="1"/>
+      <w:numFmt w:val="bullet"/>
+      <w:lvlText w:val=""/>
+      <w:lvlJc w:val="left"/>
+      <w:pPr>
+        <w:tabs>
+          <w:tab w:val="num" w:pos="2160"/>
+        </w:tabs>
+        <w:ind w:left="2160" w:hanging="360"/>
+      </w:pPr>
+      <w:rPr>
+        <w:rFonts w:ascii="Wingdings" w:hAnsi="Wingdings" w:hint="default"/>
+        <w:sz w:val="20"/>
+      </w:rPr>
+    </w:lvl>
+    <w:lvl w:ilvl="3" w:tentative="1">
+      <w:start w:val="1"/>
+      <w:numFmt w:val="bullet"/>
+      <w:lvlText w:val=""/>
+      <w:lvlJc w:val="left"/>
+      <w:pPr>
+        <w:tabs>
+          <w:tab w:val="num" w:pos="2880"/>
+        </w:tabs>
+        <w:ind w:left="2880" w:hanging="360"/>
+      </w:pPr>
+      <w:rPr>
+        <w:rFonts w:ascii="Wingdings" w:hAnsi="Wingdings" w:hint="default"/>
+        <w:sz w:val="20"/>
+      </w:rPr>
+    </w:lvl>
+    <w:lvl w:ilvl="4" w:tentative="1">
+      <w:start w:val="1"/>
+      <w:numFmt w:val="bullet"/>
+      <w:lvlText w:val=""/>
+      <w:lvlJc w:val="left"/>
+      <w:pPr>
+        <w:tabs>
+          <w:tab w:val="num" w:pos="3600"/>
+        </w:tabs>
+        <w:ind w:left="3600" w:hanging="360"/>
+      </w:pPr>
+      <w:rPr>
+        <w:rFonts w:ascii="Wingdings" w:hAnsi="Wingdings" w:hint="default"/>
+        <w:sz w:val="20"/>
+      </w:rPr>
+    </w:lvl>
+    <w:lvl w:ilvl="5" w:tentative="1">
+      <w:start w:val="1"/>
+      <w:numFmt w:val="bullet"/>
+      <w:lvlText w:val=""/>
+      <w:lvlJc w:val="left"/>
+      <w:pPr>
+        <w:tabs>
+          <w:tab w:val="num" w:pos="4320"/>
+        </w:tabs>
+        <w:ind w:left="4320" w:hanging="360"/>
+      </w:pPr>
+      <w:rPr>
+        <w:rFonts w:ascii="Wingdings" w:hAnsi="Wingdings" w:hint="default"/>
+        <w:sz w:val="20"/>
+      </w:rPr>
+    </w:lvl>
+    <w:lvl w:ilvl="6" w:tentative="1">
+      <w:start w:val="1"/>
+      <w:numFmt w:val="bullet"/>
+      <w:lvlText w:val=""/>
+      <w:lvlJc w:val="left"/>
+      <w:pPr>
+        <w:tabs>
+          <w:tab w:val="num" w:pos="5040"/>
+        </w:tabs>
+        <w:ind w:left="5040" w:hanging="360"/>
+      </w:pPr>
+      <w:rPr>
+        <w:rFonts w:ascii="Wingdings" w:hAnsi="Wingdings" w:hint="default"/>
+        <w:sz w:val="20"/>
+      </w:rPr>
+    </w:lvl>
+    <w:lvl w:ilvl="7" w:tentative="1">
+      <w:start w:val="1"/>
+      <w:numFmt w:val="bullet"/>
+      <w:lvlText w:val=""/>
+      <w:lvlJc w:val="left"/>
+      <w:pPr>
+        <w:tabs>
+          <w:tab w:val="num" w:pos="5760"/>
+        </w:tabs>
+        <w:ind w:left="5760" w:hanging="360"/>
+      </w:pPr>
+      <w:rPr>
+        <w:rFonts w:ascii="Wingdings" w:hAnsi="Wingdings" w:hint="default"/>
+        <w:sz w:val="20"/>
+      </w:rPr>
+    </w:lvl>
+    <w:lvl w:ilvl="8" w:tentative="1">
+      <w:start w:val="1"/>
+      <w:numFmt w:val="bullet"/>
+      <w:lvlText w:val=""/>
+      <w:lvlJc w:val="left"/>
+      <w:pPr>
+        <w:tabs>
+          <w:tab w:val="num" w:pos="6480"/>
+        </w:tabs>
+        <w:ind w:left="6480" w:hanging="360"/>
+      </w:pPr>
+      <w:rPr>
+        <w:rFonts w:ascii="Wingdings" w:hAnsi="Wingdings" w:hint="default"/>
+        <w:sz w:val="20"/>
+      </w:rPr>
+    </w:lvl>
+  </w:abstractNum>
+  <w:abstractNum w:abstractNumId="5">
     <w:nsid w:val="0FB8304D"/>
     <w:multiLevelType w:val="multilevel"/>
     <w:tmpl w:val="63C624E2"/>
@@ -1125,7 +2339,7 @@
       </w:rPr>
     </w:lvl>
   </w:abstractNum>
-  <w:abstractNum w:abstractNumId="4" w15:restartNumberingAfterBreak="0">
+  <w:abstractNum w:abstractNumId="6">
     <w:nsid w:val="178D1E89"/>
     <w:multiLevelType w:val="multilevel"/>
     <w:tmpl w:val="64A0D09C"/>
@@ -1246,7 +2460,7 @@
       </w:pPr>
     </w:lvl>
   </w:abstractNum>
-  <w:abstractNum w:abstractNumId="5" w15:restartNumberingAfterBreak="0">
+  <w:abstractNum w:abstractNumId="7">
     <w:nsid w:val="215B4E67"/>
     <w:multiLevelType w:val="multilevel"/>
     <w:tmpl w:val="235E4AEA"/>
@@ -1368,7 +2582,305 @@
       </w:rPr>
     </w:lvl>
   </w:abstractNum>
-  <w:abstractNum w:abstractNumId="6" w15:restartNumberingAfterBreak="0">
+  <w:abstractNum w:abstractNumId="8">
+    <w:nsid w:val="25432EBD"/>
+    <w:multiLevelType w:val="multilevel"/>
+    <w:tmpl w:val="A88226A6"/>
+    <w:lvl w:ilvl="0">
+      <w:start w:val="1"/>
+      <w:numFmt w:val="bullet"/>
+      <w:lvlText w:val=""/>
+      <w:lvlJc w:val="left"/>
+      <w:pPr>
+        <w:tabs>
+          <w:tab w:val="num" w:pos="720"/>
+        </w:tabs>
+        <w:ind w:left="720" w:hanging="360"/>
+      </w:pPr>
+      <w:rPr>
+        <w:rFonts w:ascii="Symbol" w:hAnsi="Symbol" w:hint="default"/>
+        <w:sz w:val="20"/>
+      </w:rPr>
+    </w:lvl>
+    <w:lvl w:ilvl="1" w:tentative="1">
+      <w:start w:val="1"/>
+      <w:numFmt w:val="bullet"/>
+      <w:lvlText w:val="o"/>
+      <w:lvlJc w:val="left"/>
+      <w:pPr>
+        <w:tabs>
+          <w:tab w:val="num" w:pos="1440"/>
+        </w:tabs>
+        <w:ind w:left="1440" w:hanging="360"/>
+      </w:pPr>
+      <w:rPr>
+        <w:rFonts w:ascii="Courier New" w:hAnsi="Courier New" w:hint="default"/>
+        <w:sz w:val="20"/>
+      </w:rPr>
+    </w:lvl>
+    <w:lvl w:ilvl="2" w:tentative="1">
+      <w:start w:val="1"/>
+      <w:numFmt w:val="bullet"/>
+      <w:lvlText w:val=""/>
+      <w:lvlJc w:val="left"/>
+      <w:pPr>
+        <w:tabs>
+          <w:tab w:val="num" w:pos="2160"/>
+        </w:tabs>
+        <w:ind w:left="2160" w:hanging="360"/>
+      </w:pPr>
+      <w:rPr>
+        <w:rFonts w:ascii="Wingdings" w:hAnsi="Wingdings" w:hint="default"/>
+        <w:sz w:val="20"/>
+      </w:rPr>
+    </w:lvl>
+    <w:lvl w:ilvl="3" w:tentative="1">
+      <w:start w:val="1"/>
+      <w:numFmt w:val="bullet"/>
+      <w:lvlText w:val=""/>
+      <w:lvlJc w:val="left"/>
+      <w:pPr>
+        <w:tabs>
+          <w:tab w:val="num" w:pos="2880"/>
+        </w:tabs>
+        <w:ind w:left="2880" w:hanging="360"/>
+      </w:pPr>
+      <w:rPr>
+        <w:rFonts w:ascii="Wingdings" w:hAnsi="Wingdings" w:hint="default"/>
+        <w:sz w:val="20"/>
+      </w:rPr>
+    </w:lvl>
+    <w:lvl w:ilvl="4" w:tentative="1">
+      <w:start w:val="1"/>
+      <w:numFmt w:val="bullet"/>
+      <w:lvlText w:val=""/>
+      <w:lvlJc w:val="left"/>
+      <w:pPr>
+        <w:tabs>
+          <w:tab w:val="num" w:pos="3600"/>
+        </w:tabs>
+        <w:ind w:left="3600" w:hanging="360"/>
+      </w:pPr>
+      <w:rPr>
+        <w:rFonts w:ascii="Wingdings" w:hAnsi="Wingdings" w:hint="default"/>
+        <w:sz w:val="20"/>
+      </w:rPr>
+    </w:lvl>
+    <w:lvl w:ilvl="5" w:tentative="1">
+      <w:start w:val="1"/>
+      <w:numFmt w:val="bullet"/>
+      <w:lvlText w:val=""/>
+      <w:lvlJc w:val="left"/>
+      <w:pPr>
+        <w:tabs>
+          <w:tab w:val="num" w:pos="4320"/>
+        </w:tabs>
+        <w:ind w:left="4320" w:hanging="360"/>
+      </w:pPr>
+      <w:rPr>
+        <w:rFonts w:ascii="Wingdings" w:hAnsi="Wingdings" w:hint="default"/>
+        <w:sz w:val="20"/>
+      </w:rPr>
+    </w:lvl>
+    <w:lvl w:ilvl="6" w:tentative="1">
+      <w:start w:val="1"/>
+      <w:numFmt w:val="bullet"/>
+      <w:lvlText w:val=""/>
+      <w:lvlJc w:val="left"/>
+      <w:pPr>
+        <w:tabs>
+          <w:tab w:val="num" w:pos="5040"/>
+        </w:tabs>
+        <w:ind w:left="5040" w:hanging="360"/>
+      </w:pPr>
+      <w:rPr>
+        <w:rFonts w:ascii="Wingdings" w:hAnsi="Wingdings" w:hint="default"/>
+        <w:sz w:val="20"/>
+      </w:rPr>
+    </w:lvl>
+    <w:lvl w:ilvl="7" w:tentative="1">
+      <w:start w:val="1"/>
+      <w:numFmt w:val="bullet"/>
+      <w:lvlText w:val=""/>
+      <w:lvlJc w:val="left"/>
+      <w:pPr>
+        <w:tabs>
+          <w:tab w:val="num" w:pos="5760"/>
+        </w:tabs>
+        <w:ind w:left="5760" w:hanging="360"/>
+      </w:pPr>
+      <w:rPr>
+        <w:rFonts w:ascii="Wingdings" w:hAnsi="Wingdings" w:hint="default"/>
+        <w:sz w:val="20"/>
+      </w:rPr>
+    </w:lvl>
+    <w:lvl w:ilvl="8" w:tentative="1">
+      <w:start w:val="1"/>
+      <w:numFmt w:val="bullet"/>
+      <w:lvlText w:val=""/>
+      <w:lvlJc w:val="left"/>
+      <w:pPr>
+        <w:tabs>
+          <w:tab w:val="num" w:pos="6480"/>
+        </w:tabs>
+        <w:ind w:left="6480" w:hanging="360"/>
+      </w:pPr>
+      <w:rPr>
+        <w:rFonts w:ascii="Wingdings" w:hAnsi="Wingdings" w:hint="default"/>
+        <w:sz w:val="20"/>
+      </w:rPr>
+    </w:lvl>
+  </w:abstractNum>
+  <w:abstractNum w:abstractNumId="9">
+    <w:nsid w:val="2BAB0BF2"/>
+    <w:multiLevelType w:val="multilevel"/>
+    <w:tmpl w:val="C548190E"/>
+    <w:lvl w:ilvl="0">
+      <w:start w:val="1"/>
+      <w:numFmt w:val="bullet"/>
+      <w:lvlText w:val=""/>
+      <w:lvlJc w:val="left"/>
+      <w:pPr>
+        <w:tabs>
+          <w:tab w:val="num" w:pos="720"/>
+        </w:tabs>
+        <w:ind w:left="720" w:hanging="360"/>
+      </w:pPr>
+      <w:rPr>
+        <w:rFonts w:ascii="Symbol" w:hAnsi="Symbol" w:hint="default"/>
+        <w:sz w:val="20"/>
+      </w:rPr>
+    </w:lvl>
+    <w:lvl w:ilvl="1" w:tentative="1">
+      <w:start w:val="1"/>
+      <w:numFmt w:val="bullet"/>
+      <w:lvlText w:val="o"/>
+      <w:lvlJc w:val="left"/>
+      <w:pPr>
+        <w:tabs>
+          <w:tab w:val="num" w:pos="1440"/>
+        </w:tabs>
+        <w:ind w:left="1440" w:hanging="360"/>
+      </w:pPr>
+      <w:rPr>
+        <w:rFonts w:ascii="Courier New" w:hAnsi="Courier New" w:hint="default"/>
+        <w:sz w:val="20"/>
+      </w:rPr>
+    </w:lvl>
+    <w:lvl w:ilvl="2" w:tentative="1">
+      <w:start w:val="1"/>
+      <w:numFmt w:val="bullet"/>
+      <w:lvlText w:val=""/>
+      <w:lvlJc w:val="left"/>
+      <w:pPr>
+        <w:tabs>
+          <w:tab w:val="num" w:pos="2160"/>
+        </w:tabs>
+        <w:ind w:left="2160" w:hanging="360"/>
+      </w:pPr>
+      <w:rPr>
+        <w:rFonts w:ascii="Wingdings" w:hAnsi="Wingdings" w:hint="default"/>
+        <w:sz w:val="20"/>
+      </w:rPr>
+    </w:lvl>
+    <w:lvl w:ilvl="3" w:tentative="1">
+      <w:start w:val="1"/>
+      <w:numFmt w:val="bullet"/>
+      <w:lvlText w:val=""/>
+      <w:lvlJc w:val="left"/>
+      <w:pPr>
+        <w:tabs>
+          <w:tab w:val="num" w:pos="2880"/>
+        </w:tabs>
+        <w:ind w:left="2880" w:hanging="360"/>
+      </w:pPr>
+      <w:rPr>
+        <w:rFonts w:ascii="Wingdings" w:hAnsi="Wingdings" w:hint="default"/>
+        <w:sz w:val="20"/>
+      </w:rPr>
+    </w:lvl>
+    <w:lvl w:ilvl="4" w:tentative="1">
+      <w:start w:val="1"/>
+      <w:numFmt w:val="bullet"/>
+      <w:lvlText w:val=""/>
+      <w:lvlJc w:val="left"/>
+      <w:pPr>
+        <w:tabs>
+          <w:tab w:val="num" w:pos="3600"/>
+        </w:tabs>
+        <w:ind w:left="3600" w:hanging="360"/>
+      </w:pPr>
+      <w:rPr>
+        <w:rFonts w:ascii="Wingdings" w:hAnsi="Wingdings" w:hint="default"/>
+        <w:sz w:val="20"/>
+      </w:rPr>
+    </w:lvl>
+    <w:lvl w:ilvl="5" w:tentative="1">
+      <w:start w:val="1"/>
+      <w:numFmt w:val="bullet"/>
+      <w:lvlText w:val=""/>
+      <w:lvlJc w:val="left"/>
+      <w:pPr>
+        <w:tabs>
+          <w:tab w:val="num" w:pos="4320"/>
+        </w:tabs>
+        <w:ind w:left="4320" w:hanging="360"/>
+      </w:pPr>
+      <w:rPr>
+        <w:rFonts w:ascii="Wingdings" w:hAnsi="Wingdings" w:hint="default"/>
+        <w:sz w:val="20"/>
+      </w:rPr>
+    </w:lvl>
+    <w:lvl w:ilvl="6" w:tentative="1">
+      <w:start w:val="1"/>
+      <w:numFmt w:val="bullet"/>
+      <w:lvlText w:val=""/>
+      <w:lvlJc w:val="left"/>
+      <w:pPr>
+        <w:tabs>
+          <w:tab w:val="num" w:pos="5040"/>
+        </w:tabs>
+        <w:ind w:left="5040" w:hanging="360"/>
+      </w:pPr>
+      <w:rPr>
+        <w:rFonts w:ascii="Wingdings" w:hAnsi="Wingdings" w:hint="default"/>
+        <w:sz w:val="20"/>
+      </w:rPr>
+    </w:lvl>
+    <w:lvl w:ilvl="7" w:tentative="1">
+      <w:start w:val="1"/>
+      <w:numFmt w:val="bullet"/>
+      <w:lvlText w:val=""/>
+      <w:lvlJc w:val="left"/>
+      <w:pPr>
+        <w:tabs>
+          <w:tab w:val="num" w:pos="5760"/>
+        </w:tabs>
+        <w:ind w:left="5760" w:hanging="360"/>
+      </w:pPr>
+      <w:rPr>
+        <w:rFonts w:ascii="Wingdings" w:hAnsi="Wingdings" w:hint="default"/>
+        <w:sz w:val="20"/>
+      </w:rPr>
+    </w:lvl>
+    <w:lvl w:ilvl="8" w:tentative="1">
+      <w:start w:val="1"/>
+      <w:numFmt w:val="bullet"/>
+      <w:lvlText w:val=""/>
+      <w:lvlJc w:val="left"/>
+      <w:pPr>
+        <w:tabs>
+          <w:tab w:val="num" w:pos="6480"/>
+        </w:tabs>
+        <w:ind w:left="6480" w:hanging="360"/>
+      </w:pPr>
+      <w:rPr>
+        <w:rFonts w:ascii="Wingdings" w:hAnsi="Wingdings" w:hint="default"/>
+        <w:sz w:val="20"/>
+      </w:rPr>
+    </w:lvl>
+  </w:abstractNum>
+  <w:abstractNum w:abstractNumId="10">
     <w:nsid w:val="310C5824"/>
     <w:multiLevelType w:val="multilevel"/>
     <w:tmpl w:val="3F1A578A"/>
@@ -1517,7 +3029,543 @@
       </w:rPr>
     </w:lvl>
   </w:abstractNum>
-  <w:abstractNum w:abstractNumId="7" w15:restartNumberingAfterBreak="0">
+  <w:abstractNum w:abstractNumId="11">
+    <w:nsid w:val="33ED51BF"/>
+    <w:multiLevelType w:val="hybridMultilevel"/>
+    <w:tmpl w:val="48901C52"/>
+    <w:lvl w:ilvl="0" w:tplc="0409000F">
+      <w:start w:val="1"/>
+      <w:numFmt w:val="decimal"/>
+      <w:lvlText w:val="%1."/>
+      <w:lvlJc w:val="left"/>
+      <w:pPr>
+        <w:ind w:left="720" w:hanging="360"/>
+      </w:pPr>
+      <w:rPr>
+        <w:rFonts w:hint="default"/>
+      </w:rPr>
+    </w:lvl>
+    <w:lvl w:ilvl="1" w:tplc="04090019" w:tentative="1">
+      <w:start w:val="1"/>
+      <w:numFmt w:val="lowerLetter"/>
+      <w:lvlText w:val="%2."/>
+      <w:lvlJc w:val="left"/>
+      <w:pPr>
+        <w:ind w:left="1440" w:hanging="360"/>
+      </w:pPr>
+    </w:lvl>
+    <w:lvl w:ilvl="2" w:tplc="0409001B" w:tentative="1">
+      <w:start w:val="1"/>
+      <w:numFmt w:val="lowerRoman"/>
+      <w:lvlText w:val="%3."/>
+      <w:lvlJc w:val="right"/>
+      <w:pPr>
+        <w:ind w:left="2160" w:hanging="180"/>
+      </w:pPr>
+    </w:lvl>
+    <w:lvl w:ilvl="3" w:tplc="0409000F" w:tentative="1">
+      <w:start w:val="1"/>
+      <w:numFmt w:val="decimal"/>
+      <w:lvlText w:val="%4."/>
+      <w:lvlJc w:val="left"/>
+      <w:pPr>
+        <w:ind w:left="2880" w:hanging="360"/>
+      </w:pPr>
+    </w:lvl>
+    <w:lvl w:ilvl="4" w:tplc="04090019" w:tentative="1">
+      <w:start w:val="1"/>
+      <w:numFmt w:val="lowerLetter"/>
+      <w:lvlText w:val="%5."/>
+      <w:lvlJc w:val="left"/>
+      <w:pPr>
+        <w:ind w:left="3600" w:hanging="360"/>
+      </w:pPr>
+    </w:lvl>
+    <w:lvl w:ilvl="5" w:tplc="0409001B" w:tentative="1">
+      <w:start w:val="1"/>
+      <w:numFmt w:val="lowerRoman"/>
+      <w:lvlText w:val="%6."/>
+      <w:lvlJc w:val="right"/>
+      <w:pPr>
+        <w:ind w:left="4320" w:hanging="180"/>
+      </w:pPr>
+    </w:lvl>
+    <w:lvl w:ilvl="6" w:tplc="0409000F" w:tentative="1">
+      <w:start w:val="1"/>
+      <w:numFmt w:val="decimal"/>
+      <w:lvlText w:val="%7."/>
+      <w:lvlJc w:val="left"/>
+      <w:pPr>
+        <w:ind w:left="5040" w:hanging="360"/>
+      </w:pPr>
+    </w:lvl>
+    <w:lvl w:ilvl="7" w:tplc="04090019" w:tentative="1">
+      <w:start w:val="1"/>
+      <w:numFmt w:val="lowerLetter"/>
+      <w:lvlText w:val="%8."/>
+      <w:lvlJc w:val="left"/>
+      <w:pPr>
+        <w:ind w:left="5760" w:hanging="360"/>
+      </w:pPr>
+    </w:lvl>
+    <w:lvl w:ilvl="8" w:tplc="0409001B" w:tentative="1">
+      <w:start w:val="1"/>
+      <w:numFmt w:val="lowerRoman"/>
+      <w:lvlText w:val="%9."/>
+      <w:lvlJc w:val="right"/>
+      <w:pPr>
+        <w:ind w:left="6480" w:hanging="180"/>
+      </w:pPr>
+    </w:lvl>
+  </w:abstractNum>
+  <w:abstractNum w:abstractNumId="12">
+    <w:nsid w:val="387C27BB"/>
+    <w:multiLevelType w:val="multilevel"/>
+    <w:tmpl w:val="D81EA4A6"/>
+    <w:lvl w:ilvl="0">
+      <w:start w:val="1"/>
+      <w:numFmt w:val="bullet"/>
+      <w:lvlText w:val=""/>
+      <w:lvlJc w:val="left"/>
+      <w:pPr>
+        <w:tabs>
+          <w:tab w:val="num" w:pos="720"/>
+        </w:tabs>
+        <w:ind w:left="720" w:hanging="360"/>
+      </w:pPr>
+      <w:rPr>
+        <w:rFonts w:ascii="Symbol" w:hAnsi="Symbol" w:hint="default"/>
+        <w:sz w:val="20"/>
+      </w:rPr>
+    </w:lvl>
+    <w:lvl w:ilvl="1" w:tentative="1">
+      <w:start w:val="1"/>
+      <w:numFmt w:val="bullet"/>
+      <w:lvlText w:val="o"/>
+      <w:lvlJc w:val="left"/>
+      <w:pPr>
+        <w:tabs>
+          <w:tab w:val="num" w:pos="1440"/>
+        </w:tabs>
+        <w:ind w:left="1440" w:hanging="360"/>
+      </w:pPr>
+      <w:rPr>
+        <w:rFonts w:ascii="Courier New" w:hAnsi="Courier New" w:hint="default"/>
+        <w:sz w:val="20"/>
+      </w:rPr>
+    </w:lvl>
+    <w:lvl w:ilvl="2" w:tentative="1">
+      <w:start w:val="1"/>
+      <w:numFmt w:val="bullet"/>
+      <w:lvlText w:val=""/>
+      <w:lvlJc w:val="left"/>
+      <w:pPr>
+        <w:tabs>
+          <w:tab w:val="num" w:pos="2160"/>
+        </w:tabs>
+        <w:ind w:left="2160" w:hanging="360"/>
+      </w:pPr>
+      <w:rPr>
+        <w:rFonts w:ascii="Wingdings" w:hAnsi="Wingdings" w:hint="default"/>
+        <w:sz w:val="20"/>
+      </w:rPr>
+    </w:lvl>
+    <w:lvl w:ilvl="3" w:tentative="1">
+      <w:start w:val="1"/>
+      <w:numFmt w:val="bullet"/>
+      <w:lvlText w:val=""/>
+      <w:lvlJc w:val="left"/>
+      <w:pPr>
+        <w:tabs>
+          <w:tab w:val="num" w:pos="2880"/>
+        </w:tabs>
+        <w:ind w:left="2880" w:hanging="360"/>
+      </w:pPr>
+      <w:rPr>
+        <w:rFonts w:ascii="Wingdings" w:hAnsi="Wingdings" w:hint="default"/>
+        <w:sz w:val="20"/>
+      </w:rPr>
+    </w:lvl>
+    <w:lvl w:ilvl="4" w:tentative="1">
+      <w:start w:val="1"/>
+      <w:numFmt w:val="bullet"/>
+      <w:lvlText w:val=""/>
+      <w:lvlJc w:val="left"/>
+      <w:pPr>
+        <w:tabs>
+          <w:tab w:val="num" w:pos="3600"/>
+        </w:tabs>
+        <w:ind w:left="3600" w:hanging="360"/>
+      </w:pPr>
+      <w:rPr>
+        <w:rFonts w:ascii="Wingdings" w:hAnsi="Wingdings" w:hint="default"/>
+        <w:sz w:val="20"/>
+      </w:rPr>
+    </w:lvl>
+    <w:lvl w:ilvl="5" w:tentative="1">
+      <w:start w:val="1"/>
+      <w:numFmt w:val="bullet"/>
+      <w:lvlText w:val=""/>
+      <w:lvlJc w:val="left"/>
+      <w:pPr>
+        <w:tabs>
+          <w:tab w:val="num" w:pos="4320"/>
+        </w:tabs>
+        <w:ind w:left="4320" w:hanging="360"/>
+      </w:pPr>
+      <w:rPr>
+        <w:rFonts w:ascii="Wingdings" w:hAnsi="Wingdings" w:hint="default"/>
+        <w:sz w:val="20"/>
+      </w:rPr>
+    </w:lvl>
+    <w:lvl w:ilvl="6" w:tentative="1">
+      <w:start w:val="1"/>
+      <w:numFmt w:val="bullet"/>
+      <w:lvlText w:val=""/>
+      <w:lvlJc w:val="left"/>
+      <w:pPr>
+        <w:tabs>
+          <w:tab w:val="num" w:pos="5040"/>
+        </w:tabs>
+        <w:ind w:left="5040" w:hanging="360"/>
+      </w:pPr>
+      <w:rPr>
+        <w:rFonts w:ascii="Wingdings" w:hAnsi="Wingdings" w:hint="default"/>
+        <w:sz w:val="20"/>
+      </w:rPr>
+    </w:lvl>
+    <w:lvl w:ilvl="7" w:tentative="1">
+      <w:start w:val="1"/>
+      <w:numFmt w:val="bullet"/>
+      <w:lvlText w:val=""/>
+      <w:lvlJc w:val="left"/>
+      <w:pPr>
+        <w:tabs>
+          <w:tab w:val="num" w:pos="5760"/>
+        </w:tabs>
+        <w:ind w:left="5760" w:hanging="360"/>
+      </w:pPr>
+      <w:rPr>
+        <w:rFonts w:ascii="Wingdings" w:hAnsi="Wingdings" w:hint="default"/>
+        <w:sz w:val="20"/>
+      </w:rPr>
+    </w:lvl>
+    <w:lvl w:ilvl="8" w:tentative="1">
+      <w:start w:val="1"/>
+      <w:numFmt w:val="bullet"/>
+      <w:lvlText w:val=""/>
+      <w:lvlJc w:val="left"/>
+      <w:pPr>
+        <w:tabs>
+          <w:tab w:val="num" w:pos="6480"/>
+        </w:tabs>
+        <w:ind w:left="6480" w:hanging="360"/>
+      </w:pPr>
+      <w:rPr>
+        <w:rFonts w:ascii="Wingdings" w:hAnsi="Wingdings" w:hint="default"/>
+        <w:sz w:val="20"/>
+      </w:rPr>
+    </w:lvl>
+  </w:abstractNum>
+  <w:abstractNum w:abstractNumId="13">
+    <w:nsid w:val="445C3565"/>
+    <w:multiLevelType w:val="multilevel"/>
+    <w:tmpl w:val="5CB04B10"/>
+    <w:lvl w:ilvl="0">
+      <w:start w:val="1"/>
+      <w:numFmt w:val="bullet"/>
+      <w:lvlText w:val=""/>
+      <w:lvlJc w:val="left"/>
+      <w:pPr>
+        <w:tabs>
+          <w:tab w:val="num" w:pos="720"/>
+        </w:tabs>
+        <w:ind w:left="720" w:hanging="360"/>
+      </w:pPr>
+      <w:rPr>
+        <w:rFonts w:ascii="Symbol" w:hAnsi="Symbol" w:hint="default"/>
+        <w:sz w:val="20"/>
+      </w:rPr>
+    </w:lvl>
+    <w:lvl w:ilvl="1" w:tentative="1">
+      <w:start w:val="1"/>
+      <w:numFmt w:val="bullet"/>
+      <w:lvlText w:val="o"/>
+      <w:lvlJc w:val="left"/>
+      <w:pPr>
+        <w:tabs>
+          <w:tab w:val="num" w:pos="1440"/>
+        </w:tabs>
+        <w:ind w:left="1440" w:hanging="360"/>
+      </w:pPr>
+      <w:rPr>
+        <w:rFonts w:ascii="Courier New" w:hAnsi="Courier New" w:hint="default"/>
+        <w:sz w:val="20"/>
+      </w:rPr>
+    </w:lvl>
+    <w:lvl w:ilvl="2" w:tentative="1">
+      <w:start w:val="1"/>
+      <w:numFmt w:val="bullet"/>
+      <w:lvlText w:val=""/>
+      <w:lvlJc w:val="left"/>
+      <w:pPr>
+        <w:tabs>
+          <w:tab w:val="num" w:pos="2160"/>
+        </w:tabs>
+        <w:ind w:left="2160" w:hanging="360"/>
+      </w:pPr>
+      <w:rPr>
+        <w:rFonts w:ascii="Wingdings" w:hAnsi="Wingdings" w:hint="default"/>
+        <w:sz w:val="20"/>
+      </w:rPr>
+    </w:lvl>
+    <w:lvl w:ilvl="3" w:tentative="1">
+      <w:start w:val="1"/>
+      <w:numFmt w:val="bullet"/>
+      <w:lvlText w:val=""/>
+      <w:lvlJc w:val="left"/>
+      <w:pPr>
+        <w:tabs>
+          <w:tab w:val="num" w:pos="2880"/>
+        </w:tabs>
+        <w:ind w:left="2880" w:hanging="360"/>
+      </w:pPr>
+      <w:rPr>
+        <w:rFonts w:ascii="Wingdings" w:hAnsi="Wingdings" w:hint="default"/>
+        <w:sz w:val="20"/>
+      </w:rPr>
+    </w:lvl>
+    <w:lvl w:ilvl="4" w:tentative="1">
+      <w:start w:val="1"/>
+      <w:numFmt w:val="bullet"/>
+      <w:lvlText w:val=""/>
+      <w:lvlJc w:val="left"/>
+      <w:pPr>
+        <w:tabs>
+          <w:tab w:val="num" w:pos="3600"/>
+        </w:tabs>
+        <w:ind w:left="3600" w:hanging="360"/>
+      </w:pPr>
+      <w:rPr>
+        <w:rFonts w:ascii="Wingdings" w:hAnsi="Wingdings" w:hint="default"/>
+        <w:sz w:val="20"/>
+      </w:rPr>
+    </w:lvl>
+    <w:lvl w:ilvl="5" w:tentative="1">
+      <w:start w:val="1"/>
+      <w:numFmt w:val="bullet"/>
+      <w:lvlText w:val=""/>
+      <w:lvlJc w:val="left"/>
+      <w:pPr>
+        <w:tabs>
+          <w:tab w:val="num" w:pos="4320"/>
+        </w:tabs>
+        <w:ind w:left="4320" w:hanging="360"/>
+      </w:pPr>
+      <w:rPr>
+        <w:rFonts w:ascii="Wingdings" w:hAnsi="Wingdings" w:hint="default"/>
+        <w:sz w:val="20"/>
+      </w:rPr>
+    </w:lvl>
+    <w:lvl w:ilvl="6" w:tentative="1">
+      <w:start w:val="1"/>
+      <w:numFmt w:val="bullet"/>
+      <w:lvlText w:val=""/>
+      <w:lvlJc w:val="left"/>
+      <w:pPr>
+        <w:tabs>
+          <w:tab w:val="num" w:pos="5040"/>
+        </w:tabs>
+        <w:ind w:left="5040" w:hanging="360"/>
+      </w:pPr>
+      <w:rPr>
+        <w:rFonts w:ascii="Wingdings" w:hAnsi="Wingdings" w:hint="default"/>
+        <w:sz w:val="20"/>
+      </w:rPr>
+    </w:lvl>
+    <w:lvl w:ilvl="7" w:tentative="1">
+      <w:start w:val="1"/>
+      <w:numFmt w:val="bullet"/>
+      <w:lvlText w:val=""/>
+      <w:lvlJc w:val="left"/>
+      <w:pPr>
+        <w:tabs>
+          <w:tab w:val="num" w:pos="5760"/>
+        </w:tabs>
+        <w:ind w:left="5760" w:hanging="360"/>
+      </w:pPr>
+      <w:rPr>
+        <w:rFonts w:ascii="Wingdings" w:hAnsi="Wingdings" w:hint="default"/>
+        <w:sz w:val="20"/>
+      </w:rPr>
+    </w:lvl>
+    <w:lvl w:ilvl="8" w:tentative="1">
+      <w:start w:val="1"/>
+      <w:numFmt w:val="bullet"/>
+      <w:lvlText w:val=""/>
+      <w:lvlJc w:val="left"/>
+      <w:pPr>
+        <w:tabs>
+          <w:tab w:val="num" w:pos="6480"/>
+        </w:tabs>
+        <w:ind w:left="6480" w:hanging="360"/>
+      </w:pPr>
+      <w:rPr>
+        <w:rFonts w:ascii="Wingdings" w:hAnsi="Wingdings" w:hint="default"/>
+        <w:sz w:val="20"/>
+      </w:rPr>
+    </w:lvl>
+  </w:abstractNum>
+  <w:abstractNum w:abstractNumId="14">
+    <w:nsid w:val="46D77447"/>
+    <w:multiLevelType w:val="multilevel"/>
+    <w:tmpl w:val="177E9CD4"/>
+    <w:lvl w:ilvl="0">
+      <w:start w:val="1"/>
+      <w:numFmt w:val="bullet"/>
+      <w:lvlText w:val=""/>
+      <w:lvlJc w:val="left"/>
+      <w:pPr>
+        <w:tabs>
+          <w:tab w:val="num" w:pos="720"/>
+        </w:tabs>
+        <w:ind w:left="720" w:hanging="360"/>
+      </w:pPr>
+      <w:rPr>
+        <w:rFonts w:ascii="Symbol" w:hAnsi="Symbol" w:hint="default"/>
+        <w:sz w:val="20"/>
+      </w:rPr>
+    </w:lvl>
+    <w:lvl w:ilvl="1" w:tentative="1">
+      <w:start w:val="1"/>
+      <w:numFmt w:val="bullet"/>
+      <w:lvlText w:val="o"/>
+      <w:lvlJc w:val="left"/>
+      <w:pPr>
+        <w:tabs>
+          <w:tab w:val="num" w:pos="1440"/>
+        </w:tabs>
+        <w:ind w:left="1440" w:hanging="360"/>
+      </w:pPr>
+      <w:rPr>
+        <w:rFonts w:ascii="Courier New" w:hAnsi="Courier New" w:hint="default"/>
+        <w:sz w:val="20"/>
+      </w:rPr>
+    </w:lvl>
+    <w:lvl w:ilvl="2" w:tentative="1">
+      <w:start w:val="1"/>
+      <w:numFmt w:val="bullet"/>
+      <w:lvlText w:val=""/>
+      <w:lvlJc w:val="left"/>
+      <w:pPr>
+        <w:tabs>
+          <w:tab w:val="num" w:pos="2160"/>
+        </w:tabs>
+        <w:ind w:left="2160" w:hanging="360"/>
+      </w:pPr>
+      <w:rPr>
+        <w:rFonts w:ascii="Wingdings" w:hAnsi="Wingdings" w:hint="default"/>
+        <w:sz w:val="20"/>
+      </w:rPr>
+    </w:lvl>
+    <w:lvl w:ilvl="3" w:tentative="1">
+      <w:start w:val="1"/>
+      <w:numFmt w:val="bullet"/>
+      <w:lvlText w:val=""/>
+      <w:lvlJc w:val="left"/>
+      <w:pPr>
+        <w:tabs>
+          <w:tab w:val="num" w:pos="2880"/>
+        </w:tabs>
+        <w:ind w:left="2880" w:hanging="360"/>
+      </w:pPr>
+      <w:rPr>
+        <w:rFonts w:ascii="Wingdings" w:hAnsi="Wingdings" w:hint="default"/>
+        <w:sz w:val="20"/>
+      </w:rPr>
+    </w:lvl>
+    <w:lvl w:ilvl="4" w:tentative="1">
+      <w:start w:val="1"/>
+      <w:numFmt w:val="bullet"/>
+      <w:lvlText w:val=""/>
+      <w:lvlJc w:val="left"/>
+      <w:pPr>
+        <w:tabs>
+          <w:tab w:val="num" w:pos="3600"/>
+        </w:tabs>
+        <w:ind w:left="3600" w:hanging="360"/>
+      </w:pPr>
+      <w:rPr>
+        <w:rFonts w:ascii="Wingdings" w:hAnsi="Wingdings" w:hint="default"/>
+        <w:sz w:val="20"/>
+      </w:rPr>
+    </w:lvl>
+    <w:lvl w:ilvl="5" w:tentative="1">
+      <w:start w:val="1"/>
+      <w:numFmt w:val="bullet"/>
+      <w:lvlText w:val=""/>
+      <w:lvlJc w:val="left"/>
+      <w:pPr>
+        <w:tabs>
+          <w:tab w:val="num" w:pos="4320"/>
+        </w:tabs>
+        <w:ind w:left="4320" w:hanging="360"/>
+      </w:pPr>
+      <w:rPr>
+        <w:rFonts w:ascii="Wingdings" w:hAnsi="Wingdings" w:hint="default"/>
+        <w:sz w:val="20"/>
+      </w:rPr>
+    </w:lvl>
+    <w:lvl w:ilvl="6" w:tentative="1">
+      <w:start w:val="1"/>
+      <w:numFmt w:val="bullet"/>
+      <w:lvlText w:val=""/>
+      <w:lvlJc w:val="left"/>
+      <w:pPr>
+        <w:tabs>
+          <w:tab w:val="num" w:pos="5040"/>
+        </w:tabs>
+        <w:ind w:left="5040" w:hanging="360"/>
+      </w:pPr>
+      <w:rPr>
+        <w:rFonts w:ascii="Wingdings" w:hAnsi="Wingdings" w:hint="default"/>
+        <w:sz w:val="20"/>
+      </w:rPr>
+    </w:lvl>
+    <w:lvl w:ilvl="7" w:tentative="1">
+      <w:start w:val="1"/>
+      <w:numFmt w:val="bullet"/>
+      <w:lvlText w:val=""/>
+      <w:lvlJc w:val="left"/>
+      <w:pPr>
+        <w:tabs>
+          <w:tab w:val="num" w:pos="5760"/>
+        </w:tabs>
+        <w:ind w:left="5760" w:hanging="360"/>
+      </w:pPr>
+      <w:rPr>
+        <w:rFonts w:ascii="Wingdings" w:hAnsi="Wingdings" w:hint="default"/>
+        <w:sz w:val="20"/>
+      </w:rPr>
+    </w:lvl>
+    <w:lvl w:ilvl="8" w:tentative="1">
+      <w:start w:val="1"/>
+      <w:numFmt w:val="bullet"/>
+      <w:lvlText w:val=""/>
+      <w:lvlJc w:val="left"/>
+      <w:pPr>
+        <w:tabs>
+          <w:tab w:val="num" w:pos="6480"/>
+        </w:tabs>
+        <w:ind w:left="6480" w:hanging="360"/>
+      </w:pPr>
+      <w:rPr>
+        <w:rFonts w:ascii="Wingdings" w:hAnsi="Wingdings" w:hint="default"/>
+        <w:sz w:val="20"/>
+      </w:rPr>
+    </w:lvl>
+  </w:abstractNum>
+  <w:abstractNum w:abstractNumId="15">
     <w:nsid w:val="57ED770E"/>
     <w:multiLevelType w:val="multilevel"/>
     <w:tmpl w:val="278C8B90"/>
@@ -1666,7 +3714,156 @@
       </w:rPr>
     </w:lvl>
   </w:abstractNum>
-  <w:abstractNum w:abstractNumId="8" w15:restartNumberingAfterBreak="0">
+  <w:abstractNum w:abstractNumId="16">
+    <w:nsid w:val="5F0625A8"/>
+    <w:multiLevelType w:val="multilevel"/>
+    <w:tmpl w:val="CE42726E"/>
+    <w:lvl w:ilvl="0">
+      <w:start w:val="1"/>
+      <w:numFmt w:val="bullet"/>
+      <w:lvlText w:val=""/>
+      <w:lvlJc w:val="left"/>
+      <w:pPr>
+        <w:tabs>
+          <w:tab w:val="num" w:pos="720"/>
+        </w:tabs>
+        <w:ind w:left="720" w:hanging="360"/>
+      </w:pPr>
+      <w:rPr>
+        <w:rFonts w:ascii="Symbol" w:hAnsi="Symbol" w:hint="default"/>
+        <w:sz w:val="20"/>
+      </w:rPr>
+    </w:lvl>
+    <w:lvl w:ilvl="1" w:tentative="1">
+      <w:start w:val="1"/>
+      <w:numFmt w:val="bullet"/>
+      <w:lvlText w:val="o"/>
+      <w:lvlJc w:val="left"/>
+      <w:pPr>
+        <w:tabs>
+          <w:tab w:val="num" w:pos="1440"/>
+        </w:tabs>
+        <w:ind w:left="1440" w:hanging="360"/>
+      </w:pPr>
+      <w:rPr>
+        <w:rFonts w:ascii="Courier New" w:hAnsi="Courier New" w:hint="default"/>
+        <w:sz w:val="20"/>
+      </w:rPr>
+    </w:lvl>
+    <w:lvl w:ilvl="2" w:tentative="1">
+      <w:start w:val="1"/>
+      <w:numFmt w:val="bullet"/>
+      <w:lvlText w:val=""/>
+      <w:lvlJc w:val="left"/>
+      <w:pPr>
+        <w:tabs>
+          <w:tab w:val="num" w:pos="2160"/>
+        </w:tabs>
+        <w:ind w:left="2160" w:hanging="360"/>
+      </w:pPr>
+      <w:rPr>
+        <w:rFonts w:ascii="Wingdings" w:hAnsi="Wingdings" w:hint="default"/>
+        <w:sz w:val="20"/>
+      </w:rPr>
+    </w:lvl>
+    <w:lvl w:ilvl="3" w:tentative="1">
+      <w:start w:val="1"/>
+      <w:numFmt w:val="bullet"/>
+      <w:lvlText w:val=""/>
+      <w:lvlJc w:val="left"/>
+      <w:pPr>
+        <w:tabs>
+          <w:tab w:val="num" w:pos="2880"/>
+        </w:tabs>
+        <w:ind w:left="2880" w:hanging="360"/>
+      </w:pPr>
+      <w:rPr>
+        <w:rFonts w:ascii="Wingdings" w:hAnsi="Wingdings" w:hint="default"/>
+        <w:sz w:val="20"/>
+      </w:rPr>
+    </w:lvl>
+    <w:lvl w:ilvl="4" w:tentative="1">
+      <w:start w:val="1"/>
+      <w:numFmt w:val="bullet"/>
+      <w:lvlText w:val=""/>
+      <w:lvlJc w:val="left"/>
+      <w:pPr>
+        <w:tabs>
+          <w:tab w:val="num" w:pos="3600"/>
+        </w:tabs>
+        <w:ind w:left="3600" w:hanging="360"/>
+      </w:pPr>
+      <w:rPr>
+        <w:rFonts w:ascii="Wingdings" w:hAnsi="Wingdings" w:hint="default"/>
+        <w:sz w:val="20"/>
+      </w:rPr>
+    </w:lvl>
+    <w:lvl w:ilvl="5" w:tentative="1">
+      <w:start w:val="1"/>
+      <w:numFmt w:val="bullet"/>
+      <w:lvlText w:val=""/>
+      <w:lvlJc w:val="left"/>
+      <w:pPr>
+        <w:tabs>
+          <w:tab w:val="num" w:pos="4320"/>
+        </w:tabs>
+        <w:ind w:left="4320" w:hanging="360"/>
+      </w:pPr>
+      <w:rPr>
+        <w:rFonts w:ascii="Wingdings" w:hAnsi="Wingdings" w:hint="default"/>
+        <w:sz w:val="20"/>
+      </w:rPr>
+    </w:lvl>
+    <w:lvl w:ilvl="6" w:tentative="1">
+      <w:start w:val="1"/>
+      <w:numFmt w:val="bullet"/>
+      <w:lvlText w:val=""/>
+      <w:lvlJc w:val="left"/>
+      <w:pPr>
+        <w:tabs>
+          <w:tab w:val="num" w:pos="5040"/>
+        </w:tabs>
+        <w:ind w:left="5040" w:hanging="360"/>
+      </w:pPr>
+      <w:rPr>
+        <w:rFonts w:ascii="Wingdings" w:hAnsi="Wingdings" w:hint="default"/>
+        <w:sz w:val="20"/>
+      </w:rPr>
+    </w:lvl>
+    <w:lvl w:ilvl="7" w:tentative="1">
+      <w:start w:val="1"/>
+      <w:numFmt w:val="bullet"/>
+      <w:lvlText w:val=""/>
+      <w:lvlJc w:val="left"/>
+      <w:pPr>
+        <w:tabs>
+          <w:tab w:val="num" w:pos="5760"/>
+        </w:tabs>
+        <w:ind w:left="5760" w:hanging="360"/>
+      </w:pPr>
+      <w:rPr>
+        <w:rFonts w:ascii="Wingdings" w:hAnsi="Wingdings" w:hint="default"/>
+        <w:sz w:val="20"/>
+      </w:rPr>
+    </w:lvl>
+    <w:lvl w:ilvl="8" w:tentative="1">
+      <w:start w:val="1"/>
+      <w:numFmt w:val="bullet"/>
+      <w:lvlText w:val=""/>
+      <w:lvlJc w:val="left"/>
+      <w:pPr>
+        <w:tabs>
+          <w:tab w:val="num" w:pos="6480"/>
+        </w:tabs>
+        <w:ind w:left="6480" w:hanging="360"/>
+      </w:pPr>
+      <w:rPr>
+        <w:rFonts w:ascii="Wingdings" w:hAnsi="Wingdings" w:hint="default"/>
+        <w:sz w:val="20"/>
+      </w:rPr>
+    </w:lvl>
+  </w:abstractNum>
+  <w:abstractNum w:abstractNumId="17">
     <w:nsid w:val="6C791F12"/>
     <w:multiLevelType w:val="multilevel"/>
     <w:tmpl w:val="70945560"/>
@@ -1815,7 +4012,7 @@
       </w:rPr>
     </w:lvl>
   </w:abstractNum>
-  <w:abstractNum w:abstractNumId="9" w15:restartNumberingAfterBreak="0">
+  <w:abstractNum w:abstractNumId="18">
     <w:nsid w:val="6D726BB4"/>
     <w:multiLevelType w:val="multilevel"/>
     <w:tmpl w:val="42842DFA"/>
@@ -1964,7 +4161,156 @@
       </w:rPr>
     </w:lvl>
   </w:abstractNum>
-  <w:abstractNum w:abstractNumId="10" w15:restartNumberingAfterBreak="0">
+  <w:abstractNum w:abstractNumId="19">
+    <w:nsid w:val="6FA44483"/>
+    <w:multiLevelType w:val="multilevel"/>
+    <w:tmpl w:val="39E8C2C8"/>
+    <w:lvl w:ilvl="0">
+      <w:start w:val="1"/>
+      <w:numFmt w:val="bullet"/>
+      <w:lvlText w:val=""/>
+      <w:lvlJc w:val="left"/>
+      <w:pPr>
+        <w:tabs>
+          <w:tab w:val="num" w:pos="720"/>
+        </w:tabs>
+        <w:ind w:left="720" w:hanging="360"/>
+      </w:pPr>
+      <w:rPr>
+        <w:rFonts w:ascii="Symbol" w:hAnsi="Symbol" w:hint="default"/>
+        <w:sz w:val="20"/>
+      </w:rPr>
+    </w:lvl>
+    <w:lvl w:ilvl="1" w:tentative="1">
+      <w:start w:val="1"/>
+      <w:numFmt w:val="bullet"/>
+      <w:lvlText w:val="o"/>
+      <w:lvlJc w:val="left"/>
+      <w:pPr>
+        <w:tabs>
+          <w:tab w:val="num" w:pos="1440"/>
+        </w:tabs>
+        <w:ind w:left="1440" w:hanging="360"/>
+      </w:pPr>
+      <w:rPr>
+        <w:rFonts w:ascii="Courier New" w:hAnsi="Courier New" w:hint="default"/>
+        <w:sz w:val="20"/>
+      </w:rPr>
+    </w:lvl>
+    <w:lvl w:ilvl="2" w:tentative="1">
+      <w:start w:val="1"/>
+      <w:numFmt w:val="bullet"/>
+      <w:lvlText w:val=""/>
+      <w:lvlJc w:val="left"/>
+      <w:pPr>
+        <w:tabs>
+          <w:tab w:val="num" w:pos="2160"/>
+        </w:tabs>
+        <w:ind w:left="2160" w:hanging="360"/>
+      </w:pPr>
+      <w:rPr>
+        <w:rFonts w:ascii="Wingdings" w:hAnsi="Wingdings" w:hint="default"/>
+        <w:sz w:val="20"/>
+      </w:rPr>
+    </w:lvl>
+    <w:lvl w:ilvl="3" w:tentative="1">
+      <w:start w:val="1"/>
+      <w:numFmt w:val="bullet"/>
+      <w:lvlText w:val=""/>
+      <w:lvlJc w:val="left"/>
+      <w:pPr>
+        <w:tabs>
+          <w:tab w:val="num" w:pos="2880"/>
+        </w:tabs>
+        <w:ind w:left="2880" w:hanging="360"/>
+      </w:pPr>
+      <w:rPr>
+        <w:rFonts w:ascii="Wingdings" w:hAnsi="Wingdings" w:hint="default"/>
+        <w:sz w:val="20"/>
+      </w:rPr>
+    </w:lvl>
+    <w:lvl w:ilvl="4" w:tentative="1">
+      <w:start w:val="1"/>
+      <w:numFmt w:val="bullet"/>
+      <w:lvlText w:val=""/>
+      <w:lvlJc w:val="left"/>
+      <w:pPr>
+        <w:tabs>
+          <w:tab w:val="num" w:pos="3600"/>
+        </w:tabs>
+        <w:ind w:left="3600" w:hanging="360"/>
+      </w:pPr>
+      <w:rPr>
+        <w:rFonts w:ascii="Wingdings" w:hAnsi="Wingdings" w:hint="default"/>
+        <w:sz w:val="20"/>
+      </w:rPr>
+    </w:lvl>
+    <w:lvl w:ilvl="5" w:tentative="1">
+      <w:start w:val="1"/>
+      <w:numFmt w:val="bullet"/>
+      <w:lvlText w:val=""/>
+      <w:lvlJc w:val="left"/>
+      <w:pPr>
+        <w:tabs>
+          <w:tab w:val="num" w:pos="4320"/>
+        </w:tabs>
+        <w:ind w:left="4320" w:hanging="360"/>
+      </w:pPr>
+      <w:rPr>
+        <w:rFonts w:ascii="Wingdings" w:hAnsi="Wingdings" w:hint="default"/>
+        <w:sz w:val="20"/>
+      </w:rPr>
+    </w:lvl>
+    <w:lvl w:ilvl="6" w:tentative="1">
+      <w:start w:val="1"/>
+      <w:numFmt w:val="bullet"/>
+      <w:lvlText w:val=""/>
+      <w:lvlJc w:val="left"/>
+      <w:pPr>
+        <w:tabs>
+          <w:tab w:val="num" w:pos="5040"/>
+        </w:tabs>
+        <w:ind w:left="5040" w:hanging="360"/>
+      </w:pPr>
+      <w:rPr>
+        <w:rFonts w:ascii="Wingdings" w:hAnsi="Wingdings" w:hint="default"/>
+        <w:sz w:val="20"/>
+      </w:rPr>
+    </w:lvl>
+    <w:lvl w:ilvl="7" w:tentative="1">
+      <w:start w:val="1"/>
+      <w:numFmt w:val="bullet"/>
+      <w:lvlText w:val=""/>
+      <w:lvlJc w:val="left"/>
+      <w:pPr>
+        <w:tabs>
+          <w:tab w:val="num" w:pos="5760"/>
+        </w:tabs>
+        <w:ind w:left="5760" w:hanging="360"/>
+      </w:pPr>
+      <w:rPr>
+        <w:rFonts w:ascii="Wingdings" w:hAnsi="Wingdings" w:hint="default"/>
+        <w:sz w:val="20"/>
+      </w:rPr>
+    </w:lvl>
+    <w:lvl w:ilvl="8" w:tentative="1">
+      <w:start w:val="1"/>
+      <w:numFmt w:val="bullet"/>
+      <w:lvlText w:val=""/>
+      <w:lvlJc w:val="left"/>
+      <w:pPr>
+        <w:tabs>
+          <w:tab w:val="num" w:pos="6480"/>
+        </w:tabs>
+        <w:ind w:left="6480" w:hanging="360"/>
+      </w:pPr>
+      <w:rPr>
+        <w:rFonts w:ascii="Wingdings" w:hAnsi="Wingdings" w:hint="default"/>
+        <w:sz w:val="20"/>
+      </w:rPr>
+    </w:lvl>
+  </w:abstractNum>
+  <w:abstractNum w:abstractNumId="20">
     <w:nsid w:val="6FF2749B"/>
     <w:multiLevelType w:val="multilevel"/>
     <w:tmpl w:val="811689B8"/>
@@ -2085,44 +4431,226 @@
       </w:pPr>
     </w:lvl>
   </w:abstractNum>
-  <w:num w:numId="1" w16cid:durableId="2054035871">
+  <w:abstractNum w:abstractNumId="21">
+    <w:nsid w:val="77AC5D83"/>
+    <w:multiLevelType w:val="multilevel"/>
+    <w:tmpl w:val="6BB2F0C6"/>
+    <w:lvl w:ilvl="0">
+      <w:start w:val="1"/>
+      <w:numFmt w:val="bullet"/>
+      <w:lvlText w:val=""/>
+      <w:lvlJc w:val="left"/>
+      <w:pPr>
+        <w:tabs>
+          <w:tab w:val="num" w:pos="720"/>
+        </w:tabs>
+        <w:ind w:left="720" w:hanging="360"/>
+      </w:pPr>
+      <w:rPr>
+        <w:rFonts w:ascii="Symbol" w:hAnsi="Symbol" w:hint="default"/>
+        <w:sz w:val="20"/>
+      </w:rPr>
+    </w:lvl>
+    <w:lvl w:ilvl="1" w:tentative="1">
+      <w:start w:val="1"/>
+      <w:numFmt w:val="bullet"/>
+      <w:lvlText w:val="o"/>
+      <w:lvlJc w:val="left"/>
+      <w:pPr>
+        <w:tabs>
+          <w:tab w:val="num" w:pos="1440"/>
+        </w:tabs>
+        <w:ind w:left="1440" w:hanging="360"/>
+      </w:pPr>
+      <w:rPr>
+        <w:rFonts w:ascii="Courier New" w:hAnsi="Courier New" w:hint="default"/>
+        <w:sz w:val="20"/>
+      </w:rPr>
+    </w:lvl>
+    <w:lvl w:ilvl="2" w:tentative="1">
+      <w:start w:val="1"/>
+      <w:numFmt w:val="bullet"/>
+      <w:lvlText w:val=""/>
+      <w:lvlJc w:val="left"/>
+      <w:pPr>
+        <w:tabs>
+          <w:tab w:val="num" w:pos="2160"/>
+        </w:tabs>
+        <w:ind w:left="2160" w:hanging="360"/>
+      </w:pPr>
+      <w:rPr>
+        <w:rFonts w:ascii="Wingdings" w:hAnsi="Wingdings" w:hint="default"/>
+        <w:sz w:val="20"/>
+      </w:rPr>
+    </w:lvl>
+    <w:lvl w:ilvl="3" w:tentative="1">
+      <w:start w:val="1"/>
+      <w:numFmt w:val="bullet"/>
+      <w:lvlText w:val=""/>
+      <w:lvlJc w:val="left"/>
+      <w:pPr>
+        <w:tabs>
+          <w:tab w:val="num" w:pos="2880"/>
+        </w:tabs>
+        <w:ind w:left="2880" w:hanging="360"/>
+      </w:pPr>
+      <w:rPr>
+        <w:rFonts w:ascii="Wingdings" w:hAnsi="Wingdings" w:hint="default"/>
+        <w:sz w:val="20"/>
+      </w:rPr>
+    </w:lvl>
+    <w:lvl w:ilvl="4" w:tentative="1">
+      <w:start w:val="1"/>
+      <w:numFmt w:val="bullet"/>
+      <w:lvlText w:val=""/>
+      <w:lvlJc w:val="left"/>
+      <w:pPr>
+        <w:tabs>
+          <w:tab w:val="num" w:pos="3600"/>
+        </w:tabs>
+        <w:ind w:left="3600" w:hanging="360"/>
+      </w:pPr>
+      <w:rPr>
+        <w:rFonts w:ascii="Wingdings" w:hAnsi="Wingdings" w:hint="default"/>
+        <w:sz w:val="20"/>
+      </w:rPr>
+    </w:lvl>
+    <w:lvl w:ilvl="5" w:tentative="1">
+      <w:start w:val="1"/>
+      <w:numFmt w:val="bullet"/>
+      <w:lvlText w:val=""/>
+      <w:lvlJc w:val="left"/>
+      <w:pPr>
+        <w:tabs>
+          <w:tab w:val="num" w:pos="4320"/>
+        </w:tabs>
+        <w:ind w:left="4320" w:hanging="360"/>
+      </w:pPr>
+      <w:rPr>
+        <w:rFonts w:ascii="Wingdings" w:hAnsi="Wingdings" w:hint="default"/>
+        <w:sz w:val="20"/>
+      </w:rPr>
+    </w:lvl>
+    <w:lvl w:ilvl="6" w:tentative="1">
+      <w:start w:val="1"/>
+      <w:numFmt w:val="bullet"/>
+      <w:lvlText w:val=""/>
+      <w:lvlJc w:val="left"/>
+      <w:pPr>
+        <w:tabs>
+          <w:tab w:val="num" w:pos="5040"/>
+        </w:tabs>
+        <w:ind w:left="5040" w:hanging="360"/>
+      </w:pPr>
+      <w:rPr>
+        <w:rFonts w:ascii="Wingdings" w:hAnsi="Wingdings" w:hint="default"/>
+        <w:sz w:val="20"/>
+      </w:rPr>
+    </w:lvl>
+    <w:lvl w:ilvl="7" w:tentative="1">
+      <w:start w:val="1"/>
+      <w:numFmt w:val="bullet"/>
+      <w:lvlText w:val=""/>
+      <w:lvlJc w:val="left"/>
+      <w:pPr>
+        <w:tabs>
+          <w:tab w:val="num" w:pos="5760"/>
+        </w:tabs>
+        <w:ind w:left="5760" w:hanging="360"/>
+      </w:pPr>
+      <w:rPr>
+        <w:rFonts w:ascii="Wingdings" w:hAnsi="Wingdings" w:hint="default"/>
+        <w:sz w:val="20"/>
+      </w:rPr>
+    </w:lvl>
+    <w:lvl w:ilvl="8" w:tentative="1">
+      <w:start w:val="1"/>
+      <w:numFmt w:val="bullet"/>
+      <w:lvlText w:val=""/>
+      <w:lvlJc w:val="left"/>
+      <w:pPr>
+        <w:tabs>
+          <w:tab w:val="num" w:pos="6480"/>
+        </w:tabs>
+        <w:ind w:left="6480" w:hanging="360"/>
+      </w:pPr>
+      <w:rPr>
+        <w:rFonts w:ascii="Wingdings" w:hAnsi="Wingdings" w:hint="default"/>
+        <w:sz w:val="20"/>
+      </w:rPr>
+    </w:lvl>
+  </w:abstractNum>
+  <w:num w:numId="1">
+    <w:abstractNumId w:val="20"/>
+  </w:num>
+  <w:num w:numId="2">
+    <w:abstractNumId w:val="6"/>
+  </w:num>
+  <w:num w:numId="3">
+    <w:abstractNumId w:val="1"/>
+  </w:num>
+  <w:num w:numId="4">
+    <w:abstractNumId w:val="2"/>
+  </w:num>
+  <w:num w:numId="5">
+    <w:abstractNumId w:val="17"/>
+  </w:num>
+  <w:num w:numId="6">
+    <w:abstractNumId w:val="3"/>
+  </w:num>
+  <w:num w:numId="7">
+    <w:abstractNumId w:val="15"/>
+  </w:num>
+  <w:num w:numId="8">
+    <w:abstractNumId w:val="18"/>
+  </w:num>
+  <w:num w:numId="9">
     <w:abstractNumId w:val="10"/>
   </w:num>
-  <w:num w:numId="2" w16cid:durableId="1208371310">
+  <w:num w:numId="10">
+    <w:abstractNumId w:val="5"/>
+  </w:num>
+  <w:num w:numId="11">
+    <w:abstractNumId w:val="7"/>
+  </w:num>
+  <w:num w:numId="12">
+    <w:abstractNumId w:val="16"/>
+  </w:num>
+  <w:num w:numId="13">
+    <w:abstractNumId w:val="9"/>
+  </w:num>
+  <w:num w:numId="14">
+    <w:abstractNumId w:val="12"/>
+  </w:num>
+  <w:num w:numId="15">
+    <w:abstractNumId w:val="21"/>
+  </w:num>
+  <w:num w:numId="16">
+    <w:abstractNumId w:val="13"/>
+  </w:num>
+  <w:num w:numId="17">
+    <w:abstractNumId w:val="8"/>
+  </w:num>
+  <w:num w:numId="18">
+    <w:abstractNumId w:val="0"/>
+  </w:num>
+  <w:num w:numId="19">
+    <w:abstractNumId w:val="19"/>
+  </w:num>
+  <w:num w:numId="20">
     <w:abstractNumId w:val="4"/>
   </w:num>
-  <w:num w:numId="3" w16cid:durableId="60250521">
-    <w:abstractNumId w:val="0"/>
+  <w:num w:numId="21">
+    <w:abstractNumId w:val="14"/>
   </w:num>
-  <w:num w:numId="4" w16cid:durableId="1970865214">
-    <w:abstractNumId w:val="1"/>
-  </w:num>
-  <w:num w:numId="5" w16cid:durableId="1569417856">
-    <w:abstractNumId w:val="8"/>
-  </w:num>
-  <w:num w:numId="6" w16cid:durableId="807866537">
-    <w:abstractNumId w:val="2"/>
-  </w:num>
-  <w:num w:numId="7" w16cid:durableId="1215704069">
-    <w:abstractNumId w:val="7"/>
-  </w:num>
-  <w:num w:numId="8" w16cid:durableId="179054548">
-    <w:abstractNumId w:val="9"/>
-  </w:num>
-  <w:num w:numId="9" w16cid:durableId="1383401601">
-    <w:abstractNumId w:val="6"/>
-  </w:num>
-  <w:num w:numId="10" w16cid:durableId="435173128">
-    <w:abstractNumId w:val="3"/>
-  </w:num>
-  <w:num w:numId="11" w16cid:durableId="1077440618">
-    <w:abstractNumId w:val="5"/>
+  <w:num w:numId="22">
+    <w:abstractNumId w:val="11"/>
   </w:num>
 </w:numbering>
 </file>
 
 <file path=word/styles.xml><?xml version="1.0" encoding="utf-8"?>
-<w:styles xmlns:mc="http://schemas.openxmlformats.org/markup-compatibility/2006" xmlns:r="http://schemas.openxmlformats.org/officeDocument/2006/relationships" xmlns:w="http://schemas.openxmlformats.org/wordprocessingml/2006/main" xmlns:w14="http://schemas.microsoft.com/office/word/2010/wordml" xmlns:w15="http://schemas.microsoft.com/office/word/2012/wordml" xmlns:w16cex="http://schemas.microsoft.com/office/word/2018/wordml/cex" xmlns:w16cid="http://schemas.microsoft.com/office/word/2016/wordml/cid" xmlns:w16="http://schemas.microsoft.com/office/word/2018/wordml" xmlns:w16du="http://schemas.microsoft.com/office/word/2023/wordml/word16du" xmlns:w16sdtdh="http://schemas.microsoft.com/office/word/2020/wordml/sdtdatahash" xmlns:w16sdtfl="http://schemas.microsoft.com/office/word/2024/wordml/sdtformatlock" xmlns:w16se="http://schemas.microsoft.com/office/word/2015/wordml/symex" mc:Ignorable="w14 w15 w16se w16cid w16 w16cex w16sdtdh w16sdtfl w16du">
+<w:styles xmlns:mc="http://schemas.openxmlformats.org/markup-compatibility/2006" xmlns:r="http://schemas.openxmlformats.org/officeDocument/2006/relationships" xmlns:w="http://schemas.openxmlformats.org/wordprocessingml/2006/main" xmlns:w14="http://schemas.microsoft.com/office/word/2010/wordml" xmlns:w15="http://schemas.microsoft.com/office/word/2012/wordml" mc:Ignorable="w14 w15">
   <w:docDefaults>
     <w:rPrDefault>
       <w:rPr>
@@ -2138,7 +4666,7 @@
       </w:pPr>
     </w:pPrDefault>
   </w:docDefaults>
-  <w:latentStyles w:defLockedState="0" w:defUIPriority="99" w:defSemiHidden="0" w:defUnhideWhenUsed="0" w:defQFormat="0" w:count="376">
+  <w:latentStyles w:defLockedState="0" w:defUIPriority="99" w:defSemiHidden="0" w:defUnhideWhenUsed="0" w:defQFormat="0" w:count="371">
     <w:lsdException w:name="Normal" w:uiPriority="0" w:qFormat="1"/>
     <w:lsdException w:name="heading 1" w:uiPriority="9" w:qFormat="1"/>
     <w:lsdException w:name="heading 2" w:semiHidden="1" w:uiPriority="9" w:unhideWhenUsed="1" w:qFormat="1"/>
@@ -2510,11 +5038,6 @@
     <w:lsdException w:name="List Table 5 Dark Accent 6" w:uiPriority="50"/>
     <w:lsdException w:name="List Table 6 Colorful Accent 6" w:uiPriority="51"/>
     <w:lsdException w:name="List Table 7 Colorful Accent 6" w:uiPriority="52"/>
-    <w:lsdException w:name="Mention" w:semiHidden="1" w:unhideWhenUsed="1"/>
-    <w:lsdException w:name="Smart Hyperlink" w:semiHidden="1" w:unhideWhenUsed="1"/>
-    <w:lsdException w:name="Hashtag" w:semiHidden="1" w:unhideWhenUsed="1"/>
-    <w:lsdException w:name="Unresolved Mention" w:semiHidden="1" w:unhideWhenUsed="1"/>
-    <w:lsdException w:name="Smart Link" w:semiHidden="1" w:unhideWhenUsed="1"/>
   </w:latentStyles>
   <w:style w:type="paragraph" w:default="1" w:styleId="Normal">
     <w:name w:val="Normal"/>
@@ -2722,7 +5245,6 @@
   <w:style w:type="character" w:default="1" w:styleId="DefaultParagraphFont">
     <w:name w:val="Default Paragraph Font"/>
     <w:uiPriority w:val="1"/>
-    <w:semiHidden/>
     <w:unhideWhenUsed/>
   </w:style>
   <w:style w:type="table" w:default="1" w:styleId="TableNormal">

</xml_diff>

<commit_message>
Added Levelling System information to user manual
</commit_message>
<xml_diff>
--- a/User Manual/User-Manual.docx
+++ b/User Manual/User-Manual.docx
@@ -615,6 +615,7 @@
     <w:p>
       <w:pPr>
         <w:pStyle w:val="Normal"/>
+        <w:spacing w:before="0" w:after="160"/>
         <w:rPr/>
       </w:pPr>
       <w:r>
@@ -697,13 +698,7 @@
         <w:rPr>
           <w:u w:val="single"/>
         </w:rPr>
-        <w:t xml:space="preserve">2.1 </w:t>
-      </w:r>
-      <w:r>
-        <w:rPr>
-          <w:u w:val="single"/>
-        </w:rPr>
-        <w:t>- Sorting</w:t>
+        <w:t>2.1 - Sorting</w:t>
       </w:r>
     </w:p>
     <w:p>
@@ -745,7 +740,7 @@
         <mc:AlternateContent>
           <mc:Choice Requires="wps">
             <w:drawing>
-              <wp:anchor behindDoc="0" distT="0" distB="0" distL="0" distR="0" simplePos="0" locked="0" layoutInCell="0" allowOverlap="1" relativeHeight="14">
+              <wp:anchor behindDoc="0" distT="0" distB="0" distL="0" distR="0" simplePos="0" locked="0" layoutInCell="0" allowOverlap="1" relativeHeight="13">
                 <wp:simplePos x="0" y="0"/>
                 <wp:positionH relativeFrom="column">
                   <wp:posOffset>1157605</wp:posOffset>
@@ -945,13 +940,7 @@
         <w:br/>
         <w:br/>
         <w:br/>
-        <w:t xml:space="preserve">2.2 – </w:t>
-      </w:r>
-      <w:r>
-        <w:rPr>
-          <w:u w:val="single"/>
-        </w:rPr>
-        <w:t>Clear sorting</w:t>
+        <w:t>2.2 – Clear sorting</w:t>
       </w:r>
     </w:p>
     <w:p>
@@ -1243,7 +1232,7 @@
         <mc:AlternateContent>
           <mc:Choice Requires="wps">
             <w:drawing>
-              <wp:anchor behindDoc="0" distT="0" distB="0" distL="0" distR="0" simplePos="0" locked="0" layoutInCell="0" allowOverlap="1" relativeHeight="17">
+              <wp:anchor behindDoc="0" distT="0" distB="0" distL="0" distR="0" simplePos="0" locked="0" layoutInCell="0" allowOverlap="1" relativeHeight="15">
                 <wp:simplePos x="0" y="0"/>
                 <wp:positionH relativeFrom="column">
                   <wp:align>center</wp:align>
@@ -1410,7 +1399,7 @@
           </mc:Fallback>
         </mc:AlternateContent>
         <w:drawing>
-          <wp:anchor behindDoc="0" distT="0" distB="0" distL="0" distR="0" simplePos="0" locked="0" layoutInCell="0" allowOverlap="1" relativeHeight="20">
+          <wp:anchor behindDoc="0" distT="0" distB="0" distL="0" distR="0" simplePos="0" locked="0" layoutInCell="0" allowOverlap="1" relativeHeight="17">
             <wp:simplePos x="0" y="0"/>
             <wp:positionH relativeFrom="column">
               <wp:posOffset>655320</wp:posOffset>
@@ -1457,7 +1446,7 @@
         <mc:AlternateContent>
           <mc:Choice Requires="wps">
             <w:drawing>
-              <wp:anchor behindDoc="0" distT="0" distB="0" distL="0" distR="0" simplePos="0" locked="0" layoutInCell="0" allowOverlap="1" relativeHeight="21">
+              <wp:anchor behindDoc="0" distT="0" distB="0" distL="0" distR="0" simplePos="0" locked="0" layoutInCell="0" allowOverlap="1" relativeHeight="18">
                 <wp:simplePos x="0" y="0"/>
                 <wp:positionH relativeFrom="column">
                   <wp:posOffset>-340995</wp:posOffset>
@@ -1688,7 +1677,7 @@
         <mc:AlternateContent>
           <mc:Choice Requires="wps">
             <w:drawing>
-              <wp:anchor behindDoc="0" distT="0" distB="0" distL="0" distR="0" simplePos="0" locked="0" layoutInCell="0" allowOverlap="1" relativeHeight="24">
+              <wp:anchor behindDoc="0" distT="0" distB="0" distL="0" distR="0" simplePos="0" locked="0" layoutInCell="0" allowOverlap="1" relativeHeight="20">
                 <wp:simplePos x="0" y="0"/>
                 <wp:positionH relativeFrom="column">
                   <wp:align>center</wp:align>
@@ -1924,7 +1913,7 @@
       <w:pPr>
         <w:pStyle w:val="Normal"/>
         <w:suppressAutoHyphens w:val="true"/>
-        <w:spacing w:lineRule="auto" w:line="254"/>
+        <w:spacing w:lineRule="auto" w:line="252"/>
         <w:rPr>
           <w:rFonts w:ascii="Aptos" w:hAnsi="Aptos" w:eastAsia="Aptos" w:cs="Aptos"/>
           <w:b/>
@@ -1946,7 +1935,7 @@
       <w:pPr>
         <w:pStyle w:val="Normal"/>
         <w:suppressAutoHyphens w:val="true"/>
-        <w:spacing w:lineRule="auto" w:line="254"/>
+        <w:spacing w:lineRule="auto" w:line="252"/>
         <w:rPr>
           <w:rFonts w:ascii="Aptos" w:hAnsi="Aptos" w:eastAsia="Aptos" w:cs="Aptos"/>
           <w:b/>
@@ -1968,7 +1957,7 @@
       <w:pPr>
         <w:pStyle w:val="Normal"/>
         <w:suppressAutoHyphens w:val="true"/>
-        <w:spacing w:lineRule="auto" w:line="254"/>
+        <w:spacing w:lineRule="auto" w:line="252"/>
         <w:rPr>
           <w:rFonts w:ascii="Aptos" w:hAnsi="Aptos" w:eastAsia="Aptos" w:cs="Aptos"/>
           <w:lang w:val="en-US"/>
@@ -2001,7 +1990,7 @@
       <w:pPr>
         <w:pStyle w:val="Normal"/>
         <w:suppressAutoHyphens w:val="true"/>
-        <w:spacing w:lineRule="auto" w:line="254"/>
+        <w:spacing w:lineRule="auto" w:line="252"/>
         <w:rPr>
           <w:rFonts w:ascii="Aptos" w:hAnsi="Aptos" w:eastAsia="Aptos" w:cs="Aptos"/>
           <w:bCs/>
@@ -2021,7 +2010,7 @@
       <w:pPr>
         <w:pStyle w:val="Normal"/>
         <w:suppressAutoHyphens w:val="true"/>
-        <w:spacing w:lineRule="auto" w:line="254"/>
+        <w:spacing w:lineRule="auto" w:line="252"/>
         <w:rPr>
           <w:rFonts w:ascii="Aptos" w:hAnsi="Aptos" w:eastAsia="Aptos" w:cs="Aptos"/>
           <w:lang w:val="en-US"/>
@@ -2044,7 +2033,7 @@
           <w:numId w:val="8"/>
         </w:numPr>
         <w:suppressAutoHyphens w:val="true"/>
-        <w:spacing w:lineRule="auto" w:line="254"/>
+        <w:spacing w:lineRule="auto" w:line="252"/>
         <w:rPr>
           <w:rFonts w:ascii="Aptos" w:hAnsi="Aptos" w:eastAsia="Aptos" w:cs="Aptos"/>
           <w:lang w:val="en-US"/>
@@ -2066,7 +2055,7 @@
           <w:numId w:val="8"/>
         </w:numPr>
         <w:suppressAutoHyphens w:val="true"/>
-        <w:spacing w:lineRule="auto" w:line="254"/>
+        <w:spacing w:lineRule="auto" w:line="252"/>
         <w:rPr>
           <w:rFonts w:ascii="Aptos" w:hAnsi="Aptos" w:eastAsia="Aptos" w:cs="Aptos"/>
           <w:lang w:val="en-US"/>
@@ -2084,7 +2073,7 @@
       <w:pPr>
         <w:pStyle w:val="Normal"/>
         <w:suppressAutoHyphens w:val="true"/>
-        <w:spacing w:lineRule="auto" w:line="254"/>
+        <w:spacing w:lineRule="auto" w:line="252"/>
         <w:rPr>
           <w:rFonts w:ascii="Aptos" w:hAnsi="Aptos" w:eastAsia="Aptos" w:cs="Aptos"/>
           <w:lang w:val="en-US"/>
@@ -2107,7 +2096,7 @@
           <w:numId w:val="9"/>
         </w:numPr>
         <w:suppressAutoHyphens w:val="true"/>
-        <w:spacing w:lineRule="auto" w:line="254"/>
+        <w:spacing w:lineRule="auto" w:line="252"/>
         <w:rPr>
           <w:rFonts w:ascii="Aptos" w:hAnsi="Aptos" w:eastAsia="Aptos" w:cs="Aptos"/>
           <w:lang w:val="en-US"/>
@@ -2129,7 +2118,7 @@
           <w:numId w:val="9"/>
         </w:numPr>
         <w:suppressAutoHyphens w:val="true"/>
-        <w:spacing w:lineRule="auto" w:line="254"/>
+        <w:spacing w:lineRule="auto" w:line="252"/>
         <w:rPr>
           <w:rFonts w:ascii="Aptos" w:hAnsi="Aptos" w:eastAsia="Aptos" w:cs="Aptos"/>
           <w:lang w:val="en-US"/>
@@ -2147,7 +2136,7 @@
       <w:pPr>
         <w:pStyle w:val="Normal"/>
         <w:suppressAutoHyphens w:val="true"/>
-        <w:spacing w:lineRule="auto" w:line="254"/>
+        <w:spacing w:lineRule="auto" w:line="252"/>
         <w:rPr>
           <w:rFonts w:ascii="Aptos" w:hAnsi="Aptos" w:eastAsia="Aptos" w:cs="Aptos"/>
           <w:lang w:val="en-US"/>
@@ -2170,7 +2159,7 @@
           <w:numId w:val="10"/>
         </w:numPr>
         <w:suppressAutoHyphens w:val="true"/>
-        <w:spacing w:lineRule="auto" w:line="254"/>
+        <w:spacing w:lineRule="auto" w:line="252"/>
         <w:rPr>
           <w:rFonts w:ascii="Aptos" w:hAnsi="Aptos" w:eastAsia="Aptos" w:cs="Aptos"/>
           <w:lang w:val="en-US"/>
@@ -2207,7 +2196,7 @@
           <w:numId w:val="10"/>
         </w:numPr>
         <w:suppressAutoHyphens w:val="true"/>
-        <w:spacing w:lineRule="auto" w:line="254"/>
+        <w:spacing w:lineRule="auto" w:line="252"/>
         <w:rPr>
           <w:rFonts w:ascii="Aptos" w:hAnsi="Aptos" w:eastAsia="Aptos" w:cs="Aptos"/>
           <w:lang w:val="en-US"/>
@@ -2225,7 +2214,7 @@
       <w:pPr>
         <w:pStyle w:val="Normal"/>
         <w:suppressAutoHyphens w:val="true"/>
-        <w:spacing w:lineRule="auto" w:line="254"/>
+        <w:spacing w:lineRule="auto" w:line="252"/>
         <w:rPr>
           <w:rFonts w:ascii="Aptos" w:hAnsi="Aptos" w:eastAsia="Aptos" w:cs="Aptos"/>
           <w:lang w:val="en-US"/>
@@ -2248,7 +2237,7 @@
           <w:numId w:val="11"/>
         </w:numPr>
         <w:suppressAutoHyphens w:val="true"/>
-        <w:spacing w:lineRule="auto" w:line="254"/>
+        <w:spacing w:lineRule="auto" w:line="252"/>
         <w:rPr>
           <w:rFonts w:ascii="Aptos" w:hAnsi="Aptos" w:eastAsia="Aptos" w:cs="Aptos"/>
           <w:lang w:val="en-US"/>
@@ -2281,7 +2270,7 @@
       <w:pPr>
         <w:pStyle w:val="Normal"/>
         <w:suppressAutoHyphens w:val="true"/>
-        <w:spacing w:lineRule="auto" w:line="254"/>
+        <w:spacing w:lineRule="auto" w:line="252"/>
         <w:rPr>
           <w:rFonts w:ascii="Aptos" w:hAnsi="Aptos" w:eastAsia="Aptos" w:cs="Aptos"/>
           <w:lang w:val="en-US"/>
@@ -2304,7 +2293,7 @@
           <w:numId w:val="12"/>
         </w:numPr>
         <w:suppressAutoHyphens w:val="true"/>
-        <w:spacing w:lineRule="auto" w:line="254"/>
+        <w:spacing w:lineRule="auto" w:line="252"/>
         <w:rPr>
           <w:rFonts w:ascii="Aptos" w:hAnsi="Aptos" w:eastAsia="Aptos" w:cs="Aptos"/>
           <w:lang w:val="en-US"/>
@@ -2337,7 +2326,7 @@
       <w:pPr>
         <w:pStyle w:val="Normal"/>
         <w:suppressAutoHyphens w:val="true"/>
-        <w:spacing w:lineRule="auto" w:line="254"/>
+        <w:spacing w:lineRule="auto" w:line="252"/>
         <w:rPr>
           <w:rFonts w:ascii="Aptos" w:hAnsi="Aptos" w:eastAsia="Aptos" w:cs="Aptos"/>
           <w:lang w:val="en-US"/>
@@ -2359,7 +2348,7 @@
           <w:numId w:val="12"/>
         </w:numPr>
         <w:suppressAutoHyphens w:val="true"/>
-        <w:spacing w:lineRule="auto" w:line="254"/>
+        <w:spacing w:lineRule="auto" w:line="252"/>
         <w:rPr>
           <w:rFonts w:ascii="Aptos" w:hAnsi="Aptos" w:eastAsia="Aptos" w:cs="Aptos"/>
           <w:lang w:val="en-US"/>
@@ -2377,7 +2366,7 @@
       <w:pPr>
         <w:pStyle w:val="Normal"/>
         <w:suppressAutoHyphens w:val="true"/>
-        <w:spacing w:lineRule="auto" w:line="254"/>
+        <w:spacing w:lineRule="auto" w:line="252"/>
         <w:rPr>
           <w:rFonts w:ascii="Aptos" w:hAnsi="Aptos" w:eastAsia="Aptos" w:cs="Aptos"/>
           <w:lang w:val="en-US"/>
@@ -2428,7 +2417,7 @@
       <w:pPr>
         <w:pStyle w:val="Normal"/>
         <w:suppressAutoHyphens w:val="true"/>
-        <w:spacing w:lineRule="auto" w:line="254"/>
+        <w:spacing w:lineRule="auto" w:line="252"/>
         <w:rPr>
           <w:rFonts w:ascii="Aptos" w:hAnsi="Aptos" w:eastAsia="Aptos" w:cs="Aptos"/>
           <w:lang w:val="en-US"/>
@@ -2445,7 +2434,7 @@
       <w:pPr>
         <w:pStyle w:val="Normal"/>
         <w:suppressAutoHyphens w:val="true"/>
-        <w:spacing w:lineRule="auto" w:line="254"/>
+        <w:spacing w:lineRule="auto" w:line="252"/>
         <w:rPr>
           <w:rFonts w:ascii="Aptos" w:hAnsi="Aptos" w:eastAsia="Aptos" w:cs="Aptos"/>
           <w:lang w:val="en-US"/>
@@ -2462,7 +2451,7 @@
       <w:pPr>
         <w:pStyle w:val="Normal"/>
         <w:suppressAutoHyphens w:val="true"/>
-        <w:spacing w:lineRule="auto" w:line="254"/>
+        <w:spacing w:lineRule="auto" w:line="252"/>
         <w:rPr>
           <w:rFonts w:ascii="Aptos" w:hAnsi="Aptos" w:eastAsia="Aptos" w:cs="Aptos"/>
           <w:b/>
@@ -2484,7 +2473,7 @@
       <w:pPr>
         <w:pStyle w:val="Normal"/>
         <w:suppressAutoHyphens w:val="true"/>
-        <w:spacing w:lineRule="auto" w:line="254"/>
+        <w:spacing w:lineRule="auto" w:line="252"/>
         <w:rPr>
           <w:rFonts w:ascii="Aptos" w:hAnsi="Aptos" w:eastAsia="Aptos" w:cs="Aptos"/>
           <w:lang w:val="en-US"/>
@@ -2517,7 +2506,7 @@
       <w:pPr>
         <w:pStyle w:val="Normal"/>
         <w:suppressAutoHyphens w:val="true"/>
-        <w:spacing w:lineRule="auto" w:line="254"/>
+        <w:spacing w:lineRule="auto" w:line="252"/>
         <w:rPr>
           <w:rFonts w:ascii="Aptos" w:hAnsi="Aptos" w:eastAsia="Aptos" w:cs="Aptos"/>
           <w:b/>
@@ -2539,7 +2528,7 @@
       <w:pPr>
         <w:pStyle w:val="Normal"/>
         <w:suppressAutoHyphens w:val="true"/>
-        <w:spacing w:lineRule="auto" w:line="254"/>
+        <w:spacing w:lineRule="auto" w:line="252"/>
         <w:rPr>
           <w:rFonts w:ascii="Aptos" w:hAnsi="Aptos" w:eastAsia="Aptos" w:cs="Aptos"/>
           <w:lang w:val="en-US"/>
@@ -2562,7 +2551,7 @@
           <w:numId w:val="13"/>
         </w:numPr>
         <w:suppressAutoHyphens w:val="true"/>
-        <w:spacing w:lineRule="auto" w:line="254"/>
+        <w:spacing w:lineRule="auto" w:line="252"/>
         <w:rPr>
           <w:rFonts w:ascii="Aptos" w:hAnsi="Aptos" w:eastAsia="Aptos" w:cs="Aptos"/>
           <w:lang w:val="en-US"/>
@@ -2595,7 +2584,7 @@
       <w:pPr>
         <w:pStyle w:val="Normal"/>
         <w:suppressAutoHyphens w:val="true"/>
-        <w:spacing w:lineRule="auto" w:line="254"/>
+        <w:spacing w:lineRule="auto" w:line="252"/>
         <w:rPr>
           <w:rFonts w:ascii="Aptos" w:hAnsi="Aptos" w:eastAsia="Aptos" w:cs="Aptos"/>
           <w:lang w:val="en-US"/>
@@ -2618,7 +2607,7 @@
           <w:numId w:val="14"/>
         </w:numPr>
         <w:suppressAutoHyphens w:val="true"/>
-        <w:spacing w:lineRule="auto" w:line="254"/>
+        <w:spacing w:lineRule="auto" w:line="252"/>
         <w:rPr>
           <w:rFonts w:ascii="Aptos" w:hAnsi="Aptos" w:eastAsia="Aptos" w:cs="Aptos"/>
           <w:lang w:val="en-US"/>
@@ -2651,7 +2640,7 @@
       <w:pPr>
         <w:pStyle w:val="Normal"/>
         <w:suppressAutoHyphens w:val="true"/>
-        <w:spacing w:lineRule="auto" w:line="254"/>
+        <w:spacing w:lineRule="auto" w:line="252"/>
         <w:rPr>
           <w:rFonts w:ascii="Aptos" w:hAnsi="Aptos" w:eastAsia="Aptos" w:cs="Aptos"/>
           <w:bCs/>
@@ -2675,7 +2664,7 @@
           <w:numId w:val="14"/>
         </w:numPr>
         <w:suppressAutoHyphens w:val="true"/>
-        <w:spacing w:lineRule="auto" w:line="254"/>
+        <w:spacing w:lineRule="auto" w:line="252"/>
         <w:rPr>
           <w:rFonts w:ascii="Aptos" w:hAnsi="Aptos" w:eastAsia="Aptos" w:cs="Aptos"/>
           <w:bCs/>
@@ -2695,7 +2684,7 @@
       <w:pPr>
         <w:pStyle w:val="Normal"/>
         <w:suppressAutoHyphens w:val="true"/>
-        <w:spacing w:lineRule="auto" w:line="254"/>
+        <w:spacing w:lineRule="auto" w:line="252"/>
         <w:rPr>
           <w:rFonts w:ascii="Aptos" w:hAnsi="Aptos" w:eastAsia="Aptos" w:cs="Aptos"/>
           <w:bCs/>
@@ -2719,7 +2708,7 @@
           <w:numId w:val="15"/>
         </w:numPr>
         <w:suppressAutoHyphens w:val="true"/>
-        <w:spacing w:lineRule="auto" w:line="254" w:before="0" w:after="160"/>
+        <w:spacing w:lineRule="auto" w:line="252" w:before="0" w:after="160"/>
         <w:contextualSpacing/>
         <w:rPr>
           <w:rFonts w:ascii="Aptos" w:hAnsi="Aptos" w:eastAsia="Aptos" w:cs="Aptos"/>
@@ -2740,7 +2729,7 @@
       <w:pPr>
         <w:pStyle w:val="Normal"/>
         <w:suppressAutoHyphens w:val="true"/>
-        <w:spacing w:lineRule="auto" w:line="254"/>
+        <w:spacing w:lineRule="auto" w:line="252"/>
         <w:rPr>
           <w:rFonts w:ascii="Aptos" w:hAnsi="Aptos" w:eastAsia="Aptos" w:cs="Aptos"/>
           <w:bCs/>
@@ -2792,7 +2781,7 @@
       <w:pPr>
         <w:pStyle w:val="Normal"/>
         <w:suppressAutoHyphens w:val="true"/>
-        <w:spacing w:lineRule="auto" w:line="254"/>
+        <w:spacing w:lineRule="auto" w:line="252"/>
         <w:rPr>
           <w:rFonts w:ascii="Aptos" w:hAnsi="Aptos" w:eastAsia="Aptos" w:cs="Aptos"/>
           <w:bCs/>
@@ -2812,7 +2801,7 @@
       <w:pPr>
         <w:pStyle w:val="Normal"/>
         <w:suppressAutoHyphens w:val="true"/>
-        <w:spacing w:lineRule="auto" w:line="254"/>
+        <w:spacing w:lineRule="auto" w:line="252"/>
         <w:rPr>
           <w:rFonts w:ascii="Aptos" w:hAnsi="Aptos" w:eastAsia="Aptos" w:cs="Aptos"/>
           <w:bCs/>
@@ -2864,7 +2853,7 @@
       <w:pPr>
         <w:pStyle w:val="Normal"/>
         <w:suppressAutoHyphens w:val="true"/>
-        <w:spacing w:lineRule="auto" w:line="254"/>
+        <w:spacing w:lineRule="auto" w:line="252"/>
         <w:rPr>
           <w:rFonts w:ascii="Aptos" w:hAnsi="Aptos" w:eastAsia="Aptos" w:cs="Aptos"/>
           <w:bCs/>
@@ -2884,7 +2873,7 @@
       <w:pPr>
         <w:pStyle w:val="Normal"/>
         <w:suppressAutoHyphens w:val="true"/>
-        <w:spacing w:lineRule="auto" w:line="254"/>
+        <w:spacing w:lineRule="auto" w:line="252"/>
         <w:rPr>
           <w:rFonts w:ascii="Aptos" w:hAnsi="Aptos" w:eastAsia="Aptos" w:cs="Aptos"/>
           <w:bCs/>
@@ -2936,7 +2925,7 @@
       <w:pPr>
         <w:pStyle w:val="Normal"/>
         <w:suppressAutoHyphens w:val="true"/>
-        <w:spacing w:lineRule="auto" w:line="254"/>
+        <w:spacing w:lineRule="auto" w:line="252"/>
         <w:rPr>
           <w:rFonts w:ascii="Aptos" w:hAnsi="Aptos" w:eastAsia="Aptos" w:cs="Aptos"/>
           <w:bCs/>
@@ -2960,7 +2949,7 @@
           <w:numId w:val="16"/>
         </w:numPr>
         <w:suppressAutoHyphens w:val="true"/>
-        <w:spacing w:lineRule="auto" w:line="254"/>
+        <w:spacing w:lineRule="auto" w:line="252"/>
         <w:rPr>
           <w:rFonts w:ascii="Aptos" w:hAnsi="Aptos" w:eastAsia="Aptos" w:cs="Aptos"/>
           <w:bCs/>
@@ -2980,7 +2969,7 @@
       <w:pPr>
         <w:pStyle w:val="Normal"/>
         <w:suppressAutoHyphens w:val="true"/>
-        <w:spacing w:lineRule="auto" w:line="254"/>
+        <w:spacing w:lineRule="auto" w:line="252"/>
         <w:rPr>
           <w:rFonts w:ascii="Aptos" w:hAnsi="Aptos" w:eastAsia="Aptos" w:cs="Aptos"/>
           <w:bCs/>
@@ -3004,7 +2993,7 @@
           <w:numId w:val="17"/>
         </w:numPr>
         <w:suppressAutoHyphens w:val="true"/>
-        <w:spacing w:lineRule="auto" w:line="254"/>
+        <w:spacing w:lineRule="auto" w:line="252"/>
         <w:rPr>
           <w:rFonts w:ascii="Aptos" w:hAnsi="Aptos" w:eastAsia="Aptos" w:cs="Aptos"/>
           <w:lang w:val="en-US"/>
@@ -3037,7 +3026,7 @@
       <w:pPr>
         <w:pStyle w:val="Normal"/>
         <w:suppressAutoHyphens w:val="true"/>
-        <w:spacing w:lineRule="auto" w:line="254"/>
+        <w:spacing w:lineRule="auto" w:line="252"/>
         <w:rPr>
           <w:rFonts w:ascii="Aptos" w:hAnsi="Aptos" w:eastAsia="Aptos" w:cs="Aptos"/>
           <w:lang w:val="en-US"/>
@@ -3088,7 +3077,7 @@
       <w:pPr>
         <w:pStyle w:val="Normal"/>
         <w:suppressAutoHyphens w:val="true"/>
-        <w:spacing w:lineRule="auto" w:line="254"/>
+        <w:spacing w:lineRule="auto" w:line="252"/>
         <w:rPr>
           <w:rFonts w:ascii="Aptos" w:hAnsi="Aptos" w:eastAsia="Aptos" w:cs="Aptos"/>
           <w:lang w:val="en-US"/>
@@ -3105,7 +3094,7 @@
       <w:pPr>
         <w:pStyle w:val="Normal"/>
         <w:suppressAutoHyphens w:val="true"/>
-        <w:spacing w:lineRule="auto" w:line="254"/>
+        <w:spacing w:lineRule="auto" w:line="252"/>
         <w:rPr>
           <w:rFonts w:ascii="Aptos" w:hAnsi="Aptos" w:eastAsia="Aptos" w:cs="Aptos"/>
           <w:b/>
@@ -3127,7 +3116,7 @@
       <w:pPr>
         <w:pStyle w:val="Normal"/>
         <w:suppressAutoHyphens w:val="true"/>
-        <w:spacing w:lineRule="auto" w:line="254"/>
+        <w:spacing w:lineRule="auto" w:line="252"/>
         <w:rPr>
           <w:rFonts w:ascii="Aptos" w:hAnsi="Aptos" w:eastAsia="Aptos" w:cs="Aptos"/>
           <w:lang w:val="en-US"/>
@@ -3146,7 +3135,7 @@
       <w:pPr>
         <w:pStyle w:val="Normal"/>
         <w:suppressAutoHyphens w:val="true"/>
-        <w:spacing w:lineRule="auto" w:line="254"/>
+        <w:spacing w:lineRule="auto" w:line="252"/>
         <w:rPr>
           <w:rFonts w:ascii="Aptos" w:hAnsi="Aptos" w:eastAsia="Aptos" w:cs="Aptos"/>
           <w:bCs/>
@@ -3188,7 +3177,7 @@
       <w:pPr>
         <w:pStyle w:val="Normal"/>
         <w:suppressAutoHyphens w:val="true"/>
-        <w:spacing w:lineRule="auto" w:line="254"/>
+        <w:spacing w:lineRule="auto" w:line="252"/>
         <w:rPr>
           <w:rFonts w:ascii="Aptos" w:hAnsi="Aptos" w:eastAsia="Aptos" w:cs="Aptos"/>
           <w:bCs/>
@@ -3209,10 +3198,10 @@
         <w:pStyle w:val="Normal"/>
         <w:numPr>
           <w:ilvl w:val="0"/>
-          <w:numId w:val="21"/>
+          <w:numId w:val="25"/>
         </w:numPr>
         <w:suppressAutoHyphens w:val="true"/>
-        <w:spacing w:lineRule="auto" w:line="254"/>
+        <w:spacing w:lineRule="auto" w:line="252"/>
         <w:rPr>
           <w:rFonts w:ascii="Aptos" w:hAnsi="Aptos" w:eastAsia="Aptos" w:cs="Aptos"/>
           <w:lang w:val="en-US"/>
@@ -3232,6 +3221,160 @@
           <w:lang w:val="en-US"/>
         </w:rPr>
         <w:t xml:space="preserve"> – Awarded for completing the first course.</w:t>
+      </w:r>
+    </w:p>
+    <w:p>
+      <w:pPr>
+        <w:pStyle w:val="Normal"/>
+        <w:numPr>
+          <w:ilvl w:val="0"/>
+          <w:numId w:val="26"/>
+        </w:numPr>
+        <w:suppressAutoHyphens w:val="true"/>
+        <w:spacing w:lineRule="auto" w:line="252"/>
+        <w:rPr>
+          <w:rFonts w:ascii="Aptos" w:hAnsi="Aptos" w:eastAsia="Aptos" w:cs="Aptos"/>
+          <w:lang w:val="en-US"/>
+        </w:rPr>
+      </w:pPr>
+      <w:r>
+        <w:rPr>
+          <w:rFonts w:eastAsia="Aptos" w:cs="Aptos"/>
+          <w:bCs/>
+          <w:lang w:val="en-US"/>
+        </w:rPr>
+        <w:t>Intermediate Badge</w:t>
+      </w:r>
+      <w:r>
+        <w:rPr>
+          <w:rFonts w:eastAsia="Aptos" w:cs="Aptos"/>
+          <w:lang w:val="en-US"/>
+        </w:rPr>
+        <w:t xml:space="preserve"> – Earned after completing </w:t>
+      </w:r>
+      <w:r>
+        <w:rPr>
+          <w:rFonts w:eastAsia="Aptos" w:cs="Aptos"/>
+          <w:bCs/>
+          <w:lang w:val="en-US"/>
+        </w:rPr>
+        <w:t>3 courses</w:t>
+      </w:r>
+      <w:r>
+        <w:rPr>
+          <w:rFonts w:eastAsia="Aptos" w:cs="Aptos"/>
+          <w:lang w:val="en-US"/>
+        </w:rPr>
+        <w:t>.</w:t>
+      </w:r>
+    </w:p>
+    <w:p>
+      <w:pPr>
+        <w:pStyle w:val="Normal"/>
+        <w:numPr>
+          <w:ilvl w:val="0"/>
+          <w:numId w:val="27"/>
+        </w:numPr>
+        <w:suppressAutoHyphens w:val="true"/>
+        <w:spacing w:lineRule="auto" w:line="252"/>
+        <w:rPr>
+          <w:rFonts w:ascii="Aptos" w:hAnsi="Aptos" w:eastAsia="Aptos" w:cs="Aptos"/>
+          <w:lang w:val="en-US"/>
+        </w:rPr>
+      </w:pPr>
+      <w:r>
+        <w:rPr>
+          <w:rFonts w:eastAsia="Aptos" w:cs="Aptos"/>
+          <w:bCs/>
+          <w:lang w:val="en-US"/>
+        </w:rPr>
+        <w:t>Advanced Badge</w:t>
+      </w:r>
+      <w:r>
+        <w:rPr>
+          <w:rFonts w:eastAsia="Aptos" w:cs="Aptos"/>
+          <w:lang w:val="en-US"/>
+        </w:rPr>
+        <w:t xml:space="preserve"> – Earned after completing </w:t>
+      </w:r>
+      <w:r>
+        <w:rPr>
+          <w:rFonts w:eastAsia="Aptos" w:cs="Aptos"/>
+          <w:bCs/>
+          <w:lang w:val="en-US"/>
+        </w:rPr>
+        <w:t>5 courses</w:t>
+      </w:r>
+      <w:r>
+        <w:rPr>
+          <w:rFonts w:eastAsia="Aptos" w:cs="Aptos"/>
+          <w:lang w:val="en-US"/>
+        </w:rPr>
+        <w:t>.</w:t>
+      </w:r>
+    </w:p>
+    <w:p>
+      <w:pPr>
+        <w:pStyle w:val="Normal"/>
+        <w:numPr>
+          <w:ilvl w:val="0"/>
+          <w:numId w:val="28"/>
+        </w:numPr>
+        <w:suppressAutoHyphens w:val="true"/>
+        <w:spacing w:lineRule="auto" w:line="252"/>
+        <w:rPr>
+          <w:rFonts w:ascii="Aptos" w:hAnsi="Aptos" w:eastAsia="Aptos" w:cs="Aptos"/>
+          <w:lang w:val="en-US"/>
+        </w:rPr>
+      </w:pPr>
+      <w:r>
+        <w:rPr>
+          <w:rFonts w:eastAsia="Aptos" w:cs="Aptos"/>
+          <w:bCs/>
+          <w:lang w:val="en-US"/>
+        </w:rPr>
+        <w:t>Expert Badge</w:t>
+      </w:r>
+      <w:r>
+        <w:rPr>
+          <w:rFonts w:eastAsia="Aptos" w:cs="Aptos"/>
+          <w:lang w:val="en-US"/>
+        </w:rPr>
+        <w:t xml:space="preserve"> – Earned after completing </w:t>
+      </w:r>
+      <w:r>
+        <w:rPr>
+          <w:rFonts w:eastAsia="Aptos" w:cs="Aptos"/>
+          <w:bCs/>
+          <w:lang w:val="en-US"/>
+        </w:rPr>
+        <w:t>7 courses</w:t>
+      </w:r>
+      <w:r>
+        <w:rPr>
+          <w:rFonts w:eastAsia="Aptos" w:cs="Aptos"/>
+          <w:lang w:val="en-US"/>
+        </w:rPr>
+        <w:t>.</w:t>
+      </w:r>
+    </w:p>
+    <w:p>
+      <w:pPr>
+        <w:pStyle w:val="Normal"/>
+        <w:suppressAutoHyphens w:val="true"/>
+        <w:spacing w:lineRule="auto" w:line="252"/>
+        <w:rPr>
+          <w:rFonts w:ascii="Aptos" w:hAnsi="Aptos" w:eastAsia="Aptos" w:cs="Aptos"/>
+          <w:lang w:val="en-US"/>
+        </w:rPr>
+      </w:pPr>
+      <w:r>
+        <w:rPr>
+          <w:rFonts w:eastAsia="Aptos" w:cs="Aptos"/>
+          <w:bCs/>
+          <w:lang w:val="en-US"/>
+        </w:rPr>
+        <w:t>Hover Feature</w:t>
       </w:r>
     </w:p>
     <w:p>
@@ -3242,194 +3385,40 @@
           <w:numId w:val="18"/>
         </w:numPr>
         <w:suppressAutoHyphens w:val="true"/>
-        <w:spacing w:lineRule="auto" w:line="254"/>
+        <w:spacing w:lineRule="auto" w:line="252"/>
         <w:rPr>
           <w:rFonts w:ascii="Aptos" w:hAnsi="Aptos" w:eastAsia="Aptos" w:cs="Aptos"/>
           <w:lang w:val="en-US"/>
         </w:rPr>
       </w:pPr>
+      <w:r>
+        <w:rPr>
+          <w:rFonts w:eastAsia="Aptos" w:cs="Aptos"/>
+          <w:lang w:val="en-US"/>
+        </w:rPr>
+        <w:t xml:space="preserve">Hovering over a badge displays its </w:t>
+      </w:r>
       <w:r>
         <w:rPr>
           <w:rFonts w:eastAsia="Aptos" w:cs="Aptos"/>
           <w:bCs/>
           <w:lang w:val="en-US"/>
         </w:rPr>
-        <w:t>Intermediate Badge</w:t>
+        <w:t>criteria and progress</w:t>
       </w:r>
       <w:r>
         <w:rPr>
           <w:rFonts w:eastAsia="Aptos" w:cs="Aptos"/>
           <w:lang w:val="en-US"/>
         </w:rPr>
-        <w:t xml:space="preserve"> – Earned after completing </w:t>
-      </w:r>
-      <w:r>
-        <w:rPr>
-          <w:rFonts w:eastAsia="Aptos" w:cs="Aptos"/>
-          <w:bCs/>
-          <w:lang w:val="en-US"/>
-        </w:rPr>
-        <w:t>3 courses</w:t>
-      </w:r>
-      <w:r>
-        <w:rPr>
-          <w:rFonts w:eastAsia="Aptos" w:cs="Aptos"/>
-          <w:lang w:val="en-US"/>
-        </w:rPr>
         <w:t>.</w:t>
       </w:r>
     </w:p>
     <w:p>
       <w:pPr>
         <w:pStyle w:val="Normal"/>
-        <w:numPr>
-          <w:ilvl w:val="0"/>
-          <w:numId w:val="18"/>
-        </w:numPr>
         <w:suppressAutoHyphens w:val="true"/>
-        <w:spacing w:lineRule="auto" w:line="254"/>
-        <w:rPr>
-          <w:rFonts w:ascii="Aptos" w:hAnsi="Aptos" w:eastAsia="Aptos" w:cs="Aptos"/>
-          <w:lang w:val="en-US"/>
-        </w:rPr>
-      </w:pPr>
-      <w:r>
-        <w:rPr>
-          <w:rFonts w:eastAsia="Aptos" w:cs="Aptos"/>
-          <w:bCs/>
-          <w:lang w:val="en-US"/>
-        </w:rPr>
-        <w:t>Advanced Badge</w:t>
-      </w:r>
-      <w:r>
-        <w:rPr>
-          <w:rFonts w:eastAsia="Aptos" w:cs="Aptos"/>
-          <w:lang w:val="en-US"/>
-        </w:rPr>
-        <w:t xml:space="preserve"> – Earned after completing </w:t>
-      </w:r>
-      <w:r>
-        <w:rPr>
-          <w:rFonts w:eastAsia="Aptos" w:cs="Aptos"/>
-          <w:bCs/>
-          <w:lang w:val="en-US"/>
-        </w:rPr>
-        <w:t>5 courses</w:t>
-      </w:r>
-      <w:r>
-        <w:rPr>
-          <w:rFonts w:eastAsia="Aptos" w:cs="Aptos"/>
-          <w:lang w:val="en-US"/>
-        </w:rPr>
-        <w:t>.</w:t>
-      </w:r>
-    </w:p>
-    <w:p>
-      <w:pPr>
-        <w:pStyle w:val="Normal"/>
-        <w:numPr>
-          <w:ilvl w:val="0"/>
-          <w:numId w:val="18"/>
-        </w:numPr>
-        <w:suppressAutoHyphens w:val="true"/>
-        <w:spacing w:lineRule="auto" w:line="254"/>
-        <w:rPr>
-          <w:rFonts w:ascii="Aptos" w:hAnsi="Aptos" w:eastAsia="Aptos" w:cs="Aptos"/>
-          <w:lang w:val="en-US"/>
-        </w:rPr>
-      </w:pPr>
-      <w:r>
-        <w:rPr>
-          <w:rFonts w:eastAsia="Aptos" w:cs="Aptos"/>
-          <w:bCs/>
-          <w:lang w:val="en-US"/>
-        </w:rPr>
-        <w:t>Expert Badge</w:t>
-      </w:r>
-      <w:r>
-        <w:rPr>
-          <w:rFonts w:eastAsia="Aptos" w:cs="Aptos"/>
-          <w:lang w:val="en-US"/>
-        </w:rPr>
-        <w:t xml:space="preserve"> – Earned after completing </w:t>
-      </w:r>
-      <w:r>
-        <w:rPr>
-          <w:rFonts w:eastAsia="Aptos" w:cs="Aptos"/>
-          <w:bCs/>
-          <w:lang w:val="en-US"/>
-        </w:rPr>
-        <w:t>7 courses</w:t>
-      </w:r>
-      <w:r>
-        <w:rPr>
-          <w:rFonts w:eastAsia="Aptos" w:cs="Aptos"/>
-          <w:lang w:val="en-US"/>
-        </w:rPr>
-        <w:t>.</w:t>
-      </w:r>
-    </w:p>
-    <w:p>
-      <w:pPr>
-        <w:pStyle w:val="Normal"/>
-        <w:suppressAutoHyphens w:val="true"/>
-        <w:spacing w:lineRule="auto" w:line="254"/>
-        <w:rPr>
-          <w:rFonts w:ascii="Aptos" w:hAnsi="Aptos" w:eastAsia="Aptos" w:cs="Aptos"/>
-          <w:lang w:val="en-US"/>
-        </w:rPr>
-      </w:pPr>
-      <w:r>
-        <w:rPr>
-          <w:rFonts w:eastAsia="Aptos" w:cs="Aptos"/>
-          <w:bCs/>
-          <w:lang w:val="en-US"/>
-        </w:rPr>
-        <w:t>Hover Feature</w:t>
-      </w:r>
-    </w:p>
-    <w:p>
-      <w:pPr>
-        <w:pStyle w:val="Normal"/>
-        <w:numPr>
-          <w:ilvl w:val="0"/>
-          <w:numId w:val="19"/>
-        </w:numPr>
-        <w:suppressAutoHyphens w:val="true"/>
-        <w:spacing w:lineRule="auto" w:line="254"/>
-        <w:rPr>
-          <w:rFonts w:ascii="Aptos" w:hAnsi="Aptos" w:eastAsia="Aptos" w:cs="Aptos"/>
-          <w:lang w:val="en-US"/>
-        </w:rPr>
-      </w:pPr>
-      <w:r>
-        <w:rPr>
-          <w:rFonts w:eastAsia="Aptos" w:cs="Aptos"/>
-          <w:lang w:val="en-US"/>
-        </w:rPr>
-        <w:t xml:space="preserve">Hovering over a badge displays its </w:t>
-      </w:r>
-      <w:r>
-        <w:rPr>
-          <w:rFonts w:eastAsia="Aptos" w:cs="Aptos"/>
-          <w:bCs/>
-          <w:lang w:val="en-US"/>
-        </w:rPr>
-        <w:t>criteria and progress</w:t>
-      </w:r>
-      <w:r>
-        <w:rPr>
-          <w:rFonts w:eastAsia="Aptos" w:cs="Aptos"/>
-          <w:lang w:val="en-US"/>
-        </w:rPr>
-        <w:t>.</w:t>
-      </w:r>
-    </w:p>
-    <w:p>
-      <w:pPr>
-        <w:pStyle w:val="Normal"/>
-        <w:suppressAutoHyphens w:val="true"/>
-        <w:spacing w:lineRule="auto" w:line="254"/>
+        <w:spacing w:lineRule="auto" w:line="252"/>
         <w:rPr>
           <w:rFonts w:ascii="Aptos" w:hAnsi="Aptos" w:eastAsia="Aptos" w:cs="Aptos"/>
           <w:lang w:val="en-US"/>
@@ -3480,7 +3469,7 @@
       <w:pPr>
         <w:pStyle w:val="Normal"/>
         <w:suppressAutoHyphens w:val="true"/>
-        <w:spacing w:lineRule="auto" w:line="254"/>
+        <w:spacing w:lineRule="auto" w:line="252"/>
         <w:rPr>
           <w:rFonts w:ascii="Aptos" w:hAnsi="Aptos" w:eastAsia="Aptos" w:cs="Aptos"/>
         </w:rPr>
@@ -3489,6 +3478,43 @@
         <w:rPr>
           <w:rFonts w:eastAsia="Aptos" w:cs="Aptos"/>
         </w:rPr>
+      </w:r>
+    </w:p>
+    <w:p>
+      <w:pPr>
+        <w:pStyle w:val="Normal"/>
+        <w:suppressAutoHyphens w:val="true"/>
+        <w:spacing w:lineRule="auto" w:line="252"/>
+        <w:rPr>
+          <w:rFonts w:ascii="Aptos" w:hAnsi="Aptos" w:eastAsia="Aptos" w:cs="Aptos"/>
+        </w:rPr>
+      </w:pPr>
+      <w:r>
+        <w:rPr>
+          <w:rFonts w:eastAsia="Aptos" w:cs="Aptos"/>
+        </w:rPr>
+      </w:r>
+    </w:p>
+    <w:p>
+      <w:pPr>
+        <w:pStyle w:val="Normal"/>
+        <w:suppressAutoHyphens w:val="true"/>
+        <w:spacing w:lineRule="auto" w:line="252"/>
+        <w:rPr>
+          <w:rFonts w:ascii="Aptos" w:hAnsi="Aptos" w:eastAsia="Aptos" w:cs="Aptos"/>
+          <w:b/>
+          <w:bCs/>
+        </w:rPr>
+      </w:pPr>
+      <w:r>
+        <w:rPr>
+          <w:rFonts w:eastAsia="Aptos" w:cs="Aptos"/>
+          <w:b/>
+          <w:bCs/>
+        </w:rPr>
+        <w:t>4. Levelling System</w:t>
+        <w:br/>
+        <w:br/>
       </w:r>
     </w:p>
     <w:p>
@@ -3498,10 +3524,1324 @@
         <w:bidi w:val="0"/>
         <w:spacing w:lineRule="auto" w:line="259" w:before="0" w:after="160"/>
         <w:jc w:val="left"/>
-        <w:rPr/>
-      </w:pPr>
-      <w:r>
-        <w:rPr/>
+        <w:rPr>
+          <w:b w:val="false"/>
+          <w:bCs w:val="false"/>
+          <w:u w:val="single"/>
+        </w:rPr>
+      </w:pPr>
+      <w:r>
+        <w:rPr>
+          <w:b w:val="false"/>
+          <w:bCs w:val="false"/>
+          <w:u w:val="single"/>
+        </w:rPr>
+        <w:t>Overview</w:t>
+        <w:br/>
+        <w:br/>
+      </w:r>
+      <w:r>
+        <w:rPr>
+          <w:b w:val="false"/>
+          <w:bCs w:val="false"/>
+          <w:u w:val="none"/>
+        </w:rPr>
+        <w:t>The Skills Build Gamification featueres two levelling systems working side by side. There are ranks and levels.</w:t>
+      </w:r>
+    </w:p>
+    <w:p>
+      <w:pPr>
+        <w:pStyle w:val="Normal"/>
+        <w:widowControl/>
+        <w:bidi w:val="0"/>
+        <w:spacing w:lineRule="auto" w:line="259" w:before="0" w:after="160"/>
+        <w:jc w:val="left"/>
+        <w:rPr>
+          <w:u w:val="none"/>
+        </w:rPr>
+      </w:pPr>
+      <w:r>
+        <w:rPr>
+          <w:u w:val="none"/>
+        </w:rPr>
+      </w:r>
+    </w:p>
+    <w:p>
+      <w:pPr>
+        <w:pStyle w:val="Normal"/>
+        <w:widowControl/>
+        <w:bidi w:val="0"/>
+        <w:spacing w:lineRule="auto" w:line="259" w:before="0" w:after="160"/>
+        <w:jc w:val="left"/>
+        <w:rPr>
+          <w:b w:val="false"/>
+          <w:bCs w:val="false"/>
+          <w:u w:val="single"/>
+        </w:rPr>
+      </w:pPr>
+      <w:r>
+        <w:rPr>
+          <w:b w:val="false"/>
+          <w:bCs w:val="false"/>
+          <w:u w:val="single"/>
+        </w:rPr>
+        <w:t>4.1 – How to view rank / level information</w:t>
+        <w:br/>
+        <w:br/>
+      </w:r>
+      <w:r>
+        <w:rPr>
+          <w:b w:val="false"/>
+          <w:bCs w:val="false"/>
+          <w:u w:val="none"/>
+        </w:rPr>
+        <w:t>To view a student’s own levelling information, they can use the dashboard, and navigate to the user profile, by clicking the user profile button at the bottom of the page (more detail on the dashboard can be found in section “1. Dashboard”). Here,  they will find the level and rank displayed underneath their username, as well as an image to show the logo of the rank, as well as other information, which is detailed in section “3. User Profile Management”.</w:t>
+      </w:r>
+    </w:p>
+    <w:p>
+      <w:pPr>
+        <w:pStyle w:val="Normal"/>
+        <w:widowControl/>
+        <w:bidi w:val="0"/>
+        <w:spacing w:lineRule="auto" w:line="259" w:before="0" w:after="160"/>
+        <w:jc w:val="left"/>
+        <w:rPr>
+          <w:b w:val="false"/>
+          <w:bCs w:val="false"/>
+          <w:u w:val="single"/>
+        </w:rPr>
+      </w:pPr>
+      <w:r>
+        <w:rPr>
+          <w:b w:val="false"/>
+          <w:bCs w:val="false"/>
+          <w:u w:val="none"/>
+        </w:rPr>
+        <w:t>To view other students’ ranks, a student, once logged in and on the dashboard page, can navigate to the leaderboard by selecting leaderboard at the bottom of the page (more detail on the leaderboard page can be found in section “2. Leaderboard”). Once on the leaderboard page, they can click the view profile button next to each student on the leaderboard to see information about their profile, including rank and level.</w:t>
+      </w:r>
+      <w:r>
+        <w:rPr>
+          <w:b w:val="false"/>
+          <w:bCs w:val="false"/>
+          <w:u w:val="single"/>
+        </w:rPr>
+        <w:br/>
+      </w:r>
+    </w:p>
+    <w:p>
+      <w:pPr>
+        <w:pStyle w:val="Normal"/>
+        <w:widowControl/>
+        <w:bidi w:val="0"/>
+        <w:spacing w:lineRule="auto" w:line="259" w:before="0" w:after="160"/>
+        <w:jc w:val="left"/>
+        <w:rPr>
+          <w:b w:val="false"/>
+          <w:bCs w:val="false"/>
+          <w:u w:val="single"/>
+        </w:rPr>
+      </w:pPr>
+      <w:r>
+        <w:rPr>
+          <w:b w:val="false"/>
+          <w:bCs w:val="false"/>
+          <w:u w:val="single"/>
+        </w:rPr>
+        <w:t>4.2 How to earn ranks and levels</w:t>
+      </w:r>
+    </w:p>
+    <w:p>
+      <w:pPr>
+        <w:pStyle w:val="Normal"/>
+        <w:widowControl/>
+        <w:bidi w:val="0"/>
+        <w:spacing w:lineRule="auto" w:line="259" w:before="0" w:after="160"/>
+        <w:jc w:val="left"/>
+        <w:rPr>
+          <w:b w:val="false"/>
+          <w:bCs w:val="false"/>
+          <w:u w:val="none"/>
+        </w:rPr>
+      </w:pPr>
+      <w:r>
+        <w:rPr>
+          <w:b w:val="false"/>
+          <w:bCs w:val="false"/>
+          <w:u w:val="none"/>
+        </w:rPr>
+        <w:t>Ranks and levels are both earned using the points system. Whenever a student completes a course, they will be awarded a certain amount of points, which contribute to progress towards the next rank, and the next level. It has intentionally been made slightly easier to progress to the next level compared to the next rank, to allow students to feel a constant sense of progression as they complete more courses and learn new skills</w:t>
+      </w:r>
+    </w:p>
+    <w:p>
+      <w:pPr>
+        <w:pStyle w:val="Normal"/>
+        <w:widowControl/>
+        <w:bidi w:val="0"/>
+        <w:spacing w:lineRule="auto" w:line="259" w:before="0" w:after="160"/>
+        <w:jc w:val="left"/>
+        <w:rPr>
+          <w:b w:val="false"/>
+          <w:bCs w:val="false"/>
+          <w:u w:val="single"/>
+        </w:rPr>
+      </w:pPr>
+      <w:r>
+        <w:rPr>
+          <w:b w:val="false"/>
+          <w:bCs w:val="false"/>
+          <w:u w:val="single"/>
+        </w:rPr>
+        <w:br/>
+        <w:t>4.3 Initial Level and Rank</w:t>
+      </w:r>
+    </w:p>
+    <w:p>
+      <w:pPr>
+        <w:pStyle w:val="Normal"/>
+        <w:widowControl/>
+        <w:bidi w:val="0"/>
+        <w:spacing w:lineRule="auto" w:line="259" w:before="0" w:after="160"/>
+        <w:jc w:val="left"/>
+        <w:rPr>
+          <w:b w:val="false"/>
+          <w:bCs w:val="false"/>
+          <w:u w:val="none"/>
+        </w:rPr>
+      </w:pPr>
+      <w:r>
+        <mc:AlternateContent>
+          <mc:Choice Requires="wps">
+            <w:drawing>
+              <wp:anchor behindDoc="0" distT="0" distB="0" distL="0" distR="0" simplePos="0" locked="0" layoutInCell="0" allowOverlap="1" relativeHeight="22">
+                <wp:simplePos x="0" y="0"/>
+                <wp:positionH relativeFrom="column">
+                  <wp:posOffset>1243330</wp:posOffset>
+                </wp:positionH>
+                <wp:positionV relativeFrom="paragraph">
+                  <wp:posOffset>465455</wp:posOffset>
+                </wp:positionV>
+                <wp:extent cx="2895600" cy="2619375"/>
+                <wp:effectExtent l="0" t="0" r="0" b="0"/>
+                <wp:wrapSquare wrapText="largest"/>
+                <wp:docPr id="16" name="Frame6"/>
+                <a:graphic xmlns:a="http://schemas.openxmlformats.org/drawingml/2006/main">
+                  <a:graphicData uri="http://schemas.microsoft.com/office/word/2010/wordprocessingShape">
+                    <wps:wsp>
+                      <wps:cNvSpPr/>
+                      <wps:spPr>
+                        <a:xfrm>
+                          <a:off x="0" y="0"/>
+                          <a:ext cx="2895480" cy="2619360"/>
+                        </a:xfrm>
+                        <a:prstGeom prst="rect">
+                          <a:avLst/>
+                        </a:prstGeom>
+                        <a:solidFill>
+                          <a:srgbClr val="ffffff"/>
+                        </a:solidFill>
+                        <a:ln w="0">
+                          <a:noFill/>
+                        </a:ln>
+                      </wps:spPr>
+                      <wps:style>
+                        <a:lnRef idx="0"/>
+                        <a:fillRef idx="0"/>
+                        <a:effectRef idx="0"/>
+                        <a:fontRef idx="minor"/>
+                      </wps:style>
+                      <wps:txbx>
+                        <w:txbxContent>
+                          <w:p>
+                            <w:pPr>
+                              <w:pStyle w:val="Caption"/>
+                              <w:suppressLineNumbers/>
+                              <w:spacing w:before="120" w:after="120"/>
+                              <w:rPr/>
+                            </w:pPr>
+                            <w:r>
+                              <w:rPr>
+                                <w:color w:val="000000"/>
+                              </w:rPr>
+                              <w:drawing>
+                                <wp:inline distT="0" distB="0" distL="0" distR="0">
+                                  <wp:extent cx="2895600" cy="2088515"/>
+                                  <wp:effectExtent l="0" t="0" r="0" b="0"/>
+                                  <wp:docPr id="18" name="Image8" descr=""/>
+                                  <wp:cNvGraphicFramePr>
+                                    <a:graphicFrameLocks xmlns:a="http://schemas.openxmlformats.org/drawingml/2006/main" noChangeAspect="1"/>
+                                  </wp:cNvGraphicFramePr>
+                                  <a:graphic xmlns:a="http://schemas.openxmlformats.org/drawingml/2006/main">
+                                    <a:graphicData uri="http://schemas.openxmlformats.org/drawingml/2006/picture">
+                                      <pic:pic xmlns:pic="http://schemas.openxmlformats.org/drawingml/2006/picture">
+                                        <pic:nvPicPr>
+                                          <pic:cNvPr id="18" name="Image8" descr=""/>
+                                          <pic:cNvPicPr>
+                                            <a:picLocks noChangeAspect="1" noChangeArrowheads="1"/>
+                                          </pic:cNvPicPr>
+                                        </pic:nvPicPr>
+                                        <pic:blipFill>
+                                          <a:blip r:embed="rId22"/>
+                                          <a:stretch>
+                                            <a:fillRect/>
+                                          </a:stretch>
+                                        </pic:blipFill>
+                                        <pic:spPr bwMode="auto">
+                                          <a:xfrm>
+                                            <a:off x="0" y="0"/>
+                                            <a:ext cx="2895600" cy="2088515"/>
+                                          </a:xfrm>
+                                          <a:prstGeom prst="rect">
+                                            <a:avLst/>
+                                          </a:prstGeom>
+                                        </pic:spPr>
+                                      </pic:pic>
+                                    </a:graphicData>
+                                  </a:graphic>
+                                </wp:inline>
+                              </w:drawing>
+                            </w:r>
+                            <w:r>
+                              <w:rPr>
+                                <w:color w:val="000000"/>
+                              </w:rPr>
+                              <w:t>New students start at Rank Bronze, and Level 0 when they have just created their account</w:t>
+                            </w:r>
+                          </w:p>
+                        </w:txbxContent>
+                      </wps:txbx>
+                      <wps:bodyPr lIns="0" rIns="0" tIns="0" bIns="0" anchor="t">
+                        <a:noAutofit/>
+                      </wps:bodyPr>
+                    </wps:wsp>
+                  </a:graphicData>
+                </a:graphic>
+              </wp:anchor>
+            </w:drawing>
+          </mc:Choice>
+          <mc:Fallback>
+            <w:pict>
+              <v:rect id="shape_0" ID="Frame6" path="m0,0l-2147483645,0l-2147483645,-2147483646l0,-2147483646xe" fillcolor="white" stroked="f" o:allowincell="f" style="position:absolute;margin-left:97.9pt;margin-top:36.65pt;width:227.95pt;height:206.2pt;mso-wrap-style:square;v-text-anchor:top">
+                <v:fill o:detectmouseclick="t" type="solid" color2="black"/>
+                <v:stroke color="#3465a4" joinstyle="round" endcap="flat"/>
+                <v:textbox>
+                  <w:txbxContent>
+                    <w:p>
+                      <w:pPr>
+                        <w:pStyle w:val="Caption"/>
+                        <w:suppressLineNumbers/>
+                        <w:spacing w:before="120" w:after="120"/>
+                        <w:rPr/>
+                      </w:pPr>
+                      <w:r>
+                        <w:rPr>
+                          <w:color w:val="000000"/>
+                        </w:rPr>
+                        <w:drawing>
+                          <wp:inline distT="0" distB="0" distL="0" distR="0">
+                            <wp:extent cx="2895600" cy="2088515"/>
+                            <wp:effectExtent l="0" t="0" r="0" b="0"/>
+                            <wp:docPr id="19" name="Image8" descr=""/>
+                            <wp:cNvGraphicFramePr>
+                              <a:graphicFrameLocks xmlns:a="http://schemas.openxmlformats.org/drawingml/2006/main" noChangeAspect="1"/>
+                            </wp:cNvGraphicFramePr>
+                            <a:graphic xmlns:a="http://schemas.openxmlformats.org/drawingml/2006/main">
+                              <a:graphicData uri="http://schemas.openxmlformats.org/drawingml/2006/picture">
+                                <pic:pic xmlns:pic="http://schemas.openxmlformats.org/drawingml/2006/picture">
+                                  <pic:nvPicPr>
+                                    <pic:cNvPr id="19" name="Image8" descr=""/>
+                                    <pic:cNvPicPr>
+                                      <a:picLocks noChangeAspect="1" noChangeArrowheads="1"/>
+                                    </pic:cNvPicPr>
+                                  </pic:nvPicPr>
+                                  <pic:blipFill>
+                                    <a:blip r:embed="rId23"/>
+                                    <a:stretch>
+                                      <a:fillRect/>
+                                    </a:stretch>
+                                  </pic:blipFill>
+                                  <pic:spPr bwMode="auto">
+                                    <a:xfrm>
+                                      <a:off x="0" y="0"/>
+                                      <a:ext cx="2895600" cy="2088515"/>
+                                    </a:xfrm>
+                                    <a:prstGeom prst="rect">
+                                      <a:avLst/>
+                                    </a:prstGeom>
+                                  </pic:spPr>
+                                </pic:pic>
+                              </a:graphicData>
+                            </a:graphic>
+                          </wp:inline>
+                        </w:drawing>
+                      </w:r>
+                      <w:r>
+                        <w:rPr>
+                          <w:color w:val="000000"/>
+                        </w:rPr>
+                        <w:t>New students start at Rank Bronze, and Level 0 when they have just created their account</w:t>
+                      </w:r>
+                    </w:p>
+                  </w:txbxContent>
+                </v:textbox>
+                <w10:wrap type="square" side="largest"/>
+              </v:rect>
+            </w:pict>
+          </mc:Fallback>
+        </mc:AlternateContent>
+      </w:r>
+      <w:r>
+        <w:rPr>
+          <w:b w:val="false"/>
+          <w:bCs w:val="false"/>
+          <w:u w:val="none"/>
+        </w:rPr>
+        <w:t xml:space="preserve">All students will begin on Level 0 and Rank Bronze when they have first created their account. </w:t>
+      </w:r>
+    </w:p>
+    <w:p>
+      <w:pPr>
+        <w:pStyle w:val="Normal"/>
+        <w:widowControl/>
+        <w:bidi w:val="0"/>
+        <w:spacing w:lineRule="auto" w:line="259" w:before="0" w:after="160"/>
+        <w:jc w:val="left"/>
+        <w:rPr>
+          <w:b w:val="false"/>
+          <w:bCs w:val="false"/>
+          <w:u w:val="none"/>
+        </w:rPr>
+      </w:pPr>
+      <w:r>
+        <w:rPr>
+          <w:b w:val="false"/>
+          <w:bCs w:val="false"/>
+          <w:u w:val="none"/>
+        </w:rPr>
+        <w:t>/</w:t>
+        <w:br/>
+        <w:br/>
+        <w:br/>
+        <w:br/>
+        <w:br/>
+        <w:br/>
+        <w:br/>
+        <w:br/>
+        <w:br/>
+        <w:br/>
+        <w:br/>
+        <w:br/>
+        <w:br/>
+        <w:br/>
+        <w:br/>
+        <w:br/>
+        <w:br/>
+        <w:br/>
+        <w:t>As students complete more courses and earn more points, the level and rank will increase.</w:t>
+      </w:r>
+    </w:p>
+    <w:p>
+      <w:pPr>
+        <w:pStyle w:val="Normal"/>
+        <w:widowControl/>
+        <w:bidi w:val="0"/>
+        <w:spacing w:lineRule="auto" w:line="259" w:before="0" w:after="160"/>
+        <w:jc w:val="left"/>
+        <w:rPr>
+          <w:b w:val="false"/>
+          <w:bCs w:val="false"/>
+          <w:u w:val="none"/>
+        </w:rPr>
+      </w:pPr>
+      <w:r>
+        <w:rPr>
+          <w:b w:val="false"/>
+          <w:bCs w:val="false"/>
+          <w:u w:val="none"/>
+        </w:rPr>
+        <mc:AlternateContent>
+          <mc:Choice Requires="wps">
+            <w:drawing>
+              <wp:anchor behindDoc="0" distT="0" distB="0" distL="0" distR="0" simplePos="0" locked="0" layoutInCell="0" allowOverlap="1" relativeHeight="24">
+                <wp:simplePos x="0" y="0"/>
+                <wp:positionH relativeFrom="column">
+                  <wp:align>center</wp:align>
+                </wp:positionH>
+                <wp:positionV relativeFrom="paragraph">
+                  <wp:posOffset>635</wp:posOffset>
+                </wp:positionV>
+                <wp:extent cx="5731510" cy="2625725"/>
+                <wp:effectExtent l="0" t="0" r="0" b="0"/>
+                <wp:wrapSquare wrapText="largest"/>
+                <wp:docPr id="17" name="Frame7"/>
+                <a:graphic xmlns:a="http://schemas.openxmlformats.org/drawingml/2006/main">
+                  <a:graphicData uri="http://schemas.microsoft.com/office/word/2010/wordprocessingShape">
+                    <wps:wsp>
+                      <wps:cNvSpPr/>
+                      <wps:spPr>
+                        <a:xfrm>
+                          <a:off x="0" y="0"/>
+                          <a:ext cx="5731560" cy="2625840"/>
+                        </a:xfrm>
+                        <a:prstGeom prst="rect">
+                          <a:avLst/>
+                        </a:prstGeom>
+                        <a:solidFill>
+                          <a:srgbClr val="ffffff"/>
+                        </a:solidFill>
+                        <a:ln w="0">
+                          <a:noFill/>
+                        </a:ln>
+                      </wps:spPr>
+                      <wps:style>
+                        <a:lnRef idx="0"/>
+                        <a:fillRef idx="0"/>
+                        <a:effectRef idx="0"/>
+                        <a:fontRef idx="minor"/>
+                      </wps:style>
+                      <wps:txbx>
+                        <w:txbxContent>
+                          <w:p>
+                            <w:pPr>
+                              <w:pStyle w:val="Caption"/>
+                              <w:suppressLineNumbers/>
+                              <w:spacing w:before="120" w:after="120"/>
+                              <w:rPr/>
+                            </w:pPr>
+                            <w:r>
+                              <w:rPr>
+                                <w:color w:val="000000"/>
+                              </w:rPr>
+                              <w:drawing>
+                                <wp:inline distT="0" distB="0" distL="0" distR="0">
+                                  <wp:extent cx="5731510" cy="2094865"/>
+                                  <wp:effectExtent l="0" t="0" r="0" b="0"/>
+                                  <wp:docPr id="19" name="Image9" descr=""/>
+                                  <wp:cNvGraphicFramePr>
+                                    <a:graphicFrameLocks xmlns:a="http://schemas.openxmlformats.org/drawingml/2006/main" noChangeAspect="1"/>
+                                  </wp:cNvGraphicFramePr>
+                                  <a:graphic xmlns:a="http://schemas.openxmlformats.org/drawingml/2006/main">
+                                    <a:graphicData uri="http://schemas.openxmlformats.org/drawingml/2006/picture">
+                                      <pic:pic xmlns:pic="http://schemas.openxmlformats.org/drawingml/2006/picture">
+                                        <pic:nvPicPr>
+                                          <pic:cNvPr id="19" name="Image9" descr=""/>
+                                          <pic:cNvPicPr>
+                                            <a:picLocks noChangeAspect="1" noChangeArrowheads="1"/>
+                                          </pic:cNvPicPr>
+                                        </pic:nvPicPr>
+                                        <pic:blipFill>
+                                          <a:blip r:embed="rId24"/>
+                                          <a:stretch>
+                                            <a:fillRect/>
+                                          </a:stretch>
+                                        </pic:blipFill>
+                                        <pic:spPr bwMode="auto">
+                                          <a:xfrm>
+                                            <a:off x="0" y="0"/>
+                                            <a:ext cx="5731510" cy="2094865"/>
+                                          </a:xfrm>
+                                          <a:prstGeom prst="rect">
+                                            <a:avLst/>
+                                          </a:prstGeom>
+                                        </pic:spPr>
+                                      </pic:pic>
+                                    </a:graphicData>
+                                  </a:graphic>
+                                </wp:inline>
+                              </w:drawing>
+                            </w:r>
+                            <w:r>
+                              <w:rPr>
+                                <w:color w:val="000000"/>
+                              </w:rPr>
+                              <w:t>After completing some courses and earning 20pts, student Bob12's rank increased from Bronze to Silver, and their level increased from 0 to 2.</w:t>
+                            </w:r>
+                          </w:p>
+                        </w:txbxContent>
+                      </wps:txbx>
+                      <wps:bodyPr lIns="0" rIns="0" tIns="0" bIns="0" anchor="t">
+                        <a:noAutofit/>
+                      </wps:bodyPr>
+                    </wps:wsp>
+                  </a:graphicData>
+                </a:graphic>
+              </wp:anchor>
+            </w:drawing>
+          </mc:Choice>
+          <mc:Fallback>
+            <w:pict>
+              <v:rect id="shape_0" ID="Frame7" path="m0,0l-2147483645,0l-2147483645,-2147483646l0,-2147483646xe" fillcolor="white" stroked="f" o:allowincell="f" style="position:absolute;margin-left:0pt;margin-top:0.05pt;width:451.25pt;height:206.7pt;mso-wrap-style:square;v-text-anchor:top;mso-position-horizontal:center">
+                <v:fill o:detectmouseclick="t" type="solid" color2="black"/>
+                <v:stroke color="#3465a4" joinstyle="round" endcap="flat"/>
+                <v:textbox>
+                  <w:txbxContent>
+                    <w:p>
+                      <w:pPr>
+                        <w:pStyle w:val="Caption"/>
+                        <w:suppressLineNumbers/>
+                        <w:spacing w:before="120" w:after="120"/>
+                        <w:rPr/>
+                      </w:pPr>
+                      <w:r>
+                        <w:rPr>
+                          <w:color w:val="000000"/>
+                        </w:rPr>
+                        <w:drawing>
+                          <wp:inline distT="0" distB="0" distL="0" distR="0">
+                            <wp:extent cx="5731510" cy="2094865"/>
+                            <wp:effectExtent l="0" t="0" r="0" b="0"/>
+                            <wp:docPr id="20" name="Image9" descr=""/>
+                            <wp:cNvGraphicFramePr>
+                              <a:graphicFrameLocks xmlns:a="http://schemas.openxmlformats.org/drawingml/2006/main" noChangeAspect="1"/>
+                            </wp:cNvGraphicFramePr>
+                            <a:graphic xmlns:a="http://schemas.openxmlformats.org/drawingml/2006/main">
+                              <a:graphicData uri="http://schemas.openxmlformats.org/drawingml/2006/picture">
+                                <pic:pic xmlns:pic="http://schemas.openxmlformats.org/drawingml/2006/picture">
+                                  <pic:nvPicPr>
+                                    <pic:cNvPr id="20" name="Image9" descr=""/>
+                                    <pic:cNvPicPr>
+                                      <a:picLocks noChangeAspect="1" noChangeArrowheads="1"/>
+                                    </pic:cNvPicPr>
+                                  </pic:nvPicPr>
+                                  <pic:blipFill>
+                                    <a:blip r:embed="rId25"/>
+                                    <a:stretch>
+                                      <a:fillRect/>
+                                    </a:stretch>
+                                  </pic:blipFill>
+                                  <pic:spPr bwMode="auto">
+                                    <a:xfrm>
+                                      <a:off x="0" y="0"/>
+                                      <a:ext cx="5731510" cy="2094865"/>
+                                    </a:xfrm>
+                                    <a:prstGeom prst="rect">
+                                      <a:avLst/>
+                                    </a:prstGeom>
+                                  </pic:spPr>
+                                </pic:pic>
+                              </a:graphicData>
+                            </a:graphic>
+                          </wp:inline>
+                        </w:drawing>
+                      </w:r>
+                      <w:r>
+                        <w:rPr>
+                          <w:color w:val="000000"/>
+                        </w:rPr>
+                        <w:t>After completing some courses and earning 20pts, student Bob12's rank increased from Bronze to Silver, and their level increased from 0 to 2.</w:t>
+                      </w:r>
+                    </w:p>
+                  </w:txbxContent>
+                </v:textbox>
+                <w10:wrap type="square" side="largest"/>
+              </v:rect>
+            </w:pict>
+          </mc:Fallback>
+        </mc:AlternateContent>
+      </w:r>
+    </w:p>
+    <w:p>
+      <w:pPr>
+        <w:pStyle w:val="Normal"/>
+        <w:widowControl/>
+        <w:bidi w:val="0"/>
+        <w:spacing w:lineRule="auto" w:line="259" w:before="0" w:after="160"/>
+        <w:jc w:val="left"/>
+        <w:rPr>
+          <w:b w:val="false"/>
+          <w:bCs w:val="false"/>
+          <w:u w:val="single"/>
+        </w:rPr>
+      </w:pPr>
+      <w:r>
+        <w:rPr>
+          <w:b w:val="false"/>
+          <w:bCs w:val="false"/>
+          <w:u w:val="single"/>
+        </w:rPr>
+        <w:t>4.4 What ranks are in SkillsBuild Gamification?</w:t>
+        <w:br/>
+        <w:br/>
+      </w:r>
+      <w:r>
+        <w:rPr>
+          <w:b w:val="false"/>
+          <w:bCs w:val="false"/>
+          <w:u w:val="none"/>
+        </w:rPr>
+        <w:t>There are 8 ranks in SkillsBuild Gamification:</w:t>
+      </w:r>
+      <w:r>
+        <w:rPr>
+          <w:b w:val="false"/>
+          <w:bCs w:val="false"/>
+          <w:u w:val="none"/>
+        </w:rPr>
+        <w:drawing>
+          <wp:anchor behindDoc="0" distT="0" distB="0" distL="0" distR="0" simplePos="0" locked="0" layoutInCell="0" allowOverlap="1" relativeHeight="28">
+            <wp:simplePos x="0" y="0"/>
+            <wp:positionH relativeFrom="column">
+              <wp:posOffset>539750</wp:posOffset>
+            </wp:positionH>
+            <wp:positionV relativeFrom="paragraph">
+              <wp:posOffset>590550</wp:posOffset>
+            </wp:positionV>
+            <wp:extent cx="611505" cy="377190"/>
+            <wp:effectExtent l="0" t="0" r="0" b="0"/>
+            <wp:wrapSquare wrapText="largest"/>
+            <wp:docPr id="18" name="Image11" descr=""/>
+            <wp:cNvGraphicFramePr>
+              <a:graphicFrameLocks xmlns:a="http://schemas.openxmlformats.org/drawingml/2006/main" noChangeAspect="1"/>
+            </wp:cNvGraphicFramePr>
+            <a:graphic xmlns:a="http://schemas.openxmlformats.org/drawingml/2006/main">
+              <a:graphicData uri="http://schemas.openxmlformats.org/drawingml/2006/picture">
+                <pic:pic xmlns:pic="http://schemas.openxmlformats.org/drawingml/2006/picture">
+                  <pic:nvPicPr>
+                    <pic:cNvPr id="18" name="Image11" descr=""/>
+                    <pic:cNvPicPr>
+                      <a:picLocks noChangeAspect="1" noChangeArrowheads="1"/>
+                    </pic:cNvPicPr>
+                  </pic:nvPicPr>
+                  <pic:blipFill>
+                    <a:blip r:embed="rId26"/>
+                    <a:stretch>
+                      <a:fillRect/>
+                    </a:stretch>
+                  </pic:blipFill>
+                  <pic:spPr bwMode="auto">
+                    <a:xfrm>
+                      <a:off x="0" y="0"/>
+                      <a:ext cx="611505" cy="377190"/>
+                    </a:xfrm>
+                    <a:prstGeom prst="rect">
+                      <a:avLst/>
+                    </a:prstGeom>
+                  </pic:spPr>
+                </pic:pic>
+              </a:graphicData>
+            </a:graphic>
+          </wp:anchor>
+        </w:drawing>
+        <w:br/>
+      </w:r>
+      <w:r>
+        <w:rPr>
+          <w:b w:val="false"/>
+          <w:bCs w:val="false"/>
+          <w:u w:val="single"/>
+        </w:rPr>
+        <w:br/>
+      </w:r>
+      <w:r>
+        <w:rPr>
+          <w:b w:val="false"/>
+          <w:bCs w:val="false"/>
+          <w:u w:val="single"/>
+        </w:rPr>
+        <w:drawing>
+          <wp:anchor behindDoc="0" distT="0" distB="0" distL="0" distR="0" simplePos="0" locked="0" layoutInCell="0" allowOverlap="1" relativeHeight="26">
+            <wp:simplePos x="0" y="0"/>
+            <wp:positionH relativeFrom="column">
+              <wp:posOffset>80645</wp:posOffset>
+            </wp:positionH>
+            <wp:positionV relativeFrom="paragraph">
+              <wp:posOffset>625475</wp:posOffset>
+            </wp:positionV>
+            <wp:extent cx="680085" cy="342265"/>
+            <wp:effectExtent l="0" t="0" r="0" b="0"/>
+            <wp:wrapSquare wrapText="largest"/>
+            <wp:docPr id="19" name="Image10" descr=""/>
+            <wp:cNvGraphicFramePr>
+              <a:graphicFrameLocks xmlns:a="http://schemas.openxmlformats.org/drawingml/2006/main" noChangeAspect="1"/>
+            </wp:cNvGraphicFramePr>
+            <a:graphic xmlns:a="http://schemas.openxmlformats.org/drawingml/2006/main">
+              <a:graphicData uri="http://schemas.openxmlformats.org/drawingml/2006/picture">
+                <pic:pic xmlns:pic="http://schemas.openxmlformats.org/drawingml/2006/picture">
+                  <pic:nvPicPr>
+                    <pic:cNvPr id="19" name="Image10" descr=""/>
+                    <pic:cNvPicPr>
+                      <a:picLocks noChangeAspect="1" noChangeArrowheads="1"/>
+                    </pic:cNvPicPr>
+                  </pic:nvPicPr>
+                  <pic:blipFill>
+                    <a:blip r:embed="rId27"/>
+                    <a:stretch>
+                      <a:fillRect/>
+                    </a:stretch>
+                  </pic:blipFill>
+                  <pic:spPr bwMode="auto">
+                    <a:xfrm>
+                      <a:off x="0" y="0"/>
+                      <a:ext cx="680085" cy="342265"/>
+                    </a:xfrm>
+                    <a:prstGeom prst="rect">
+                      <a:avLst/>
+                    </a:prstGeom>
+                  </pic:spPr>
+                </pic:pic>
+              </a:graphicData>
+            </a:graphic>
+          </wp:anchor>
+        </w:drawing>
+        <w:drawing>
+          <wp:anchor behindDoc="0" distT="0" distB="0" distL="0" distR="0" simplePos="0" locked="0" layoutInCell="0" allowOverlap="1" relativeHeight="32">
+            <wp:simplePos x="0" y="0"/>
+            <wp:positionH relativeFrom="column">
+              <wp:posOffset>-66675</wp:posOffset>
+            </wp:positionH>
+            <wp:positionV relativeFrom="paragraph">
+              <wp:posOffset>1141095</wp:posOffset>
+            </wp:positionV>
+            <wp:extent cx="796290" cy="398145"/>
+            <wp:effectExtent l="0" t="0" r="0" b="0"/>
+            <wp:wrapSquare wrapText="largest"/>
+            <wp:docPr id="20" name="Image14" descr=""/>
+            <wp:cNvGraphicFramePr>
+              <a:graphicFrameLocks xmlns:a="http://schemas.openxmlformats.org/drawingml/2006/main" noChangeAspect="1"/>
+            </wp:cNvGraphicFramePr>
+            <a:graphic xmlns:a="http://schemas.openxmlformats.org/drawingml/2006/main">
+              <a:graphicData uri="http://schemas.openxmlformats.org/drawingml/2006/picture">
+                <pic:pic xmlns:pic="http://schemas.openxmlformats.org/drawingml/2006/picture">
+                  <pic:nvPicPr>
+                    <pic:cNvPr id="20" name="Image14" descr=""/>
+                    <pic:cNvPicPr>
+                      <a:picLocks noChangeAspect="1" noChangeArrowheads="1"/>
+                    </pic:cNvPicPr>
+                  </pic:nvPicPr>
+                  <pic:blipFill>
+                    <a:blip r:embed="rId28"/>
+                    <a:stretch>
+                      <a:fillRect/>
+                    </a:stretch>
+                  </pic:blipFill>
+                  <pic:spPr bwMode="auto">
+                    <a:xfrm>
+                      <a:off x="0" y="0"/>
+                      <a:ext cx="796290" cy="398145"/>
+                    </a:xfrm>
+                    <a:prstGeom prst="rect">
+                      <a:avLst/>
+                    </a:prstGeom>
+                  </pic:spPr>
+                </pic:pic>
+              </a:graphicData>
+            </a:graphic>
+          </wp:anchor>
+        </w:drawing>
+        <w:br/>
+      </w:r>
+      <w:r>
+        <w:rPr>
+          <w:b w:val="false"/>
+          <w:bCs w:val="false"/>
+          <w:u w:val="single"/>
+        </w:rPr>
+        <w:drawing>
+          <wp:anchor behindDoc="0" distT="0" distB="0" distL="0" distR="0" simplePos="0" locked="0" layoutInCell="0" allowOverlap="1" relativeHeight="30">
+            <wp:simplePos x="0" y="0"/>
+            <wp:positionH relativeFrom="column">
+              <wp:posOffset>1588135</wp:posOffset>
+            </wp:positionH>
+            <wp:positionV relativeFrom="paragraph">
+              <wp:posOffset>537210</wp:posOffset>
+            </wp:positionV>
+            <wp:extent cx="735330" cy="430530"/>
+            <wp:effectExtent l="0" t="0" r="0" b="0"/>
+            <wp:wrapSquare wrapText="largest"/>
+            <wp:docPr id="21" name="Image13" descr=""/>
+            <wp:cNvGraphicFramePr>
+              <a:graphicFrameLocks xmlns:a="http://schemas.openxmlformats.org/drawingml/2006/main" noChangeAspect="1"/>
+            </wp:cNvGraphicFramePr>
+            <a:graphic xmlns:a="http://schemas.openxmlformats.org/drawingml/2006/main">
+              <a:graphicData uri="http://schemas.openxmlformats.org/drawingml/2006/picture">
+                <pic:pic xmlns:pic="http://schemas.openxmlformats.org/drawingml/2006/picture">
+                  <pic:nvPicPr>
+                    <pic:cNvPr id="21" name="Image13" descr=""/>
+                    <pic:cNvPicPr>
+                      <a:picLocks noChangeAspect="1" noChangeArrowheads="1"/>
+                    </pic:cNvPicPr>
+                  </pic:nvPicPr>
+                  <pic:blipFill>
+                    <a:blip r:embed="rId29"/>
+                    <a:stretch>
+                      <a:fillRect/>
+                    </a:stretch>
+                  </pic:blipFill>
+                  <pic:spPr bwMode="auto">
+                    <a:xfrm>
+                      <a:off x="0" y="0"/>
+                      <a:ext cx="735330" cy="430530"/>
+                    </a:xfrm>
+                    <a:prstGeom prst="rect">
+                      <a:avLst/>
+                    </a:prstGeom>
+                  </pic:spPr>
+                </pic:pic>
+              </a:graphicData>
+            </a:graphic>
+          </wp:anchor>
+        </w:drawing>
+        <w:br/>
+      </w:r>
+      <w:r>
+        <w:rPr>
+          <w:b w:val="false"/>
+          <w:bCs w:val="false"/>
+          <w:u w:val="single"/>
+        </w:rPr>
+        <w:drawing>
+          <wp:anchor behindDoc="0" distT="0" distB="0" distL="0" distR="0" simplePos="0" locked="0" layoutInCell="0" allowOverlap="1" relativeHeight="29">
+            <wp:simplePos x="0" y="0"/>
+            <wp:positionH relativeFrom="column">
+              <wp:posOffset>1042035</wp:posOffset>
+            </wp:positionH>
+            <wp:positionV relativeFrom="paragraph">
+              <wp:posOffset>563880</wp:posOffset>
+            </wp:positionV>
+            <wp:extent cx="835025" cy="403860"/>
+            <wp:effectExtent l="0" t="0" r="0" b="0"/>
+            <wp:wrapSquare wrapText="largest"/>
+            <wp:docPr id="22" name="Image12" descr=""/>
+            <wp:cNvGraphicFramePr>
+              <a:graphicFrameLocks xmlns:a="http://schemas.openxmlformats.org/drawingml/2006/main" noChangeAspect="1"/>
+            </wp:cNvGraphicFramePr>
+            <a:graphic xmlns:a="http://schemas.openxmlformats.org/drawingml/2006/main">
+              <a:graphicData uri="http://schemas.openxmlformats.org/drawingml/2006/picture">
+                <pic:pic xmlns:pic="http://schemas.openxmlformats.org/drawingml/2006/picture">
+                  <pic:nvPicPr>
+                    <pic:cNvPr id="22" name="Image12" descr=""/>
+                    <pic:cNvPicPr>
+                      <a:picLocks noChangeAspect="1" noChangeArrowheads="1"/>
+                    </pic:cNvPicPr>
+                  </pic:nvPicPr>
+                  <pic:blipFill>
+                    <a:blip r:embed="rId30"/>
+                    <a:stretch>
+                      <a:fillRect/>
+                    </a:stretch>
+                  </pic:blipFill>
+                  <pic:spPr bwMode="auto">
+                    <a:xfrm>
+                      <a:off x="0" y="0"/>
+                      <a:ext cx="835025" cy="403860"/>
+                    </a:xfrm>
+                    <a:prstGeom prst="rect">
+                      <a:avLst/>
+                    </a:prstGeom>
+                  </pic:spPr>
+                </pic:pic>
+              </a:graphicData>
+            </a:graphic>
+          </wp:anchor>
+        </w:drawing>
+        <w:br/>
+      </w:r>
+      <w:r>
+        <w:rPr>
+          <w:b w:val="false"/>
+          <w:bCs w:val="false"/>
+          <w:u w:val="single"/>
+        </w:rPr>
+        <w:drawing>
+          <wp:anchor behindDoc="0" distT="0" distB="0" distL="0" distR="0" simplePos="0" locked="0" layoutInCell="0" allowOverlap="1" relativeHeight="33">
+            <wp:simplePos x="0" y="0"/>
+            <wp:positionH relativeFrom="column">
+              <wp:posOffset>610235</wp:posOffset>
+            </wp:positionH>
+            <wp:positionV relativeFrom="paragraph">
+              <wp:posOffset>1169035</wp:posOffset>
+            </wp:positionV>
+            <wp:extent cx="694055" cy="364490"/>
+            <wp:effectExtent l="0" t="0" r="0" b="0"/>
+            <wp:wrapSquare wrapText="largest"/>
+            <wp:docPr id="23" name="Image15" descr=""/>
+            <wp:cNvGraphicFramePr>
+              <a:graphicFrameLocks xmlns:a="http://schemas.openxmlformats.org/drawingml/2006/main" noChangeAspect="1"/>
+            </wp:cNvGraphicFramePr>
+            <a:graphic xmlns:a="http://schemas.openxmlformats.org/drawingml/2006/main">
+              <a:graphicData uri="http://schemas.openxmlformats.org/drawingml/2006/picture">
+                <pic:pic xmlns:pic="http://schemas.openxmlformats.org/drawingml/2006/picture">
+                  <pic:nvPicPr>
+                    <pic:cNvPr id="23" name="Image15" descr=""/>
+                    <pic:cNvPicPr>
+                      <a:picLocks noChangeAspect="1" noChangeArrowheads="1"/>
+                    </pic:cNvPicPr>
+                  </pic:nvPicPr>
+                  <pic:blipFill>
+                    <a:blip r:embed="rId31"/>
+                    <a:stretch>
+                      <a:fillRect/>
+                    </a:stretch>
+                  </pic:blipFill>
+                  <pic:spPr bwMode="auto">
+                    <a:xfrm>
+                      <a:off x="0" y="0"/>
+                      <a:ext cx="694055" cy="364490"/>
+                    </a:xfrm>
+                    <a:prstGeom prst="rect">
+                      <a:avLst/>
+                    </a:prstGeom>
+                  </pic:spPr>
+                </pic:pic>
+              </a:graphicData>
+            </a:graphic>
+          </wp:anchor>
+        </w:drawing>
+        <w:br/>
+      </w:r>
+      <w:r>
+        <w:rPr>
+          <w:b w:val="false"/>
+          <w:bCs w:val="false"/>
+          <w:u w:val="single"/>
+        </w:rPr>
+        <w:drawing>
+          <wp:anchor behindDoc="0" distT="0" distB="0" distL="0" distR="0" simplePos="0" locked="0" layoutInCell="0" allowOverlap="1" relativeHeight="34">
+            <wp:simplePos x="0" y="0"/>
+            <wp:positionH relativeFrom="column">
+              <wp:posOffset>1436370</wp:posOffset>
+            </wp:positionH>
+            <wp:positionV relativeFrom="paragraph">
+              <wp:posOffset>1107440</wp:posOffset>
+            </wp:positionV>
+            <wp:extent cx="654685" cy="463550"/>
+            <wp:effectExtent l="0" t="0" r="0" b="0"/>
+            <wp:wrapSquare wrapText="largest"/>
+            <wp:docPr id="24" name="Image16" descr=""/>
+            <wp:cNvGraphicFramePr>
+              <a:graphicFrameLocks xmlns:a="http://schemas.openxmlformats.org/drawingml/2006/main" noChangeAspect="1"/>
+            </wp:cNvGraphicFramePr>
+            <a:graphic xmlns:a="http://schemas.openxmlformats.org/drawingml/2006/main">
+              <a:graphicData uri="http://schemas.openxmlformats.org/drawingml/2006/picture">
+                <pic:pic xmlns:pic="http://schemas.openxmlformats.org/drawingml/2006/picture">
+                  <pic:nvPicPr>
+                    <pic:cNvPr id="24" name="Image16" descr=""/>
+                    <pic:cNvPicPr>
+                      <a:picLocks noChangeAspect="1" noChangeArrowheads="1"/>
+                    </pic:cNvPicPr>
+                  </pic:nvPicPr>
+                  <pic:blipFill>
+                    <a:blip r:embed="rId32"/>
+                    <a:stretch>
+                      <a:fillRect/>
+                    </a:stretch>
+                  </pic:blipFill>
+                  <pic:spPr bwMode="auto">
+                    <a:xfrm>
+                      <a:off x="0" y="0"/>
+                      <a:ext cx="654685" cy="463550"/>
+                    </a:xfrm>
+                    <a:prstGeom prst="rect">
+                      <a:avLst/>
+                    </a:prstGeom>
+                  </pic:spPr>
+                </pic:pic>
+              </a:graphicData>
+            </a:graphic>
+          </wp:anchor>
+        </w:drawing>
+        <w:drawing>
+          <wp:anchor behindDoc="0" distT="0" distB="0" distL="0" distR="0" simplePos="0" locked="0" layoutInCell="0" allowOverlap="1" relativeHeight="40">
+            <wp:simplePos x="0" y="0"/>
+            <wp:positionH relativeFrom="column">
+              <wp:posOffset>2006600</wp:posOffset>
+            </wp:positionH>
+            <wp:positionV relativeFrom="paragraph">
+              <wp:posOffset>1018540</wp:posOffset>
+            </wp:positionV>
+            <wp:extent cx="841375" cy="552450"/>
+            <wp:effectExtent l="0" t="0" r="0" b="0"/>
+            <wp:wrapSquare wrapText="largest"/>
+            <wp:docPr id="25" name="Image17" descr=""/>
+            <wp:cNvGraphicFramePr>
+              <a:graphicFrameLocks xmlns:a="http://schemas.openxmlformats.org/drawingml/2006/main" noChangeAspect="1"/>
+            </wp:cNvGraphicFramePr>
+            <a:graphic xmlns:a="http://schemas.openxmlformats.org/drawingml/2006/main">
+              <a:graphicData uri="http://schemas.openxmlformats.org/drawingml/2006/picture">
+                <pic:pic xmlns:pic="http://schemas.openxmlformats.org/drawingml/2006/picture">
+                  <pic:nvPicPr>
+                    <pic:cNvPr id="25" name="Image17" descr=""/>
+                    <pic:cNvPicPr>
+                      <a:picLocks noChangeAspect="1" noChangeArrowheads="1"/>
+                    </pic:cNvPicPr>
+                  </pic:nvPicPr>
+                  <pic:blipFill>
+                    <a:blip r:embed="rId33"/>
+                    <a:stretch>
+                      <a:fillRect/>
+                    </a:stretch>
+                  </pic:blipFill>
+                  <pic:spPr bwMode="auto">
+                    <a:xfrm>
+                      <a:off x="0" y="0"/>
+                      <a:ext cx="841375" cy="552450"/>
+                    </a:xfrm>
+                    <a:prstGeom prst="rect">
+                      <a:avLst/>
+                    </a:prstGeom>
+                  </pic:spPr>
+                </pic:pic>
+              </a:graphicData>
+            </a:graphic>
+          </wp:anchor>
+        </w:drawing>
+      </w:r>
+      <w:r>
+        <w:rPr>
+          <w:b w:val="false"/>
+          <w:bCs w:val="false"/>
+          <w:u w:val="single"/>
+        </w:rPr>
+        <w:br/>
+      </w:r>
+    </w:p>
+    <w:p>
+      <w:pPr>
+        <w:pStyle w:val="Normal"/>
+        <w:widowControl/>
+        <w:numPr>
+          <w:ilvl w:val="0"/>
+          <w:numId w:val="19"/>
+        </w:numPr>
+        <w:bidi w:val="0"/>
+        <w:spacing w:lineRule="auto" w:line="259" w:before="0" w:after="160"/>
+        <w:jc w:val="left"/>
+        <w:rPr>
+          <w:b w:val="false"/>
+          <w:bCs w:val="false"/>
+          <w:u w:val="single"/>
+        </w:rPr>
+      </w:pPr>
+      <w:r>
+        <w:rPr>
+          <w:b w:val="false"/>
+          <w:bCs w:val="false"/>
+          <w:u w:val="none"/>
+        </w:rPr>
+        <w:t>Bronze: The initial rank all students start on</w:t>
+      </w:r>
+    </w:p>
+    <w:p>
+      <w:pPr>
+        <w:pStyle w:val="Normal"/>
+        <w:widowControl/>
+        <w:numPr>
+          <w:ilvl w:val="0"/>
+          <w:numId w:val="19"/>
+        </w:numPr>
+        <w:bidi w:val="0"/>
+        <w:spacing w:lineRule="auto" w:line="259" w:before="0" w:after="160"/>
+        <w:jc w:val="left"/>
+        <w:rPr>
+          <w:b w:val="false"/>
+          <w:bCs w:val="false"/>
+          <w:u w:val="single"/>
+        </w:rPr>
+      </w:pPr>
+      <w:r>
+        <w:rPr>
+          <w:b w:val="false"/>
+          <w:bCs w:val="false"/>
+          <w:u w:val="none"/>
+        </w:rPr>
+        <w:t>Silver: Obtained after reaching 20pts</w:t>
+      </w:r>
+    </w:p>
+    <w:p>
+      <w:pPr>
+        <w:pStyle w:val="Normal"/>
+        <w:widowControl/>
+        <w:numPr>
+          <w:ilvl w:val="0"/>
+          <w:numId w:val="19"/>
+        </w:numPr>
+        <w:bidi w:val="0"/>
+        <w:spacing w:lineRule="auto" w:line="259" w:before="0" w:after="160"/>
+        <w:jc w:val="left"/>
+        <w:rPr>
+          <w:b w:val="false"/>
+          <w:bCs w:val="false"/>
+          <w:u w:val="single"/>
+        </w:rPr>
+      </w:pPr>
+      <w:r>
+        <w:rPr>
+          <w:b w:val="false"/>
+          <w:bCs w:val="false"/>
+          <w:u w:val="none"/>
+        </w:rPr>
+        <w:t>Gold: Obtained after reaching 40pts</w:t>
+      </w:r>
+      <w:r>
+        <w:rPr>
+          <w:b w:val="false"/>
+          <w:bCs w:val="false"/>
+          <w:u w:val="single"/>
+        </w:rPr>
+        <w:t>.</w:t>
+      </w:r>
+    </w:p>
+    <w:p>
+      <w:pPr>
+        <w:pStyle w:val="Normal"/>
+        <w:widowControl/>
+        <w:numPr>
+          <w:ilvl w:val="0"/>
+          <w:numId w:val="19"/>
+        </w:numPr>
+        <w:bidi w:val="0"/>
+        <w:spacing w:lineRule="auto" w:line="259" w:before="0" w:after="160"/>
+        <w:jc w:val="left"/>
+        <w:rPr>
+          <w:b w:val="false"/>
+          <w:bCs w:val="false"/>
+          <w:u w:val="single"/>
+        </w:rPr>
+      </w:pPr>
+      <w:r>
+        <w:rPr>
+          <w:b w:val="false"/>
+          <w:bCs w:val="false"/>
+          <w:u w:val="none"/>
+        </w:rPr>
+        <w:t>Platinum: Obtained after reaching 60pts</w:t>
+      </w:r>
+    </w:p>
+    <w:p>
+      <w:pPr>
+        <w:pStyle w:val="Normal"/>
+        <w:widowControl/>
+        <w:numPr>
+          <w:ilvl w:val="0"/>
+          <w:numId w:val="19"/>
+        </w:numPr>
+        <w:bidi w:val="0"/>
+        <w:spacing w:lineRule="auto" w:line="259" w:before="0" w:after="160"/>
+        <w:jc w:val="left"/>
+        <w:rPr>
+          <w:b w:val="false"/>
+          <w:bCs w:val="false"/>
+          <w:u w:val="single"/>
+        </w:rPr>
+      </w:pPr>
+      <w:r>
+        <w:rPr>
+          <w:b w:val="false"/>
+          <w:bCs w:val="false"/>
+          <w:u w:val="none"/>
+        </w:rPr>
+        <w:t>Diamond: Obtained after reaching 80pts</w:t>
+      </w:r>
+    </w:p>
+    <w:p>
+      <w:pPr>
+        <w:pStyle w:val="Normal"/>
+        <w:widowControl/>
+        <w:numPr>
+          <w:ilvl w:val="0"/>
+          <w:numId w:val="19"/>
+        </w:numPr>
+        <w:bidi w:val="0"/>
+        <w:spacing w:lineRule="auto" w:line="259" w:before="0" w:after="160"/>
+        <w:jc w:val="left"/>
+        <w:rPr>
+          <w:b w:val="false"/>
+          <w:bCs w:val="false"/>
+          <w:u w:val="single"/>
+        </w:rPr>
+      </w:pPr>
+      <w:r>
+        <w:rPr>
+          <w:b w:val="false"/>
+          <w:bCs w:val="false"/>
+          <w:u w:val="none"/>
+        </w:rPr>
+        <w:t>Champion: Obtained after reaching 100pts</w:t>
+      </w:r>
+    </w:p>
+    <w:p>
+      <w:pPr>
+        <w:pStyle w:val="Normal"/>
+        <w:widowControl/>
+        <w:numPr>
+          <w:ilvl w:val="0"/>
+          <w:numId w:val="19"/>
+        </w:numPr>
+        <w:bidi w:val="0"/>
+        <w:spacing w:lineRule="auto" w:line="259" w:before="0" w:after="160"/>
+        <w:jc w:val="left"/>
+        <w:rPr>
+          <w:b w:val="false"/>
+          <w:bCs w:val="false"/>
+          <w:u w:val="single"/>
+        </w:rPr>
+      </w:pPr>
+      <w:r>
+        <w:rPr>
+          <w:b w:val="false"/>
+          <w:bCs w:val="false"/>
+          <w:u w:val="none"/>
+        </w:rPr>
+        <w:t>Mega Champion: Obtained after reaching 120pts</w:t>
+      </w:r>
+    </w:p>
+    <w:p>
+      <w:pPr>
+        <w:pStyle w:val="Normal"/>
+        <w:widowControl/>
+        <w:numPr>
+          <w:ilvl w:val="0"/>
+          <w:numId w:val="19"/>
+        </w:numPr>
+        <w:bidi w:val="0"/>
+        <w:spacing w:lineRule="auto" w:line="259" w:before="0" w:after="160"/>
+        <w:jc w:val="left"/>
+        <w:rPr>
+          <w:b w:val="false"/>
+          <w:bCs w:val="false"/>
+          <w:u w:val="single"/>
+        </w:rPr>
+      </w:pPr>
+      <w:r>
+        <w:rPr>
+          <w:b w:val="false"/>
+          <w:bCs w:val="false"/>
+          <w:u w:val="none"/>
+        </w:rPr>
+        <w:t>Legend: Obtained after reaching 140pts</w:t>
+      </w:r>
+    </w:p>
+    <w:p>
+      <w:pPr>
+        <w:pStyle w:val="Normal"/>
+        <w:widowControl/>
+        <w:bidi w:val="0"/>
+        <w:spacing w:lineRule="auto" w:line="259" w:before="0" w:after="160"/>
+        <w:jc w:val="left"/>
+        <w:rPr>
+          <w:u w:val="none"/>
+        </w:rPr>
+      </w:pPr>
+      <w:r>
+        <w:rPr>
+          <w:u w:val="none"/>
+        </w:rPr>
+      </w:r>
+    </w:p>
+    <w:p>
+      <w:pPr>
+        <w:pStyle w:val="Normal"/>
+        <w:widowControl/>
+        <w:bidi w:val="0"/>
+        <w:spacing w:lineRule="auto" w:line="259" w:before="0" w:after="160"/>
+        <w:jc w:val="left"/>
+        <w:rPr>
+          <w:u w:val="none"/>
+        </w:rPr>
+      </w:pPr>
+      <w:r>
+        <w:rPr>
+          <w:u w:val="none"/>
+        </w:rPr>
       </w:r>
     </w:p>
     <w:sectPr>
@@ -3519,6 +4859,13 @@
 
 <file path=word/numbering.xml><?xml version="1.0" encoding="utf-8"?>
 <w:numbering xmlns:w="http://schemas.openxmlformats.org/wordprocessingml/2006/main" xmlns:o="urn:schemas-microsoft-com:office:office" xmlns:r="http://schemas.openxmlformats.org/officeDocument/2006/relationships" xmlns:v="urn:schemas-microsoft-com:vml" xmlns:mc="http://schemas.openxmlformats.org/markup-compatibility/2006" xmlns:w14="http://schemas.microsoft.com/office/word/2010/wordml" mc:Ignorable="w14">
+  <w:numPicBullet w:numPicBulletId="0">
+    <w:pict>
+      <v:shape style="width:5.5pt;height:5.5pt" o:bullet="t">
+        <v:imagedata r:id="rId1" o:title=""/>
+      </v:shape>
+    </w:pict>
+  </w:numPicBullet>
   <w:abstractNum w:abstractNumId="1">
     <w:lvl w:ilvl="0">
       <w:start w:val="1"/>
@@ -5970,6 +7317,297 @@
   <w:abstractNum w:abstractNumId="18">
     <w:lvl w:ilvl="0">
       <w:start w:val="1"/>
+      <w:numFmt w:val="bullet"/>
+      <w:lvlText w:val=""/>
+      <w:lvlJc w:val="left"/>
+      <w:pPr>
+        <w:tabs>
+          <w:tab w:val="num" w:pos="720"/>
+        </w:tabs>
+        <w:ind w:left="720" w:hanging="360"/>
+      </w:pPr>
+      <w:rPr>
+        <w:rFonts w:ascii="Symbol" w:hAnsi="Symbol" w:cs="Symbol" w:hint="default"/>
+        <w:sz w:val="20"/>
+      </w:rPr>
+    </w:lvl>
+    <w:lvl w:ilvl="1">
+      <w:start w:val="1"/>
+      <w:numFmt w:val="bullet"/>
+      <w:lvlText w:val="o"/>
+      <w:lvlJc w:val="left"/>
+      <w:pPr>
+        <w:tabs>
+          <w:tab w:val="num" w:pos="1440"/>
+        </w:tabs>
+        <w:ind w:left="1440" w:hanging="360"/>
+      </w:pPr>
+      <w:rPr>
+        <w:rFonts w:ascii="Courier New" w:hAnsi="Courier New" w:cs="Courier New" w:hint="default"/>
+        <w:sz w:val="20"/>
+      </w:rPr>
+    </w:lvl>
+    <w:lvl w:ilvl="2">
+      <w:start w:val="1"/>
+      <w:numFmt w:val="bullet"/>
+      <w:lvlText w:val=""/>
+      <w:lvlJc w:val="left"/>
+      <w:pPr>
+        <w:tabs>
+          <w:tab w:val="num" w:pos="2160"/>
+        </w:tabs>
+        <w:ind w:left="2160" w:hanging="360"/>
+      </w:pPr>
+      <w:rPr>
+        <w:rFonts w:ascii="Wingdings" w:hAnsi="Wingdings" w:cs="Wingdings" w:hint="default"/>
+        <w:sz w:val="20"/>
+      </w:rPr>
+    </w:lvl>
+    <w:lvl w:ilvl="3">
+      <w:start w:val="1"/>
+      <w:numFmt w:val="bullet"/>
+      <w:lvlText w:val=""/>
+      <w:lvlJc w:val="left"/>
+      <w:pPr>
+        <w:tabs>
+          <w:tab w:val="num" w:pos="2880"/>
+        </w:tabs>
+        <w:ind w:left="2880" w:hanging="360"/>
+      </w:pPr>
+      <w:rPr>
+        <w:rFonts w:ascii="Wingdings" w:hAnsi="Wingdings" w:cs="Wingdings" w:hint="default"/>
+        <w:sz w:val="20"/>
+      </w:rPr>
+    </w:lvl>
+    <w:lvl w:ilvl="4">
+      <w:start w:val="1"/>
+      <w:numFmt w:val="bullet"/>
+      <w:lvlText w:val=""/>
+      <w:lvlJc w:val="left"/>
+      <w:pPr>
+        <w:tabs>
+          <w:tab w:val="num" w:pos="3600"/>
+        </w:tabs>
+        <w:ind w:left="3600" w:hanging="360"/>
+      </w:pPr>
+      <w:rPr>
+        <w:rFonts w:ascii="Wingdings" w:hAnsi="Wingdings" w:cs="Wingdings" w:hint="default"/>
+        <w:sz w:val="20"/>
+      </w:rPr>
+    </w:lvl>
+    <w:lvl w:ilvl="5">
+      <w:start w:val="1"/>
+      <w:numFmt w:val="bullet"/>
+      <w:lvlText w:val=""/>
+      <w:lvlJc w:val="left"/>
+      <w:pPr>
+        <w:tabs>
+          <w:tab w:val="num" w:pos="4320"/>
+        </w:tabs>
+        <w:ind w:left="4320" w:hanging="360"/>
+      </w:pPr>
+      <w:rPr>
+        <w:rFonts w:ascii="Wingdings" w:hAnsi="Wingdings" w:cs="Wingdings" w:hint="default"/>
+        <w:sz w:val="20"/>
+      </w:rPr>
+    </w:lvl>
+    <w:lvl w:ilvl="6">
+      <w:start w:val="1"/>
+      <w:numFmt w:val="bullet"/>
+      <w:lvlText w:val=""/>
+      <w:lvlJc w:val="left"/>
+      <w:pPr>
+        <w:tabs>
+          <w:tab w:val="num" w:pos="5040"/>
+        </w:tabs>
+        <w:ind w:left="5040" w:hanging="360"/>
+      </w:pPr>
+      <w:rPr>
+        <w:rFonts w:ascii="Wingdings" w:hAnsi="Wingdings" w:cs="Wingdings" w:hint="default"/>
+        <w:sz w:val="20"/>
+      </w:rPr>
+    </w:lvl>
+    <w:lvl w:ilvl="7">
+      <w:start w:val="1"/>
+      <w:numFmt w:val="bullet"/>
+      <w:lvlText w:val=""/>
+      <w:lvlJc w:val="left"/>
+      <w:pPr>
+        <w:tabs>
+          <w:tab w:val="num" w:pos="5760"/>
+        </w:tabs>
+        <w:ind w:left="5760" w:hanging="360"/>
+      </w:pPr>
+      <w:rPr>
+        <w:rFonts w:ascii="Wingdings" w:hAnsi="Wingdings" w:cs="Wingdings" w:hint="default"/>
+        <w:sz w:val="20"/>
+      </w:rPr>
+    </w:lvl>
+    <w:lvl w:ilvl="8">
+      <w:start w:val="1"/>
+      <w:numFmt w:val="bullet"/>
+      <w:lvlText w:val=""/>
+      <w:lvlJc w:val="left"/>
+      <w:pPr>
+        <w:tabs>
+          <w:tab w:val="num" w:pos="6480"/>
+        </w:tabs>
+        <w:ind w:left="6480" w:hanging="360"/>
+      </w:pPr>
+      <w:rPr>
+        <w:rFonts w:ascii="Wingdings" w:hAnsi="Wingdings" w:cs="Wingdings" w:hint="default"/>
+        <w:sz w:val="20"/>
+      </w:rPr>
+    </w:lvl>
+  </w:abstractNum>
+  <w:abstractNum w:abstractNumId="19">
+    <w:lvl w:ilvl="0">
+      <w:start w:val="1"/>
+      <w:numFmt w:val="bullet"/>
+      <w:lvlText w:val=""/>
+      <w:lvlJc w:val="left"/>
+      <w:pPr>
+        <w:tabs>
+          <w:tab w:val="num" w:pos="720"/>
+        </w:tabs>
+        <w:ind w:left="720" w:hanging="360"/>
+      </w:pPr>
+      <w:rPr>
+        <w:rFonts w:ascii="Symbol" w:hAnsi="Symbol" w:cs="Symbol" w:hint="default"/>
+      </w:rPr>
+    </w:lvl>
+    <w:lvl w:ilvl="1">
+      <w:start w:val="1"/>
+      <w:numFmt w:val="bullet"/>
+      <w:lvlText w:val="◦"/>
+      <w:lvlPicBulletId w:val="0"/>
+      <w:lvlJc w:val="left"/>
+      <w:pPr>
+        <w:tabs>
+          <w:tab w:val="num" w:pos="1080"/>
+        </w:tabs>
+        <w:ind w:left="1080" w:hanging="360"/>
+      </w:pPr>
+      <w:rPr>
+        <w:rFonts w:ascii="Symbol" w:hAnsi="Symbol" w:cs="Symbol" w:hint="default"/>
+      </w:rPr>
+    </w:lvl>
+    <w:lvl w:ilvl="2">
+      <w:start w:val="1"/>
+      <w:numFmt w:val="bullet"/>
+      <w:lvlText w:val="▪"/>
+      <w:lvlPicBulletId w:val="0"/>
+      <w:lvlJc w:val="left"/>
+      <w:pPr>
+        <w:tabs>
+          <w:tab w:val="num" w:pos="1440"/>
+        </w:tabs>
+        <w:ind w:left="1440" w:hanging="360"/>
+      </w:pPr>
+      <w:rPr>
+        <w:rFonts w:ascii="Symbol" w:hAnsi="Symbol" w:cs="Symbol" w:hint="default"/>
+      </w:rPr>
+    </w:lvl>
+    <w:lvl w:ilvl="3">
+      <w:start w:val="1"/>
+      <w:numFmt w:val="bullet"/>
+      <w:lvlText w:val="•"/>
+      <w:lvlPicBulletId w:val="0"/>
+      <w:lvlJc w:val="left"/>
+      <w:pPr>
+        <w:tabs>
+          <w:tab w:val="num" w:pos="1800"/>
+        </w:tabs>
+        <w:ind w:left="1800" w:hanging="360"/>
+      </w:pPr>
+      <w:rPr>
+        <w:rFonts w:ascii="Symbol" w:hAnsi="Symbol" w:cs="Symbol" w:hint="default"/>
+      </w:rPr>
+    </w:lvl>
+    <w:lvl w:ilvl="4">
+      <w:start w:val="1"/>
+      <w:numFmt w:val="bullet"/>
+      <w:lvlText w:val="◦"/>
+      <w:lvlPicBulletId w:val="0"/>
+      <w:lvlJc w:val="left"/>
+      <w:pPr>
+        <w:tabs>
+          <w:tab w:val="num" w:pos="2160"/>
+        </w:tabs>
+        <w:ind w:left="2160" w:hanging="360"/>
+      </w:pPr>
+      <w:rPr>
+        <w:rFonts w:ascii="Symbol" w:hAnsi="Symbol" w:cs="Symbol" w:hint="default"/>
+      </w:rPr>
+    </w:lvl>
+    <w:lvl w:ilvl="5">
+      <w:start w:val="1"/>
+      <w:numFmt w:val="bullet"/>
+      <w:lvlText w:val="▪"/>
+      <w:lvlPicBulletId w:val="0"/>
+      <w:lvlJc w:val="left"/>
+      <w:pPr>
+        <w:tabs>
+          <w:tab w:val="num" w:pos="2520"/>
+        </w:tabs>
+        <w:ind w:left="2520" w:hanging="360"/>
+      </w:pPr>
+      <w:rPr>
+        <w:rFonts w:ascii="Symbol" w:hAnsi="Symbol" w:cs="Symbol" w:hint="default"/>
+      </w:rPr>
+    </w:lvl>
+    <w:lvl w:ilvl="6">
+      <w:start w:val="1"/>
+      <w:numFmt w:val="bullet"/>
+      <w:lvlText w:val="•"/>
+      <w:lvlPicBulletId w:val="0"/>
+      <w:lvlJc w:val="left"/>
+      <w:pPr>
+        <w:tabs>
+          <w:tab w:val="num" w:pos="2880"/>
+        </w:tabs>
+        <w:ind w:left="2880" w:hanging="360"/>
+      </w:pPr>
+      <w:rPr>
+        <w:rFonts w:ascii="Symbol" w:hAnsi="Symbol" w:cs="Symbol" w:hint="default"/>
+      </w:rPr>
+    </w:lvl>
+    <w:lvl w:ilvl="7">
+      <w:start w:val="1"/>
+      <w:numFmt w:val="bullet"/>
+      <w:lvlText w:val="◦"/>
+      <w:lvlPicBulletId w:val="0"/>
+      <w:lvlJc w:val="left"/>
+      <w:pPr>
+        <w:tabs>
+          <w:tab w:val="num" w:pos="3240"/>
+        </w:tabs>
+        <w:ind w:left="3240" w:hanging="360"/>
+      </w:pPr>
+      <w:rPr>
+        <w:rFonts w:ascii="Symbol" w:hAnsi="Symbol" w:cs="Symbol" w:hint="default"/>
+      </w:rPr>
+    </w:lvl>
+    <w:lvl w:ilvl="8">
+      <w:start w:val="1"/>
+      <w:numFmt w:val="bullet"/>
+      <w:lvlText w:val="▪"/>
+      <w:lvlPicBulletId w:val="0"/>
+      <w:lvlJc w:val="left"/>
+      <w:pPr>
+        <w:tabs>
+          <w:tab w:val="num" w:pos="3600"/>
+        </w:tabs>
+        <w:ind w:left="3600" w:hanging="360"/>
+      </w:pPr>
+      <w:rPr>
+        <w:rFonts w:ascii="Symbol" w:hAnsi="Symbol" w:cs="Symbol" w:hint="default"/>
+      </w:rPr>
+    </w:lvl>
+  </w:abstractNum>
+  <w:abstractNum w:abstractNumId="20">
+    <w:lvl w:ilvl="0">
+      <w:start w:val="1"/>
       <w:numFmt w:val="decimal"/>
       <w:lvlText w:val="%1."/>
       <w:lvlJc w:val="left"/>
@@ -6086,153 +7724,364 @@
       <w:rPr/>
     </w:lvl>
   </w:abstractNum>
-  <w:abstractNum w:abstractNumId="19">
+  <w:abstractNum w:abstractNumId="21">
     <w:lvl w:ilvl="0">
       <w:start w:val="1"/>
-      <w:numFmt w:val="bullet"/>
-      <w:lvlText w:val=""/>
-      <w:lvlJc w:val="left"/>
-      <w:pPr>
-        <w:tabs>
-          <w:tab w:val="num" w:pos="720"/>
+      <w:numFmt w:val="decimal"/>
+      <w:lvlText w:val="%1."/>
+      <w:lvlJc w:val="left"/>
+      <w:pPr>
+        <w:tabs>
+          <w:tab w:val="num" w:pos="0"/>
         </w:tabs>
         <w:ind w:left="720" w:hanging="360"/>
       </w:pPr>
-      <w:rPr>
-        <w:rFonts w:ascii="Symbol" w:hAnsi="Symbol" w:cs="Symbol" w:hint="default"/>
-        <w:sz w:val="20"/>
-      </w:rPr>
+      <w:rPr/>
     </w:lvl>
     <w:lvl w:ilvl="1">
       <w:start w:val="1"/>
-      <w:numFmt w:val="bullet"/>
-      <w:lvlText w:val="o"/>
-      <w:lvlJc w:val="left"/>
-      <w:pPr>
-        <w:tabs>
-          <w:tab w:val="num" w:pos="1440"/>
+      <w:numFmt w:val="lowerLetter"/>
+      <w:lvlText w:val="%2."/>
+      <w:lvlJc w:val="left"/>
+      <w:pPr>
+        <w:tabs>
+          <w:tab w:val="num" w:pos="0"/>
         </w:tabs>
         <w:ind w:left="1440" w:hanging="360"/>
       </w:pPr>
-      <w:rPr>
-        <w:rFonts w:ascii="Courier New" w:hAnsi="Courier New" w:cs="Courier New" w:hint="default"/>
-        <w:sz w:val="20"/>
-      </w:rPr>
+      <w:rPr/>
     </w:lvl>
     <w:lvl w:ilvl="2">
       <w:start w:val="1"/>
-      <w:numFmt w:val="bullet"/>
-      <w:lvlText w:val=""/>
-      <w:lvlJc w:val="left"/>
-      <w:pPr>
-        <w:tabs>
-          <w:tab w:val="num" w:pos="2160"/>
-        </w:tabs>
-        <w:ind w:left="2160" w:hanging="360"/>
-      </w:pPr>
-      <w:rPr>
-        <w:rFonts w:ascii="Wingdings" w:hAnsi="Wingdings" w:cs="Wingdings" w:hint="default"/>
-        <w:sz w:val="20"/>
-      </w:rPr>
+      <w:numFmt w:val="lowerRoman"/>
+      <w:lvlText w:val="%3."/>
+      <w:lvlJc w:val="right"/>
+      <w:pPr>
+        <w:tabs>
+          <w:tab w:val="num" w:pos="0"/>
+        </w:tabs>
+        <w:ind w:left="2160" w:hanging="180"/>
+      </w:pPr>
+      <w:rPr/>
     </w:lvl>
     <w:lvl w:ilvl="3">
       <w:start w:val="1"/>
-      <w:numFmt w:val="bullet"/>
-      <w:lvlText w:val=""/>
-      <w:lvlJc w:val="left"/>
-      <w:pPr>
-        <w:tabs>
-          <w:tab w:val="num" w:pos="2880"/>
+      <w:numFmt w:val="decimal"/>
+      <w:lvlText w:val="%4."/>
+      <w:lvlJc w:val="left"/>
+      <w:pPr>
+        <w:tabs>
+          <w:tab w:val="num" w:pos="0"/>
         </w:tabs>
         <w:ind w:left="2880" w:hanging="360"/>
       </w:pPr>
-      <w:rPr>
-        <w:rFonts w:ascii="Wingdings" w:hAnsi="Wingdings" w:cs="Wingdings" w:hint="default"/>
-        <w:sz w:val="20"/>
-      </w:rPr>
+      <w:rPr/>
     </w:lvl>
     <w:lvl w:ilvl="4">
       <w:start w:val="1"/>
-      <w:numFmt w:val="bullet"/>
-      <w:lvlText w:val=""/>
-      <w:lvlJc w:val="left"/>
-      <w:pPr>
-        <w:tabs>
-          <w:tab w:val="num" w:pos="3600"/>
+      <w:numFmt w:val="lowerLetter"/>
+      <w:lvlText w:val="%5."/>
+      <w:lvlJc w:val="left"/>
+      <w:pPr>
+        <w:tabs>
+          <w:tab w:val="num" w:pos="0"/>
         </w:tabs>
         <w:ind w:left="3600" w:hanging="360"/>
       </w:pPr>
-      <w:rPr>
-        <w:rFonts w:ascii="Wingdings" w:hAnsi="Wingdings" w:cs="Wingdings" w:hint="default"/>
-        <w:sz w:val="20"/>
-      </w:rPr>
+      <w:rPr/>
     </w:lvl>
     <w:lvl w:ilvl="5">
       <w:start w:val="1"/>
-      <w:numFmt w:val="bullet"/>
-      <w:lvlText w:val=""/>
-      <w:lvlJc w:val="left"/>
-      <w:pPr>
-        <w:tabs>
-          <w:tab w:val="num" w:pos="4320"/>
-        </w:tabs>
-        <w:ind w:left="4320" w:hanging="360"/>
-      </w:pPr>
-      <w:rPr>
-        <w:rFonts w:ascii="Wingdings" w:hAnsi="Wingdings" w:cs="Wingdings" w:hint="default"/>
-        <w:sz w:val="20"/>
-      </w:rPr>
+      <w:numFmt w:val="lowerRoman"/>
+      <w:lvlText w:val="%6."/>
+      <w:lvlJc w:val="right"/>
+      <w:pPr>
+        <w:tabs>
+          <w:tab w:val="num" w:pos="0"/>
+        </w:tabs>
+        <w:ind w:left="4320" w:hanging="180"/>
+      </w:pPr>
+      <w:rPr/>
     </w:lvl>
     <w:lvl w:ilvl="6">
       <w:start w:val="1"/>
-      <w:numFmt w:val="bullet"/>
-      <w:lvlText w:val=""/>
-      <w:lvlJc w:val="left"/>
-      <w:pPr>
-        <w:tabs>
-          <w:tab w:val="num" w:pos="5040"/>
+      <w:numFmt w:val="decimal"/>
+      <w:lvlText w:val="%7."/>
+      <w:lvlJc w:val="left"/>
+      <w:pPr>
+        <w:tabs>
+          <w:tab w:val="num" w:pos="0"/>
         </w:tabs>
         <w:ind w:left="5040" w:hanging="360"/>
       </w:pPr>
-      <w:rPr>
-        <w:rFonts w:ascii="Wingdings" w:hAnsi="Wingdings" w:cs="Wingdings" w:hint="default"/>
-        <w:sz w:val="20"/>
-      </w:rPr>
+      <w:rPr/>
     </w:lvl>
     <w:lvl w:ilvl="7">
       <w:start w:val="1"/>
-      <w:numFmt w:val="bullet"/>
-      <w:lvlText w:val=""/>
-      <w:lvlJc w:val="left"/>
-      <w:pPr>
-        <w:tabs>
-          <w:tab w:val="num" w:pos="5760"/>
+      <w:numFmt w:val="lowerLetter"/>
+      <w:lvlText w:val="%8."/>
+      <w:lvlJc w:val="left"/>
+      <w:pPr>
+        <w:tabs>
+          <w:tab w:val="num" w:pos="0"/>
         </w:tabs>
         <w:ind w:left="5760" w:hanging="360"/>
       </w:pPr>
-      <w:rPr>
-        <w:rFonts w:ascii="Wingdings" w:hAnsi="Wingdings" w:cs="Wingdings" w:hint="default"/>
-        <w:sz w:val="20"/>
-      </w:rPr>
+      <w:rPr/>
     </w:lvl>
     <w:lvl w:ilvl="8">
       <w:start w:val="1"/>
-      <w:numFmt w:val="bullet"/>
-      <w:lvlText w:val=""/>
-      <w:lvlJc w:val="left"/>
-      <w:pPr>
-        <w:tabs>
-          <w:tab w:val="num" w:pos="6480"/>
-        </w:tabs>
-        <w:ind w:left="6480" w:hanging="360"/>
-      </w:pPr>
-      <w:rPr>
-        <w:rFonts w:ascii="Wingdings" w:hAnsi="Wingdings" w:cs="Wingdings" w:hint="default"/>
-        <w:sz w:val="20"/>
-      </w:rPr>
+      <w:numFmt w:val="lowerRoman"/>
+      <w:lvlText w:val="%9."/>
+      <w:lvlJc w:val="right"/>
+      <w:pPr>
+        <w:tabs>
+          <w:tab w:val="num" w:pos="0"/>
+        </w:tabs>
+        <w:ind w:left="6480" w:hanging="180"/>
+      </w:pPr>
+      <w:rPr/>
     </w:lvl>
   </w:abstractNum>
-  <w:abstractNum w:abstractNumId="20">
+  <w:abstractNum w:abstractNumId="22">
+    <w:lvl w:ilvl="0">
+      <w:start w:val="1"/>
+      <w:numFmt w:val="decimal"/>
+      <w:lvlText w:val="%1."/>
+      <w:lvlJc w:val="left"/>
+      <w:pPr>
+        <w:tabs>
+          <w:tab w:val="num" w:pos="0"/>
+        </w:tabs>
+        <w:ind w:left="720" w:hanging="360"/>
+      </w:pPr>
+      <w:rPr/>
+    </w:lvl>
+    <w:lvl w:ilvl="1">
+      <w:start w:val="1"/>
+      <w:numFmt w:val="lowerLetter"/>
+      <w:lvlText w:val="%2."/>
+      <w:lvlJc w:val="left"/>
+      <w:pPr>
+        <w:tabs>
+          <w:tab w:val="num" w:pos="0"/>
+        </w:tabs>
+        <w:ind w:left="1440" w:hanging="360"/>
+      </w:pPr>
+      <w:rPr/>
+    </w:lvl>
+    <w:lvl w:ilvl="2">
+      <w:start w:val="1"/>
+      <w:numFmt w:val="lowerRoman"/>
+      <w:lvlText w:val="%3."/>
+      <w:lvlJc w:val="right"/>
+      <w:pPr>
+        <w:tabs>
+          <w:tab w:val="num" w:pos="0"/>
+        </w:tabs>
+        <w:ind w:left="2160" w:hanging="180"/>
+      </w:pPr>
+      <w:rPr/>
+    </w:lvl>
+    <w:lvl w:ilvl="3">
+      <w:start w:val="1"/>
+      <w:numFmt w:val="decimal"/>
+      <w:lvlText w:val="%4."/>
+      <w:lvlJc w:val="left"/>
+      <w:pPr>
+        <w:tabs>
+          <w:tab w:val="num" w:pos="0"/>
+        </w:tabs>
+        <w:ind w:left="2880" w:hanging="360"/>
+      </w:pPr>
+      <w:rPr/>
+    </w:lvl>
+    <w:lvl w:ilvl="4">
+      <w:start w:val="1"/>
+      <w:numFmt w:val="lowerLetter"/>
+      <w:lvlText w:val="%5."/>
+      <w:lvlJc w:val="left"/>
+      <w:pPr>
+        <w:tabs>
+          <w:tab w:val="num" w:pos="0"/>
+        </w:tabs>
+        <w:ind w:left="3600" w:hanging="360"/>
+      </w:pPr>
+      <w:rPr/>
+    </w:lvl>
+    <w:lvl w:ilvl="5">
+      <w:start w:val="1"/>
+      <w:numFmt w:val="lowerRoman"/>
+      <w:lvlText w:val="%6."/>
+      <w:lvlJc w:val="right"/>
+      <w:pPr>
+        <w:tabs>
+          <w:tab w:val="num" w:pos="0"/>
+        </w:tabs>
+        <w:ind w:left="4320" w:hanging="180"/>
+      </w:pPr>
+      <w:rPr/>
+    </w:lvl>
+    <w:lvl w:ilvl="6">
+      <w:start w:val="1"/>
+      <w:numFmt w:val="decimal"/>
+      <w:lvlText w:val="%7."/>
+      <w:lvlJc w:val="left"/>
+      <w:pPr>
+        <w:tabs>
+          <w:tab w:val="num" w:pos="0"/>
+        </w:tabs>
+        <w:ind w:left="5040" w:hanging="360"/>
+      </w:pPr>
+      <w:rPr/>
+    </w:lvl>
+    <w:lvl w:ilvl="7">
+      <w:start w:val="1"/>
+      <w:numFmt w:val="lowerLetter"/>
+      <w:lvlText w:val="%8."/>
+      <w:lvlJc w:val="left"/>
+      <w:pPr>
+        <w:tabs>
+          <w:tab w:val="num" w:pos="0"/>
+        </w:tabs>
+        <w:ind w:left="5760" w:hanging="360"/>
+      </w:pPr>
+      <w:rPr/>
+    </w:lvl>
+    <w:lvl w:ilvl="8">
+      <w:start w:val="1"/>
+      <w:numFmt w:val="lowerRoman"/>
+      <w:lvlText w:val="%9."/>
+      <w:lvlJc w:val="right"/>
+      <w:pPr>
+        <w:tabs>
+          <w:tab w:val="num" w:pos="0"/>
+        </w:tabs>
+        <w:ind w:left="6480" w:hanging="180"/>
+      </w:pPr>
+      <w:rPr/>
+    </w:lvl>
+  </w:abstractNum>
+  <w:abstractNum w:abstractNumId="23">
+    <w:lvl w:ilvl="0">
+      <w:start w:val="1"/>
+      <w:numFmt w:val="decimal"/>
+      <w:lvlText w:val="%1."/>
+      <w:lvlJc w:val="left"/>
+      <w:pPr>
+        <w:tabs>
+          <w:tab w:val="num" w:pos="0"/>
+        </w:tabs>
+        <w:ind w:left="720" w:hanging="360"/>
+      </w:pPr>
+      <w:rPr/>
+    </w:lvl>
+    <w:lvl w:ilvl="1">
+      <w:start w:val="1"/>
+      <w:numFmt w:val="lowerLetter"/>
+      <w:lvlText w:val="%2."/>
+      <w:lvlJc w:val="left"/>
+      <w:pPr>
+        <w:tabs>
+          <w:tab w:val="num" w:pos="0"/>
+        </w:tabs>
+        <w:ind w:left="1440" w:hanging="360"/>
+      </w:pPr>
+      <w:rPr/>
+    </w:lvl>
+    <w:lvl w:ilvl="2">
+      <w:start w:val="1"/>
+      <w:numFmt w:val="lowerRoman"/>
+      <w:lvlText w:val="%3."/>
+      <w:lvlJc w:val="right"/>
+      <w:pPr>
+        <w:tabs>
+          <w:tab w:val="num" w:pos="0"/>
+        </w:tabs>
+        <w:ind w:left="2160" w:hanging="180"/>
+      </w:pPr>
+      <w:rPr/>
+    </w:lvl>
+    <w:lvl w:ilvl="3">
+      <w:start w:val="1"/>
+      <w:numFmt w:val="decimal"/>
+      <w:lvlText w:val="%4."/>
+      <w:lvlJc w:val="left"/>
+      <w:pPr>
+        <w:tabs>
+          <w:tab w:val="num" w:pos="0"/>
+        </w:tabs>
+        <w:ind w:left="2880" w:hanging="360"/>
+      </w:pPr>
+      <w:rPr/>
+    </w:lvl>
+    <w:lvl w:ilvl="4">
+      <w:start w:val="1"/>
+      <w:numFmt w:val="lowerLetter"/>
+      <w:lvlText w:val="%5."/>
+      <w:lvlJc w:val="left"/>
+      <w:pPr>
+        <w:tabs>
+          <w:tab w:val="num" w:pos="0"/>
+        </w:tabs>
+        <w:ind w:left="3600" w:hanging="360"/>
+      </w:pPr>
+      <w:rPr/>
+    </w:lvl>
+    <w:lvl w:ilvl="5">
+      <w:start w:val="1"/>
+      <w:numFmt w:val="lowerRoman"/>
+      <w:lvlText w:val="%6."/>
+      <w:lvlJc w:val="right"/>
+      <w:pPr>
+        <w:tabs>
+          <w:tab w:val="num" w:pos="0"/>
+        </w:tabs>
+        <w:ind w:left="4320" w:hanging="180"/>
+      </w:pPr>
+      <w:rPr/>
+    </w:lvl>
+    <w:lvl w:ilvl="6">
+      <w:start w:val="1"/>
+      <w:numFmt w:val="decimal"/>
+      <w:lvlText w:val="%7."/>
+      <w:lvlJc w:val="left"/>
+      <w:pPr>
+        <w:tabs>
+          <w:tab w:val="num" w:pos="0"/>
+        </w:tabs>
+        <w:ind w:left="5040" w:hanging="360"/>
+      </w:pPr>
+      <w:rPr/>
+    </w:lvl>
+    <w:lvl w:ilvl="7">
+      <w:start w:val="1"/>
+      <w:numFmt w:val="lowerLetter"/>
+      <w:lvlText w:val="%8."/>
+      <w:lvlJc w:val="left"/>
+      <w:pPr>
+        <w:tabs>
+          <w:tab w:val="num" w:pos="0"/>
+        </w:tabs>
+        <w:ind w:left="5760" w:hanging="360"/>
+      </w:pPr>
+      <w:rPr/>
+    </w:lvl>
+    <w:lvl w:ilvl="8">
+      <w:start w:val="1"/>
+      <w:numFmt w:val="lowerRoman"/>
+      <w:lvlText w:val="%9."/>
+      <w:lvlJc w:val="right"/>
+      <w:pPr>
+        <w:tabs>
+          <w:tab w:val="num" w:pos="0"/>
+        </w:tabs>
+        <w:ind w:left="6480" w:hanging="180"/>
+      </w:pPr>
+      <w:rPr/>
+    </w:lvl>
+  </w:abstractNum>
+  <w:abstractNum w:abstractNumId="24">
     <w:lvl w:ilvl="0">
       <w:start w:val="1"/>
       <w:numFmt w:val="none"/>
@@ -6412,10 +8261,31 @@
     <w:abstractNumId w:val="20"/>
   </w:num>
   <w:num w:numId="21">
-    <w:abstractNumId w:val="18"/>
+    <w:abstractNumId w:val="21"/>
+  </w:num>
+  <w:num w:numId="22">
+    <w:abstractNumId w:val="22"/>
+  </w:num>
+  <w:num w:numId="23">
+    <w:abstractNumId w:val="23"/>
+  </w:num>
+  <w:num w:numId="24">
+    <w:abstractNumId w:val="24"/>
+  </w:num>
+  <w:num w:numId="25">
+    <w:abstractNumId w:val="20"/>
     <w:lvlOverride w:ilvl="0">
       <w:startOverride w:val="1"/>
     </w:lvlOverride>
+  </w:num>
+  <w:num w:numId="26">
+    <w:abstractNumId w:val="20"/>
+  </w:num>
+  <w:num w:numId="27">
+    <w:abstractNumId w:val="20"/>
+  </w:num>
+  <w:num w:numId="28">
+    <w:abstractNumId w:val="20"/>
   </w:num>
 </w:numbering>
 </file>
@@ -6815,6 +8685,7 @@
     <w:qFormat/>
     <w:pPr>
       <w:widowControl/>
+      <w:suppressAutoHyphens w:val="true"/>
       <w:bidi w:val="0"/>
       <w:spacing w:lineRule="auto" w:line="259" w:before="0" w:after="160"/>
       <w:jc w:val="left"/>
@@ -7245,6 +9116,13 @@
       <w:spacing w:val="5"/>
     </w:rPr>
   </w:style>
+  <w:style w:type="character" w:styleId="Bullets">
+    <w:name w:val="Bullets"/>
+    <w:qFormat/>
+    <w:rPr>
+      <w:rFonts w:ascii="OpenSymbol" w:hAnsi="OpenSymbol" w:eastAsia="OpenSymbol" w:cs="OpenSymbol"/>
+    </w:rPr>
+  </w:style>
   <w:style w:type="paragraph" w:styleId="Heading">
     <w:name w:val="Heading"/>
     <w:basedOn w:val="Normal"/>
@@ -7412,6 +9290,13 @@
       <w:sz w:val="18"/>
       <w:szCs w:val="18"/>
     </w:rPr>
+  </w:style>
+  <w:style w:type="paragraph" w:styleId="FrameContents">
+    <w:name w:val="Frame Contents"/>
+    <w:basedOn w:val="Normal"/>
+    <w:qFormat/>
+    <w:pPr/>
+    <w:rPr/>
   </w:style>
   <w:style w:type="numbering" w:styleId="NoList" w:default="1">
     <w:name w:val="No List"/>

</xml_diff>

<commit_message>
DoD: User Manual Complete
Updated user manual with guide on the analytics page
</commit_message>
<xml_diff>
--- a/User Manual/User-Manual.docx
+++ b/User Manual/User-Manual.docx
@@ -1,6 +1,6 @@
 
 <file path=word/document.xml><?xml version="1.0" encoding="utf-8"?>
-<w:document xmlns:wpc="http://schemas.microsoft.com/office/word/2010/wordprocessingCanvas" xmlns:cx="http://schemas.microsoft.com/office/drawing/2014/chartex" xmlns:cx1="http://schemas.microsoft.com/office/drawing/2015/9/8/chartex" xmlns:cx2="http://schemas.microsoft.com/office/drawing/2015/10/21/chartex" xmlns:cx3="http://schemas.microsoft.com/office/drawing/2016/5/9/chartex" xmlns:cx4="http://schemas.microsoft.com/office/drawing/2016/5/10/chartex" xmlns:cx5="http://schemas.microsoft.com/office/drawing/2016/5/11/chartex" xmlns:cx6="http://schemas.microsoft.com/office/drawing/2016/5/12/chartex" xmlns:cx7="http://schemas.microsoft.com/office/drawing/2016/5/13/chartex" xmlns:cx8="http://schemas.microsoft.com/office/drawing/2016/5/14/chartex" xmlns:mc="http://schemas.openxmlformats.org/markup-compatibility/2006" xmlns:aink="http://schemas.microsoft.com/office/drawing/2016/ink" xmlns:am3d="http://schemas.microsoft.com/office/drawing/2017/model3d" xmlns:o="urn:schemas-microsoft-com:office:office" xmlns:oel="http://schemas.microsoft.com/office/2019/extlst" xmlns:r="http://schemas.openxmlformats.org/officeDocument/2006/relationships" xmlns:m="http://schemas.openxmlformats.org/officeDocument/2006/math" xmlns:v="urn:schemas-microsoft-com:vml" xmlns:wp14="http://schemas.microsoft.com/office/word/2010/wordprocessingDrawing" xmlns:wp="http://schemas.openxmlformats.org/drawingml/2006/wordprocessingDrawing" xmlns:w10="urn:schemas-microsoft-com:office:word" xmlns:w="http://schemas.openxmlformats.org/wordprocessingml/2006/main" xmlns:w14="http://schemas.microsoft.com/office/word/2010/wordml" xmlns:w15="http://schemas.microsoft.com/office/word/2012/wordml" xmlns:w16cex="http://schemas.microsoft.com/office/word/2018/wordml/cex" xmlns:w16cid="http://schemas.microsoft.com/office/word/2016/wordml/cid" xmlns:w16="http://schemas.microsoft.com/office/word/2018/wordml" xmlns:w16du="http://schemas.microsoft.com/office/word/2023/wordml/word16du" xmlns:w16sdtdh="http://schemas.microsoft.com/office/word/2020/wordml/sdtdatahash" xmlns:w16sdtfl="http://schemas.microsoft.com/office/word/2024/wordml/sdtformatlock" xmlns:w16se="http://schemas.microsoft.com/office/word/2015/wordml/symex" xmlns:wpg="http://schemas.microsoft.com/office/word/2010/wordprocessingGroup" xmlns:wpi="http://schemas.microsoft.com/office/word/2010/wordprocessingInk" xmlns:wne="http://schemas.microsoft.com/office/word/2006/wordml" xmlns:wps="http://schemas.microsoft.com/office/word/2010/wordprocessingShape" mc:Ignorable="w14 w15 w16se w16cid w16 w16cex w16sdtdh w16sdtfl w16du wp14">
+<w:document xmlns:wpc="http://schemas.microsoft.com/office/word/2010/wordprocessingCanvas" xmlns:cx="http://schemas.microsoft.com/office/drawing/2014/chartex" xmlns:cx1="http://schemas.microsoft.com/office/drawing/2015/9/8/chartex" xmlns:cx2="http://schemas.microsoft.com/office/drawing/2015/10/21/chartex" xmlns:cx3="http://schemas.microsoft.com/office/drawing/2016/5/9/chartex" xmlns:cx4="http://schemas.microsoft.com/office/drawing/2016/5/10/chartex" xmlns:cx5="http://schemas.microsoft.com/office/drawing/2016/5/11/chartex" xmlns:cx6="http://schemas.microsoft.com/office/drawing/2016/5/12/chartex" xmlns:cx7="http://schemas.microsoft.com/office/drawing/2016/5/13/chartex" xmlns:cx8="http://schemas.microsoft.com/office/drawing/2016/5/14/chartex" xmlns:mc="http://schemas.openxmlformats.org/markup-compatibility/2006" xmlns:aink="http://schemas.microsoft.com/office/drawing/2016/ink" xmlns:am3d="http://schemas.microsoft.com/office/drawing/2017/model3d" xmlns:o="urn:schemas-microsoft-com:office:office" xmlns:oel="http://schemas.microsoft.com/office/2019/extlst" xmlns:r="http://schemas.openxmlformats.org/officeDocument/2006/relationships" xmlns:m="http://schemas.openxmlformats.org/officeDocument/2006/math" xmlns:v="urn:schemas-microsoft-com:vml" xmlns:wp14="http://schemas.microsoft.com/office/word/2010/wordprocessingDrawing" xmlns:wp="http://schemas.openxmlformats.org/drawingml/2006/wordprocessingDrawing" xmlns:w10="urn:schemas-microsoft-com:office:word" xmlns:w="http://schemas.openxmlformats.org/wordprocessingml/2006/main" xmlns:w14="http://schemas.microsoft.com/office/word/2010/wordml" xmlns:w15="http://schemas.microsoft.com/office/word/2012/wordml" xmlns:w16cex="http://schemas.microsoft.com/office/word/2018/wordml/cex" xmlns:w16cid="http://schemas.microsoft.com/office/word/2016/wordml/cid" xmlns:w16="http://schemas.microsoft.com/office/word/2018/wordml" xmlns:w16du="http://schemas.microsoft.com/office/word/2023/wordml/word16du" xmlns:w16sdtdh="http://schemas.microsoft.com/office/word/2020/wordml/sdtdatahash" xmlns:w16se="http://schemas.microsoft.com/office/word/2015/wordml/symex" xmlns:wpg="http://schemas.microsoft.com/office/word/2010/wordprocessingGroup" xmlns:wpi="http://schemas.microsoft.com/office/word/2010/wordprocessingInk" xmlns:wne="http://schemas.microsoft.com/office/word/2006/wordml" xmlns:wps="http://schemas.microsoft.com/office/word/2010/wordprocessingShape" mc:Ignorable="w14 w15 w16se w16cid w16 w16cex w16sdtdh w16du wp14">
   <w:body>
     <w:p>
       <w:r>
@@ -817,6 +817,9 @@
         <w:br/>
       </w:r>
       <w:r>
+        <w:rPr>
+          <w:noProof/>
+        </w:rPr>
         <w:drawing>
           <wp:inline distT="0" distB="0" distL="0" distR="0" wp14:anchorId="387F0DB2" wp14:editId="0B63A661">
             <wp:extent cx="5731510" cy="2571750"/>
@@ -1154,6 +1157,9 @@
         <w:jc w:val="both"/>
       </w:pPr>
       <w:r>
+        <w:rPr>
+          <w:noProof/>
+        </w:rPr>
         <w:drawing>
           <wp:inline distT="0" distB="0" distL="0" distR="0" wp14:anchorId="0B591D8E" wp14:editId="5A3220DB">
             <wp:extent cx="5731510" cy="2599690"/>
@@ -1260,6 +1266,9 @@
         <w:spacing w:after="0" w:line="240" w:lineRule="auto"/>
       </w:pPr>
       <w:r>
+        <w:rPr>
+          <w:noProof/>
+        </w:rPr>
         <w:drawing>
           <wp:inline distT="0" distB="0" distL="0" distR="0" wp14:anchorId="6DA4F232" wp14:editId="2AC16269">
             <wp:extent cx="5731510" cy="2529840"/>
@@ -1362,6 +1371,9 @@
         <w:spacing w:after="0" w:line="240" w:lineRule="auto"/>
       </w:pPr>
       <w:r>
+        <w:rPr>
+          <w:noProof/>
+        </w:rPr>
         <w:drawing>
           <wp:inline distT="0" distB="0" distL="0" distR="0" wp14:anchorId="2539E4B7" wp14:editId="0DEE6DDB">
             <wp:extent cx="5731510" cy="2602865"/>
@@ -1481,6 +1493,9 @@
         <w:ind w:left="360"/>
       </w:pPr>
       <w:r>
+        <w:rPr>
+          <w:noProof/>
+        </w:rPr>
         <w:lastRenderedPageBreak/>
         <w:drawing>
           <wp:inline distT="0" distB="0" distL="0" distR="0" wp14:anchorId="6914A86F" wp14:editId="331BA2B2">
@@ -2664,7 +2679,7 @@
               </wp:anchor>
             </w:drawing>
           </mc:Choice>
-          <mc:Fallback>
+          <mc:Fallback xmlns:w16sdtfl="http://schemas.microsoft.com/office/word/2024/wordml/sdtformatlock">
             <w:pict>
               <v:rect w14:anchorId="330DF6DC" id="Frame2" o:spid="_x0000_s1026" style="position:absolute;margin-left:91.15pt;margin-top:2.9pt;width:251.9pt;height:94.2pt;z-index:13;visibility:visible;mso-wrap-style:square;mso-wrap-distance-left:0;mso-wrap-distance-top:0;mso-wrap-distance-right:0;mso-wrap-distance-bottom:0;mso-position-horizontal:absolute;mso-position-horizontal-relative:text;mso-position-vertical:absolute;mso-position-vertical-relative:text;v-text-anchor:top" o:gfxdata="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" o:allowincell="f" stroked="f" strokeweight="0">
                 <v:textbox inset="0,0,0,0">
@@ -2696,7 +2711,7 @@
                                     </pic:cNvPicPr>
                                   </pic:nvPicPr>
                                   <pic:blipFill>
-                                    <a:blip r:embed="rId20"/>
+                                    <a:blip r:embed="rId21"/>
                                     <a:stretch>
                                       <a:fillRect/>
                                     </a:stretch>
@@ -2859,7 +2874,7 @@
                                           </pic:cNvPicPr>
                                         </pic:nvPicPr>
                                         <pic:blipFill>
-                                          <a:blip r:embed="rId21"/>
+                                          <a:blip r:embed="rId22"/>
                                           <a:stretch>
                                             <a:fillRect/>
                                           </a:stretch>
@@ -2894,7 +2909,7 @@
               </wp:anchor>
             </w:drawing>
           </mc:Choice>
-          <mc:Fallback>
+          <mc:Fallback xmlns:w16sdtfl="http://schemas.microsoft.com/office/word/2024/wordml/sdtformatlock">
             <w:pict>
               <v:rect w14:anchorId="360D21A7" id="Frame1" o:spid="_x0000_s1027" style="position:absolute;margin-left:0;margin-top:.05pt;width:481.9pt;height:141.8pt;z-index:11;visibility:visible;mso-wrap-style:square;mso-wrap-distance-left:0;mso-wrap-distance-top:0;mso-wrap-distance-right:0;mso-wrap-distance-bottom:0;mso-position-horizontal:center;mso-position-horizontal-relative:text;mso-position-vertical:absolute;mso-position-vertical-relative:text;v-text-anchor:top" o:gfxdata="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" o:allowincell="f" stroked="f" strokeweight="0">
                 <v:textbox inset="0,0,0,0">
@@ -2926,7 +2941,7 @@
                                     </pic:cNvPicPr>
                                   </pic:nvPicPr>
                                   <pic:blipFill>
-                                    <a:blip r:embed="rId21"/>
+                                    <a:blip r:embed="rId23"/>
                                     <a:stretch>
                                       <a:fillRect/>
                                     </a:stretch>
@@ -3077,7 +3092,7 @@
                                           </pic:cNvPicPr>
                                         </pic:nvPicPr>
                                         <pic:blipFill>
-                                          <a:blip r:embed="rId22"/>
+                                          <a:blip r:embed="rId24"/>
                                           <a:stretch>
                                             <a:fillRect/>
                                           </a:stretch>
@@ -3112,7 +3127,7 @@
               </wp:anchor>
             </w:drawing>
           </mc:Choice>
-          <mc:Fallback>
+          <mc:Fallback xmlns:w16sdtfl="http://schemas.microsoft.com/office/word/2024/wordml/sdtformatlock">
             <w:pict>
               <v:rect w14:anchorId="54817BEB" id="Frame3" o:spid="_x0000_s1028" style="position:absolute;margin-left:0;margin-top:.05pt;width:481.9pt;height:181.45pt;z-index:15;visibility:visible;mso-wrap-style:square;mso-wrap-distance-left:0;mso-wrap-distance-top:0;mso-wrap-distance-right:0;mso-wrap-distance-bottom:0;mso-position-horizontal:center;mso-position-horizontal-relative:text;mso-position-vertical:absolute;mso-position-vertical-relative:text;v-text-anchor:top" o:gfxdata="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" o:allowincell="f" stroked="f" strokeweight="0">
                 <v:textbox inset="0,0,0,0">
@@ -3144,7 +3159,7 @@
                                     </pic:cNvPicPr>
                                   </pic:nvPicPr>
                                   <pic:blipFill>
-                                    <a:blip r:embed="rId22"/>
+                                    <a:blip r:embed="rId25"/>
                                     <a:stretch>
                                       <a:fillRect/>
                                     </a:stretch>
@@ -3207,7 +3222,7 @@
                     </pic:cNvPicPr>
                   </pic:nvPicPr>
                   <pic:blipFill>
-                    <a:blip r:embed="rId23"/>
+                    <a:blip r:embed="rId26"/>
                     <a:stretch>
                       <a:fillRect/>
                     </a:stretch>
@@ -3308,7 +3323,7 @@
                                           </pic:cNvPicPr>
                                         </pic:nvPicPr>
                                         <pic:blipFill>
-                                          <a:blip r:embed="rId24"/>
+                                          <a:blip r:embed="rId27"/>
                                           <a:stretch>
                                             <a:fillRect/>
                                           </a:stretch>
@@ -3343,7 +3358,7 @@
               </wp:anchor>
             </w:drawing>
           </mc:Choice>
-          <mc:Fallback>
+          <mc:Fallback xmlns:w16sdtfl="http://schemas.microsoft.com/office/word/2024/wordml/sdtformatlock">
             <w:pict>
               <v:rect w14:anchorId="5C4FA7DC" id="Frame4" o:spid="_x0000_s1029" style="position:absolute;margin-left:-26.85pt;margin-top:301.85pt;width:481.9pt;height:197.35pt;z-index:18;visibility:visible;mso-wrap-style:square;mso-wrap-distance-left:0;mso-wrap-distance-top:0;mso-wrap-distance-right:0;mso-wrap-distance-bottom:0;mso-position-horizontal:absolute;mso-position-horizontal-relative:text;mso-position-vertical:absolute;mso-position-vertical-relative:text;v-text-anchor:top" o:gfxdata="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" o:allowincell="f" stroked="f" strokeweight="0">
                 <v:textbox inset="0,0,0,0">
@@ -3375,7 +3390,7 @@
                                     </pic:cNvPicPr>
                                   </pic:nvPicPr>
                                   <pic:blipFill>
-                                    <a:blip r:embed="rId24"/>
+                                    <a:blip r:embed="rId28"/>
                                     <a:stretch>
                                       <a:fillRect/>
                                     </a:stretch>
@@ -3552,7 +3567,7 @@
                                           </pic:cNvPicPr>
                                         </pic:nvPicPr>
                                         <pic:blipFill>
-                                          <a:blip r:embed="rId25"/>
+                                          <a:blip r:embed="rId29"/>
                                           <a:stretch>
                                             <a:fillRect/>
                                           </a:stretch>
@@ -3587,7 +3602,7 @@
               </wp:anchor>
             </w:drawing>
           </mc:Choice>
-          <mc:Fallback>
+          <mc:Fallback xmlns:w16sdtfl="http://schemas.microsoft.com/office/word/2024/wordml/sdtformatlock">
             <w:pict>
               <v:rect w14:anchorId="2E6CDFAE" id="Frame5" o:spid="_x0000_s1030" style="position:absolute;margin-left:0;margin-top:.05pt;width:481.9pt;height:201.95pt;z-index:20;visibility:visible;mso-wrap-style:square;mso-wrap-distance-left:0;mso-wrap-distance-top:0;mso-wrap-distance-right:0;mso-wrap-distance-bottom:0;mso-position-horizontal:center;mso-position-horizontal-relative:text;mso-position-vertical:absolute;mso-position-vertical-relative:text;v-text-anchor:top" o:gfxdata="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" o:allowincell="f" stroked="f" strokeweight="0">
                 <v:textbox inset="0,0,0,0">
@@ -3619,7 +3634,7 @@
                                     </pic:cNvPicPr>
                                   </pic:nvPicPr>
                                   <pic:blipFill>
-                                    <a:blip r:embed="rId25"/>
+                                    <a:blip r:embed="rId30"/>
                                     <a:stretch>
                                       <a:fillRect/>
                                     </a:stretch>
@@ -4145,7 +4160,7 @@
                     </pic:cNvPicPr>
                   </pic:nvPicPr>
                   <pic:blipFill>
-                    <a:blip r:embed="rId26"/>
+                    <a:blip r:embed="rId31"/>
                     <a:stretch>
                       <a:fillRect/>
                     </a:stretch>
@@ -4472,7 +4487,7 @@
                     </pic:cNvPicPr>
                   </pic:nvPicPr>
                   <pic:blipFill>
-                    <a:blip r:embed="rId27"/>
+                    <a:blip r:embed="rId32"/>
                     <a:stretch>
                       <a:fillRect/>
                     </a:stretch>
@@ -4544,7 +4559,7 @@
                     </pic:cNvPicPr>
                   </pic:nvPicPr>
                   <pic:blipFill>
-                    <a:blip r:embed="rId28"/>
+                    <a:blip r:embed="rId33"/>
                     <a:stretch>
                       <a:fillRect/>
                     </a:stretch>
@@ -4615,7 +4630,7 @@
                     </pic:cNvPicPr>
                   </pic:nvPicPr>
                   <pic:blipFill>
-                    <a:blip r:embed="rId29"/>
+                    <a:blip r:embed="rId34"/>
                     <a:stretch>
                       <a:fillRect/>
                     </a:stretch>
@@ -4761,7 +4776,7 @@
                     </pic:cNvPicPr>
                   </pic:nvPicPr>
                   <pic:blipFill>
-                    <a:blip r:embed="rId30"/>
+                    <a:blip r:embed="rId35"/>
                     <a:stretch>
                       <a:fillRect/>
                     </a:stretch>
@@ -4935,7 +4950,7 @@
                     <pic:cNvPicPr/>
                   </pic:nvPicPr>
                   <pic:blipFill>
-                    <a:blip r:embed="rId31" cstate="print">
+                    <a:blip r:embed="rId36" cstate="print">
                       <a:extLst>
                         <a:ext uri="{28A0092B-C50C-407E-A947-70E740481C1C}">
                           <a14:useLocalDpi xmlns:a14="http://schemas.microsoft.com/office/drawing/2010/main" val="0"/>
@@ -5026,7 +5041,7 @@
                     <pic:cNvPicPr/>
                   </pic:nvPicPr>
                   <pic:blipFill>
-                    <a:blip r:embed="rId32" cstate="print">
+                    <a:blip r:embed="rId37" cstate="print">
                       <a:extLst>
                         <a:ext uri="{28A0092B-C50C-407E-A947-70E740481C1C}">
                           <a14:useLocalDpi xmlns:a14="http://schemas.microsoft.com/office/drawing/2010/main" val="0"/>
@@ -5117,7 +5132,7 @@
                     <pic:cNvPicPr/>
                   </pic:nvPicPr>
                   <pic:blipFill>
-                    <a:blip r:embed="rId33" cstate="print">
+                    <a:blip r:embed="rId38" cstate="print">
                       <a:extLst>
                         <a:ext uri="{28A0092B-C50C-407E-A947-70E740481C1C}">
                           <a14:useLocalDpi xmlns:a14="http://schemas.microsoft.com/office/drawing/2010/main" val="0"/>
@@ -5208,7 +5223,7 @@
                     <pic:cNvPicPr/>
                   </pic:nvPicPr>
                   <pic:blipFill>
-                    <a:blip r:embed="rId34" cstate="print">
+                    <a:blip r:embed="rId39" cstate="print">
                       <a:extLst>
                         <a:ext uri="{28A0092B-C50C-407E-A947-70E740481C1C}">
                           <a14:useLocalDpi xmlns:a14="http://schemas.microsoft.com/office/drawing/2010/main" val="0"/>
@@ -5319,7 +5334,7 @@
                     </pic:cNvPicPr>
                   </pic:nvPicPr>
                   <pic:blipFill>
-                    <a:blip r:embed="rId35"/>
+                    <a:blip r:embed="rId40"/>
                     <a:stretch>
                       <a:fillRect/>
                     </a:stretch>
@@ -5587,7 +5602,7 @@
                                           </pic:cNvPicPr>
                                         </pic:nvPicPr>
                                         <pic:blipFill>
-                                          <a:blip r:embed="rId36"/>
+                                          <a:blip r:embed="rId41"/>
                                           <a:stretch>
                                             <a:fillRect/>
                                           </a:stretch>
@@ -5625,7 +5640,7 @@
               </wp:anchor>
             </w:drawing>
           </mc:Choice>
-          <mc:Fallback>
+          <mc:Fallback xmlns:w16sdtfl="http://schemas.microsoft.com/office/word/2024/wordml/sdtformatlock">
             <w:pict>
               <v:rect w14:anchorId="4B4AB3DC" id="Frame6" o:spid="_x0000_s1031" style="position:absolute;margin-left:97.9pt;margin-top:36.65pt;width:228pt;height:206.25pt;z-index:22;visibility:visible;mso-wrap-style:square;mso-wrap-distance-left:0;mso-wrap-distance-top:0;mso-wrap-distance-right:0;mso-wrap-distance-bottom:0;mso-position-horizontal:absolute;mso-position-horizontal-relative:text;mso-position-vertical:absolute;mso-position-vertical-relative:text;v-text-anchor:top" o:gfxdata="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" o:allowincell="f" stroked="f" strokeweight="0">
                 <v:textbox inset="0,0,0,0">
@@ -5658,7 +5673,7 @@
                                     </pic:cNvPicPr>
                                   </pic:nvPicPr>
                                   <pic:blipFill>
-                                    <a:blip r:embed="rId36"/>
+                                    <a:blip r:embed="rId42"/>
                                     <a:stretch>
                                       <a:fillRect/>
                                     </a:stretch>
@@ -5840,7 +5855,7 @@
                                           </pic:cNvPicPr>
                                         </pic:nvPicPr>
                                         <pic:blipFill>
-                                          <a:blip r:embed="rId37"/>
+                                          <a:blip r:embed="rId43"/>
                                           <a:stretch>
                                             <a:fillRect/>
                                           </a:stretch>
@@ -5878,7 +5893,7 @@
               </wp:anchor>
             </w:drawing>
           </mc:Choice>
-          <mc:Fallback>
+          <mc:Fallback xmlns:w16sdtfl="http://schemas.microsoft.com/office/word/2024/wordml/sdtformatlock">
             <w:pict>
               <v:rect w14:anchorId="1A1831B4" id="Frame7" o:spid="_x0000_s1032" style="position:absolute;margin-left:0;margin-top:.05pt;width:451.3pt;height:206.75pt;z-index:24;visibility:visible;mso-wrap-style:square;mso-wrap-distance-left:0;mso-wrap-distance-top:0;mso-wrap-distance-right:0;mso-wrap-distance-bottom:0;mso-position-horizontal:center;mso-position-horizontal-relative:text;mso-position-vertical:absolute;mso-position-vertical-relative:text;v-text-anchor:top" o:gfxdata="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" o:allowincell="f" stroked="f" strokeweight="0">
                 <v:textbox inset="0,0,0,0">
@@ -5911,7 +5926,7 @@
                                     </pic:cNvPicPr>
                                   </pic:nvPicPr>
                                   <pic:blipFill>
-                                    <a:blip r:embed="rId37"/>
+                                    <a:blip r:embed="rId44"/>
                                     <a:stretch>
                                       <a:fillRect/>
                                     </a:stretch>
@@ -6116,8 +6131,542 @@
         <w:t>Legend: Obtained after reaching 140pts</w:t>
       </w:r>
     </w:p>
+    <w:p>
+      <w:pPr>
+        <w:pStyle w:val="ListParagraph"/>
+        <w:spacing w:line="252" w:lineRule="auto"/>
+        <w:rPr>
+          <w:rFonts w:eastAsia="Aptos" w:cs="Aptos"/>
+          <w:b/>
+          <w:bCs/>
+        </w:rPr>
+      </w:pPr>
+    </w:p>
+    <w:p>
+      <w:pPr>
+        <w:pStyle w:val="ListParagraph"/>
+        <w:spacing w:line="252" w:lineRule="auto"/>
+        <w:rPr>
+          <w:rFonts w:eastAsia="Aptos" w:cs="Aptos"/>
+          <w:b/>
+          <w:bCs/>
+        </w:rPr>
+      </w:pPr>
+    </w:p>
+    <w:p>
+      <w:pPr>
+        <w:pStyle w:val="ListParagraph"/>
+        <w:spacing w:line="252" w:lineRule="auto"/>
+        <w:rPr>
+          <w:rFonts w:eastAsia="Aptos" w:cs="Aptos"/>
+          <w:b/>
+          <w:bCs/>
+        </w:rPr>
+      </w:pPr>
+    </w:p>
+    <w:p>
+      <w:pPr>
+        <w:pStyle w:val="ListParagraph"/>
+        <w:spacing w:line="252" w:lineRule="auto"/>
+        <w:rPr>
+          <w:rFonts w:eastAsia="Aptos" w:cs="Aptos"/>
+          <w:b/>
+          <w:bCs/>
+        </w:rPr>
+      </w:pPr>
+    </w:p>
+    <w:p>
+      <w:pPr>
+        <w:pStyle w:val="ListParagraph"/>
+        <w:spacing w:line="252" w:lineRule="auto"/>
+        <w:rPr>
+          <w:rFonts w:eastAsia="Aptos" w:cs="Aptos"/>
+          <w:b/>
+          <w:bCs/>
+        </w:rPr>
+      </w:pPr>
+    </w:p>
+    <w:p>
+      <w:pPr>
+        <w:pStyle w:val="ListParagraph"/>
+        <w:spacing w:line="252" w:lineRule="auto"/>
+        <w:rPr>
+          <w:rFonts w:eastAsia="Aptos" w:cs="Aptos"/>
+          <w:b/>
+          <w:bCs/>
+        </w:rPr>
+      </w:pPr>
+    </w:p>
+    <w:p>
+      <w:pPr>
+        <w:pStyle w:val="ListParagraph"/>
+        <w:spacing w:line="252" w:lineRule="auto"/>
+        <w:rPr>
+          <w:rFonts w:eastAsia="Aptos" w:cs="Aptos"/>
+          <w:b/>
+          <w:bCs/>
+        </w:rPr>
+      </w:pPr>
+    </w:p>
+    <w:p>
+      <w:pPr>
+        <w:pStyle w:val="ListParagraph"/>
+        <w:spacing w:line="252" w:lineRule="auto"/>
+        <w:rPr>
+          <w:rFonts w:eastAsia="Aptos" w:cs="Aptos"/>
+          <w:b/>
+          <w:bCs/>
+        </w:rPr>
+      </w:pPr>
+    </w:p>
+    <w:p>
+      <w:pPr>
+        <w:pStyle w:val="ListParagraph"/>
+        <w:spacing w:line="252" w:lineRule="auto"/>
+        <w:rPr>
+          <w:rFonts w:eastAsia="Aptos" w:cs="Aptos"/>
+          <w:b/>
+          <w:bCs/>
+        </w:rPr>
+      </w:pPr>
+    </w:p>
+    <w:p>
+      <w:pPr>
+        <w:pStyle w:val="ListParagraph"/>
+        <w:spacing w:line="252" w:lineRule="auto"/>
+        <w:rPr>
+          <w:rFonts w:eastAsia="Aptos" w:cs="Aptos"/>
+          <w:b/>
+          <w:bCs/>
+        </w:rPr>
+      </w:pPr>
+    </w:p>
+    <w:p>
+      <w:pPr>
+        <w:pStyle w:val="ListParagraph"/>
+        <w:spacing w:line="252" w:lineRule="auto"/>
+        <w:rPr>
+          <w:rFonts w:eastAsia="Aptos" w:cs="Aptos"/>
+          <w:b/>
+          <w:bCs/>
+        </w:rPr>
+      </w:pPr>
+    </w:p>
+    <w:p>
+      <w:pPr>
+        <w:pStyle w:val="ListParagraph"/>
+        <w:spacing w:line="252" w:lineRule="auto"/>
+        <w:rPr>
+          <w:rFonts w:eastAsia="Aptos" w:cs="Aptos"/>
+          <w:b/>
+          <w:bCs/>
+        </w:rPr>
+      </w:pPr>
+    </w:p>
+    <w:p>
+      <w:pPr>
+        <w:pStyle w:val="ListParagraph"/>
+        <w:spacing w:line="252" w:lineRule="auto"/>
+        <w:rPr>
+          <w:rFonts w:eastAsia="Aptos" w:cs="Aptos"/>
+          <w:b/>
+          <w:bCs/>
+        </w:rPr>
+      </w:pPr>
+    </w:p>
+    <w:p>
+      <w:pPr>
+        <w:pStyle w:val="ListParagraph"/>
+        <w:spacing w:line="252" w:lineRule="auto"/>
+        <w:rPr>
+          <w:rFonts w:eastAsia="Aptos" w:cs="Aptos"/>
+          <w:b/>
+          <w:bCs/>
+        </w:rPr>
+      </w:pPr>
+    </w:p>
+    <w:p>
+      <w:pPr>
+        <w:pStyle w:val="ListParagraph"/>
+        <w:spacing w:line="252" w:lineRule="auto"/>
+        <w:rPr>
+          <w:rFonts w:eastAsia="Aptos" w:cs="Aptos"/>
+          <w:b/>
+          <w:bCs/>
+        </w:rPr>
+      </w:pPr>
+    </w:p>
+    <w:p>
+      <w:pPr>
+        <w:pStyle w:val="ListParagraph"/>
+        <w:spacing w:line="252" w:lineRule="auto"/>
+        <w:rPr>
+          <w:rFonts w:eastAsia="Aptos" w:cs="Aptos"/>
+          <w:b/>
+          <w:bCs/>
+        </w:rPr>
+      </w:pPr>
+    </w:p>
+    <w:p>
+      <w:pPr>
+        <w:pStyle w:val="ListParagraph"/>
+        <w:spacing w:line="252" w:lineRule="auto"/>
+        <w:rPr>
+          <w:rFonts w:eastAsia="Aptos" w:cs="Aptos"/>
+          <w:b/>
+          <w:bCs/>
+        </w:rPr>
+      </w:pPr>
+    </w:p>
+    <w:p>
+      <w:pPr>
+        <w:pStyle w:val="ListParagraph"/>
+        <w:numPr>
+          <w:ilvl w:val="0"/>
+          <w:numId w:val="28"/>
+        </w:numPr>
+        <w:spacing w:line="252" w:lineRule="auto"/>
+        <w:rPr>
+          <w:rFonts w:eastAsia="Aptos" w:cs="Aptos"/>
+          <w:b/>
+          <w:bCs/>
+        </w:rPr>
+      </w:pPr>
+      <w:r>
+        <w:rPr>
+          <w:rFonts w:eastAsia="Aptos" w:cs="Aptos"/>
+          <w:b/>
+          <w:bCs/>
+        </w:rPr>
+        <w:t>Analytics Page</w:t>
+      </w:r>
+    </w:p>
+    <w:p>
+      <w:pPr>
+        <w:rPr>
+          <w:u w:val="single"/>
+        </w:rPr>
+      </w:pPr>
+      <w:r>
+        <w:rPr>
+          <w:u w:val="single"/>
+        </w:rPr>
+        <w:drawing>
+          <wp:anchor distT="0" distB="0" distL="114300" distR="114300" simplePos="0" relativeHeight="251658240" behindDoc="0" locked="0" layoutInCell="1" allowOverlap="1" wp14:anchorId="4D1F8223" wp14:editId="078CCCD8">
+            <wp:simplePos x="0" y="0"/>
+            <wp:positionH relativeFrom="column">
+              <wp:posOffset>0</wp:posOffset>
+            </wp:positionH>
+            <wp:positionV relativeFrom="paragraph">
+              <wp:posOffset>957557</wp:posOffset>
+            </wp:positionV>
+            <wp:extent cx="5731510" cy="2853690"/>
+            <wp:effectExtent l="0" t="0" r="0" b="3810"/>
+            <wp:wrapTopAndBottom/>
+            <wp:docPr id="1999591598" name="Picture 1" descr="A screenshot of a computer&#10;&#10;Description automatically generated"/>
+            <wp:cNvGraphicFramePr>
+              <a:graphicFrameLocks xmlns:a="http://schemas.openxmlformats.org/drawingml/2006/main" noChangeAspect="1"/>
+            </wp:cNvGraphicFramePr>
+            <a:graphic xmlns:a="http://schemas.openxmlformats.org/drawingml/2006/main">
+              <a:graphicData uri="http://schemas.openxmlformats.org/drawingml/2006/picture">
+                <pic:pic xmlns:pic="http://schemas.openxmlformats.org/drawingml/2006/picture">
+                  <pic:nvPicPr>
+                    <pic:cNvPr id="1999591598" name="Picture 1" descr="A screenshot of a computer&#10;&#10;Description automatically generated"/>
+                    <pic:cNvPicPr/>
+                  </pic:nvPicPr>
+                  <pic:blipFill>
+                    <a:blip r:embed="rId45" cstate="print">
+                      <a:extLst>
+                        <a:ext uri="{28A0092B-C50C-407E-A947-70E740481C1C}">
+                          <a14:useLocalDpi xmlns:a14="http://schemas.microsoft.com/office/drawing/2010/main" val="0"/>
+                        </a:ext>
+                      </a:extLst>
+                    </a:blip>
+                    <a:stretch>
+                      <a:fillRect/>
+                    </a:stretch>
+                  </pic:blipFill>
+                  <pic:spPr>
+                    <a:xfrm>
+                      <a:off x="0" y="0"/>
+                      <a:ext cx="5731510" cy="2853690"/>
+                    </a:xfrm>
+                    <a:prstGeom prst="rect">
+                      <a:avLst/>
+                    </a:prstGeom>
+                  </pic:spPr>
+                </pic:pic>
+              </a:graphicData>
+            </a:graphic>
+            <wp14:sizeRelH relativeFrom="page">
+              <wp14:pctWidth>0</wp14:pctWidth>
+            </wp14:sizeRelH>
+            <wp14:sizeRelV relativeFrom="page">
+              <wp14:pctHeight>0</wp14:pctHeight>
+            </wp14:sizeRelV>
+          </wp:anchor>
+        </w:drawing>
+      </w:r>
+      <w:r>
+        <w:rPr>
+          <w:u w:val="single"/>
+        </w:rPr>
+        <w:t>Overview</w:t>
+      </w:r>
+      <w:r>
+        <w:rPr>
+          <w:u w:val="single"/>
+        </w:rPr>
+        <w:br/>
+      </w:r>
+      <w:r>
+        <w:rPr>
+          <w:u w:val="single"/>
+        </w:rPr>
+        <w:br/>
+      </w:r>
+      <w:r>
+        <w:t xml:space="preserve">The </w:t>
+      </w:r>
+      <w:r>
+        <w:t>analytics page provides an overview for the admins to understand trends on the site. It is the page that admins first see when they log into the site. Other users cannot access the analytics page.</w:t>
+      </w:r>
+    </w:p>
+    <w:p>
+      <w:r>
+        <w:lastRenderedPageBreak/>
+        <w:drawing>
+          <wp:anchor distT="0" distB="0" distL="114300" distR="114300" simplePos="0" relativeHeight="251659264" behindDoc="1" locked="0" layoutInCell="1" allowOverlap="1" wp14:anchorId="5F05D930" wp14:editId="0F4FE83B">
+            <wp:simplePos x="0" y="0"/>
+            <wp:positionH relativeFrom="column">
+              <wp:posOffset>0</wp:posOffset>
+            </wp:positionH>
+            <wp:positionV relativeFrom="paragraph">
+              <wp:posOffset>1021027</wp:posOffset>
+            </wp:positionV>
+            <wp:extent cx="5731510" cy="2853690"/>
+            <wp:effectExtent l="0" t="0" r="0" b="3810"/>
+            <wp:wrapTopAndBottom/>
+            <wp:docPr id="46306801" name="Picture 1" descr="A screenshot of a graph&#10;&#10;Description automatically generated"/>
+            <wp:cNvGraphicFramePr>
+              <a:graphicFrameLocks xmlns:a="http://schemas.openxmlformats.org/drawingml/2006/main" noChangeAspect="1"/>
+            </wp:cNvGraphicFramePr>
+            <a:graphic xmlns:a="http://schemas.openxmlformats.org/drawingml/2006/main">
+              <a:graphicData uri="http://schemas.openxmlformats.org/drawingml/2006/picture">
+                <pic:pic xmlns:pic="http://schemas.openxmlformats.org/drawingml/2006/picture">
+                  <pic:nvPicPr>
+                    <pic:cNvPr id="46306801" name="Picture 1" descr="A screenshot of a graph&#10;&#10;Description automatically generated"/>
+                    <pic:cNvPicPr/>
+                  </pic:nvPicPr>
+                  <pic:blipFill>
+                    <a:blip r:embed="rId46" cstate="print">
+                      <a:extLst>
+                        <a:ext uri="{28A0092B-C50C-407E-A947-70E740481C1C}">
+                          <a14:useLocalDpi xmlns:a14="http://schemas.microsoft.com/office/drawing/2010/main" val="0"/>
+                        </a:ext>
+                      </a:extLst>
+                    </a:blip>
+                    <a:stretch>
+                      <a:fillRect/>
+                    </a:stretch>
+                  </pic:blipFill>
+                  <pic:spPr>
+                    <a:xfrm>
+                      <a:off x="0" y="0"/>
+                      <a:ext cx="5731510" cy="2853690"/>
+                    </a:xfrm>
+                    <a:prstGeom prst="rect">
+                      <a:avLst/>
+                    </a:prstGeom>
+                  </pic:spPr>
+                </pic:pic>
+              </a:graphicData>
+            </a:graphic>
+            <wp14:sizeRelH relativeFrom="page">
+              <wp14:pctWidth>0</wp14:pctWidth>
+            </wp14:sizeRelH>
+            <wp14:sizeRelV relativeFrom="page">
+              <wp14:pctHeight>0</wp14:pctHeight>
+            </wp14:sizeRelV>
+          </wp:anchor>
+        </w:drawing>
+      </w:r>
+      <w:r>
+        <w:rPr>
+          <w:u w:val="single"/>
+        </w:rPr>
+        <w:t>5</w:t>
+      </w:r>
+      <w:r>
+        <w:rPr>
+          <w:u w:val="single"/>
+        </w:rPr>
+        <w:t xml:space="preserve">.1 – </w:t>
+      </w:r>
+      <w:r>
+        <w:rPr>
+          <w:u w:val="single"/>
+        </w:rPr>
+        <w:t>Goals</w:t>
+      </w:r>
+      <w:r>
+        <w:rPr>
+          <w:u w:val="single"/>
+        </w:rPr>
+        <w:br/>
+      </w:r>
+      <w:r>
+        <w:rPr>
+          <w:u w:val="single"/>
+        </w:rPr>
+        <w:br/>
+      </w:r>
+      <w:r>
+        <w:t>On the left side of the screen, there is a doughnut chart which shows how many total student goals are active (ongoing), completed, and expired. Hovering over a segment in the doughnut chart reveals the percentage and count for that segment:</w:t>
+      </w:r>
+    </w:p>
+    <w:p>
+      <w:pPr>
+        <w:rPr>
+          <w:u w:val="single"/>
+        </w:rPr>
+      </w:pPr>
+    </w:p>
+    <w:p>
+      <w:r>
+        <w:rPr>
+          <w:u w:val="single"/>
+        </w:rPr>
+        <w:t>5</w:t>
+      </w:r>
+      <w:r>
+        <w:rPr>
+          <w:u w:val="single"/>
+        </w:rPr>
+        <w:t>.</w:t>
+      </w:r>
+      <w:r>
+        <w:rPr>
+          <w:u w:val="single"/>
+        </w:rPr>
+        <w:t>2</w:t>
+      </w:r>
+      <w:r>
+        <w:rPr>
+          <w:u w:val="single"/>
+        </w:rPr>
+        <w:t xml:space="preserve"> – </w:t>
+      </w:r>
+      <w:r>
+        <w:rPr>
+          <w:u w:val="single"/>
+        </w:rPr>
+        <w:t>Courses</w:t>
+      </w:r>
+      <w:r>
+        <w:rPr>
+          <w:u w:val="single"/>
+        </w:rPr>
+        <w:br/>
+      </w:r>
+      <w:r>
+        <w:rPr>
+          <w:u w:val="single"/>
+        </w:rPr>
+        <w:br/>
+      </w:r>
+      <w:r>
+        <w:t xml:space="preserve">On the </w:t>
+      </w:r>
+      <w:r>
+        <w:t>right</w:t>
+      </w:r>
+      <w:r>
+        <w:t xml:space="preserve"> side of the screen, there is a </w:t>
+      </w:r>
+      <w:r>
+        <w:t xml:space="preserve">list of courses. Each one has the number of students in progress (started but not completed) and the number of students who have completed the course. Additionally, clicking the header of any of the courses will direct the admin to the course’s page on IBM </w:t>
+      </w:r>
+      <w:proofErr w:type="spellStart"/>
+      <w:r>
+        <w:t>SkillsBuild</w:t>
+      </w:r>
+      <w:proofErr w:type="spellEnd"/>
+      <w:r>
+        <w:t>.</w:t>
+      </w:r>
+    </w:p>
+    <w:p>
+      <w:pPr>
+        <w:rPr>
+          <w:u w:val="single"/>
+        </w:rPr>
+      </w:pPr>
+      <w:r>
+        <w:rPr>
+          <w:u w:val="single"/>
+        </w:rPr>
+        <w:t>5</w:t>
+      </w:r>
+      <w:r>
+        <w:rPr>
+          <w:u w:val="single"/>
+        </w:rPr>
+        <w:t>.</w:t>
+      </w:r>
+      <w:r>
+        <w:rPr>
+          <w:u w:val="single"/>
+        </w:rPr>
+        <w:t>3</w:t>
+      </w:r>
+      <w:r>
+        <w:rPr>
+          <w:u w:val="single"/>
+        </w:rPr>
+        <w:t xml:space="preserve"> – </w:t>
+      </w:r>
+      <w:r>
+        <w:rPr>
+          <w:u w:val="single"/>
+        </w:rPr>
+        <w:t>Other buttons</w:t>
+      </w:r>
+    </w:p>
+    <w:p>
+      <w:r>
+        <w:t xml:space="preserve">On the top left of the screen, there are buttons to view the student dashboard and to view the user profile. Clicking “View Student Dashboard” redirects the admin to the normal student dashboard </w:t>
+      </w:r>
+      <w:r>
+        <w:t>page and</w:t>
+      </w:r>
+      <w:r>
+        <w:t xml:space="preserve"> allows the admin to interact as a student</w:t>
+      </w:r>
+      <w:r>
+        <w:t>,</w:t>
+      </w:r>
+      <w:r>
+        <w:t xml:space="preserve"> to better</w:t>
+      </w:r>
+      <w:r>
+        <w:t xml:space="preserve"> comprehend the</w:t>
+      </w:r>
+      <w:r>
+        <w:t xml:space="preserve"> user experience. Clicking “View User Profile” allows the admin to view their profile</w:t>
+      </w:r>
+      <w:r>
+        <w:t>.</w:t>
+      </w:r>
+    </w:p>
     <w:p/>
-    <w:p/>
+    <w:p>
+      <w:pPr>
+        <w:rPr>
+          <w:u w:val="single"/>
+        </w:rPr>
+      </w:pPr>
+    </w:p>
     <w:sectPr>
       <w:pgSz w:w="11906" w:h="16838"/>
       <w:pgMar w:top="1440" w:right="1440" w:bottom="1440" w:left="1440" w:header="0" w:footer="0" w:gutter="0"/>
@@ -6130,89 +6679,33 @@
 </file>
 
 <file path=word/numbering.xml><?xml version="1.0" encoding="utf-8"?>
-<w:numbering xmlns:wpc="http://schemas.microsoft.com/office/word/2010/wordprocessingCanvas" xmlns:cx="http://schemas.microsoft.com/office/drawing/2014/chartex" xmlns:cx1="http://schemas.microsoft.com/office/drawing/2015/9/8/chartex" xmlns:cx2="http://schemas.microsoft.com/office/drawing/2015/10/21/chartex" xmlns:cx3="http://schemas.microsoft.com/office/drawing/2016/5/9/chartex" xmlns:cx4="http://schemas.microsoft.com/office/drawing/2016/5/10/chartex" xmlns:cx5="http://schemas.microsoft.com/office/drawing/2016/5/11/chartex" xmlns:cx6="http://schemas.microsoft.com/office/drawing/2016/5/12/chartex" xmlns:cx7="http://schemas.microsoft.com/office/drawing/2016/5/13/chartex" xmlns:cx8="http://schemas.microsoft.com/office/drawing/2016/5/14/chartex" xmlns:mc="http://schemas.openxmlformats.org/markup-compatibility/2006" xmlns:aink="http://schemas.microsoft.com/office/drawing/2016/ink" xmlns:am3d="http://schemas.microsoft.com/office/drawing/2017/model3d" xmlns:o="urn:schemas-microsoft-com:office:office" xmlns:oel="http://schemas.microsoft.com/office/2019/extlst" xmlns:r="http://schemas.openxmlformats.org/officeDocument/2006/relationships" xmlns:m="http://schemas.openxmlformats.org/officeDocument/2006/math" xmlns:v="urn:schemas-microsoft-com:vml" xmlns:wp14="http://schemas.microsoft.com/office/word/2010/wordprocessingDrawing" xmlns:wp="http://schemas.openxmlformats.org/drawingml/2006/wordprocessingDrawing" xmlns:w10="urn:schemas-microsoft-com:office:word" xmlns:w="http://schemas.openxmlformats.org/wordprocessingml/2006/main" xmlns:w14="http://schemas.microsoft.com/office/word/2010/wordml" xmlns:w15="http://schemas.microsoft.com/office/word/2012/wordml" xmlns:w16cex="http://schemas.microsoft.com/office/word/2018/wordml/cex" xmlns:w16cid="http://schemas.microsoft.com/office/word/2016/wordml/cid" xmlns:w16="http://schemas.microsoft.com/office/word/2018/wordml" xmlns:w16du="http://schemas.microsoft.com/office/word/2023/wordml/word16du" xmlns:w16sdtdh="http://schemas.microsoft.com/office/word/2020/wordml/sdtdatahash" xmlns:w16sdtfl="http://schemas.microsoft.com/office/word/2024/wordml/sdtformatlock" xmlns:w16se="http://schemas.microsoft.com/office/word/2015/wordml/symex" xmlns:wpg="http://schemas.microsoft.com/office/word/2010/wordprocessingGroup" xmlns:wpi="http://schemas.microsoft.com/office/word/2010/wordprocessingInk" xmlns:wne="http://schemas.microsoft.com/office/word/2006/wordml" xmlns:wps="http://schemas.microsoft.com/office/word/2010/wordprocessingShape" mc:Ignorable="w14 w15 w16se w16cid w16 w16cex w16sdtdh w16sdtfl w16du wp14">
+<w:numbering xmlns:wpc="http://schemas.microsoft.com/office/word/2010/wordprocessingCanvas" xmlns:cx="http://schemas.microsoft.com/office/drawing/2014/chartex" xmlns:cx1="http://schemas.microsoft.com/office/drawing/2015/9/8/chartex" xmlns:cx2="http://schemas.microsoft.com/office/drawing/2015/10/21/chartex" xmlns:cx3="http://schemas.microsoft.com/office/drawing/2016/5/9/chartex" xmlns:cx4="http://schemas.microsoft.com/office/drawing/2016/5/10/chartex" xmlns:cx5="http://schemas.microsoft.com/office/drawing/2016/5/11/chartex" xmlns:cx6="http://schemas.microsoft.com/office/drawing/2016/5/12/chartex" xmlns:cx7="http://schemas.microsoft.com/office/drawing/2016/5/13/chartex" xmlns:cx8="http://schemas.microsoft.com/office/drawing/2016/5/14/chartex" xmlns:mc="http://schemas.openxmlformats.org/markup-compatibility/2006" xmlns:aink="http://schemas.microsoft.com/office/drawing/2016/ink" xmlns:am3d="http://schemas.microsoft.com/office/drawing/2017/model3d" xmlns:o="urn:schemas-microsoft-com:office:office" xmlns:oel="http://schemas.microsoft.com/office/2019/extlst" xmlns:r="http://schemas.openxmlformats.org/officeDocument/2006/relationships" xmlns:m="http://schemas.openxmlformats.org/officeDocument/2006/math" xmlns:v="urn:schemas-microsoft-com:vml" xmlns:wp14="http://schemas.microsoft.com/office/word/2010/wordprocessingDrawing" xmlns:wp="http://schemas.openxmlformats.org/drawingml/2006/wordprocessingDrawing" xmlns:w10="urn:schemas-microsoft-com:office:word" xmlns:w="http://schemas.openxmlformats.org/wordprocessingml/2006/main" xmlns:w14="http://schemas.microsoft.com/office/word/2010/wordml" xmlns:w15="http://schemas.microsoft.com/office/word/2012/wordml" xmlns:w16cex="http://schemas.microsoft.com/office/word/2018/wordml/cex" xmlns:w16cid="http://schemas.microsoft.com/office/word/2016/wordml/cid" xmlns:w16="http://schemas.microsoft.com/office/word/2018/wordml" xmlns:w16du="http://schemas.microsoft.com/office/word/2023/wordml/word16du" xmlns:w16sdtdh="http://schemas.microsoft.com/office/word/2020/wordml/sdtdatahash" xmlns:w16se="http://schemas.microsoft.com/office/word/2015/wordml/symex" xmlns:wpg="http://schemas.microsoft.com/office/word/2010/wordprocessingGroup" xmlns:wpi="http://schemas.microsoft.com/office/word/2010/wordprocessingInk" xmlns:wne="http://schemas.microsoft.com/office/word/2006/wordml" xmlns:wps="http://schemas.microsoft.com/office/word/2010/wordprocessingShape" mc:Ignorable="w14 w15 w16se w16cid w16 w16cex w16sdtdh w16du wp14">
   <w:numPicBullet w:numPicBulletId="0">
-    <mc:AlternateContent>
-      <mc:Choice Requires="v">
-        <w:pict>
-          <v:shapetype w14:anchorId="479BF6DA" id="_x0000_t75" coordsize="21600,21600" o:spt="75" o:preferrelative="t" path="m@4@5l@4@11@9@11@9@5xe" filled="f" stroked="f">
-            <v:stroke joinstyle="miter"/>
-            <v:formulas>
-              <v:f eqn="if lineDrawn pixelLineWidth 0"/>
-              <v:f eqn="sum @0 1 0"/>
-              <v:f eqn="sum 0 0 @1"/>
-              <v:f eqn="prod @2 1 2"/>
-              <v:f eqn="prod @3 21600 pixelWidth"/>
-              <v:f eqn="prod @3 21600 pixelHeight"/>
-              <v:f eqn="sum @0 0 1"/>
-              <v:f eqn="prod @6 1 2"/>
-              <v:f eqn="prod @7 21600 pixelWidth"/>
-              <v:f eqn="sum @8 21600 0"/>
-              <v:f eqn="prod @7 21600 pixelHeight"/>
-              <v:f eqn="sum @10 21600 0"/>
-            </v:formulas>
-            <v:path o:extrusionok="f" gradientshapeok="t" o:connecttype="rect"/>
-            <o:lock v:ext="edit" aspectratio="t"/>
-          </v:shapetype>
-          <v:shape id="Picture 96318504" o:spid="_x0000_i1025" type="#_x0000_t75" style="width:5pt;height:5pt;visibility:visible;mso-wrap-style:square" filled="t">
-            <v:imagedata r:id="rId1" o:title=""/>
-            <o:lock v:ext="edit" aspectratio="f"/>
-          </v:shape>
-        </w:pict>
-      </mc:Choice>
-      <mc:Fallback>
-        <w:drawing>
-          <wp:inline distT="0" distB="0" distL="0" distR="0" wp14:anchorId="5DCC7C0C" wp14:editId="08BFBCB1">
-            <wp:extent cx="63500" cy="63500"/>
-            <wp:effectExtent l="0" t="0" r="0" b="0"/>
-            <wp:docPr id="96318504" name="Picture 96318504"/>
-            <wp:cNvGraphicFramePr>
-              <a:graphicFrameLocks xmlns:a="http://schemas.openxmlformats.org/drawingml/2006/main"/>
-            </wp:cNvGraphicFramePr>
-            <a:graphic xmlns:a="http://schemas.openxmlformats.org/drawingml/2006/main">
-              <a:graphicData uri="http://schemas.openxmlformats.org/drawingml/2006/picture">
-                <pic:pic xmlns:pic="http://schemas.openxmlformats.org/drawingml/2006/picture">
-                  <pic:nvPicPr>
-                    <pic:cNvPr id="0" name="Picture -1023"/>
-                    <pic:cNvPicPr preferRelativeResize="0">
-                      <a:picLocks noChangeArrowheads="1"/>
-                    </pic:cNvPicPr>
-                  </pic:nvPicPr>
-                  <pic:blipFill>
-                    <a:blip r:embed="rId2">
-                      <a:extLst>
-                        <a:ext uri="{28A0092B-C50C-407E-A947-70E740481C1C}">
-                          <a14:useLocalDpi xmlns:a14="http://schemas.microsoft.com/office/drawing/2010/main" val="0"/>
-                        </a:ext>
-                      </a:extLst>
-                    </a:blip>
-                    <a:srcRect/>
-                    <a:stretch>
-                      <a:fillRect/>
-                    </a:stretch>
-                  </pic:blipFill>
-                  <pic:spPr bwMode="auto">
-                    <a:xfrm>
-                      <a:off x="0" y="0"/>
-                      <a:ext cx="63500" cy="63500"/>
-                    </a:xfrm>
-                    <a:prstGeom prst="rect">
-                      <a:avLst/>
-                    </a:prstGeom>
-                    <a:solidFill>
-                      <a:srgbClr val="FFFFFF"/>
-                    </a:solidFill>
-                    <a:ln>
-                      <a:noFill/>
-                    </a:ln>
-                  </pic:spPr>
-                </pic:pic>
-              </a:graphicData>
-            </a:graphic>
-          </wp:inline>
-        </w:drawing>
-      </mc:Fallback>
-    </mc:AlternateContent>
+    <w:pict>
+      <v:shapetype id="_x0000_t75" coordsize="21600,21600" o:spt="75" o:preferrelative="t" path="m@4@5l@4@11@9@11@9@5xe" filled="f" stroked="f">
+        <v:stroke joinstyle="miter"/>
+        <v:formulas>
+          <v:f eqn="if lineDrawn pixelLineWidth 0"/>
+          <v:f eqn="sum @0 1 0"/>
+          <v:f eqn="sum 0 0 @1"/>
+          <v:f eqn="prod @2 1 2"/>
+          <v:f eqn="prod @3 21600 pixelWidth"/>
+          <v:f eqn="prod @3 21600 pixelHeight"/>
+          <v:f eqn="sum @0 0 1"/>
+          <v:f eqn="prod @6 1 2"/>
+          <v:f eqn="prod @7 21600 pixelWidth"/>
+          <v:f eqn="sum @8 21600 0"/>
+          <v:f eqn="prod @7 21600 pixelHeight"/>
+          <v:f eqn="sum @10 21600 0"/>
+        </v:formulas>
+        <v:path o:extrusionok="f" gradientshapeok="t" o:connecttype="rect"/>
+        <o:lock v:ext="edit" aspectratio="t"/>
+      </v:shapetype>
+      <v:shape id="_x0000_i1133" type="#_x0000_t75" style="width:5.2pt;height:5.2pt;visibility:visible;mso-wrap-style:square" o:bullet="t" filled="t">
+        <v:imagedata r:id="rId1" o:title=""/>
+        <o:lock v:ext="edit" aspectratio="f"/>
+      </v:shape>
+    </w:pict>
   </w:numPicBullet>
   <w:abstractNum w:abstractNumId="0" w15:restartNumberingAfterBreak="0">
     <w:nsid w:val="06342DFF"/>
@@ -11207,7 +11700,7 @@
 </file>
 
 <file path=word/styles.xml><?xml version="1.0" encoding="utf-8"?>
-<w:styles xmlns:mc="http://schemas.openxmlformats.org/markup-compatibility/2006" xmlns:r="http://schemas.openxmlformats.org/officeDocument/2006/relationships" xmlns:w="http://schemas.openxmlformats.org/wordprocessingml/2006/main" xmlns:w14="http://schemas.microsoft.com/office/word/2010/wordml" xmlns:w15="http://schemas.microsoft.com/office/word/2012/wordml" xmlns:w16cex="http://schemas.microsoft.com/office/word/2018/wordml/cex" xmlns:w16cid="http://schemas.microsoft.com/office/word/2016/wordml/cid" xmlns:w16="http://schemas.microsoft.com/office/word/2018/wordml" xmlns:w16du="http://schemas.microsoft.com/office/word/2023/wordml/word16du" xmlns:w16sdtdh="http://schemas.microsoft.com/office/word/2020/wordml/sdtdatahash" xmlns:w16sdtfl="http://schemas.microsoft.com/office/word/2024/wordml/sdtformatlock" xmlns:w16se="http://schemas.microsoft.com/office/word/2015/wordml/symex" mc:Ignorable="w14 w15 w16se w16cid w16 w16cex w16sdtdh w16sdtfl w16du">
+<w:styles xmlns:mc="http://schemas.openxmlformats.org/markup-compatibility/2006" xmlns:r="http://schemas.openxmlformats.org/officeDocument/2006/relationships" xmlns:w="http://schemas.openxmlformats.org/wordprocessingml/2006/main" xmlns:w14="http://schemas.microsoft.com/office/word/2010/wordml" xmlns:w15="http://schemas.microsoft.com/office/word/2012/wordml" xmlns:w16cex="http://schemas.microsoft.com/office/word/2018/wordml/cex" xmlns:w16cid="http://schemas.microsoft.com/office/word/2016/wordml/cid" xmlns:w16="http://schemas.microsoft.com/office/word/2018/wordml" xmlns:w16du="http://schemas.microsoft.com/office/word/2023/wordml/word16du" xmlns:w16sdtdh="http://schemas.microsoft.com/office/word/2020/wordml/sdtdatahash" xmlns:w16se="http://schemas.microsoft.com/office/word/2015/wordml/symex" mc:Ignorable="w14 w15 w16se w16cid w16 w16cex w16sdtdh w16du">
   <w:docDefaults>
     <w:rPrDefault>
       <w:rPr>
@@ -11810,6 +12303,7 @@
   <w:style w:type="character" w:default="1" w:styleId="DefaultParagraphFont">
     <w:name w:val="Default Paragraph Font"/>
     <w:uiPriority w:val="1"/>
+    <w:semiHidden/>
     <w:unhideWhenUsed/>
   </w:style>
   <w:style w:type="table" w:default="1" w:styleId="TableNormal">

</xml_diff>

<commit_message>
Replace User-Manual with reviews deleting reviews comments stories
</commit_message>
<xml_diff>
--- a/User Manual/User-Manual.docx
+++ b/User Manual/User-Manual.docx
@@ -12,7 +12,31 @@
           <w:szCs w:val="28"/>
           <w:u w:val="single"/>
         </w:rPr>
-        <w:t>IMB SkillsBuild Gamification User Manual:</w:t>
+        <w:t xml:space="preserve">IMB </w:t>
+      </w:r>
+      <w:proofErr w:type="spellStart"/>
+      <w:r>
+        <w:rPr>
+          <w:rFonts w:ascii="Aptos (Heading)" w:hAnsi="Aptos (Heading)"/>
+          <w:b/>
+          <w:bCs/>
+          <w:sz w:val="28"/>
+          <w:szCs w:val="28"/>
+          <w:u w:val="single"/>
+        </w:rPr>
+        <w:t>SkillsBuild</w:t>
+      </w:r>
+      <w:proofErr w:type="spellEnd"/>
+      <w:r>
+        <w:rPr>
+          <w:rFonts w:ascii="Aptos (Heading)" w:hAnsi="Aptos (Heading)"/>
+          <w:b/>
+          <w:bCs/>
+          <w:sz w:val="28"/>
+          <w:szCs w:val="28"/>
+          <w:u w:val="single"/>
+        </w:rPr>
+        <w:t xml:space="preserve"> Gamification User Manual:</w:t>
       </w:r>
       <w:r>
         <w:rPr>
@@ -34,7 +58,31 @@
     </w:p>
     <w:p>
       <w:r>
-        <w:t>IBM SkillsBuild Gamification is a tool designed to enhance engagement with IBM SkillsBuild by introducing a leaderboard and levelling system. It allows users to track their progress and encourages participation through a competitive learning environment. The software aims to make online learning more interactive and rewarding, focusing on students using IBM SkillsBuild to develop key skills in computer science.</w:t>
+        <w:t xml:space="preserve">IBM </w:t>
+      </w:r>
+      <w:proofErr w:type="spellStart"/>
+      <w:r>
+        <w:t>SkillsBuild</w:t>
+      </w:r>
+      <w:proofErr w:type="spellEnd"/>
+      <w:r>
+        <w:t xml:space="preserve"> Gamification is a tool designed to enhance engagement with IBM </w:t>
+      </w:r>
+      <w:proofErr w:type="spellStart"/>
+      <w:r>
+        <w:t>SkillsBuild</w:t>
+      </w:r>
+      <w:proofErr w:type="spellEnd"/>
+      <w:r>
+        <w:t xml:space="preserve"> by introducing a leaderboard and levelling system. It allows users to track their progress and encourages participation through a competitive learning environment. The software aims to make online learning more interactive and rewarding, focusing on students using IBM </w:t>
+      </w:r>
+      <w:proofErr w:type="spellStart"/>
+      <w:r>
+        <w:t>SkillsBuild</w:t>
+      </w:r>
+      <w:proofErr w:type="spellEnd"/>
+      <w:r>
+        <w:t xml:space="preserve"> to develop key skills in computer science.</w:t>
       </w:r>
     </w:p>
     <w:p>
@@ -417,7 +465,15 @@
         </w:numPr>
       </w:pPr>
       <w:r>
-        <w:t>Users can click a course tile to be redirected to the official IBM SkillsBuild website, where they can access the course content.</w:t>
+        <w:t xml:space="preserve">Users can click a course tile to be redirected to the official IBM </w:t>
+      </w:r>
+      <w:proofErr w:type="spellStart"/>
+      <w:r>
+        <w:t>SkillsBuild</w:t>
+      </w:r>
+      <w:proofErr w:type="spellEnd"/>
+      <w:r>
+        <w:t xml:space="preserve"> website, where they can access the course content.</w:t>
       </w:r>
     </w:p>
     <w:p>
@@ -428,7 +484,15 @@
         </w:numPr>
       </w:pPr>
       <w:r>
-        <w:t>After completing or progressing through the course on IBM SkillsBuild, users return to the platform to update their course status.</w:t>
+        <w:t xml:space="preserve">After completing or progressing through the course on IBM </w:t>
+      </w:r>
+      <w:proofErr w:type="spellStart"/>
+      <w:r>
+        <w:t>SkillsBuild</w:t>
+      </w:r>
+      <w:proofErr w:type="spellEnd"/>
+      <w:r>
+        <w:t>, users return to the platform to update their course status.</w:t>
       </w:r>
     </w:p>
     <w:p>
@@ -4654,7 +4718,15 @@
         <w:br/>
       </w:r>
       <w:r>
-        <w:t>The Skills Build Gamification featueres two levelling systems working side by side. There are ranks and levels.</w:t>
+        <w:t xml:space="preserve">The Skills Build Gamification </w:t>
+      </w:r>
+      <w:proofErr w:type="spellStart"/>
+      <w:r>
+        <w:t>featueres</w:t>
+      </w:r>
+      <w:proofErr w:type="spellEnd"/>
+      <w:r>
+        <w:t xml:space="preserve"> two levelling systems working side by side. There are ranks and levels.</w:t>
       </w:r>
     </w:p>
     <w:p/>
@@ -4948,12 +5020,26 @@
         <w:rPr>
           <w:u w:val="single"/>
         </w:rPr>
-        <w:t>4.4 What ranks are in SkillsBuild Gamification?</w:t>
-      </w:r>
+        <w:t xml:space="preserve">4.4 What ranks are in </w:t>
+      </w:r>
+      <w:proofErr w:type="spellStart"/>
       <w:r>
         <w:rPr>
           <w:u w:val="single"/>
         </w:rPr>
+        <w:t>SkillsBuild</w:t>
+      </w:r>
+      <w:proofErr w:type="spellEnd"/>
+      <w:r>
+        <w:rPr>
+          <w:u w:val="single"/>
+        </w:rPr>
+        <w:t xml:space="preserve"> Gamification?</w:t>
+      </w:r>
+      <w:r>
+        <w:rPr>
+          <w:u w:val="single"/>
+        </w:rPr>
         <w:br/>
       </w:r>
       <w:r>
@@ -4963,7 +5049,15 @@
         <w:br/>
       </w:r>
       <w:r>
-        <w:t>There are 8 ranks in SkillsBuild Gamification:</w:t>
+        <w:t xml:space="preserve">There are 8 ranks in </w:t>
+      </w:r>
+      <w:proofErr w:type="spellStart"/>
+      <w:r>
+        <w:t>SkillsBuild</w:t>
+      </w:r>
+      <w:proofErr w:type="spellEnd"/>
+      <w:r>
+        <w:t xml:space="preserve"> Gamification:</w:t>
       </w:r>
     </w:p>
     <w:p>
@@ -5477,7 +5571,15 @@
         <w:br/>
       </w:r>
       <w:r>
-        <w:t>On the right side of the screen, there is a list of courses. Each one has the number of students in progress (started but not completed) and the number of students who have completed the course. Additionally, clicking the header of any of the courses will direct the admin to the course’s page on IBM SkillsBuild.</w:t>
+        <w:t xml:space="preserve">On the right side of the screen, there is a list of courses. Each one has the number of students in progress (started but not completed) and the number of students who have completed the course. Additionally, clicking the header of any of the courses will direct the admin to the course’s page on IBM </w:t>
+      </w:r>
+      <w:proofErr w:type="spellStart"/>
+      <w:r>
+        <w:t>SkillsBuild</w:t>
+      </w:r>
+      <w:proofErr w:type="spellEnd"/>
+      <w:r>
+        <w:t>.</w:t>
       </w:r>
     </w:p>
     <w:p>
@@ -5538,7 +5640,15 @@
     </w:p>
     <w:p>
       <w:r>
-        <w:t xml:space="preserve">This feature introduces friend functionality to our IBM SkillsBuildGamification. Students are now able to see incoming friend requests, see their friends list, send friend requests to other </w:t>
+        <w:t xml:space="preserve">This feature introduces friend functionality to our IBM </w:t>
+      </w:r>
+      <w:proofErr w:type="spellStart"/>
+      <w:r>
+        <w:t>SkillsBuildGamification</w:t>
+      </w:r>
+      <w:proofErr w:type="spellEnd"/>
+      <w:r>
+        <w:t xml:space="preserve">. Students are now able to see incoming friend requests, see their friends list, send friend requests to other </w:t>
       </w:r>
       <w:r>
         <w:lastRenderedPageBreak/>
@@ -6825,7 +6935,35 @@
         <w:rPr>
           <w:lang w:val="en-US"/>
         </w:rPr>
-        <w:t>The Avatar Shop, where users can personalize their profile using a range of avatar features from multiple categories (like Bottts, Avataaars, Adventurer, etc.). Each avatar category comes with unique customization options such as eyes, mouth, top, clothing, and textures.</w:t>
+        <w:t xml:space="preserve">The Avatar Shop, where users can personalize their profile using a range of avatar features from multiple categories (like </w:t>
+      </w:r>
+      <w:proofErr w:type="spellStart"/>
+      <w:r>
+        <w:rPr>
+          <w:lang w:val="en-US"/>
+        </w:rPr>
+        <w:t>Bottts</w:t>
+      </w:r>
+      <w:proofErr w:type="spellEnd"/>
+      <w:r>
+        <w:rPr>
+          <w:lang w:val="en-US"/>
+        </w:rPr>
+        <w:t xml:space="preserve">, </w:t>
+      </w:r>
+      <w:proofErr w:type="spellStart"/>
+      <w:r>
+        <w:rPr>
+          <w:lang w:val="en-US"/>
+        </w:rPr>
+        <w:t>Avataaars</w:t>
+      </w:r>
+      <w:proofErr w:type="spellEnd"/>
+      <w:r>
+        <w:rPr>
+          <w:lang w:val="en-US"/>
+        </w:rPr>
+        <w:t>, Adventurer, etc.). Each avatar category comes with unique customization options such as eyes, mouth, top, clothing, and textures.</w:t>
       </w:r>
       <w:r>
         <w:t> </w:t>
@@ -6864,6 +7002,9 @@
     </w:p>
     <w:p>
       <w:r>
+        <w:rPr>
+          <w:noProof/>
+        </w:rPr>
         <w:drawing>
           <wp:inline distT="0" distB="0" distL="0" distR="0" wp14:anchorId="21D8B30E" wp14:editId="3CA76AD3">
             <wp:extent cx="5731510" cy="2980690"/>
@@ -6955,7 +7096,35 @@
         <w:rPr>
           <w:lang w:val="en-US"/>
         </w:rPr>
-        <w:t>The Category Buttons to switch between avatar types (e.g., Bottts, Avataaars). This will reload feature sets specific to that category.</w:t>
+        <w:t xml:space="preserve">The Category Buttons to switch between avatar types (e.g., </w:t>
+      </w:r>
+      <w:proofErr w:type="spellStart"/>
+      <w:r>
+        <w:rPr>
+          <w:lang w:val="en-US"/>
+        </w:rPr>
+        <w:t>Bottts</w:t>
+      </w:r>
+      <w:proofErr w:type="spellEnd"/>
+      <w:r>
+        <w:rPr>
+          <w:lang w:val="en-US"/>
+        </w:rPr>
+        <w:t xml:space="preserve">, </w:t>
+      </w:r>
+      <w:proofErr w:type="spellStart"/>
+      <w:r>
+        <w:rPr>
+          <w:lang w:val="en-US"/>
+        </w:rPr>
+        <w:t>Avataaars</w:t>
+      </w:r>
+      <w:proofErr w:type="spellEnd"/>
+      <w:r>
+        <w:rPr>
+          <w:lang w:val="en-US"/>
+        </w:rPr>
+        <w:t>). This will reload feature sets specific to that category.</w:t>
       </w:r>
       <w:r>
         <w:t> </w:t>
@@ -6963,6 +7132,9 @@
     </w:p>
     <w:p>
       <w:r>
+        <w:rPr>
+          <w:noProof/>
+        </w:rPr>
         <w:lastRenderedPageBreak/>
         <w:drawing>
           <wp:inline distT="0" distB="0" distL="0" distR="0" wp14:anchorId="1159F608" wp14:editId="2F71D28E">
@@ -7047,6 +7219,9 @@
     </w:p>
     <w:p>
       <w:r>
+        <w:rPr>
+          <w:noProof/>
+        </w:rPr>
         <w:drawing>
           <wp:inline distT="0" distB="0" distL="0" distR="0" wp14:anchorId="4340517F" wp14:editId="7CBB106B">
             <wp:extent cx="5731510" cy="2966085"/>
@@ -7211,6 +7386,9 @@
     </w:p>
     <w:p>
       <w:r>
+        <w:rPr>
+          <w:noProof/>
+        </w:rPr>
         <w:drawing>
           <wp:inline distT="0" distB="0" distL="0" distR="0" wp14:anchorId="15833EA5" wp14:editId="2E689223">
             <wp:extent cx="5731510" cy="2944495"/>
@@ -7426,6 +7604,9 @@
     </w:p>
     <w:p>
       <w:r>
+        <w:rPr>
+          <w:noProof/>
+        </w:rPr>
         <w:lastRenderedPageBreak/>
         <w:drawing>
           <wp:inline distT="0" distB="0" distL="0" distR="0" wp14:anchorId="6706FAAF" wp14:editId="6BB8DFA4">
@@ -7573,6 +7754,294 @@
     </w:p>
     <w:p>
       <w:pPr>
+        <w:spacing w:after="0" w:line="240" w:lineRule="auto"/>
+        <w:rPr>
+          <w:b/>
+          <w:bCs/>
+        </w:rPr>
+      </w:pPr>
+      <w:r>
+        <w:rPr>
+          <w:b/>
+          <w:bCs/>
+        </w:rPr>
+        <w:br w:type="page"/>
+      </w:r>
+    </w:p>
+    <w:p>
+      <w:pPr>
+        <w:suppressAutoHyphens w:val="0"/>
+        <w:rPr>
+          <w:rFonts w:ascii="Aptos" w:eastAsia="Aptos" w:hAnsi="Aptos" w:cs="Aptos"/>
+          <w:b/>
+          <w:bCs/>
+        </w:rPr>
+      </w:pPr>
+      <w:r>
+        <w:rPr>
+          <w:rFonts w:ascii="Aptos" w:eastAsia="Aptos" w:hAnsi="Aptos" w:cs="Aptos"/>
+          <w:b/>
+          <w:bCs/>
+        </w:rPr>
+        <w:lastRenderedPageBreak/>
+        <w:t xml:space="preserve">8.0 </w:t>
+      </w:r>
+      <w:r>
+        <w:rPr>
+          <w:rFonts w:ascii="Aptos" w:eastAsia="Aptos" w:hAnsi="Aptos" w:cs="Aptos"/>
+          <w:b/>
+          <w:bCs/>
+        </w:rPr>
+        <w:t>Adding,</w:t>
+      </w:r>
+      <w:r>
+        <w:rPr>
+          <w:rFonts w:ascii="Aptos" w:eastAsia="Aptos" w:hAnsi="Aptos" w:cs="Aptos"/>
+          <w:b/>
+          <w:bCs/>
+        </w:rPr>
+        <w:t xml:space="preserve"> </w:t>
+      </w:r>
+      <w:r>
+        <w:rPr>
+          <w:rFonts w:ascii="Aptos" w:eastAsia="Aptos" w:hAnsi="Aptos" w:cs="Aptos"/>
+          <w:b/>
+          <w:bCs/>
+        </w:rPr>
+        <w:t>seeing, and deleting reviews</w:t>
+      </w:r>
+    </w:p>
+    <w:p>
+      <w:pPr>
+        <w:rPr>
+          <w:rFonts w:ascii="Aptos" w:eastAsia="Aptos" w:hAnsi="Aptos" w:cs="Aptos"/>
+        </w:rPr>
+      </w:pPr>
+      <w:r>
+        <w:rPr>
+          <w:rFonts w:ascii="Aptos" w:eastAsia="Aptos" w:hAnsi="Aptos" w:cs="Aptos"/>
+        </w:rPr>
+        <w:t>On the dashboard a button which is called add review which will only appear below the button on the dashboard of its corresponding course if the user has completed the course. See review will always appear below its corresponding course on the main page  to see all reviews. Example:</w:t>
+      </w:r>
+    </w:p>
+    <w:p>
+      <w:pPr>
+        <w:ind w:left="360"/>
+        <w:rPr>
+          <w:rFonts w:ascii="Aptos" w:eastAsia="Aptos" w:hAnsi="Aptos" w:cs="Aptos"/>
+        </w:rPr>
+      </w:pPr>
+      <w:r>
+        <w:rPr>
+          <w:rFonts w:ascii="Aptos" w:eastAsia="Aptos" w:hAnsi="Aptos" w:cs="Aptos"/>
+        </w:rPr>
+        <w:drawing>
+          <wp:inline distT="0" distB="0" distL="0" distR="0" wp14:anchorId="3F2741B0" wp14:editId="600FD979">
+            <wp:extent cx="5731510" cy="2811780"/>
+            <wp:effectExtent l="0" t="0" r="2540" b="7620"/>
+            <wp:docPr id="572738468" name="Picture 1"/>
+            <wp:cNvGraphicFramePr>
+              <a:graphicFrameLocks xmlns:a="http://schemas.openxmlformats.org/drawingml/2006/main" noChangeAspect="1"/>
+            </wp:cNvGraphicFramePr>
+            <a:graphic xmlns:a="http://schemas.openxmlformats.org/drawingml/2006/main">
+              <a:graphicData uri="http://schemas.openxmlformats.org/drawingml/2006/picture">
+                <pic:pic xmlns:pic="http://schemas.openxmlformats.org/drawingml/2006/picture">
+                  <pic:nvPicPr>
+                    <pic:cNvPr id="572738468" name=""/>
+                    <pic:cNvPicPr/>
+                  </pic:nvPicPr>
+                  <pic:blipFill>
+                    <a:blip r:embed="rId54"/>
+                    <a:stretch>
+                      <a:fillRect/>
+                    </a:stretch>
+                  </pic:blipFill>
+                  <pic:spPr>
+                    <a:xfrm>
+                      <a:off x="0" y="0"/>
+                      <a:ext cx="5731510" cy="2811780"/>
+                    </a:xfrm>
+                    <a:prstGeom prst="rect">
+                      <a:avLst/>
+                    </a:prstGeom>
+                  </pic:spPr>
+                </pic:pic>
+              </a:graphicData>
+            </a:graphic>
+          </wp:inline>
+        </w:drawing>
+      </w:r>
+    </w:p>
+    <w:p>
+      <w:pPr>
+        <w:ind w:left="360"/>
+        <w:rPr>
+          <w:rFonts w:ascii="Aptos" w:eastAsia="Aptos" w:hAnsi="Aptos" w:cs="Aptos"/>
+        </w:rPr>
+      </w:pPr>
+    </w:p>
+    <w:p>
+      <w:pPr>
+        <w:rPr>
+          <w:rFonts w:ascii="Aptos" w:eastAsia="Aptos" w:hAnsi="Aptos" w:cs="Aptos"/>
+        </w:rPr>
+      </w:pPr>
+      <w:r>
+        <w:rPr>
+          <w:rFonts w:ascii="Aptos" w:eastAsia="Aptos" w:hAnsi="Aptos" w:cs="Aptos"/>
+        </w:rPr>
+        <w:t>Once add review has been clicked this page will appear:</w:t>
+      </w:r>
+    </w:p>
+    <w:p>
+      <w:pPr>
+        <w:ind w:left="360"/>
+        <w:rPr>
+          <w:rFonts w:ascii="Aptos" w:eastAsia="Aptos" w:hAnsi="Aptos" w:cs="Aptos"/>
+        </w:rPr>
+      </w:pPr>
+      <w:r>
+        <w:rPr>
+          <w:rFonts w:ascii="Aptos" w:eastAsia="Aptos" w:hAnsi="Aptos" w:cs="Aptos"/>
+        </w:rPr>
+        <w:drawing>
+          <wp:inline distT="0" distB="0" distL="0" distR="0" wp14:anchorId="5B16DD4F" wp14:editId="1734FE30">
+            <wp:extent cx="5731510" cy="4030345"/>
+            <wp:effectExtent l="0" t="0" r="2540" b="8255"/>
+            <wp:docPr id="234113932" name="Picture 1"/>
+            <wp:cNvGraphicFramePr>
+              <a:graphicFrameLocks xmlns:a="http://schemas.openxmlformats.org/drawingml/2006/main" noChangeAspect="1"/>
+            </wp:cNvGraphicFramePr>
+            <a:graphic xmlns:a="http://schemas.openxmlformats.org/drawingml/2006/main">
+              <a:graphicData uri="http://schemas.openxmlformats.org/drawingml/2006/picture">
+                <pic:pic xmlns:pic="http://schemas.openxmlformats.org/drawingml/2006/picture">
+                  <pic:nvPicPr>
+                    <pic:cNvPr id="234113932" name=""/>
+                    <pic:cNvPicPr/>
+                  </pic:nvPicPr>
+                  <pic:blipFill>
+                    <a:blip r:embed="rId55"/>
+                    <a:stretch>
+                      <a:fillRect/>
+                    </a:stretch>
+                  </pic:blipFill>
+                  <pic:spPr>
+                    <a:xfrm>
+                      <a:off x="0" y="0"/>
+                      <a:ext cx="5731510" cy="4030345"/>
+                    </a:xfrm>
+                    <a:prstGeom prst="rect">
+                      <a:avLst/>
+                    </a:prstGeom>
+                  </pic:spPr>
+                </pic:pic>
+              </a:graphicData>
+            </a:graphic>
+          </wp:inline>
+        </w:drawing>
+      </w:r>
+    </w:p>
+    <w:p>
+      <w:pPr>
+        <w:ind w:left="360"/>
+        <w:rPr>
+          <w:rFonts w:ascii="Aptos" w:eastAsia="Aptos" w:hAnsi="Aptos" w:cs="Aptos"/>
+        </w:rPr>
+      </w:pPr>
+      <w:r>
+        <w:rPr>
+          <w:rFonts w:ascii="Aptos" w:eastAsia="Aptos" w:hAnsi="Aptos" w:cs="Aptos"/>
+        </w:rPr>
+        <w:lastRenderedPageBreak/>
+        <w:t>This page will allow the user to select a drop down of 1-5 to show how satisfied with the course they are. They can also enter text for their review if they want to add more context to their review. After you press submit and the page will take you see review.</w:t>
+      </w:r>
+    </w:p>
+    <w:p>
+      <w:pPr>
+        <w:ind w:left="360"/>
+        <w:rPr>
+          <w:rFonts w:ascii="Aptos" w:eastAsia="Aptos" w:hAnsi="Aptos" w:cs="Aptos"/>
+        </w:rPr>
+      </w:pPr>
+    </w:p>
+    <w:p>
+      <w:pPr>
+        <w:ind w:left="360"/>
+        <w:rPr>
+          <w:rFonts w:ascii="Aptos" w:eastAsia="Aptos" w:hAnsi="Aptos" w:cs="Aptos"/>
+        </w:rPr>
+      </w:pPr>
+      <w:r>
+        <w:rPr>
+          <w:rFonts w:ascii="Aptos" w:eastAsia="Aptos" w:hAnsi="Aptos" w:cs="Aptos"/>
+        </w:rPr>
+        <w:t>This page will appear after submitting a new review or after you have clicked on see reviews:</w:t>
+      </w:r>
+    </w:p>
+    <w:p>
+      <w:pPr>
+        <w:ind w:left="360"/>
+        <w:rPr>
+          <w:rFonts w:ascii="Aptos" w:eastAsia="Aptos" w:hAnsi="Aptos" w:cs="Aptos"/>
+        </w:rPr>
+      </w:pPr>
+      <w:r>
+        <w:rPr>
+          <w:rFonts w:ascii="Aptos" w:eastAsia="Aptos" w:hAnsi="Aptos" w:cs="Aptos"/>
+        </w:rPr>
+        <w:drawing>
+          <wp:inline distT="0" distB="0" distL="0" distR="0" wp14:anchorId="67082CC9" wp14:editId="3FAB0172">
+            <wp:extent cx="5731510" cy="2703195"/>
+            <wp:effectExtent l="0" t="0" r="2540" b="1905"/>
+            <wp:docPr id="397394814" name="Picture 1"/>
+            <wp:cNvGraphicFramePr>
+              <a:graphicFrameLocks xmlns:a="http://schemas.openxmlformats.org/drawingml/2006/main" noChangeAspect="1"/>
+            </wp:cNvGraphicFramePr>
+            <a:graphic xmlns:a="http://schemas.openxmlformats.org/drawingml/2006/main">
+              <a:graphicData uri="http://schemas.openxmlformats.org/drawingml/2006/picture">
+                <pic:pic xmlns:pic="http://schemas.openxmlformats.org/drawingml/2006/picture">
+                  <pic:nvPicPr>
+                    <pic:cNvPr id="397394814" name=""/>
+                    <pic:cNvPicPr/>
+                  </pic:nvPicPr>
+                  <pic:blipFill>
+                    <a:blip r:embed="rId56"/>
+                    <a:stretch>
+                      <a:fillRect/>
+                    </a:stretch>
+                  </pic:blipFill>
+                  <pic:spPr>
+                    <a:xfrm>
+                      <a:off x="0" y="0"/>
+                      <a:ext cx="5731510" cy="2703195"/>
+                    </a:xfrm>
+                    <a:prstGeom prst="rect">
+                      <a:avLst/>
+                    </a:prstGeom>
+                  </pic:spPr>
+                </pic:pic>
+              </a:graphicData>
+            </a:graphic>
+          </wp:inline>
+        </w:drawing>
+      </w:r>
+    </w:p>
+    <w:p>
+      <w:pPr>
+        <w:ind w:left="360"/>
+        <w:rPr>
+          <w:rFonts w:ascii="Aptos" w:eastAsia="Aptos" w:hAnsi="Aptos" w:cs="Aptos"/>
+        </w:rPr>
+      </w:pPr>
+      <w:r>
+        <w:rPr>
+          <w:rFonts w:ascii="Aptos" w:eastAsia="Aptos" w:hAnsi="Aptos" w:cs="Aptos"/>
+        </w:rPr>
+        <w:t>This page will appear and will show you reviews from other people about the course including your own. Also on this page If the user that is login is an admin the delete review button will appear for each review and when clicked on will remove the review from the database. When the dashboard button is clicked it will take you back to dashboard.</w:t>
+      </w:r>
+    </w:p>
+    <w:p>
+      <w:pPr>
         <w:rPr>
           <w:b/>
           <w:bCs/>
@@ -7596,7 +8065,7 @@
     <mc:AlternateContent>
       <mc:Choice Requires="v">
         <w:pict>
-          <v:shapetype w14:anchorId="69557C46" id="_x0000_t75" coordsize="21600,21600" o:spt="75" o:preferrelative="t" path="m@4@5l@4@11@9@11@9@5xe" filled="f" stroked="f">
+          <v:shapetype w14:anchorId="34AEC7F6" id="_x0000_t75" coordsize="21600,21600" o:spt="75" o:preferrelative="t" path="m@4@5l@4@11@9@11@9@5xe" filled="f" stroked="f">
             <v:stroke joinstyle="miter"/>
             <v:formulas>
               <v:f eqn="if lineDrawn pixelLineWidth 0"/>
@@ -7615,7 +8084,7 @@
             <v:path o:extrusionok="f" gradientshapeok="t" o:connecttype="rect"/>
             <o:lock v:ext="edit" aspectratio="t"/>
           </v:shapetype>
-          <v:shape id="Picture 350141880" o:spid="_x0000_i1025" type="#_x0000_t75" style="width:5.5pt;height:5.5pt;visibility:visible;mso-wrap-style:square" filled="t">
+          <v:shape id="Picture 709000933" o:spid="_x0000_i1025" type="#_x0000_t75" style="width:5.5pt;height:5.5pt;visibility:visible;mso-wrap-style:square" filled="t">
             <v:imagedata r:id="rId1" o:title=""/>
             <o:lock v:ext="edit" aspectratio="f"/>
           </v:shape>
@@ -7623,10 +8092,10 @@
       </mc:Choice>
       <mc:Fallback>
         <w:drawing>
-          <wp:inline distT="0" distB="0" distL="0" distR="0" wp14:anchorId="3482669C" wp14:editId="09A72E71">
+          <wp:inline distT="0" distB="0" distL="0" distR="0" wp14:anchorId="7E194754" wp14:editId="2AD25AC0">
             <wp:extent cx="69850" cy="69850"/>
             <wp:effectExtent l="0" t="0" r="0" b="0"/>
-            <wp:docPr id="350141880" name="Picture 350141880"/>
+            <wp:docPr id="709000933" name="Picture 709000933"/>
             <wp:cNvGraphicFramePr>
               <a:graphicFrameLocks xmlns:a="http://schemas.openxmlformats.org/drawingml/2006/main"/>
             </wp:cNvGraphicFramePr>
@@ -10148,6 +10617,126 @@
     </w:lvl>
   </w:abstractNum>
   <w:abstractNum w:abstractNumId="18" w15:restartNumberingAfterBreak="0">
+    <w:nsid w:val="33ED51BF"/>
+    <w:multiLevelType w:val="multilevel"/>
+    <w:tmpl w:val="FBC08A5E"/>
+    <w:lvl w:ilvl="0">
+      <w:start w:val="1"/>
+      <w:numFmt w:val="decimal"/>
+      <w:lvlText w:val="%1."/>
+      <w:lvlJc w:val="left"/>
+      <w:pPr>
+        <w:ind w:left="720" w:hanging="360"/>
+      </w:pPr>
+      <w:rPr>
+        <w:rFonts w:hint="default"/>
+      </w:rPr>
+    </w:lvl>
+    <w:lvl w:ilvl="1">
+      <w:numFmt w:val="decimal"/>
+      <w:isLgl/>
+      <w:lvlText w:val="%1.%2"/>
+      <w:lvlJc w:val="left"/>
+      <w:pPr>
+        <w:ind w:left="720" w:hanging="360"/>
+      </w:pPr>
+      <w:rPr>
+        <w:rFonts w:hint="default"/>
+      </w:rPr>
+    </w:lvl>
+    <w:lvl w:ilvl="2">
+      <w:start w:val="1"/>
+      <w:numFmt w:val="decimal"/>
+      <w:isLgl/>
+      <w:lvlText w:val="%1.%2.%3"/>
+      <w:lvlJc w:val="left"/>
+      <w:pPr>
+        <w:ind w:left="1080" w:hanging="720"/>
+      </w:pPr>
+      <w:rPr>
+        <w:rFonts w:hint="default"/>
+      </w:rPr>
+    </w:lvl>
+    <w:lvl w:ilvl="3">
+      <w:start w:val="1"/>
+      <w:numFmt w:val="decimal"/>
+      <w:isLgl/>
+      <w:lvlText w:val="%1.%2.%3.%4"/>
+      <w:lvlJc w:val="left"/>
+      <w:pPr>
+        <w:ind w:left="1080" w:hanging="720"/>
+      </w:pPr>
+      <w:rPr>
+        <w:rFonts w:hint="default"/>
+      </w:rPr>
+    </w:lvl>
+    <w:lvl w:ilvl="4">
+      <w:start w:val="1"/>
+      <w:numFmt w:val="decimal"/>
+      <w:isLgl/>
+      <w:lvlText w:val="%1.%2.%3.%4.%5"/>
+      <w:lvlJc w:val="left"/>
+      <w:pPr>
+        <w:ind w:left="1440" w:hanging="1080"/>
+      </w:pPr>
+      <w:rPr>
+        <w:rFonts w:hint="default"/>
+      </w:rPr>
+    </w:lvl>
+    <w:lvl w:ilvl="5">
+      <w:start w:val="1"/>
+      <w:numFmt w:val="decimal"/>
+      <w:isLgl/>
+      <w:lvlText w:val="%1.%2.%3.%4.%5.%6"/>
+      <w:lvlJc w:val="left"/>
+      <w:pPr>
+        <w:ind w:left="1440" w:hanging="1080"/>
+      </w:pPr>
+      <w:rPr>
+        <w:rFonts w:hint="default"/>
+      </w:rPr>
+    </w:lvl>
+    <w:lvl w:ilvl="6">
+      <w:start w:val="1"/>
+      <w:numFmt w:val="decimal"/>
+      <w:isLgl/>
+      <w:lvlText w:val="%1.%2.%3.%4.%5.%6.%7"/>
+      <w:lvlJc w:val="left"/>
+      <w:pPr>
+        <w:ind w:left="1800" w:hanging="1440"/>
+      </w:pPr>
+      <w:rPr>
+        <w:rFonts w:hint="default"/>
+      </w:rPr>
+    </w:lvl>
+    <w:lvl w:ilvl="7">
+      <w:start w:val="1"/>
+      <w:numFmt w:val="decimal"/>
+      <w:isLgl/>
+      <w:lvlText w:val="%1.%2.%3.%4.%5.%6.%7.%8"/>
+      <w:lvlJc w:val="left"/>
+      <w:pPr>
+        <w:ind w:left="1800" w:hanging="1440"/>
+      </w:pPr>
+      <w:rPr>
+        <w:rFonts w:hint="default"/>
+      </w:rPr>
+    </w:lvl>
+    <w:lvl w:ilvl="8">
+      <w:start w:val="1"/>
+      <w:numFmt w:val="decimal"/>
+      <w:isLgl/>
+      <w:lvlText w:val="%1.%2.%3.%4.%5.%6.%7.%8.%9"/>
+      <w:lvlJc w:val="left"/>
+      <w:pPr>
+        <w:ind w:left="2160" w:hanging="1800"/>
+      </w:pPr>
+      <w:rPr>
+        <w:rFonts w:hint="default"/>
+      </w:rPr>
+    </w:lvl>
+  </w:abstractNum>
+  <w:abstractNum w:abstractNumId="19" w15:restartNumberingAfterBreak="0">
     <w:nsid w:val="3C0E3607"/>
     <w:multiLevelType w:val="multilevel"/>
     <w:tmpl w:val="D52EDB14"/>
@@ -10296,7 +10885,7 @@
       </w:rPr>
     </w:lvl>
   </w:abstractNum>
-  <w:abstractNum w:abstractNumId="19" w15:restartNumberingAfterBreak="0">
+  <w:abstractNum w:abstractNumId="20" w15:restartNumberingAfterBreak="0">
     <w:nsid w:val="3C636029"/>
     <w:multiLevelType w:val="multilevel"/>
     <w:tmpl w:val="BCC0A002"/>
@@ -10436,7 +11025,7 @@
       </w:rPr>
     </w:lvl>
   </w:abstractNum>
-  <w:abstractNum w:abstractNumId="20" w15:restartNumberingAfterBreak="0">
+  <w:abstractNum w:abstractNumId="21" w15:restartNumberingAfterBreak="0">
     <w:nsid w:val="49E229C3"/>
     <w:multiLevelType w:val="multilevel"/>
     <w:tmpl w:val="BBF2B12A"/>
@@ -10557,7 +11146,7 @@
       </w:rPr>
     </w:lvl>
   </w:abstractNum>
-  <w:abstractNum w:abstractNumId="21" w15:restartNumberingAfterBreak="0">
+  <w:abstractNum w:abstractNumId="22" w15:restartNumberingAfterBreak="0">
     <w:nsid w:val="4A4C0CB0"/>
     <w:multiLevelType w:val="multilevel"/>
     <w:tmpl w:val="F9EA5292"/>
@@ -10670,7 +11259,7 @@
       </w:pPr>
     </w:lvl>
   </w:abstractNum>
-  <w:abstractNum w:abstractNumId="22" w15:restartNumberingAfterBreak="0">
+  <w:abstractNum w:abstractNumId="23" w15:restartNumberingAfterBreak="0">
     <w:nsid w:val="4DB44317"/>
     <w:multiLevelType w:val="multilevel"/>
     <w:tmpl w:val="1430BC9C"/>
@@ -10819,7 +11408,7 @@
       </w:rPr>
     </w:lvl>
   </w:abstractNum>
-  <w:abstractNum w:abstractNumId="23" w15:restartNumberingAfterBreak="0">
+  <w:abstractNum w:abstractNumId="24" w15:restartNumberingAfterBreak="0">
     <w:nsid w:val="504641E1"/>
     <w:multiLevelType w:val="multilevel"/>
     <w:tmpl w:val="5288B64C"/>
@@ -10968,7 +11557,7 @@
       </w:rPr>
     </w:lvl>
   </w:abstractNum>
-  <w:abstractNum w:abstractNumId="24" w15:restartNumberingAfterBreak="0">
+  <w:abstractNum w:abstractNumId="25" w15:restartNumberingAfterBreak="0">
     <w:nsid w:val="5D3A56A0"/>
     <w:multiLevelType w:val="multilevel"/>
     <w:tmpl w:val="0E4A844C"/>
@@ -11117,7 +11706,127 @@
       </w:rPr>
     </w:lvl>
   </w:abstractNum>
-  <w:abstractNum w:abstractNumId="25" w15:restartNumberingAfterBreak="0">
+  <w:abstractNum w:abstractNumId="26" w15:restartNumberingAfterBreak="0">
+    <w:nsid w:val="5FE5198F"/>
+    <w:multiLevelType w:val="multilevel"/>
+    <w:tmpl w:val="FBC08A5E"/>
+    <w:lvl w:ilvl="0">
+      <w:start w:val="1"/>
+      <w:numFmt w:val="decimal"/>
+      <w:lvlText w:val="%1."/>
+      <w:lvlJc w:val="left"/>
+      <w:pPr>
+        <w:ind w:left="720" w:hanging="360"/>
+      </w:pPr>
+      <w:rPr>
+        <w:rFonts w:hint="default"/>
+      </w:rPr>
+    </w:lvl>
+    <w:lvl w:ilvl="1">
+      <w:numFmt w:val="decimal"/>
+      <w:isLgl/>
+      <w:lvlText w:val="%1.%2"/>
+      <w:lvlJc w:val="left"/>
+      <w:pPr>
+        <w:ind w:left="720" w:hanging="360"/>
+      </w:pPr>
+      <w:rPr>
+        <w:rFonts w:hint="default"/>
+      </w:rPr>
+    </w:lvl>
+    <w:lvl w:ilvl="2">
+      <w:start w:val="1"/>
+      <w:numFmt w:val="decimal"/>
+      <w:isLgl/>
+      <w:lvlText w:val="%1.%2.%3"/>
+      <w:lvlJc w:val="left"/>
+      <w:pPr>
+        <w:ind w:left="1080" w:hanging="720"/>
+      </w:pPr>
+      <w:rPr>
+        <w:rFonts w:hint="default"/>
+      </w:rPr>
+    </w:lvl>
+    <w:lvl w:ilvl="3">
+      <w:start w:val="1"/>
+      <w:numFmt w:val="decimal"/>
+      <w:isLgl/>
+      <w:lvlText w:val="%1.%2.%3.%4"/>
+      <w:lvlJc w:val="left"/>
+      <w:pPr>
+        <w:ind w:left="1080" w:hanging="720"/>
+      </w:pPr>
+      <w:rPr>
+        <w:rFonts w:hint="default"/>
+      </w:rPr>
+    </w:lvl>
+    <w:lvl w:ilvl="4">
+      <w:start w:val="1"/>
+      <w:numFmt w:val="decimal"/>
+      <w:isLgl/>
+      <w:lvlText w:val="%1.%2.%3.%4.%5"/>
+      <w:lvlJc w:val="left"/>
+      <w:pPr>
+        <w:ind w:left="1440" w:hanging="1080"/>
+      </w:pPr>
+      <w:rPr>
+        <w:rFonts w:hint="default"/>
+      </w:rPr>
+    </w:lvl>
+    <w:lvl w:ilvl="5">
+      <w:start w:val="1"/>
+      <w:numFmt w:val="decimal"/>
+      <w:isLgl/>
+      <w:lvlText w:val="%1.%2.%3.%4.%5.%6"/>
+      <w:lvlJc w:val="left"/>
+      <w:pPr>
+        <w:ind w:left="1440" w:hanging="1080"/>
+      </w:pPr>
+      <w:rPr>
+        <w:rFonts w:hint="default"/>
+      </w:rPr>
+    </w:lvl>
+    <w:lvl w:ilvl="6">
+      <w:start w:val="1"/>
+      <w:numFmt w:val="decimal"/>
+      <w:isLgl/>
+      <w:lvlText w:val="%1.%2.%3.%4.%5.%6.%7"/>
+      <w:lvlJc w:val="left"/>
+      <w:pPr>
+        <w:ind w:left="1800" w:hanging="1440"/>
+      </w:pPr>
+      <w:rPr>
+        <w:rFonts w:hint="default"/>
+      </w:rPr>
+    </w:lvl>
+    <w:lvl w:ilvl="7">
+      <w:start w:val="1"/>
+      <w:numFmt w:val="decimal"/>
+      <w:isLgl/>
+      <w:lvlText w:val="%1.%2.%3.%4.%5.%6.%7.%8"/>
+      <w:lvlJc w:val="left"/>
+      <w:pPr>
+        <w:ind w:left="1800" w:hanging="1440"/>
+      </w:pPr>
+      <w:rPr>
+        <w:rFonts w:hint="default"/>
+      </w:rPr>
+    </w:lvl>
+    <w:lvl w:ilvl="8">
+      <w:start w:val="1"/>
+      <w:numFmt w:val="decimal"/>
+      <w:isLgl/>
+      <w:lvlText w:val="%1.%2.%3.%4.%5.%6.%7.%8.%9"/>
+      <w:lvlJc w:val="left"/>
+      <w:pPr>
+        <w:ind w:left="2160" w:hanging="1800"/>
+      </w:pPr>
+      <w:rPr>
+        <w:rFonts w:hint="default"/>
+      </w:rPr>
+    </w:lvl>
+  </w:abstractNum>
+  <w:abstractNum w:abstractNumId="27" w15:restartNumberingAfterBreak="0">
     <w:nsid w:val="62C74421"/>
     <w:multiLevelType w:val="multilevel"/>
     <w:tmpl w:val="DCD46C14"/>
@@ -11230,7 +11939,7 @@
       </w:pPr>
     </w:lvl>
   </w:abstractNum>
-  <w:abstractNum w:abstractNumId="26" w15:restartNumberingAfterBreak="0">
+  <w:abstractNum w:abstractNumId="28" w15:restartNumberingAfterBreak="0">
     <w:nsid w:val="63FB707C"/>
     <w:multiLevelType w:val="multilevel"/>
     <w:tmpl w:val="21425C66"/>
@@ -11346,7 +12055,7 @@
       </w:pPr>
     </w:lvl>
   </w:abstractNum>
-  <w:abstractNum w:abstractNumId="27" w15:restartNumberingAfterBreak="0">
+  <w:abstractNum w:abstractNumId="29" w15:restartNumberingAfterBreak="0">
     <w:nsid w:val="657F128B"/>
     <w:multiLevelType w:val="multilevel"/>
     <w:tmpl w:val="2190DAEA"/>
@@ -11494,7 +12203,7 @@
       </w:rPr>
     </w:lvl>
   </w:abstractNum>
-  <w:abstractNum w:abstractNumId="28" w15:restartNumberingAfterBreak="0">
+  <w:abstractNum w:abstractNumId="30" w15:restartNumberingAfterBreak="0">
     <w:nsid w:val="67131272"/>
     <w:multiLevelType w:val="multilevel"/>
     <w:tmpl w:val="BF5CDEA8"/>
@@ -11607,7 +12316,7 @@
       </w:pPr>
     </w:lvl>
   </w:abstractNum>
-  <w:abstractNum w:abstractNumId="29" w15:restartNumberingAfterBreak="0">
+  <w:abstractNum w:abstractNumId="31" w15:restartNumberingAfterBreak="0">
     <w:nsid w:val="68863B8B"/>
     <w:multiLevelType w:val="multilevel"/>
     <w:tmpl w:val="E6FAC278"/>
@@ -11720,7 +12429,7 @@
       </w:pPr>
     </w:lvl>
   </w:abstractNum>
-  <w:abstractNum w:abstractNumId="30" w15:restartNumberingAfterBreak="0">
+  <w:abstractNum w:abstractNumId="32" w15:restartNumberingAfterBreak="0">
     <w:nsid w:val="6C8F6B55"/>
     <w:multiLevelType w:val="multilevel"/>
     <w:tmpl w:val="FA484644"/>
@@ -11869,7 +12578,7 @@
       </w:rPr>
     </w:lvl>
   </w:abstractNum>
-  <w:abstractNum w:abstractNumId="31" w15:restartNumberingAfterBreak="0">
+  <w:abstractNum w:abstractNumId="33" w15:restartNumberingAfterBreak="0">
     <w:nsid w:val="6DF1772E"/>
     <w:multiLevelType w:val="multilevel"/>
     <w:tmpl w:val="F0CAF95C"/>
@@ -12018,7 +12727,7 @@
       </w:rPr>
     </w:lvl>
   </w:abstractNum>
-  <w:abstractNum w:abstractNumId="32" w15:restartNumberingAfterBreak="0">
+  <w:abstractNum w:abstractNumId="34" w15:restartNumberingAfterBreak="0">
     <w:nsid w:val="71E24BC9"/>
     <w:multiLevelType w:val="multilevel"/>
     <w:tmpl w:val="21BED83C"/>
@@ -12167,7 +12876,7 @@
       </w:rPr>
     </w:lvl>
   </w:abstractNum>
-  <w:abstractNum w:abstractNumId="33" w15:restartNumberingAfterBreak="0">
+  <w:abstractNum w:abstractNumId="35" w15:restartNumberingAfterBreak="0">
     <w:nsid w:val="72130E74"/>
     <w:multiLevelType w:val="multilevel"/>
     <w:tmpl w:val="4F56E7E6"/>
@@ -12316,7 +13025,7 @@
       </w:rPr>
     </w:lvl>
   </w:abstractNum>
-  <w:abstractNum w:abstractNumId="34" w15:restartNumberingAfterBreak="0">
+  <w:abstractNum w:abstractNumId="36" w15:restartNumberingAfterBreak="0">
     <w:nsid w:val="73705DA3"/>
     <w:multiLevelType w:val="multilevel"/>
     <w:tmpl w:val="FF12E6B4"/>
@@ -12465,7 +13174,7 @@
       </w:rPr>
     </w:lvl>
   </w:abstractNum>
-  <w:abstractNum w:abstractNumId="35" w15:restartNumberingAfterBreak="0">
+  <w:abstractNum w:abstractNumId="37" w15:restartNumberingAfterBreak="0">
     <w:nsid w:val="759D5BE3"/>
     <w:multiLevelType w:val="multilevel"/>
     <w:tmpl w:val="CBC83E3E"/>
@@ -12615,34 +13324,34 @@
     </w:lvl>
   </w:abstractNum>
   <w:num w:numId="1" w16cid:durableId="1357317174">
-    <w:abstractNumId w:val="22"/>
+    <w:abstractNumId w:val="23"/>
   </w:num>
   <w:num w:numId="2" w16cid:durableId="877358492">
-    <w:abstractNumId w:val="30"/>
+    <w:abstractNumId w:val="32"/>
   </w:num>
   <w:num w:numId="3" w16cid:durableId="919677024">
     <w:abstractNumId w:val="13"/>
   </w:num>
   <w:num w:numId="4" w16cid:durableId="1807312214">
-    <w:abstractNumId w:val="18"/>
+    <w:abstractNumId w:val="19"/>
   </w:num>
   <w:num w:numId="5" w16cid:durableId="691958190">
     <w:abstractNumId w:val="1"/>
   </w:num>
   <w:num w:numId="6" w16cid:durableId="1550725885">
-    <w:abstractNumId w:val="32"/>
+    <w:abstractNumId w:val="34"/>
   </w:num>
   <w:num w:numId="7" w16cid:durableId="1877162373">
-    <w:abstractNumId w:val="26"/>
+    <w:abstractNumId w:val="28"/>
   </w:num>
   <w:num w:numId="8" w16cid:durableId="1877353698">
     <w:abstractNumId w:val="16"/>
   </w:num>
   <w:num w:numId="9" w16cid:durableId="1367753138">
-    <w:abstractNumId w:val="34"/>
+    <w:abstractNumId w:val="36"/>
   </w:num>
   <w:num w:numId="10" w16cid:durableId="1609653397">
-    <w:abstractNumId w:val="31"/>
+    <w:abstractNumId w:val="33"/>
   </w:num>
   <w:num w:numId="11" w16cid:durableId="543567656">
     <w:abstractNumId w:val="5"/>
@@ -12651,13 +13360,13 @@
     <w:abstractNumId w:val="0"/>
   </w:num>
   <w:num w:numId="13" w16cid:durableId="1197936804">
-    <w:abstractNumId w:val="33"/>
+    <w:abstractNumId w:val="35"/>
   </w:num>
   <w:num w:numId="14" w16cid:durableId="1867863628">
     <w:abstractNumId w:val="14"/>
   </w:num>
   <w:num w:numId="15" w16cid:durableId="1498809893">
-    <w:abstractNumId w:val="19"/>
+    <w:abstractNumId w:val="20"/>
   </w:num>
   <w:num w:numId="16" w16cid:durableId="1953438974">
     <w:abstractNumId w:val="15"/>
@@ -12666,10 +13375,10 @@
     <w:abstractNumId w:val="10"/>
   </w:num>
   <w:num w:numId="18" w16cid:durableId="1012613336">
-    <w:abstractNumId w:val="23"/>
+    <w:abstractNumId w:val="24"/>
   </w:num>
   <w:num w:numId="19" w16cid:durableId="1848669273">
-    <w:abstractNumId w:val="27"/>
+    <w:abstractNumId w:val="29"/>
   </w:num>
   <w:num w:numId="20" w16cid:durableId="1564681894">
     <w:abstractNumId w:val="3"/>
@@ -12684,10 +13393,10 @@
     <w:abstractNumId w:val="12"/>
   </w:num>
   <w:num w:numId="24" w16cid:durableId="486286829">
-    <w:abstractNumId w:val="24"/>
+    <w:abstractNumId w:val="25"/>
   </w:num>
   <w:num w:numId="25" w16cid:durableId="146677585">
-    <w:abstractNumId w:val="35"/>
+    <w:abstractNumId w:val="37"/>
   </w:num>
   <w:num w:numId="26" w16cid:durableId="1375077388">
     <w:abstractNumId w:val="6"/>
@@ -12696,16 +13405,16 @@
     <w:abstractNumId w:val="17"/>
   </w:num>
   <w:num w:numId="28" w16cid:durableId="916211195">
-    <w:abstractNumId w:val="28"/>
+    <w:abstractNumId w:val="30"/>
   </w:num>
   <w:num w:numId="29" w16cid:durableId="1167478697">
-    <w:abstractNumId w:val="21"/>
+    <w:abstractNumId w:val="22"/>
   </w:num>
   <w:num w:numId="30" w16cid:durableId="1121804435">
-    <w:abstractNumId w:val="25"/>
+    <w:abstractNumId w:val="27"/>
   </w:num>
   <w:num w:numId="31" w16cid:durableId="1159882485">
-    <w:abstractNumId w:val="29"/>
+    <w:abstractNumId w:val="31"/>
   </w:num>
   <w:num w:numId="32" w16cid:durableId="1730958245">
     <w:abstractNumId w:val="11"/>
@@ -12720,25 +13429,58 @@
     <w:abstractNumId w:val="4"/>
   </w:num>
   <w:num w:numId="36" w16cid:durableId="438263007">
-    <w:abstractNumId w:val="21"/>
+    <w:abstractNumId w:val="22"/>
     <w:lvlOverride w:ilvl="0">
       <w:startOverride w:val="1"/>
     </w:lvlOverride>
   </w:num>
   <w:num w:numId="37" w16cid:durableId="86583308">
+    <w:abstractNumId w:val="22"/>
+  </w:num>
+  <w:num w:numId="38" w16cid:durableId="650257550">
+    <w:abstractNumId w:val="22"/>
+  </w:num>
+  <w:num w:numId="39" w16cid:durableId="649678245">
+    <w:abstractNumId w:val="22"/>
+  </w:num>
+  <w:num w:numId="40" w16cid:durableId="1493401277">
+    <w:abstractNumId w:val="22"/>
+  </w:num>
+  <w:num w:numId="41" w16cid:durableId="806706238">
     <w:abstractNumId w:val="21"/>
   </w:num>
-  <w:num w:numId="38" w16cid:durableId="650257550">
-    <w:abstractNumId w:val="21"/>
+  <w:num w:numId="42" w16cid:durableId="2077780508">
+    <w:abstractNumId w:val="18"/>
+    <w:lvlOverride w:ilvl="0">
+      <w:startOverride w:val="1"/>
+    </w:lvlOverride>
+    <w:lvlOverride w:ilvl="1">
+      <w:startOverride w:val="1"/>
+    </w:lvlOverride>
+    <w:lvlOverride w:ilvl="2">
+      <w:startOverride w:val="1"/>
+    </w:lvlOverride>
+    <w:lvlOverride w:ilvl="3">
+      <w:startOverride w:val="1"/>
+    </w:lvlOverride>
+    <w:lvlOverride w:ilvl="4">
+      <w:startOverride w:val="1"/>
+    </w:lvlOverride>
+    <w:lvlOverride w:ilvl="5">
+      <w:startOverride w:val="1"/>
+    </w:lvlOverride>
+    <w:lvlOverride w:ilvl="6">
+      <w:startOverride w:val="1"/>
+    </w:lvlOverride>
+    <w:lvlOverride w:ilvl="7">
+      <w:startOverride w:val="1"/>
+    </w:lvlOverride>
+    <w:lvlOverride w:ilvl="8">
+      <w:startOverride w:val="1"/>
+    </w:lvlOverride>
   </w:num>
-  <w:num w:numId="39" w16cid:durableId="649678245">
-    <w:abstractNumId w:val="21"/>
-  </w:num>
-  <w:num w:numId="40" w16cid:durableId="1493401277">
-    <w:abstractNumId w:val="21"/>
-  </w:num>
-  <w:num w:numId="41" w16cid:durableId="806706238">
-    <w:abstractNumId w:val="20"/>
+  <w:num w:numId="43" w16cid:durableId="867448189">
+    <w:abstractNumId w:val="26"/>
   </w:num>
 </w:numbering>
 </file>
@@ -13347,6 +14089,7 @@
   <w:style w:type="character" w:default="1" w:styleId="DefaultParagraphFont">
     <w:name w:val="Default Paragraph Font"/>
     <w:uiPriority w:val="1"/>
+    <w:semiHidden/>
     <w:unhideWhenUsed/>
   </w:style>
   <w:style w:type="table" w:default="1" w:styleId="TableNormal">

</xml_diff>